<commit_message>
Add Usage tab: spend by program, cohort and learner for reporting
- GET /api/usage (read-only) lists every program workspace's keys with
  OpenRouter's spend figures; cohort/email from saved records, else parsed
  from the key name (handles dashes in cohorts and emails)
- Summary figures, spend-by-program and spend-by-cohort charts, cohort and
  learner tables, needs-attention list, CSV downloads, print/PDF layout
- Docs: README section and a new guide section

Co-Authored-By: Claude Opus 5.5 <noreply@anthropic.com>
</commit_message>
<xml_diff>
--- a/docs/OpenRouter-Key-Generator-Guide.docx
+++ b/docs/OpenRouter-Key-Generator-Guide.docx
@@ -242,7 +242,7 @@
       <w:r>
         <w:fldChar w:fldCharType="separate"/>
       </w:r>
-      <w:hyperlink w:anchor="_Toc242277797" w:history="1">
+      <w:hyperlink w:anchor="_Toc242288546" w:history="1">
         <w:r>
           <w:rPr>
             <w:rStyle w:val="Hyperlink"/>
@@ -269,7 +269,7 @@
             <w:noProof/>
             <w:webHidden/>
           </w:rPr>
-          <w:instrText xml:space="preserve"> PAGEREF _Toc242277797 \h </w:instrText>
+          <w:instrText xml:space="preserve"> PAGEREF _Toc242288546 \h </w:instrText>
         </w:r>
         <w:r>
           <w:rPr>
@@ -310,7 +310,7 @@
           <w:noProof/>
         </w:rPr>
       </w:pPr>
-      <w:hyperlink w:anchor="_Toc242277798" w:history="1">
+      <w:hyperlink w:anchor="_Toc242288547" w:history="1">
         <w:r>
           <w:rPr>
             <w:rStyle w:val="Hyperlink"/>
@@ -337,7 +337,7 @@
             <w:noProof/>
             <w:webHidden/>
           </w:rPr>
-          <w:instrText xml:space="preserve"> PAGEREF _Toc242277798 \h </w:instrText>
+          <w:instrText xml:space="preserve"> PAGEREF _Toc242288547 \h </w:instrText>
         </w:r>
         <w:r>
           <w:rPr>
@@ -378,7 +378,7 @@
           <w:noProof/>
         </w:rPr>
       </w:pPr>
-      <w:hyperlink w:anchor="_Toc242277799" w:history="1">
+      <w:hyperlink w:anchor="_Toc242288548" w:history="1">
         <w:r>
           <w:rPr>
             <w:rStyle w:val="Hyperlink"/>
@@ -405,7 +405,7 @@
             <w:noProof/>
             <w:webHidden/>
           </w:rPr>
-          <w:instrText xml:space="preserve"> PAGEREF _Toc242277799 \h </w:instrText>
+          <w:instrText xml:space="preserve"> PAGEREF _Toc242288548 \h </w:instrText>
         </w:r>
         <w:r>
           <w:rPr>
@@ -446,7 +446,7 @@
           <w:noProof/>
         </w:rPr>
       </w:pPr>
-      <w:hyperlink w:anchor="_Toc242277800" w:history="1">
+      <w:hyperlink w:anchor="_Toc242288549" w:history="1">
         <w:r>
           <w:rPr>
             <w:rStyle w:val="Hyperlink"/>
@@ -473,7 +473,7 @@
             <w:noProof/>
             <w:webHidden/>
           </w:rPr>
-          <w:instrText xml:space="preserve"> PAGEREF _Toc242277800 \h </w:instrText>
+          <w:instrText xml:space="preserve"> PAGEREF _Toc242288549 \h </w:instrText>
         </w:r>
         <w:r>
           <w:rPr>
@@ -514,7 +514,7 @@
           <w:noProof/>
         </w:rPr>
       </w:pPr>
-      <w:hyperlink w:anchor="_Toc242277801" w:history="1">
+      <w:hyperlink w:anchor="_Toc242288550" w:history="1">
         <w:r>
           <w:rPr>
             <w:rStyle w:val="Hyperlink"/>
@@ -541,7 +541,7 @@
             <w:noProof/>
             <w:webHidden/>
           </w:rPr>
-          <w:instrText xml:space="preserve"> PAGEREF _Toc242277801 \h </w:instrText>
+          <w:instrText xml:space="preserve"> PAGEREF _Toc242288550 \h </w:instrText>
         </w:r>
         <w:r>
           <w:rPr>
@@ -582,7 +582,7 @@
           <w:noProof/>
         </w:rPr>
       </w:pPr>
-      <w:hyperlink w:anchor="_Toc242277802" w:history="1">
+      <w:hyperlink w:anchor="_Toc242288551" w:history="1">
         <w:r>
           <w:rPr>
             <w:rStyle w:val="Hyperlink"/>
@@ -609,7 +609,7 @@
             <w:noProof/>
             <w:webHidden/>
           </w:rPr>
-          <w:instrText xml:space="preserve"> PAGEREF _Toc242277802 \h </w:instrText>
+          <w:instrText xml:space="preserve"> PAGEREF _Toc242288551 \h </w:instrText>
         </w:r>
         <w:r>
           <w:rPr>
@@ -650,7 +650,7 @@
           <w:noProof/>
         </w:rPr>
       </w:pPr>
-      <w:hyperlink w:anchor="_Toc242277803" w:history="1">
+      <w:hyperlink w:anchor="_Toc242288552" w:history="1">
         <w:r>
           <w:rPr>
             <w:rStyle w:val="Hyperlink"/>
@@ -677,7 +677,7 @@
             <w:noProof/>
             <w:webHidden/>
           </w:rPr>
-          <w:instrText xml:space="preserve"> PAGEREF _Toc242277803 \h </w:instrText>
+          <w:instrText xml:space="preserve"> PAGEREF _Toc242288552 \h </w:instrText>
         </w:r>
         <w:r>
           <w:rPr>
@@ -718,7 +718,7 @@
           <w:noProof/>
         </w:rPr>
       </w:pPr>
-      <w:hyperlink w:anchor="_Toc242277804" w:history="1">
+      <w:hyperlink w:anchor="_Toc242288553" w:history="1">
         <w:r>
           <w:rPr>
             <w:rStyle w:val="Hyperlink"/>
@@ -745,7 +745,7 @@
             <w:noProof/>
             <w:webHidden/>
           </w:rPr>
-          <w:instrText xml:space="preserve"> PAGEREF _Toc242277804 \h </w:instrText>
+          <w:instrText xml:space="preserve"> PAGEREF _Toc242288553 \h </w:instrText>
         </w:r>
         <w:r>
           <w:rPr>
@@ -786,7 +786,7 @@
           <w:noProof/>
         </w:rPr>
       </w:pPr>
-      <w:hyperlink w:anchor="_Toc242277805" w:history="1">
+      <w:hyperlink w:anchor="_Toc242288554" w:history="1">
         <w:r>
           <w:rPr>
             <w:rStyle w:val="Hyperlink"/>
@@ -813,7 +813,7 @@
             <w:noProof/>
             <w:webHidden/>
           </w:rPr>
-          <w:instrText xml:space="preserve"> PAGEREF _Toc242277805 \h </w:instrText>
+          <w:instrText xml:space="preserve"> PAGEREF _Toc242288554 \h </w:instrText>
         </w:r>
         <w:r>
           <w:rPr>
@@ -854,7 +854,7 @@
           <w:noProof/>
         </w:rPr>
       </w:pPr>
-      <w:hyperlink w:anchor="_Toc242277806" w:history="1">
+      <w:hyperlink w:anchor="_Toc242288555" w:history="1">
         <w:r>
           <w:rPr>
             <w:rStyle w:val="Hyperlink"/>
@@ -881,7 +881,7 @@
             <w:noProof/>
             <w:webHidden/>
           </w:rPr>
-          <w:instrText xml:space="preserve"> PAGEREF _Toc242277806 \h </w:instrText>
+          <w:instrText xml:space="preserve"> PAGEREF _Toc242288555 \h </w:instrText>
         </w:r>
         <w:r>
           <w:rPr>
@@ -922,7 +922,7 @@
           <w:noProof/>
         </w:rPr>
       </w:pPr>
-      <w:hyperlink w:anchor="_Toc242277807" w:history="1">
+      <w:hyperlink w:anchor="_Toc242288556" w:history="1">
         <w:r>
           <w:rPr>
             <w:rStyle w:val="Hyperlink"/>
@@ -949,7 +949,7 @@
             <w:noProof/>
             <w:webHidden/>
           </w:rPr>
-          <w:instrText xml:space="preserve"> PAGEREF _Toc242277807 \h </w:instrText>
+          <w:instrText xml:space="preserve"> PAGEREF _Toc242288556 \h </w:instrText>
         </w:r>
         <w:r>
           <w:rPr>
@@ -990,7 +990,7 @@
           <w:noProof/>
         </w:rPr>
       </w:pPr>
-      <w:hyperlink w:anchor="_Toc242277808" w:history="1">
+      <w:hyperlink w:anchor="_Toc242288557" w:history="1">
         <w:r>
           <w:rPr>
             <w:rStyle w:val="Hyperlink"/>
@@ -1017,7 +1017,7 @@
             <w:noProof/>
             <w:webHidden/>
           </w:rPr>
-          <w:instrText xml:space="preserve"> PAGEREF _Toc242277808 \h </w:instrText>
+          <w:instrText xml:space="preserve"> PAGEREF _Toc242288557 \h </w:instrText>
         </w:r>
         <w:r>
           <w:rPr>
@@ -1058,7 +1058,7 @@
           <w:noProof/>
         </w:rPr>
       </w:pPr>
-      <w:hyperlink w:anchor="_Toc242277809" w:history="1">
+      <w:hyperlink w:anchor="_Toc242288558" w:history="1">
         <w:r>
           <w:rPr>
             <w:rStyle w:val="Hyperlink"/>
@@ -1085,7 +1085,7 @@
             <w:noProof/>
             <w:webHidden/>
           </w:rPr>
-          <w:instrText xml:space="preserve"> PAGEREF _Toc242277809 \h </w:instrText>
+          <w:instrText xml:space="preserve"> PAGEREF _Toc242288558 \h </w:instrText>
         </w:r>
         <w:r>
           <w:rPr>
@@ -1126,7 +1126,7 @@
           <w:noProof/>
         </w:rPr>
       </w:pPr>
-      <w:hyperlink w:anchor="_Toc242277810" w:history="1">
+      <w:hyperlink w:anchor="_Toc242288559" w:history="1">
         <w:r>
           <w:rPr>
             <w:rStyle w:val="Hyperlink"/>
@@ -1153,7 +1153,7 @@
             <w:noProof/>
             <w:webHidden/>
           </w:rPr>
-          <w:instrText xml:space="preserve"> PAGEREF _Toc242277810 \h </w:instrText>
+          <w:instrText xml:space="preserve"> PAGEREF _Toc242288559 \h </w:instrText>
         </w:r>
         <w:r>
           <w:rPr>
@@ -1194,7 +1194,7 @@
           <w:noProof/>
         </w:rPr>
       </w:pPr>
-      <w:hyperlink w:anchor="_Toc242277811" w:history="1">
+      <w:hyperlink w:anchor="_Toc242288560" w:history="1">
         <w:r>
           <w:rPr>
             <w:rStyle w:val="Hyperlink"/>
@@ -1221,7 +1221,7 @@
             <w:noProof/>
             <w:webHidden/>
           </w:rPr>
-          <w:instrText xml:space="preserve"> PAGEREF _Toc242277811 \h </w:instrText>
+          <w:instrText xml:space="preserve"> PAGEREF _Toc242288560 \h </w:instrText>
         </w:r>
         <w:r>
           <w:rPr>
@@ -1262,7 +1262,7 @@
           <w:noProof/>
         </w:rPr>
       </w:pPr>
-      <w:hyperlink w:anchor="_Toc242277812" w:history="1">
+      <w:hyperlink w:anchor="_Toc242288561" w:history="1">
         <w:r>
           <w:rPr>
             <w:rStyle w:val="Hyperlink"/>
@@ -1289,7 +1289,7 @@
             <w:noProof/>
             <w:webHidden/>
           </w:rPr>
-          <w:instrText xml:space="preserve"> PAGEREF _Toc242277812 \h </w:instrText>
+          <w:instrText xml:space="preserve"> PAGEREF _Toc242288561 \h </w:instrText>
         </w:r>
         <w:r>
           <w:rPr>
@@ -1330,13 +1330,13 @@
           <w:noProof/>
         </w:rPr>
       </w:pPr>
-      <w:hyperlink w:anchor="_Toc242277813" w:history="1">
+      <w:hyperlink w:anchor="_Toc242288562" w:history="1">
         <w:r>
           <w:rPr>
             <w:rStyle w:val="Hyperlink"/>
             <w:noProof/>
           </w:rPr>
-          <w:t>7. Monthly checklist</w:t>
+          <w:t>7. Usage reports for leadership</w:t>
         </w:r>
         <w:r>
           <w:rPr>
@@ -1357,7 +1357,7 @@
             <w:noProof/>
             <w:webHidden/>
           </w:rPr>
-          <w:instrText xml:space="preserve"> PAGEREF _Toc242277813 \h </w:instrText>
+          <w:instrText xml:space="preserve"> PAGEREF _Toc242288562 \h </w:instrText>
         </w:r>
         <w:r>
           <w:rPr>
@@ -1398,13 +1398,13 @@
           <w:noProof/>
         </w:rPr>
       </w:pPr>
-      <w:hyperlink w:anchor="_Toc242277814" w:history="1">
+      <w:hyperlink w:anchor="_Toc242288563" w:history="1">
         <w:r>
           <w:rPr>
             <w:rStyle w:val="Hyperlink"/>
             <w:noProof/>
           </w:rPr>
-          <w:t>When a cohort starts</w:t>
+          <w:t>What it shows</w:t>
         </w:r>
         <w:r>
           <w:rPr>
@@ -1425,7 +1425,7 @@
             <w:noProof/>
             <w:webHidden/>
           </w:rPr>
-          <w:instrText xml:space="preserve"> PAGEREF _Toc242277814 \h </w:instrText>
+          <w:instrText xml:space="preserve"> PAGEREF _Toc242288563 \h </w:instrText>
         </w:r>
         <w:r>
           <w:rPr>
@@ -1466,13 +1466,13 @@
           <w:noProof/>
         </w:rPr>
       </w:pPr>
-      <w:hyperlink w:anchor="_Toc242277815" w:history="1">
+      <w:hyperlink w:anchor="_Toc242288564" w:history="1">
         <w:r>
           <w:rPr>
             <w:rStyle w:val="Hyperlink"/>
             <w:noProof/>
           </w:rPr>
-          <w:t>When a cohort ends</w:t>
+          <w:t>Filtering and sorting</w:t>
         </w:r>
         <w:r>
           <w:rPr>
@@ -1493,7 +1493,143 @@
             <w:noProof/>
             <w:webHidden/>
           </w:rPr>
-          <w:instrText xml:space="preserve"> PAGEREF _Toc242277815 \h </w:instrText>
+          <w:instrText xml:space="preserve"> PAGEREF _Toc242288564 \h </w:instrText>
+        </w:r>
+        <w:r>
+          <w:rPr>
+            <w:noProof/>
+            <w:webHidden/>
+          </w:rPr>
+        </w:r>
+        <w:r>
+          <w:rPr>
+            <w:noProof/>
+            <w:webHidden/>
+          </w:rPr>
+          <w:fldChar w:fldCharType="separate"/>
+        </w:r>
+        <w:r>
+          <w:rPr>
+            <w:noProof/>
+            <w:webHidden/>
+          </w:rPr>
+          <w:t>8</w:t>
+        </w:r>
+        <w:r>
+          <w:rPr>
+            <w:noProof/>
+            <w:webHidden/>
+          </w:rPr>
+          <w:fldChar w:fldCharType="end"/>
+        </w:r>
+      </w:hyperlink>
+    </w:p>
+    <w:p>
+      <w:pPr>
+        <w:pStyle w:val="TOC2"/>
+        <w:tabs>
+          <w:tab w:val="right" w:leader="dot" w:pos="9736"/>
+        </w:tabs>
+        <w:rPr>
+          <w:noProof/>
+        </w:rPr>
+      </w:pPr>
+      <w:hyperlink w:anchor="_Toc242288565" w:history="1">
+        <w:r>
+          <w:rPr>
+            <w:rStyle w:val="Hyperlink"/>
+            <w:noProof/>
+          </w:rPr>
+          <w:t>Getting the report out</w:t>
+        </w:r>
+        <w:r>
+          <w:rPr>
+            <w:noProof/>
+            <w:webHidden/>
+          </w:rPr>
+          <w:tab/>
+        </w:r>
+        <w:r>
+          <w:rPr>
+            <w:noProof/>
+            <w:webHidden/>
+          </w:rPr>
+          <w:fldChar w:fldCharType="begin"/>
+        </w:r>
+        <w:r>
+          <w:rPr>
+            <w:noProof/>
+            <w:webHidden/>
+          </w:rPr>
+          <w:instrText xml:space="preserve"> PAGEREF _Toc242288565 \h </w:instrText>
+        </w:r>
+        <w:r>
+          <w:rPr>
+            <w:noProof/>
+            <w:webHidden/>
+          </w:rPr>
+        </w:r>
+        <w:r>
+          <w:rPr>
+            <w:noProof/>
+            <w:webHidden/>
+          </w:rPr>
+          <w:fldChar w:fldCharType="separate"/>
+        </w:r>
+        <w:r>
+          <w:rPr>
+            <w:noProof/>
+            <w:webHidden/>
+          </w:rPr>
+          <w:t>8</w:t>
+        </w:r>
+        <w:r>
+          <w:rPr>
+            <w:noProof/>
+            <w:webHidden/>
+          </w:rPr>
+          <w:fldChar w:fldCharType="end"/>
+        </w:r>
+      </w:hyperlink>
+    </w:p>
+    <w:p>
+      <w:pPr>
+        <w:pStyle w:val="TOC2"/>
+        <w:tabs>
+          <w:tab w:val="right" w:leader="dot" w:pos="9736"/>
+        </w:tabs>
+        <w:rPr>
+          <w:noProof/>
+        </w:rPr>
+      </w:pPr>
+      <w:hyperlink w:anchor="_Toc242288566" w:history="1">
+        <w:r>
+          <w:rPr>
+            <w:rStyle w:val="Hyperlink"/>
+            <w:noProof/>
+          </w:rPr>
+          <w:t>Good to know</w:t>
+        </w:r>
+        <w:r>
+          <w:rPr>
+            <w:noProof/>
+            <w:webHidden/>
+          </w:rPr>
+          <w:tab/>
+        </w:r>
+        <w:r>
+          <w:rPr>
+            <w:noProof/>
+            <w:webHidden/>
+          </w:rPr>
+          <w:fldChar w:fldCharType="begin"/>
+        </w:r>
+        <w:r>
+          <w:rPr>
+            <w:noProof/>
+            <w:webHidden/>
+          </w:rPr>
+          <w:instrText xml:space="preserve"> PAGEREF _Toc242288566 \h </w:instrText>
         </w:r>
         <w:r>
           <w:rPr>
@@ -1534,13 +1670,13 @@
           <w:noProof/>
         </w:rPr>
       </w:pPr>
-      <w:hyperlink w:anchor="_Toc242277816" w:history="1">
+      <w:hyperlink w:anchor="_Toc242288567" w:history="1">
         <w:r>
           <w:rPr>
             <w:rStyle w:val="Hyperlink"/>
             <w:noProof/>
           </w:rPr>
-          <w:t>8. First-time test</w:t>
+          <w:t>8. Monthly checklist</w:t>
         </w:r>
         <w:r>
           <w:rPr>
@@ -1561,7 +1697,7 @@
             <w:noProof/>
             <w:webHidden/>
           </w:rPr>
-          <w:instrText xml:space="preserve"> PAGEREF _Toc242277816 \h </w:instrText>
+          <w:instrText xml:space="preserve"> PAGEREF _Toc242288567 \h </w:instrText>
         </w:r>
         <w:r>
           <w:rPr>
@@ -1582,6 +1718,142 @@
             <w:webHidden/>
           </w:rPr>
           <w:t>8</w:t>
+        </w:r>
+        <w:r>
+          <w:rPr>
+            <w:noProof/>
+            <w:webHidden/>
+          </w:rPr>
+          <w:fldChar w:fldCharType="end"/>
+        </w:r>
+      </w:hyperlink>
+    </w:p>
+    <w:p>
+      <w:pPr>
+        <w:pStyle w:val="TOC2"/>
+        <w:tabs>
+          <w:tab w:val="right" w:leader="dot" w:pos="9736"/>
+        </w:tabs>
+        <w:rPr>
+          <w:noProof/>
+        </w:rPr>
+      </w:pPr>
+      <w:hyperlink w:anchor="_Toc242288568" w:history="1">
+        <w:r>
+          <w:rPr>
+            <w:rStyle w:val="Hyperlink"/>
+            <w:noProof/>
+          </w:rPr>
+          <w:t>When a cohort starts</w:t>
+        </w:r>
+        <w:r>
+          <w:rPr>
+            <w:noProof/>
+            <w:webHidden/>
+          </w:rPr>
+          <w:tab/>
+        </w:r>
+        <w:r>
+          <w:rPr>
+            <w:noProof/>
+            <w:webHidden/>
+          </w:rPr>
+          <w:fldChar w:fldCharType="begin"/>
+        </w:r>
+        <w:r>
+          <w:rPr>
+            <w:noProof/>
+            <w:webHidden/>
+          </w:rPr>
+          <w:instrText xml:space="preserve"> PAGEREF _Toc242288568 \h </w:instrText>
+        </w:r>
+        <w:r>
+          <w:rPr>
+            <w:noProof/>
+            <w:webHidden/>
+          </w:rPr>
+        </w:r>
+        <w:r>
+          <w:rPr>
+            <w:noProof/>
+            <w:webHidden/>
+          </w:rPr>
+          <w:fldChar w:fldCharType="separate"/>
+        </w:r>
+        <w:r>
+          <w:rPr>
+            <w:noProof/>
+            <w:webHidden/>
+          </w:rPr>
+          <w:t>8</w:t>
+        </w:r>
+        <w:r>
+          <w:rPr>
+            <w:noProof/>
+            <w:webHidden/>
+          </w:rPr>
+          <w:fldChar w:fldCharType="end"/>
+        </w:r>
+      </w:hyperlink>
+    </w:p>
+    <w:p>
+      <w:pPr>
+        <w:pStyle w:val="TOC2"/>
+        <w:tabs>
+          <w:tab w:val="right" w:leader="dot" w:pos="9736"/>
+        </w:tabs>
+        <w:rPr>
+          <w:noProof/>
+        </w:rPr>
+      </w:pPr>
+      <w:hyperlink w:anchor="_Toc242288569" w:history="1">
+        <w:r>
+          <w:rPr>
+            <w:rStyle w:val="Hyperlink"/>
+            <w:noProof/>
+          </w:rPr>
+          <w:t>When a cohort ends</w:t>
+        </w:r>
+        <w:r>
+          <w:rPr>
+            <w:noProof/>
+            <w:webHidden/>
+          </w:rPr>
+          <w:tab/>
+        </w:r>
+        <w:r>
+          <w:rPr>
+            <w:noProof/>
+            <w:webHidden/>
+          </w:rPr>
+          <w:fldChar w:fldCharType="begin"/>
+        </w:r>
+        <w:r>
+          <w:rPr>
+            <w:noProof/>
+            <w:webHidden/>
+          </w:rPr>
+          <w:instrText xml:space="preserve"> PAGEREF _Toc242288569 \h </w:instrText>
+        </w:r>
+        <w:r>
+          <w:rPr>
+            <w:noProof/>
+            <w:webHidden/>
+          </w:rPr>
+        </w:r>
+        <w:r>
+          <w:rPr>
+            <w:noProof/>
+            <w:webHidden/>
+          </w:rPr>
+          <w:fldChar w:fldCharType="separate"/>
+        </w:r>
+        <w:r>
+          <w:rPr>
+            <w:noProof/>
+            <w:webHidden/>
+          </w:rPr>
+          <w:t>9</w:t>
         </w:r>
         <w:r>
           <w:rPr>
@@ -1602,13 +1874,13 @@
           <w:noProof/>
         </w:rPr>
       </w:pPr>
-      <w:hyperlink w:anchor="_Toc242277817" w:history="1">
+      <w:hyperlink w:anchor="_Toc242288570" w:history="1">
         <w:r>
           <w:rPr>
             <w:rStyle w:val="Hyperlink"/>
             <w:noProof/>
           </w:rPr>
-          <w:t>9. How the online site is set up</w:t>
+          <w:t>9. First-time test</w:t>
         </w:r>
         <w:r>
           <w:rPr>
@@ -1629,7 +1901,7 @@
             <w:noProof/>
             <w:webHidden/>
           </w:rPr>
-          <w:instrText xml:space="preserve"> PAGEREF _Toc242277817 \h </w:instrText>
+          <w:instrText xml:space="preserve"> PAGEREF _Toc242288570 \h </w:instrText>
         </w:r>
         <w:r>
           <w:rPr>
@@ -1649,7 +1921,75 @@
             <w:noProof/>
             <w:webHidden/>
           </w:rPr>
-          <w:t>8</w:t>
+          <w:t>9</w:t>
+        </w:r>
+        <w:r>
+          <w:rPr>
+            <w:noProof/>
+            <w:webHidden/>
+          </w:rPr>
+          <w:fldChar w:fldCharType="end"/>
+        </w:r>
+      </w:hyperlink>
+    </w:p>
+    <w:p>
+      <w:pPr>
+        <w:pStyle w:val="TOC1"/>
+        <w:tabs>
+          <w:tab w:val="right" w:leader="dot" w:pos="9736"/>
+        </w:tabs>
+        <w:rPr>
+          <w:noProof/>
+        </w:rPr>
+      </w:pPr>
+      <w:hyperlink w:anchor="_Toc242288571" w:history="1">
+        <w:r>
+          <w:rPr>
+            <w:rStyle w:val="Hyperlink"/>
+            <w:noProof/>
+          </w:rPr>
+          <w:t>10. How the online site is set up</w:t>
+        </w:r>
+        <w:r>
+          <w:rPr>
+            <w:noProof/>
+            <w:webHidden/>
+          </w:rPr>
+          <w:tab/>
+        </w:r>
+        <w:r>
+          <w:rPr>
+            <w:noProof/>
+            <w:webHidden/>
+          </w:rPr>
+          <w:fldChar w:fldCharType="begin"/>
+        </w:r>
+        <w:r>
+          <w:rPr>
+            <w:noProof/>
+            <w:webHidden/>
+          </w:rPr>
+          <w:instrText xml:space="preserve"> PAGEREF _Toc242288571 \h </w:instrText>
+        </w:r>
+        <w:r>
+          <w:rPr>
+            <w:noProof/>
+            <w:webHidden/>
+          </w:rPr>
+        </w:r>
+        <w:r>
+          <w:rPr>
+            <w:noProof/>
+            <w:webHidden/>
+          </w:rPr>
+          <w:fldChar w:fldCharType="separate"/>
+        </w:r>
+        <w:r>
+          <w:rPr>
+            <w:noProof/>
+            <w:webHidden/>
+          </w:rPr>
+          <w:t>9</w:t>
         </w:r>
         <w:r>
           <w:rPr>
@@ -1670,7 +2010,7 @@
           <w:noProof/>
         </w:rPr>
       </w:pPr>
-      <w:hyperlink w:anchor="_Toc242277818" w:history="1">
+      <w:hyperlink w:anchor="_Toc242288572" w:history="1">
         <w:r>
           <w:rPr>
             <w:rStyle w:val="Hyperlink"/>
@@ -1697,7 +2037,7 @@
             <w:noProof/>
             <w:webHidden/>
           </w:rPr>
-          <w:instrText xml:space="preserve"> PAGEREF _Toc242277818 \h </w:instrText>
+          <w:instrText xml:space="preserve"> PAGEREF _Toc242288572 \h </w:instrText>
         </w:r>
         <w:r>
           <w:rPr>
@@ -1717,7 +2057,7 @@
             <w:noProof/>
             <w:webHidden/>
           </w:rPr>
-          <w:t>8</w:t>
+          <w:t>9</w:t>
         </w:r>
         <w:r>
           <w:rPr>
@@ -1738,7 +2078,7 @@
           <w:noProof/>
         </w:rPr>
       </w:pPr>
-      <w:hyperlink w:anchor="_Toc242277819" w:history="1">
+      <w:hyperlink w:anchor="_Toc242288573" w:history="1">
         <w:r>
           <w:rPr>
             <w:rStyle w:val="Hyperlink"/>
@@ -1765,7 +2105,7 @@
             <w:noProof/>
             <w:webHidden/>
           </w:rPr>
-          <w:instrText xml:space="preserve"> PAGEREF _Toc242277819 \h </w:instrText>
+          <w:instrText xml:space="preserve"> PAGEREF _Toc242288573 \h </w:instrText>
         </w:r>
         <w:r>
           <w:rPr>
@@ -1785,7 +2125,7 @@
             <w:noProof/>
             <w:webHidden/>
           </w:rPr>
-          <w:t>9</w:t>
+          <w:t>10</w:t>
         </w:r>
         <w:r>
           <w:rPr>
@@ -1806,13 +2146,13 @@
           <w:noProof/>
         </w:rPr>
       </w:pPr>
-      <w:hyperlink w:anchor="_Toc242277820" w:history="1">
+      <w:hyperlink w:anchor="_Toc242288574" w:history="1">
         <w:r>
           <w:rPr>
             <w:rStyle w:val="Hyperlink"/>
             <w:noProof/>
           </w:rPr>
-          <w:t>10. Administration</w:t>
+          <w:t>11. Administration</w:t>
         </w:r>
         <w:r>
           <w:rPr>
@@ -1833,7 +2173,7 @@
             <w:noProof/>
             <w:webHidden/>
           </w:rPr>
-          <w:instrText xml:space="preserve"> PAGEREF _Toc242277820 \h </w:instrText>
+          <w:instrText xml:space="preserve"> PAGEREF _Toc242288574 \h </w:instrText>
         </w:r>
         <w:r>
           <w:rPr>
@@ -1853,7 +2193,7 @@
             <w:noProof/>
             <w:webHidden/>
           </w:rPr>
-          <w:t>9</w:t>
+          <w:t>10</w:t>
         </w:r>
         <w:r>
           <w:rPr>
@@ -1874,7 +2214,7 @@
           <w:noProof/>
         </w:rPr>
       </w:pPr>
-      <w:hyperlink w:anchor="_Toc242277821" w:history="1">
+      <w:hyperlink w:anchor="_Toc242288575" w:history="1">
         <w:r>
           <w:rPr>
             <w:rStyle w:val="Hyperlink"/>
@@ -1901,7 +2241,7 @@
             <w:noProof/>
             <w:webHidden/>
           </w:rPr>
-          <w:instrText xml:space="preserve"> PAGEREF _Toc242277821 \h </w:instrText>
+          <w:instrText xml:space="preserve"> PAGEREF _Toc242288575 \h </w:instrText>
         </w:r>
         <w:r>
           <w:rPr>
@@ -1921,7 +2261,7 @@
             <w:noProof/>
             <w:webHidden/>
           </w:rPr>
-          <w:t>9</w:t>
+          <w:t>10</w:t>
         </w:r>
         <w:r>
           <w:rPr>
@@ -1942,7 +2282,7 @@
           <w:noProof/>
         </w:rPr>
       </w:pPr>
-      <w:hyperlink w:anchor="_Toc242277822" w:history="1">
+      <w:hyperlink w:anchor="_Toc242288576" w:history="1">
         <w:r>
           <w:rPr>
             <w:rStyle w:val="Hyperlink"/>
@@ -1969,7 +2309,7 @@
             <w:noProof/>
             <w:webHidden/>
           </w:rPr>
-          <w:instrText xml:space="preserve"> PAGEREF _Toc242277822 \h </w:instrText>
+          <w:instrText xml:space="preserve"> PAGEREF _Toc242288576 \h </w:instrText>
         </w:r>
         <w:r>
           <w:rPr>
@@ -1989,7 +2329,7 @@
             <w:noProof/>
             <w:webHidden/>
           </w:rPr>
-          <w:t>9</w:t>
+          <w:t>10</w:t>
         </w:r>
         <w:r>
           <w:rPr>
@@ -2010,7 +2350,7 @@
           <w:noProof/>
         </w:rPr>
       </w:pPr>
-      <w:hyperlink w:anchor="_Toc242277823" w:history="1">
+      <w:hyperlink w:anchor="_Toc242288577" w:history="1">
         <w:r>
           <w:rPr>
             <w:rStyle w:val="Hyperlink"/>
@@ -2037,7 +2377,7 @@
             <w:noProof/>
             <w:webHidden/>
           </w:rPr>
-          <w:instrText xml:space="preserve"> PAGEREF _Toc242277823 \h </w:instrText>
+          <w:instrText xml:space="preserve"> PAGEREF _Toc242288577 \h </w:instrText>
         </w:r>
         <w:r>
           <w:rPr>
@@ -2057,7 +2397,7 @@
             <w:noProof/>
             <w:webHidden/>
           </w:rPr>
-          <w:t>9</w:t>
+          <w:t>10</w:t>
         </w:r>
         <w:r>
           <w:rPr>
@@ -2078,7 +2418,7 @@
           <w:noProof/>
         </w:rPr>
       </w:pPr>
-      <w:hyperlink w:anchor="_Toc242277824" w:history="1">
+      <w:hyperlink w:anchor="_Toc242288578" w:history="1">
         <w:r>
           <w:rPr>
             <w:rStyle w:val="Hyperlink"/>
@@ -2105,7 +2445,7 @@
             <w:noProof/>
             <w:webHidden/>
           </w:rPr>
-          <w:instrText xml:space="preserve"> PAGEREF _Toc242277824 \h </w:instrText>
+          <w:instrText xml:space="preserve"> PAGEREF _Toc242288578 \h </w:instrText>
         </w:r>
         <w:r>
           <w:rPr>
@@ -2125,7 +2465,7 @@
             <w:noProof/>
             <w:webHidden/>
           </w:rPr>
-          <w:t>9</w:t>
+          <w:t>10</w:t>
         </w:r>
         <w:r>
           <w:rPr>
@@ -2146,13 +2486,13 @@
           <w:noProof/>
         </w:rPr>
       </w:pPr>
-      <w:hyperlink w:anchor="_Toc242277825" w:history="1">
+      <w:hyperlink w:anchor="_Toc242288579" w:history="1">
         <w:r>
           <w:rPr>
             <w:rStyle w:val="Hyperlink"/>
             <w:noProof/>
           </w:rPr>
-          <w:t>11. Running it on your own computer</w:t>
+          <w:t>12. Running it on your own computer</w:t>
         </w:r>
         <w:r>
           <w:rPr>
@@ -2173,7 +2513,7 @@
             <w:noProof/>
             <w:webHidden/>
           </w:rPr>
-          <w:instrText xml:space="preserve"> PAGEREF _Toc242277825 \h </w:instrText>
+          <w:instrText xml:space="preserve"> PAGEREF _Toc242288579 \h </w:instrText>
         </w:r>
         <w:r>
           <w:rPr>
@@ -2193,7 +2533,7 @@
             <w:noProof/>
             <w:webHidden/>
           </w:rPr>
-          <w:t>10</w:t>
+          <w:t>11</w:t>
         </w:r>
         <w:r>
           <w:rPr>
@@ -2214,7 +2554,7 @@
           <w:noProof/>
         </w:rPr>
       </w:pPr>
-      <w:hyperlink w:anchor="_Toc242277826" w:history="1">
+      <w:hyperlink w:anchor="_Toc242288580" w:history="1">
         <w:r>
           <w:rPr>
             <w:rStyle w:val="Hyperlink"/>
@@ -2241,7 +2581,7 @@
             <w:noProof/>
             <w:webHidden/>
           </w:rPr>
-          <w:instrText xml:space="preserve"> PAGEREF _Toc242277826 \h </w:instrText>
+          <w:instrText xml:space="preserve"> PAGEREF _Toc242288580 \h </w:instrText>
         </w:r>
         <w:r>
           <w:rPr>
@@ -2261,7 +2601,7 @@
             <w:noProof/>
             <w:webHidden/>
           </w:rPr>
-          <w:t>10</w:t>
+          <w:t>11</w:t>
         </w:r>
         <w:r>
           <w:rPr>
@@ -2282,7 +2622,7 @@
           <w:noProof/>
         </w:rPr>
       </w:pPr>
-      <w:hyperlink w:anchor="_Toc242277827" w:history="1">
+      <w:hyperlink w:anchor="_Toc242288581" w:history="1">
         <w:r>
           <w:rPr>
             <w:rStyle w:val="Hyperlink"/>
@@ -2309,7 +2649,7 @@
             <w:noProof/>
             <w:webHidden/>
           </w:rPr>
-          <w:instrText xml:space="preserve"> PAGEREF _Toc242277827 \h </w:instrText>
+          <w:instrText xml:space="preserve"> PAGEREF _Toc242288581 \h </w:instrText>
         </w:r>
         <w:r>
           <w:rPr>
@@ -2329,7 +2669,7 @@
             <w:noProof/>
             <w:webHidden/>
           </w:rPr>
-          <w:t>10</w:t>
+          <w:t>11</w:t>
         </w:r>
         <w:r>
           <w:rPr>
@@ -2350,7 +2690,7 @@
           <w:noProof/>
         </w:rPr>
       </w:pPr>
-      <w:hyperlink w:anchor="_Toc242277828" w:history="1">
+      <w:hyperlink w:anchor="_Toc242288582" w:history="1">
         <w:r>
           <w:rPr>
             <w:rStyle w:val="Hyperlink"/>
@@ -2377,7 +2717,7 @@
             <w:noProof/>
             <w:webHidden/>
           </w:rPr>
-          <w:instrText xml:space="preserve"> PAGEREF _Toc242277828 \h </w:instrText>
+          <w:instrText xml:space="preserve"> PAGEREF _Toc242288582 \h </w:instrText>
         </w:r>
         <w:r>
           <w:rPr>
@@ -2397,7 +2737,7 @@
             <w:noProof/>
             <w:webHidden/>
           </w:rPr>
-          <w:t>10</w:t>
+          <w:t>11</w:t>
         </w:r>
         <w:r>
           <w:rPr>
@@ -2418,7 +2758,7 @@
           <w:noProof/>
         </w:rPr>
       </w:pPr>
-      <w:hyperlink w:anchor="_Toc242277829" w:history="1">
+      <w:hyperlink w:anchor="_Toc242288583" w:history="1">
         <w:r>
           <w:rPr>
             <w:rStyle w:val="Hyperlink"/>
@@ -2445,7 +2785,7 @@
             <w:noProof/>
             <w:webHidden/>
           </w:rPr>
-          <w:instrText xml:space="preserve"> PAGEREF _Toc242277829 \h </w:instrText>
+          <w:instrText xml:space="preserve"> PAGEREF _Toc242288583 \h </w:instrText>
         </w:r>
         <w:r>
           <w:rPr>
@@ -2465,7 +2805,7 @@
             <w:noProof/>
             <w:webHidden/>
           </w:rPr>
-          <w:t>10</w:t>
+          <w:t>11</w:t>
         </w:r>
         <w:r>
           <w:rPr>
@@ -2486,13 +2826,13 @@
           <w:noProof/>
         </w:rPr>
       </w:pPr>
-      <w:hyperlink w:anchor="_Toc242277830" w:history="1">
+      <w:hyperlink w:anchor="_Toc242288584" w:history="1">
         <w:r>
           <w:rPr>
             <w:rStyle w:val="Hyperlink"/>
             <w:noProof/>
           </w:rPr>
-          <w:t>12. Changing settings in config.js</w:t>
+          <w:t>13. Changing settings in config.js</w:t>
         </w:r>
         <w:r>
           <w:rPr>
@@ -2513,7 +2853,7 @@
             <w:noProof/>
             <w:webHidden/>
           </w:rPr>
-          <w:instrText xml:space="preserve"> PAGEREF _Toc242277830 \h </w:instrText>
+          <w:instrText xml:space="preserve"> PAGEREF _Toc242288584 \h </w:instrText>
         </w:r>
         <w:r>
           <w:rPr>
@@ -2533,7 +2873,7 @@
             <w:noProof/>
             <w:webHidden/>
           </w:rPr>
-          <w:t>10</w:t>
+          <w:t>11</w:t>
         </w:r>
         <w:r>
           <w:rPr>
@@ -2554,13 +2894,13 @@
           <w:noProof/>
         </w:rPr>
       </w:pPr>
-      <w:hyperlink w:anchor="_Toc242277831" w:history="1">
+      <w:hyperlink w:anchor="_Toc242288585" w:history="1">
         <w:r>
           <w:rPr>
             <w:rStyle w:val="Hyperlink"/>
             <w:noProof/>
           </w:rPr>
-          <w:t>13. How it works (technical summary)</w:t>
+          <w:t>14. How it works (technical summary)</w:t>
         </w:r>
         <w:r>
           <w:rPr>
@@ -2581,7 +2921,7 @@
             <w:noProof/>
             <w:webHidden/>
           </w:rPr>
-          <w:instrText xml:space="preserve"> PAGEREF _Toc242277831 \h </w:instrText>
+          <w:instrText xml:space="preserve"> PAGEREF _Toc242288585 \h </w:instrText>
         </w:r>
         <w:r>
           <w:rPr>
@@ -2601,7 +2941,7 @@
             <w:noProof/>
             <w:webHidden/>
           </w:rPr>
-          <w:t>11</w:t>
+          <w:t>12</w:t>
         </w:r>
         <w:r>
           <w:rPr>
@@ -2622,13 +2962,13 @@
           <w:noProof/>
         </w:rPr>
       </w:pPr>
-      <w:hyperlink w:anchor="_Toc242277832" w:history="1">
+      <w:hyperlink w:anchor="_Toc242288586" w:history="1">
         <w:r>
           <w:rPr>
             <w:rStyle w:val="Hyperlink"/>
             <w:noProof/>
           </w:rPr>
-          <w:t>14. Security</w:t>
+          <w:t>15. Security</w:t>
         </w:r>
         <w:r>
           <w:rPr>
@@ -2649,7 +2989,7 @@
             <w:noProof/>
             <w:webHidden/>
           </w:rPr>
-          <w:instrText xml:space="preserve"> PAGEREF _Toc242277832 \h </w:instrText>
+          <w:instrText xml:space="preserve"> PAGEREF _Toc242288586 \h </w:instrText>
         </w:r>
         <w:r>
           <w:rPr>
@@ -2669,7 +3009,7 @@
             <w:noProof/>
             <w:webHidden/>
           </w:rPr>
-          <w:t>11</w:t>
+          <w:t>12</w:t>
         </w:r>
         <w:r>
           <w:rPr>
@@ -2690,13 +3030,13 @@
           <w:noProof/>
         </w:rPr>
       </w:pPr>
-      <w:hyperlink w:anchor="_Toc242277833" w:history="1">
+      <w:hyperlink w:anchor="_Toc242288587" w:history="1">
         <w:r>
           <w:rPr>
             <w:rStyle w:val="Hyperlink"/>
             <w:noProof/>
           </w:rPr>
-          <w:t>15. Troubleshooting</w:t>
+          <w:t>16. Troubleshooting</w:t>
         </w:r>
         <w:r>
           <w:rPr>
@@ -2717,7 +3057,7 @@
             <w:noProof/>
             <w:webHidden/>
           </w:rPr>
-          <w:instrText xml:space="preserve"> PAGEREF _Toc242277833 \h </w:instrText>
+          <w:instrText xml:space="preserve"> PAGEREF _Toc242288587 \h </w:instrText>
         </w:r>
         <w:r>
           <w:rPr>
@@ -2737,7 +3077,7 @@
             <w:noProof/>
             <w:webHidden/>
           </w:rPr>
-          <w:t>12</w:t>
+          <w:t>13</w:t>
         </w:r>
         <w:r>
           <w:rPr>
@@ -2758,13 +3098,13 @@
           <w:noProof/>
         </w:rPr>
       </w:pPr>
-      <w:hyperlink w:anchor="_Toc242277834" w:history="1">
+      <w:hyperlink w:anchor="_Toc242288588" w:history="1">
         <w:r>
           <w:rPr>
             <w:rStyle w:val="Hyperlink"/>
             <w:noProof/>
           </w:rPr>
-          <w:t>16. For developers</w:t>
+          <w:t>17. For developers</w:t>
         </w:r>
         <w:r>
           <w:rPr>
@@ -2785,7 +3125,7 @@
             <w:noProof/>
             <w:webHidden/>
           </w:rPr>
-          <w:instrText xml:space="preserve"> PAGEREF _Toc242277834 \h </w:instrText>
+          <w:instrText xml:space="preserve"> PAGEREF _Toc242288588 \h </w:instrText>
         </w:r>
         <w:r>
           <w:rPr>
@@ -2805,7 +3145,7 @@
             <w:noProof/>
             <w:webHidden/>
           </w:rPr>
-          <w:t>12</w:t>
+          <w:t>13</w:t>
         </w:r>
         <w:r>
           <w:rPr>
@@ -2830,7 +3170,7 @@
       <w:pPr>
         <w:pStyle w:val="Heading1"/>
       </w:pPr>
-      <w:bookmarkStart w:id="1" w:name="_Toc242277797"/>
+      <w:bookmarkStart w:id="1" w:name="_Toc242288546"/>
       <w:r>
         <w:lastRenderedPageBreak/>
         <w:t>1. Overview</w:t>
@@ -2903,14 +3243,31 @@
         <w:t>saves every key as s</w:t>
       </w:r>
       <w:r>
-        <w:t>oon as it is created, so none are lost.</w:t>
+        <w:t>oon as it is created, so none are lost,</w:t>
       </w:r>
     </w:p>
     <w:p>
       <w:pPr>
+        <w:pStyle w:val="ListBullet"/>
+      </w:pPr>
+      <w:r>
+        <w:t xml:space="preserve">shows usage and spend per program, cohort and learner for reporting (the </w:t>
+      </w:r>
+      <w:r>
+        <w:rPr>
+          <w:b/>
+        </w:rPr>
+        <w:t>Usage</w:t>
+      </w:r>
+      <w:r>
+        <w:t xml:space="preserve"> tab).</w:t>
+      </w:r>
+    </w:p>
+    <w:p>
+      <w:pPr>
         <w:pStyle w:val="Heading2"/>
       </w:pPr>
-      <w:bookmarkStart w:id="2" w:name="_Toc242277798"/>
+      <w:bookmarkStart w:id="2" w:name="_Toc242288547"/>
       <w:r>
         <w:t>Three ways to use it</w:t>
       </w:r>
@@ -3022,7 +3379,13 @@
               <w:rPr>
                 <w:sz w:val="20"/>
               </w:rPr>
-              <w:t>Everyone on the team. Nothing to install; sign in with Google.</w:t>
+              <w:t xml:space="preserve">Everyone on the team. Nothing to install; sign in </w:t>
+            </w:r>
+            <w:r>
+              <w:rPr>
+                <w:sz w:val="20"/>
+              </w:rPr>
+              <w:t>with Google.</w:t>
             </w:r>
           </w:p>
         </w:tc>
@@ -3169,7 +3532,13 @@
               <w:rPr>
                 <w:sz w:val="20"/>
               </w:rPr>
-              <w:t>People comfortable with a terminal; automation.</w:t>
+              <w:t xml:space="preserve">People comfortable with a terminal; </w:t>
+            </w:r>
+            <w:r>
+              <w:rPr>
+                <w:sz w:val="20"/>
+              </w:rPr>
+              <w:t>automation.</w:t>
             </w:r>
           </w:p>
         </w:tc>
@@ -3222,10 +3591,7 @@
               <w:t>one place per cohort</w:t>
             </w:r>
             <w:r>
-              <w:t xml:space="preserve">. The online site and </w:t>
-            </w:r>
-            <w:r>
-              <w:t>your computer each keep their own list of keys. OpenRouter still prevents duplicates either way, but the lists won't match.</w:t>
+              <w:t>. The online site and your computer each keep their own list of keys. OpenRouter still prevents duplicates either way, but the lists won't match.</w:t>
             </w:r>
           </w:p>
         </w:tc>
@@ -3236,7 +3602,7 @@
       <w:pPr>
         <w:pStyle w:val="Heading1"/>
       </w:pPr>
-      <w:bookmarkStart w:id="3" w:name="_Toc242277799"/>
+      <w:bookmarkStart w:id="3" w:name="_Toc242288548"/>
       <w:r>
         <w:t>2. Who can use the online site</w:t>
       </w:r>
@@ -3293,7 +3659,14 @@
           <w:rFonts w:ascii="Consolas" w:hAnsi="Consolas"/>
           <w:sz w:val="20"/>
         </w:rPr>
-        <w:t>ALLOWED_EMAILS</w:t>
+        <w:t>A</w:t>
+      </w:r>
+      <w:r>
+        <w:rPr>
+          <w:rFonts w:ascii="Consolas" w:hAnsi="Consolas"/>
+          <w:sz w:val="20"/>
+        </w:rPr>
+        <w:t>LLOWED_EMAILS</w:t>
       </w:r>
       <w:r>
         <w:t xml:space="preserve"> in the Vercel settings).</w:t>
@@ -3301,10 +3674,10 @@
     </w:p>
     <w:p>
       <w:r>
-        <w:t>Anyone else sees a message instead of the page: personal Goo</w:t>
-      </w:r>
-      <w:r>
-        <w:t>gle accounts get *Use your @interviewkickstart.com Google account*, and company accounts that are not on the list get *This account is not on the list of people allowed to create keys*.</w:t>
+        <w:t>Anyone else sees a message instead of the page: personal Google accounts get *Use your @interviewkickstart.com Google account*, and company accounts that are not on the list get *This account is not on the list of peo</w:t>
+      </w:r>
+      <w:r>
+        <w:t>ple allowed to create keys*.</w:t>
       </w:r>
     </w:p>
     <w:p>
@@ -3327,22 +3700,22 @@
         <w:t>Sign out</w:t>
       </w:r>
       <w:r>
-        <w:t xml:space="preserve"> is in the top-right corner of the p</w:t>
-      </w:r>
-      <w:r>
-        <w:t>age. If someone is removed from the list, they are signed out on their next click after the site is redeployed.</w:t>
+        <w:t xml:space="preserve"> is in the top-right corner of the page. If someone is removed from the list, they are signed out on their next click after the site is redeployed.</w:t>
       </w:r>
     </w:p>
     <w:p>
       <w:r>
-        <w:t>Adding and removing people is explained in section 10.</w:t>
+        <w:t>Adding and removing people is explained in se</w:t>
+      </w:r>
+      <w:r>
+        <w:t>ction 11.</w:t>
       </w:r>
     </w:p>
     <w:p>
       <w:pPr>
         <w:pStyle w:val="Heading1"/>
       </w:pPr>
-      <w:bookmarkStart w:id="4" w:name="_Toc242277800"/>
+      <w:bookmarkStart w:id="4" w:name="_Toc242288549"/>
       <w:r>
         <w:lastRenderedPageBreak/>
         <w:t>3. Key concepts</w:t>
@@ -3353,7 +3726,7 @@
       <w:pPr>
         <w:pStyle w:val="Heading2"/>
       </w:pPr>
-      <w:bookmarkStart w:id="5" w:name="_Toc242277801"/>
+      <w:bookmarkStart w:id="5" w:name="_Toc242288550"/>
       <w:r>
         <w:t>Programs and workspaces</w:t>
       </w:r>
@@ -3660,14 +4033,17 @@
         <w:t>no workspace per cohort</w:t>
       </w:r>
       <w:r>
-        <w:t>. Creating a workspace every month would mean setting up guardrails again and again. Cohorts are told apart by the key name instead.</w:t>
+        <w:t>. Creating a workspace every month would mean setting up guardrails again</w:t>
+      </w:r>
+      <w:r>
+        <w:t xml:space="preserve"> and again. Cohorts are told apart by the key name instead.</w:t>
       </w:r>
     </w:p>
     <w:p>
       <w:pPr>
         <w:pStyle w:val="Heading2"/>
       </w:pPr>
-      <w:bookmarkStart w:id="6" w:name="_Toc242277802"/>
+      <w:bookmarkStart w:id="6" w:name="_Toc242288551"/>
       <w:r>
         <w:t>Key names</w:t>
       </w:r>
@@ -3683,14 +4059,7 @@
           <w:rFonts w:ascii="Consolas" w:hAnsi="Consolas"/>
           <w:sz w:val="19"/>
         </w:rPr>
-        <w:t>&lt;REGION&gt;-&lt;serial&gt;-&lt;cohort&gt;-&lt;</w:t>
-      </w:r>
-      <w:r>
-        <w:rPr>
-          <w:rFonts w:ascii="Consolas" w:hAnsi="Consolas"/>
-          <w:sz w:val="19"/>
-        </w:rPr>
-        <w:t>email&gt;</w:t>
+        <w:t>&lt;REGION&gt;-&lt;serial&gt;-&lt;cohort&gt;-&lt;email&gt;</w:t>
       </w:r>
       <w:r>
         <w:rPr>
@@ -3878,13 +4247,13 @@
               <w:rPr>
                 <w:sz w:val="20"/>
               </w:rPr>
-              <w:t xml:space="preserve">3 digits: the learner's row number in the CSV (001, 002, …). Invalid or repeated rows still use up a number; blank rows </w:t>
-            </w:r>
-            <w:r>
-              <w:rPr>
-                <w:sz w:val="20"/>
-              </w:rPr>
-              <w:t>don't.</w:t>
+              <w:t xml:space="preserve">3 digits: the learner's </w:t>
+            </w:r>
+            <w:r>
+              <w:rPr>
+                <w:sz w:val="20"/>
+              </w:rPr>
+              <w:t>row number in the CSV (001, 002, …). Invalid or repeated rows still use up a number; blank rows don't.</w:t>
             </w:r>
           </w:p>
         </w:tc>
@@ -3935,7 +4304,13 @@
               <w:rPr>
                 <w:sz w:val="20"/>
               </w:rPr>
-              <w:t>The cohort name you type in. Capitals become lowercase and spaces become dashes. Only letters, numbers, spaces and dashes; up to 40 characters.</w:t>
+              <w:t xml:space="preserve">The cohort name you type in. Capitals become lowercase and spaces become dashes. Only letters, numbers, spaces and dashes; up to 40 </w:t>
+            </w:r>
+            <w:r>
+              <w:rPr>
+                <w:sz w:val="20"/>
+              </w:rPr>
+              <w:t>characters.</w:t>
             </w:r>
           </w:p>
         </w:tc>
@@ -4040,7 +4415,7 @@
       <w:pPr>
         <w:pStyle w:val="Heading2"/>
       </w:pPr>
-      <w:bookmarkStart w:id="7" w:name="_Toc242277803"/>
+      <w:bookmarkStart w:id="7" w:name="_Toc242288552"/>
       <w:r>
         <w:t>Running twice is safe</w:t>
       </w:r>
@@ -4057,7 +4432,10 @@
         <w:t>same region, cohort and email</w:t>
       </w:r>
       <w:r>
-        <w:t xml:space="preserve"> (any serial). If one exists, that learner is </w:t>
+        <w:t xml:space="preserve"> (any serial). If </w:t>
+      </w:r>
+      <w:r>
+        <w:t xml:space="preserve">one exists, that learner is </w:t>
       </w:r>
       <w:r>
         <w:rPr>
@@ -4066,17 +4444,14 @@
         <w:t>skipped</w:t>
       </w:r>
       <w:r>
-        <w:t xml:space="preserve">. This holds even if the rows in the CSV are in a different order the </w:t>
-      </w:r>
-      <w:r>
-        <w:t>second time. A different cohort or region does get a new key.</w:t>
+        <w:t>. This holds even if the rows in the CSV are in a different order the second time. A different cohort or region does get a new key.</w:t>
       </w:r>
     </w:p>
     <w:p>
       <w:pPr>
         <w:pStyle w:val="Heading2"/>
       </w:pPr>
-      <w:bookmarkStart w:id="8" w:name="_Toc242277804"/>
+      <w:bookmarkStart w:id="8" w:name="_Toc242288553"/>
       <w:r>
         <w:t>Credit limits</w:t>
       </w:r>
@@ -4093,7 +4468,10 @@
         <w:t>$5</w:t>
       </w:r>
       <w:r>
-        <w:t xml:space="preserve">. For a run you can pick $1, $2, $5, $10, </w:t>
+        <w:t xml:space="preserve">. For a run you can </w:t>
+      </w:r>
+      <w:r>
+        <w:t xml:space="preserve">pick $1, $2, $5, $10, </w:t>
       </w:r>
       <w:r>
         <w:rPr>
@@ -4120,10 +4498,7 @@
         <w:t>$100</w:t>
       </w:r>
       <w:r>
-        <w:t xml:space="preserve"> are refused, to catch typos like</w:t>
-      </w:r>
-      <w:r>
-        <w:t xml:space="preserve"> 500 instead of 5. Limits don't reset by themselves (this can be changed in </w:t>
+        <w:t xml:space="preserve"> are refused, to catch typos like 500 instead of 5. Limits don't reset by themselves (this can be changed in </w:t>
       </w:r>
       <w:r>
         <w:rPr>
@@ -4133,7 +4508,7 @@
         <w:t>config.js</w:t>
       </w:r>
       <w:r>
-        <w:t>, see section 12).</w:t>
+        <w:t>, see section 13).</w:t>
       </w:r>
     </w:p>
     <w:tbl>
@@ -4162,7 +4537,10 @@
               <w:t>No limit</w:t>
             </w:r>
             <w:r>
-              <w:t xml:space="preserve"> means one learner could spend the whole OpenRouter balance. Use it only when you are sure.</w:t>
+              <w:t xml:space="preserve"> means one learner could spend the whol</w:t>
+            </w:r>
+            <w:r>
+              <w:t>e OpenRouter balance. Use it only when you are sure.</w:t>
             </w:r>
           </w:p>
         </w:tc>
@@ -4173,7 +4551,7 @@
       <w:pPr>
         <w:pStyle w:val="Heading1"/>
       </w:pPr>
-      <w:bookmarkStart w:id="9" w:name="_Toc242277805"/>
+      <w:bookmarkStart w:id="9" w:name="_Toc242288554"/>
       <w:r>
         <w:lastRenderedPageBreak/>
         <w:t>4. Preparing the learner list (CSV)</w:t>
@@ -4227,7 +4605,7 @@
       <w:pPr>
         <w:pStyle w:val="Heading2"/>
       </w:pPr>
-      <w:bookmarkStart w:id="10" w:name="_Toc242277806"/>
+      <w:bookmarkStart w:id="10" w:name="_Toc242288555"/>
       <w:r>
         <w:t>Using the template</w:t>
       </w:r>
@@ -4255,10 +4633,7 @@
         <w:pStyle w:val="ListNumber"/>
       </w:pPr>
       <w:r>
-        <w:t xml:space="preserve">Open it in Excel, replace </w:t>
-      </w:r>
-      <w:r>
-        <w:t>the two sample emails with your learners' emails, one per row.</w:t>
+        <w:t>Open it in Excel, replace the two sample emails with your learners' emails, one per row.</w:t>
       </w:r>
     </w:p>
     <w:p>
@@ -4282,7 +4657,7 @@
       <w:pPr>
         <w:pStyle w:val="Heading2"/>
       </w:pPr>
-      <w:bookmarkStart w:id="11" w:name="_Toc242277807"/>
+      <w:bookmarkStart w:id="11" w:name="_Toc242288556"/>
       <w:r>
         <w:t>Rules</w:t>
       </w:r>
@@ -4293,7 +4668,10 @@
         <w:pStyle w:val="ListBullet"/>
       </w:pPr>
       <w:r>
-        <w:t xml:space="preserve">The column can also be called </w:t>
+        <w:t>The column can al</w:t>
+      </w:r>
+      <w:r>
+        <w:t xml:space="preserve">so be called </w:t>
       </w:r>
       <w:r>
         <w:rPr>
@@ -4327,13 +4705,7 @@
         <w:rPr>
           <w:b/>
         </w:rPr>
-        <w:t xml:space="preserve">one CSV per </w:t>
-      </w:r>
-      <w:r>
-        <w:rPr>
-          <w:b/>
-        </w:rPr>
-        <w:t>program</w:t>
+        <w:t>one CSV per program</w:t>
       </w:r>
       <w:r>
         <w:t xml:space="preserve"> per run.</w:t>
@@ -4368,7 +4740,7 @@
       <w:pPr>
         <w:pStyle w:val="Heading1"/>
       </w:pPr>
-      <w:bookmarkStart w:id="12" w:name="_Toc242277808"/>
+      <w:bookmarkStart w:id="12" w:name="_Toc242288557"/>
       <w:r>
         <w:t>5. Creating keys on the online site</w:t>
       </w:r>
@@ -4378,7 +4750,7 @@
       <w:pPr>
         <w:pStyle w:val="Heading2"/>
       </w:pPr>
-      <w:bookmarkStart w:id="13" w:name="_Toc242277809"/>
+      <w:bookmarkStart w:id="13" w:name="_Toc242288558"/>
       <w:r>
         <w:t>Step by step</w:t>
       </w:r>
@@ -4395,13 +4767,7 @@
         <w:rPr>
           <w:b/>
         </w:rPr>
-        <w:t>https://openrouter-key</w:t>
-      </w:r>
-      <w:r>
-        <w:rPr>
-          <w:b/>
-        </w:rPr>
-        <w:t>-generator.vercel.app</w:t>
+        <w:t>https://openrouter-key-generator.vercel.app</w:t>
       </w:r>
       <w:r>
         <w:t xml:space="preserve"> and click </w:t>
@@ -4413,7 +4779,10 @@
         <w:t>Sign in with Google</w:t>
       </w:r>
       <w:r>
-        <w:t>. Choose your @interviewkickstart.com account.</w:t>
+        <w:t>. Choose your @interviewkickstart.com account</w:t>
+      </w:r>
+      <w:r>
+        <w:t>.</w:t>
       </w:r>
     </w:p>
     <w:p>
@@ -4465,10 +4834,7 @@
         <w:t>mid-oct</w:t>
       </w:r>
       <w:r>
-        <w:t xml:space="preserve">. </w:t>
-      </w:r>
-      <w:r>
-        <w:t>The page shows what the key names will look like.</w:t>
+        <w:t>. The page shows what the key names will look like.</w:t>
       </w:r>
     </w:p>
     <w:p>
@@ -4482,7 +4848,10 @@
         <w:t>4 Credit limit per key</w:t>
       </w:r>
       <w:r>
-        <w:t>: the program's default ($5) is selected. Change it if needed.</w:t>
+        <w:t xml:space="preserve">: the program's default </w:t>
+      </w:r>
+      <w:r>
+        <w:t>($5) is selected. Change it if needed.</w:t>
       </w:r>
     </w:p>
     <w:p>
@@ -4513,10 +4882,7 @@
         <w:t>Preview</w:t>
       </w:r>
       <w:r>
-        <w:t>. Nothing is created yet. Every r</w:t>
-      </w:r>
-      <w:r>
-        <w:t xml:space="preserve">ow shows its key name and a status: </w:t>
+        <w:t xml:space="preserve">. Nothing is created yet. Every row shows its key name and a status: </w:t>
       </w:r>
       <w:r>
         <w:rPr>
@@ -4540,7 +4906,13 @@
         <w:rPr>
           <w:b/>
         </w:rPr>
-        <w:t>Problem</w:t>
+        <w:t>P</w:t>
+      </w:r>
+      <w:r>
+        <w:rPr>
+          <w:b/>
+        </w:rPr>
+        <w:t>roblem</w:t>
       </w:r>
       <w:r>
         <w:t xml:space="preserve"> (bad or repeated email).</w:t>
@@ -4568,10 +4940,7 @@
         <w:t>Generate N keys</w:t>
       </w:r>
       <w:r>
-        <w:t xml:space="preserve"> and confirm the sum</w:t>
-      </w:r>
-      <w:r>
-        <w:t>mary that pops up.</w:t>
+        <w:t xml:space="preserve"> and confirm the summary that pops up.</w:t>
       </w:r>
     </w:p>
     <w:p>
@@ -4615,7 +4984,10 @@
         <w:t>Keep the tab open</w:t>
       </w:r>
       <w:r>
-        <w:t xml:space="preserve"> until the green *Done* message appears.</w:t>
+        <w:t xml:space="preserve"> until </w:t>
+      </w:r>
+      <w:r>
+        <w:t>the green *Done* message appears.</w:t>
       </w:r>
     </w:p>
     <w:p>
@@ -4636,13 +5008,10 @@
       <w:pPr>
         <w:pStyle w:val="Heading2"/>
       </w:pPr>
-      <w:bookmarkStart w:id="14" w:name="_Toc242277810"/>
+      <w:bookmarkStart w:id="14" w:name="_Toc242288559"/>
       <w:r>
         <w:lastRenderedPageBreak/>
-        <w:t>Big li</w:t>
-      </w:r>
-      <w:r>
-        <w:t>sts</w:t>
+        <w:t>Big lists</w:t>
       </w:r>
       <w:bookmarkEnd w:id="14"/>
     </w:p>
@@ -4654,20 +5023,23 @@
         <w:rPr>
           <w:b/>
         </w:rPr>
-        <w:t>parts of about 4 minutes</w:t>
-      </w:r>
-      <w:r>
-        <w:t xml:space="preserve">. The page starts the next part by itself and shows *part 2*, *part 3* and so on. Just keep the tab open. Serial numbers and key names don't </w:t>
-      </w:r>
-      <w:r>
-        <w:t>change between parts.</w:t>
+        <w:t xml:space="preserve">parts of </w:t>
+      </w:r>
+      <w:r>
+        <w:rPr>
+          <w:b/>
+        </w:rPr>
+        <w:t>about 4 minutes</w:t>
+      </w:r>
+      <w:r>
+        <w:t>. The page starts the next part by itself and shows *part 2*, *part 3* and so on. Just keep the tab open. Serial numbers and key names don't change between parts.</w:t>
       </w:r>
     </w:p>
     <w:p>
       <w:pPr>
         <w:pStyle w:val="Heading2"/>
       </w:pPr>
-      <w:bookmarkStart w:id="15" w:name="_Toc242277811"/>
+      <w:bookmarkStart w:id="15" w:name="_Toc242288560"/>
       <w:r>
         <w:t>If something fails</w:t>
       </w:r>
@@ -4687,7 +5059,10 @@
         <w:t>Failed</w:t>
       </w:r>
       <w:r>
-        <w:t xml:space="preserve"> shows the reason next to it. The other rows carry on.</w:t>
+        <w:t xml:space="preserve"> shows the reason next to it. The other </w:t>
+      </w:r>
+      <w:r>
+        <w:t>rows carry on.</w:t>
       </w:r>
     </w:p>
     <w:p>
@@ -4703,10 +5078,7 @@
         <w:pStyle w:val="ListBullet"/>
       </w:pPr>
       <w:r>
-        <w:t>The site's error details are in the Vercel proj</w:t>
-      </w:r>
-      <w:r>
-        <w:t xml:space="preserve">ect under </w:t>
+        <w:t xml:space="preserve">The site's error details are in the Vercel project under </w:t>
       </w:r>
       <w:r>
         <w:rPr>
@@ -4747,7 +5119,10 @@
               <w:t>Key created but NOT saved</w:t>
             </w:r>
             <w:r>
-              <w:t>, the run stops. The message names a key: delete that key at https://openrouter.ai/settings/keys, then run again. (A key can only be seen once, so a key that wasn't saved is useless.)</w:t>
+              <w:t>, the run stops. The message names a key: d</w:t>
+            </w:r>
+            <w:r>
+              <w:t>elete that key at https://openrouter.ai/settings/keys, then run again. (A key can only be seen once, so a key that wasn't saved is useless.)</w:t>
             </w:r>
           </w:p>
         </w:tc>
@@ -4758,12 +5133,9 @@
       <w:pPr>
         <w:pStyle w:val="Heading1"/>
       </w:pPr>
-      <w:bookmarkStart w:id="16" w:name="_Toc242277812"/>
-      <w:r>
-        <w:t>6. Finding an</w:t>
-      </w:r>
-      <w:r>
-        <w:t>d sharing the generated keys</w:t>
+      <w:bookmarkStart w:id="16" w:name="_Toc242288561"/>
+      <w:r>
+        <w:t>6. Finding and sharing the generated keys</w:t>
       </w:r>
       <w:bookmarkEnd w:id="16"/>
     </w:p>
@@ -4852,7 +5224,13 @@
         <w:rPr>
           <w:b/>
         </w:rPr>
-        <w:t>Refresh</w:t>
+        <w:t>Refr</w:t>
+      </w:r>
+      <w:r>
+        <w:rPr>
+          <w:b/>
+        </w:rPr>
+        <w:t>esh</w:t>
       </w:r>
       <w:r>
         <w:t xml:space="preserve"> reloads the list.</w:t>
@@ -4878,14 +5256,7 @@
           <w:rFonts w:ascii="Consolas" w:hAnsi="Consolas"/>
           <w:sz w:val="19"/>
         </w:rPr>
-        <w:t>SERIAL,REGION,EMAIL_ID,PROGRAM,COHORT,KEY_NAM</w:t>
-      </w:r>
-      <w:r>
-        <w:rPr>
-          <w:rFonts w:ascii="Consolas" w:hAnsi="Consolas"/>
-          <w:sz w:val="19"/>
-        </w:rPr>
-        <w:t>E,API_KEY,KEY_HASH</w:t>
+        <w:t>SERIAL,REGION,EMAIL_ID,PROGRAM,COHORT,KEY_NAME,API_KEY,KEY_HASH</w:t>
       </w:r>
     </w:p>
     <w:tbl>
@@ -4917,7 +5288,10 @@
               <w:t>live keys</w:t>
             </w:r>
             <w:r>
-              <w:t>. Send each learner only their own key, privately. Don't email the whole file, post it in chat or upload it anywhere. Delete downloaded files when you no longer need them.</w:t>
+              <w:t>. Send each learner o</w:t>
+            </w:r>
+            <w:r>
+              <w:t>nly their own key, privately. Don't email the whole file, post it in chat or upload it anywhere. Delete downloaded files when you no longer need them.</w:t>
             </w:r>
           </w:p>
         </w:tc>
@@ -4928,349 +5302,44 @@
       <w:pPr>
         <w:pStyle w:val="Heading1"/>
       </w:pPr>
-      <w:bookmarkStart w:id="17" w:name="_Toc242277813"/>
-      <w:r>
-        <w:t>7. Monthly checklist</w:t>
+      <w:bookmarkStart w:id="17" w:name="_Toc242288562"/>
+      <w:r>
+        <w:t>7. Usage reports for leadership</w:t>
       </w:r>
       <w:bookmarkEnd w:id="17"/>
     </w:p>
     <w:p>
-      <w:pPr>
-        <w:pStyle w:val="Heading2"/>
-      </w:pPr>
-      <w:bookmarkStart w:id="18" w:name="_Toc242277814"/>
-      <w:r>
-        <w:t>When a cohort starts</w:t>
-      </w:r>
-      <w:bookmarkEnd w:id="18"/>
-    </w:p>
-    <w:p>
-      <w:pPr>
-        <w:pStyle w:val="ListNumber"/>
-      </w:pPr>
-      <w:r>
-        <w:t>Prepare one CSV per program (start from dummy.csv).</w:t>
-      </w:r>
-    </w:p>
-    <w:p>
-      <w:pPr>
-        <w:pStyle w:val="ListNumber"/>
-      </w:pPr>
-      <w:r>
-        <w:t>Open https://openrouter-key-generator.vercel.app and sign in.</w:t>
-      </w:r>
-    </w:p>
-    <w:p>
-      <w:pPr>
-        <w:pStyle w:val="ListNumber"/>
-      </w:pPr>
-      <w:r>
-        <w:t xml:space="preserve">For each program: choose program, region, cohort name (e.g. </w:t>
-      </w:r>
-      <w:r>
-        <w:rPr>
-          <w:rFonts w:ascii="Consolas" w:hAnsi="Consolas"/>
-          <w:sz w:val="20"/>
-        </w:rPr>
-        <w:t>early-nov</w:t>
-      </w:r>
-      <w:r>
-        <w:t xml:space="preserve">) and limit, upload that program's CSV, </w:t>
+      <w:r>
+        <w:t xml:space="preserve">The </w:t>
       </w:r>
       <w:r>
         <w:rPr>
           <w:b/>
         </w:rPr>
-        <w:t>Preview</w:t>
-      </w:r>
-      <w:r>
-        <w:t xml:space="preserve">, then </w:t>
+        <w:t>Usage</w:t>
+      </w:r>
+      <w:r>
+        <w:t xml:space="preserve"> tab at the top of the page shows how learners are using their keys, straight from OpenRouter. It only reads: opening it never creates, changes or disables a key. Click </w:t>
       </w:r>
       <w:r>
         <w:rPr>
           <w:b/>
         </w:rPr>
-        <w:t>Generate</w:t>
-      </w:r>
-      <w:r>
-        <w:t>.</w:t>
+        <w:t>Refresh</w:t>
+      </w:r>
+      <w:r>
+        <w:t xml:space="preserve"> for the latest figures.</w:t>
       </w:r>
     </w:p>
     <w:p>
       <w:pPr>
-        <w:pStyle w:val="ListNumber"/>
-      </w:pPr>
-      <w:r>
-        <w:t>Check the</w:t>
-      </w:r>
-      <w:r>
-        <w:t xml:space="preserve"> summary. Fix any </w:t>
-      </w:r>
-      <w:r>
-        <w:rPr>
-          <w:b/>
-        </w:rPr>
-        <w:t>Problem</w:t>
-      </w:r>
-      <w:r>
-        <w:t xml:space="preserve"> or </w:t>
-      </w:r>
-      <w:r>
-        <w:rPr>
-          <w:b/>
-        </w:rPr>
-        <w:t>Failed</w:t>
-      </w:r>
-      <w:r>
-        <w:t xml:space="preserve"> rows and run again (created keys are skipped).</w:t>
-      </w:r>
-    </w:p>
-    <w:p>
-      <w:pPr>
-        <w:pStyle w:val="ListNumber"/>
-      </w:pPr>
-      <w:r>
-        <w:t xml:space="preserve">Filter </w:t>
-      </w:r>
-      <w:r>
-        <w:rPr>
-          <w:b/>
-        </w:rPr>
-        <w:t>Generated keys</w:t>
-      </w:r>
-      <w:r>
-        <w:t xml:space="preserve"> by cohort and share each learner's key privately.</w:t>
-      </w:r>
-    </w:p>
-    <w:p>
-      <w:pPr>
         <w:pStyle w:val="Heading2"/>
       </w:pPr>
-      <w:bookmarkStart w:id="19" w:name="_Toc242277815"/>
-      <w:r>
-        <w:lastRenderedPageBreak/>
-        <w:t>When a cohort ends</w:t>
-      </w:r>
-      <w:bookmarkEnd w:id="19"/>
-    </w:p>
-    <w:p>
-      <w:r>
-        <w:t xml:space="preserve">Go to https://openrouter.ai/settings/keys, search for the cohort name (e.g. </w:t>
-      </w:r>
-      <w:r>
-        <w:rPr>
-          <w:rFonts w:ascii="Consolas" w:hAnsi="Consolas"/>
-          <w:sz w:val="20"/>
-        </w:rPr>
-        <w:t>mid-oc</w:t>
-      </w:r>
-      <w:r>
-        <w:rPr>
-          <w:rFonts w:ascii="Consolas" w:hAnsi="Consolas"/>
-          <w:sz w:val="20"/>
-        </w:rPr>
-        <w:t>t</w:t>
-      </w:r>
-      <w:r>
-        <w:t>) and disable or delete its keys. An automatic "revoke cohort" feature is planned but not built yet.</w:t>
-      </w:r>
-    </w:p>
-    <w:p>
-      <w:pPr>
-        <w:pStyle w:val="Heading1"/>
-      </w:pPr>
-      <w:bookmarkStart w:id="20" w:name="_Toc242277816"/>
-      <w:r>
-        <w:t>8. First-time test</w:t>
-      </w:r>
-      <w:bookmarkEnd w:id="20"/>
-    </w:p>
-    <w:p>
-      <w:r>
-        <w:t>Do this once, and again after any big change:</w:t>
-      </w:r>
-    </w:p>
-    <w:p>
-      <w:pPr>
-        <w:pStyle w:val="ListNumber"/>
-      </w:pPr>
-      <w:r>
-        <w:t>Make a CSV with one email (yours is fine), e.g. from dummy.csv.</w:t>
-      </w:r>
-    </w:p>
-    <w:p>
-      <w:pPr>
-        <w:pStyle w:val="ListNumber"/>
-      </w:pPr>
-      <w:r>
-        <w:t>On the site choose SWE, U</w:t>
-      </w:r>
-      <w:r>
-        <w:t xml:space="preserve">S, cohort </w:t>
-      </w:r>
-      <w:r>
-        <w:rPr>
-          <w:rFonts w:ascii="Consolas" w:hAnsi="Consolas"/>
-          <w:sz w:val="20"/>
-        </w:rPr>
-        <w:t>test-run</w:t>
-      </w:r>
-      <w:r>
-        <w:t xml:space="preserve">, limit </w:t>
-      </w:r>
-      <w:r>
-        <w:rPr>
-          <w:b/>
-        </w:rPr>
-        <w:t>$1</w:t>
-      </w:r>
-      <w:r>
-        <w:t xml:space="preserve">. Upload the CSV and click </w:t>
-      </w:r>
-      <w:r>
-        <w:rPr>
-          <w:b/>
-        </w:rPr>
-        <w:t>Preview</w:t>
-      </w:r>
-      <w:r>
-        <w:t>. Check the key name.</w:t>
-      </w:r>
-    </w:p>
-    <w:p>
-      <w:pPr>
-        <w:pStyle w:val="ListNumber"/>
-      </w:pPr>
-      <w:r>
-        <w:t xml:space="preserve">Click </w:t>
-      </w:r>
-      <w:r>
-        <w:rPr>
-          <w:b/>
-        </w:rPr>
-        <w:t>Generate 1 key</w:t>
-      </w:r>
-      <w:r>
-        <w:t>.</w:t>
-      </w:r>
-    </w:p>
-    <w:p>
-      <w:pPr>
-        <w:pStyle w:val="ListNumber"/>
-      </w:pPr>
-      <w:r>
-        <w:t xml:space="preserve">Copy the key from </w:t>
-      </w:r>
-      <w:r>
-        <w:rPr>
-          <w:b/>
-        </w:rPr>
-        <w:t>Generated keys</w:t>
-      </w:r>
-      <w:r>
-        <w:t xml:space="preserve"> and check it works (Windows PowerShell shown; in CMD use </w:t>
-      </w:r>
-      <w:r>
-        <w:rPr>
-          <w:rFonts w:ascii="Consolas" w:hAnsi="Consolas"/>
-          <w:sz w:val="20"/>
-        </w:rPr>
-        <w:t>curl</w:t>
-      </w:r>
-      <w:r>
-        <w:t xml:space="preserve"> instead of </w:t>
-      </w:r>
-      <w:r>
-        <w:rPr>
-          <w:rFonts w:ascii="Consolas" w:hAnsi="Consolas"/>
-          <w:sz w:val="20"/>
-        </w:rPr>
-        <w:t>curl.exe</w:t>
-      </w:r>
-      <w:r>
-        <w:t>):</w:t>
-      </w:r>
-    </w:p>
-    <w:p>
-      <w:pPr>
-        <w:shd w:val="clear" w:color="auto" w:fill="EEF1F5"/>
-        <w:ind w:left="227"/>
-      </w:pPr>
-      <w:r>
-        <w:rPr>
-          <w:rFonts w:ascii="Consolas" w:hAnsi="Consolas"/>
-          <w:sz w:val="19"/>
-        </w:rPr>
-        <w:t>curl.exe https://openrouter.ai/ap</w:t>
-      </w:r>
-      <w:r>
-        <w:rPr>
-          <w:rFonts w:ascii="Consolas" w:hAnsi="Consolas"/>
-          <w:sz w:val="19"/>
-        </w:rPr>
-        <w:t>i/v1/key -H "Authorization: Bearer PASTE_KEY_HERE"</w:t>
-      </w:r>
-    </w:p>
-    <w:p>
-      <w:r>
-        <w:t xml:space="preserve">It should show the key's name and a limit of 1. The key should also appear in the </w:t>
-      </w:r>
-      <w:r>
-        <w:rPr>
-          <w:b/>
-        </w:rPr>
-        <w:t>Agentic AI-SWE</w:t>
-      </w:r>
-      <w:r>
-        <w:t xml:space="preserve"> workspace at https://openrouter.ai/settings/keys.</w:t>
-      </w:r>
-    </w:p>
-    <w:p>
-      <w:pPr>
-        <w:pStyle w:val="ListBullet"/>
-      </w:pPr>
-      <w:r>
-        <w:t xml:space="preserve">Click </w:t>
-      </w:r>
-      <w:r>
-        <w:rPr>
-          <w:b/>
-        </w:rPr>
-        <w:t>Preview</w:t>
-      </w:r>
-      <w:r>
-        <w:t xml:space="preserve"> again: the row should say </w:t>
-      </w:r>
-      <w:r>
-        <w:rPr>
-          <w:b/>
-        </w:rPr>
-        <w:t>Already exists</w:t>
-      </w:r>
-      <w:r>
-        <w:t xml:space="preserve">, </w:t>
-      </w:r>
-      <w:r>
-        <w:t>and there should be nothing to generate.</w:t>
-      </w:r>
-    </w:p>
-    <w:p>
-      <w:pPr>
-        <w:pStyle w:val="ListBullet"/>
-      </w:pPr>
-      <w:r>
-        <w:t>Delete the test key at https://openrouter.ai/settings/keys.</w:t>
-      </w:r>
-    </w:p>
-    <w:p>
-      <w:pPr>
-        <w:pStyle w:val="Heading1"/>
-      </w:pPr>
-      <w:bookmarkStart w:id="21" w:name="_Toc242277817"/>
-      <w:r>
-        <w:t>9. How the online site is set up</w:t>
-      </w:r>
-      <w:bookmarkEnd w:id="21"/>
+      <w:bookmarkStart w:id="18" w:name="_Toc242288563"/>
+      <w:r>
+        <w:t>What it shows</w:t>
+      </w:r>
+      <w:bookmarkEnd w:id="18"/>
     </w:p>
     <w:tbl>
       <w:tblPr>
@@ -5317,7 +5386,7 @@
                 <w:color w:val="FFFFFF"/>
                 <w:sz w:val="20"/>
               </w:rPr>
-              <w:t>What / where</w:t>
+              <w:t>What it shows</w:t>
             </w:r>
           </w:p>
         </w:tc>
@@ -5335,7 +5404,7 @@
               <w:rPr>
                 <w:sz w:val="20"/>
               </w:rPr>
-              <w:t>Site address</w:t>
+              <w:t>Summary figures</w:t>
             </w:r>
           </w:p>
         </w:tc>
@@ -5351,7 +5420,19 @@
               <w:rPr>
                 <w:sz w:val="20"/>
               </w:rPr>
-              <w:t>https://openrouter-key-generator.vercel.app</w:t>
+              <w:t>Total</w:t>
+            </w:r>
+            <w:r>
+              <w:rPr>
+                <w:sz w:val="20"/>
+              </w:rPr>
+              <w:t xml:space="preserve"> spend (all time); spend this month; budget used (spend as a % of the total of the keys' credit limits); learners with keys and number of cohorts; active learners (% who used their key at least once); average spend per active learner; keys at or near their</w:t>
+            </w:r>
+            <w:r>
+              <w:rPr>
+                <w:sz w:val="20"/>
+              </w:rPr>
+              <w:t xml:space="preserve"> limit (90%+); keys not used 7 days after they were created.</w:t>
             </w:r>
           </w:p>
         </w:tc>
@@ -5369,7 +5450,7 @@
               <w:rPr>
                 <w:sz w:val="20"/>
               </w:rPr>
-              <w:t>Hosting</w:t>
+              <w:t>Spend by program</w:t>
             </w:r>
           </w:p>
         </w:tc>
@@ -5385,33 +5466,14 @@
               <w:rPr>
                 <w:sz w:val="20"/>
               </w:rPr>
-              <w:t xml:space="preserve">Vercel, team </w:t>
-            </w:r>
-            <w:r>
-              <w:rPr>
-                <w:rFonts w:ascii="Consolas" w:hAnsi="Consolas"/>
-                <w:sz w:val="20"/>
-              </w:rPr>
-              <w:t>new-programs-ik</w:t>
-            </w:r>
-            <w:r>
-              <w:rPr>
-                <w:sz w:val="20"/>
-              </w:rPr>
-              <w:t xml:space="preserve">, project </w:t>
-            </w:r>
-            <w:r>
-              <w:rPr>
-                <w:rFonts w:ascii="Consolas" w:hAnsi="Consolas"/>
-                <w:sz w:val="20"/>
-              </w:rPr>
-              <w:t>openrouter-key-generator</w:t>
-            </w:r>
-            <w:r>
-              <w:rPr>
-                <w:sz w:val="20"/>
-              </w:rPr>
-              <w:t xml:space="preserve"> (https://vercel.com/new-programs-ik/openrouter-key-generator). Free Hobby plan.</w:t>
+              <w:t xml:space="preserve">One bar per program. Hover over (or tab to) a bar for spend, this month, learners, % </w:t>
+            </w:r>
+            <w:r>
+              <w:rPr>
+                <w:sz w:val="20"/>
+              </w:rPr>
+              <w:lastRenderedPageBreak/>
+              <w:t>active and budget used.</w:t>
             </w:r>
           </w:p>
         </w:tc>
@@ -5429,7 +5491,8 @@
               <w:rPr>
                 <w:sz w:val="20"/>
               </w:rPr>
-              <w:t>Key storage</w:t>
+              <w:lastRenderedPageBreak/>
+              <w:t>Spend by cohort</w:t>
             </w:r>
           </w:p>
         </w:tc>
@@ -5445,33 +5508,13 @@
               <w:rPr>
                 <w:sz w:val="20"/>
               </w:rPr>
-              <w:t xml:space="preserve">Private Vercel Blob store </w:t>
-            </w:r>
-            <w:r>
-              <w:rPr>
-                <w:rFonts w:ascii="Consolas" w:hAnsi="Consolas"/>
-                <w:sz w:val="20"/>
-              </w:rPr>
-              <w:t>openrouter-keys</w:t>
-            </w:r>
-            <w:r>
-              <w:rPr>
-                <w:sz w:val="20"/>
-              </w:rPr>
-              <w:t xml:space="preserve"> (Vercel project → Storage). One file per run under </w:t>
-            </w:r>
-            <w:r>
-              <w:rPr>
-                <w:rFonts w:ascii="Consolas" w:hAnsi="Consolas"/>
-                <w:sz w:val="20"/>
-              </w:rPr>
-              <w:t>keys/</w:t>
-            </w:r>
-            <w:r>
-              <w:rPr>
-                <w:sz w:val="20"/>
-              </w:rPr>
-              <w:t>.</w:t>
+              <w:t>One bar per cohort (program · region · cohort), the</w:t>
+            </w:r>
+            <w:r>
+              <w:rPr>
+                <w:sz w:val="20"/>
+              </w:rPr>
+              <w:t xml:space="preserve"> top 15 by spend.</w:t>
             </w:r>
           </w:p>
         </w:tc>
@@ -5489,7 +5532,7 @@
               <w:rPr>
                 <w:sz w:val="20"/>
               </w:rPr>
-              <w:t>Sign-in</w:t>
+              <w:t>Cohorts table</w:t>
             </w:r>
           </w:p>
         </w:tc>
@@ -5505,52 +5548,7 @@
               <w:rPr>
                 <w:sz w:val="20"/>
               </w:rPr>
-              <w:t>Google Cloud projec</w:t>
-            </w:r>
-            <w:r>
-              <w:rPr>
-                <w:sz w:val="20"/>
-              </w:rPr>
-              <w:t xml:space="preserve">t with an </w:t>
-            </w:r>
-            <w:r>
-              <w:rPr>
-                <w:b/>
-                <w:sz w:val="20"/>
-              </w:rPr>
-              <w:t>Internal</w:t>
-            </w:r>
-            <w:r>
-              <w:rPr>
-                <w:sz w:val="20"/>
-              </w:rPr>
-              <w:t xml:space="preserve"> OAuth consent screen and a Web application OAuth client (ID starts </w:t>
-            </w:r>
-            <w:r>
-              <w:rPr>
-                <w:rFonts w:ascii="Consolas" w:hAnsi="Consolas"/>
-                <w:sz w:val="20"/>
-              </w:rPr>
-              <w:t>997169956711-k2namb…</w:t>
-            </w:r>
-            <w:r>
-              <w:rPr>
-                <w:sz w:val="20"/>
-              </w:rPr>
-              <w:t xml:space="preserve">). Redirect URI: </w:t>
-            </w:r>
-            <w:r>
-              <w:rPr>
-                <w:rFonts w:ascii="Consolas" w:hAnsi="Consolas"/>
-                <w:sz w:val="20"/>
-              </w:rPr>
-              <w:t>https://openrouter-key-generator.vercel.app/auth/callback</w:t>
-            </w:r>
-            <w:r>
-              <w:rPr>
-                <w:sz w:val="20"/>
-              </w:rPr>
-              <w:t>.</w:t>
+              <w:t>Per cohort: date the keys were created, learners, active, % active, spend, this month, average per active learner, budget, % budget used.</w:t>
             </w:r>
           </w:p>
         </w:tc>
@@ -5568,7 +5566,7 @@
               <w:rPr>
                 <w:sz w:val="20"/>
               </w:rPr>
-              <w:t>OpenRouter</w:t>
+              <w:t>Needs attention</w:t>
             </w:r>
           </w:p>
         </w:tc>
@@ -5584,26 +5582,13 @@
               <w:rPr>
                 <w:sz w:val="20"/>
               </w:rPr>
-              <w:t xml:space="preserve">One </w:t>
-            </w:r>
-            <w:r>
-              <w:rPr>
-                <w:b/>
-                <w:sz w:val="20"/>
-              </w:rPr>
-              <w:t>Management key</w:t>
-            </w:r>
-            <w:r>
-              <w:rPr>
-                <w:sz w:val="20"/>
-              </w:rPr>
-              <w:t xml:space="preserve"> that can create keys in all program workspa</w:t>
-            </w:r>
-            <w:r>
-              <w:rPr>
-                <w:sz w:val="20"/>
-              </w:rPr>
-              <w:t>ces.</w:t>
+              <w:t>Keys at or near their credit limit, and keys not used 7 days after c</w:t>
+            </w:r>
+            <w:r>
+              <w:rPr>
+                <w:sz w:val="20"/>
+              </w:rPr>
+              <w:t>reation. Use it to follow up with learners or raise a limit.</w:t>
             </w:r>
           </w:p>
         </w:tc>
@@ -5621,7 +5606,7 @@
               <w:rPr>
                 <w:sz w:val="20"/>
               </w:rPr>
-              <w:t>Code</w:t>
+              <w:t>Learners table</w:t>
             </w:r>
           </w:p>
         </w:tc>
@@ -5637,20 +5622,7 @@
               <w:rPr>
                 <w:sz w:val="20"/>
               </w:rPr>
-              <w:t xml:space="preserve">https://github.com/new-programs-ik/openrouter-api-key-creation (branch </w:t>
-            </w:r>
-            <w:r>
-              <w:rPr>
-                <w:rFonts w:ascii="Consolas" w:hAnsi="Consolas"/>
-                <w:sz w:val="20"/>
-              </w:rPr>
-              <w:t>main</w:t>
-            </w:r>
-            <w:r>
-              <w:rPr>
-                <w:sz w:val="20"/>
-              </w:rPr>
-              <w:t>).</w:t>
+              <w:t>Every key: learner, program, region, cohort, spend, this month, limit, remaining, % of limit used, status (Active, Near limit, At limit, Not used, New, Disabled), created date.</w:t>
             </w:r>
           </w:p>
         </w:tc>
@@ -5661,11 +5633,959 @@
       <w:pPr>
         <w:pStyle w:val="Heading2"/>
       </w:pPr>
-      <w:bookmarkStart w:id="22" w:name="_Toc242277818"/>
+      <w:bookmarkStart w:id="19" w:name="_Toc242288564"/>
+      <w:r>
+        <w:t>Filtering and sorting</w:t>
+      </w:r>
+      <w:bookmarkEnd w:id="19"/>
+    </w:p>
+    <w:p>
+      <w:pPr>
+        <w:pStyle w:val="ListBullet"/>
+      </w:pPr>
+      <w:r>
+        <w:t xml:space="preserve">Filter by </w:t>
+      </w:r>
+      <w:r>
+        <w:rPr>
+          <w:b/>
+        </w:rPr>
+        <w:t>program</w:t>
+      </w:r>
+      <w:r>
+        <w:t xml:space="preserve">, </w:t>
+      </w:r>
+      <w:r>
+        <w:rPr>
+          <w:b/>
+        </w:rPr>
+        <w:t>region</w:t>
+      </w:r>
+      <w:r>
+        <w:t xml:space="preserve"> and </w:t>
+      </w:r>
+      <w:r>
+        <w:rPr>
+          <w:b/>
+        </w:rPr>
+        <w:t>cohort</w:t>
+      </w:r>
+      <w:r>
+        <w:t>, or search for a learner's email. Every figure, chart and table follows the filters.</w:t>
+      </w:r>
+    </w:p>
+    <w:p>
+      <w:pPr>
+        <w:pStyle w:val="ListBullet"/>
+      </w:pPr>
+      <w:r>
+        <w:t xml:space="preserve">Disabled keys are left out unless you tick </w:t>
+      </w:r>
+      <w:r>
+        <w:rPr>
+          <w:b/>
+        </w:rPr>
+        <w:t>Include disabled keys</w:t>
+      </w:r>
+      <w:r>
+        <w:t>.</w:t>
+      </w:r>
+    </w:p>
+    <w:p>
+      <w:pPr>
+        <w:pStyle w:val="ListBullet"/>
+      </w:pPr>
+      <w:r>
+        <w:t>Click a column heading to sort by it; click ag</w:t>
+      </w:r>
+      <w:r>
+        <w:t>ain to reverse.</w:t>
+      </w:r>
+    </w:p>
+    <w:p>
+      <w:pPr>
+        <w:pStyle w:val="Heading2"/>
+      </w:pPr>
+      <w:bookmarkStart w:id="20" w:name="_Toc242288565"/>
+      <w:r>
+        <w:t>Getting the report out</w:t>
+      </w:r>
+      <w:bookmarkEnd w:id="20"/>
+    </w:p>
+    <w:p>
+      <w:pPr>
+        <w:pStyle w:val="ListBullet"/>
+      </w:pPr>
+      <w:r>
+        <w:rPr>
+          <w:b/>
+        </w:rPr>
+        <w:t>Download CSV</w:t>
+      </w:r>
+      <w:r>
+        <w:t xml:space="preserve"> on each table saves exactly what the table shows (with the current filters and sort), for Excel or slides.</w:t>
+      </w:r>
+    </w:p>
+    <w:p>
+      <w:pPr>
+        <w:pStyle w:val="ListBullet"/>
+      </w:pPr>
+      <w:r>
+        <w:rPr>
+          <w:b/>
+        </w:rPr>
+        <w:t>Print / Save as PDF</w:t>
+      </w:r>
+      <w:r>
+        <w:t xml:space="preserve"> prints a clean report: the filters and the date of the data are printed at th</w:t>
+      </w:r>
+      <w:r>
+        <w:t xml:space="preserve">e top, and the buttons and tabs are left out. In the print window choose </w:t>
+      </w:r>
+      <w:r>
+        <w:rPr>
+          <w:b/>
+        </w:rPr>
+        <w:t>Save as PDF</w:t>
+      </w:r>
+      <w:r>
+        <w:t xml:space="preserve"> as the printer.</w:t>
+      </w:r>
+    </w:p>
+    <w:p>
+      <w:pPr>
+        <w:pStyle w:val="ListBullet"/>
+      </w:pPr>
+      <w:r>
+        <w:t xml:space="preserve">The full learner list is long, so it is only added to the PDF when </w:t>
+      </w:r>
+      <w:r>
+        <w:rPr>
+          <w:b/>
+        </w:rPr>
+        <w:t>Include learner list in PDF</w:t>
+      </w:r>
+      <w:r>
+        <w:t xml:space="preserve"> is ticked.</w:t>
+      </w:r>
+    </w:p>
+    <w:p>
+      <w:pPr>
+        <w:pStyle w:val="Heading2"/>
+      </w:pPr>
+      <w:bookmarkStart w:id="21" w:name="_Toc242288566"/>
+      <w:r>
+        <w:t>Good to know</w:t>
+      </w:r>
+      <w:bookmarkEnd w:id="21"/>
+    </w:p>
+    <w:p>
+      <w:pPr>
+        <w:pStyle w:val="ListBullet"/>
+      </w:pPr>
+      <w:r>
+        <w:t xml:space="preserve">All amounts are in </w:t>
+      </w:r>
+      <w:r>
+        <w:rPr>
+          <w:b/>
+        </w:rPr>
+        <w:t>US dollars</w:t>
+      </w:r>
+      <w:r>
+        <w:t xml:space="preserve">, as </w:t>
+      </w:r>
+      <w:r>
+        <w:t>charged by OpenRouter.</w:t>
+      </w:r>
+    </w:p>
+    <w:p>
+      <w:pPr>
+        <w:pStyle w:val="ListBullet"/>
+      </w:pPr>
+      <w:r>
+        <w:rPr>
+          <w:b/>
+        </w:rPr>
+        <w:t>This month</w:t>
+      </w:r>
+      <w:r>
+        <w:t xml:space="preserve"> means the current calendar month in UTC. OpenRouter only gives each key's spend for today, this week, this month and all time, so past months (e.g. "September only") can't be shown per key yet. A later version can add tren</w:t>
+      </w:r>
+      <w:r>
+        <w:t>ds over time from OpenRouter's analytics.</w:t>
+      </w:r>
+    </w:p>
+    <w:p>
+      <w:pPr>
+        <w:pStyle w:val="ListBullet"/>
+      </w:pPr>
+      <w:r>
+        <w:rPr>
+          <w:b/>
+        </w:rPr>
+        <w:t>Budget</w:t>
+      </w:r>
+      <w:r>
+        <w:t xml:space="preserve"> is the total of the keys' credit limits. Keys with no limit are not in it; the note under the figures says how many there are.</w:t>
+      </w:r>
+    </w:p>
+    <w:p>
+      <w:pPr>
+        <w:pStyle w:val="ListBullet"/>
+      </w:pPr>
+      <w:r>
+        <w:t>Keys that weren't created with this tool's naming (</w:t>
+      </w:r>
+      <w:r>
+        <w:rPr>
+          <w:rFonts w:ascii="Consolas" w:hAnsi="Consolas"/>
+          <w:sz w:val="20"/>
+        </w:rPr>
+        <w:t>REGION-serial-cohort-email</w:t>
+      </w:r>
+      <w:r>
+        <w:t>) a</w:t>
+      </w:r>
+      <w:r>
+        <w:t>ppear as "(other keys)".</w:t>
+      </w:r>
+    </w:p>
+    <w:p>
+      <w:pPr>
+        <w:pStyle w:val="Heading1"/>
+      </w:pPr>
+      <w:bookmarkStart w:id="22" w:name="_Toc242288567"/>
+      <w:r>
+        <w:t>8. Monthly checklist</w:t>
+      </w:r>
+      <w:bookmarkEnd w:id="22"/>
+    </w:p>
+    <w:p>
+      <w:pPr>
+        <w:pStyle w:val="Heading2"/>
+      </w:pPr>
+      <w:bookmarkStart w:id="23" w:name="_Toc242288568"/>
+      <w:r>
+        <w:t>When a cohort starts</w:t>
+      </w:r>
+      <w:bookmarkEnd w:id="23"/>
+    </w:p>
+    <w:p>
+      <w:pPr>
+        <w:pStyle w:val="ListNumber"/>
+      </w:pPr>
+      <w:r>
+        <w:t>Prepare one CSV per program (start from dummy.csv).</w:t>
+      </w:r>
+    </w:p>
+    <w:p>
+      <w:pPr>
+        <w:pStyle w:val="ListNumber"/>
+      </w:pPr>
+      <w:r>
+        <w:t>Open https://openrouter-key-generator.vercel.app and sign in.</w:t>
+      </w:r>
+    </w:p>
+    <w:p>
+      <w:pPr>
+        <w:pStyle w:val="ListNumber"/>
+      </w:pPr>
+      <w:r>
+        <w:t xml:space="preserve">For each program: choose program, region, cohort name (e.g. </w:t>
+      </w:r>
+      <w:r>
+        <w:rPr>
+          <w:rFonts w:ascii="Consolas" w:hAnsi="Consolas"/>
+          <w:sz w:val="20"/>
+        </w:rPr>
+        <w:t>early-nov</w:t>
+      </w:r>
+      <w:r>
+        <w:t xml:space="preserve">) and </w:t>
+      </w:r>
+      <w:r>
+        <w:t xml:space="preserve">limit, upload that program's CSV, </w:t>
+      </w:r>
+      <w:r>
+        <w:rPr>
+          <w:b/>
+        </w:rPr>
+        <w:t>Preview</w:t>
+      </w:r>
+      <w:r>
+        <w:t xml:space="preserve">, then </w:t>
+      </w:r>
+      <w:r>
+        <w:rPr>
+          <w:b/>
+        </w:rPr>
+        <w:t>Generate</w:t>
+      </w:r>
+      <w:r>
+        <w:t>.</w:t>
+      </w:r>
+    </w:p>
+    <w:p>
+      <w:pPr>
+        <w:pStyle w:val="ListNumber"/>
+      </w:pPr>
+      <w:r>
+        <w:t xml:space="preserve">Check the summary. Fix any </w:t>
+      </w:r>
+      <w:r>
+        <w:rPr>
+          <w:b/>
+        </w:rPr>
+        <w:t>Problem</w:t>
+      </w:r>
+      <w:r>
+        <w:t xml:space="preserve"> or </w:t>
+      </w:r>
+      <w:r>
+        <w:rPr>
+          <w:b/>
+        </w:rPr>
+        <w:t>Failed</w:t>
+      </w:r>
+      <w:r>
+        <w:t xml:space="preserve"> rows and run again (created keys are skipped).</w:t>
+      </w:r>
+    </w:p>
+    <w:p>
+      <w:pPr>
+        <w:pStyle w:val="ListNumber"/>
+      </w:pPr>
+      <w:r>
+        <w:t xml:space="preserve">Filter </w:t>
+      </w:r>
+      <w:r>
+        <w:rPr>
+          <w:b/>
+        </w:rPr>
+        <w:t>Generated keys</w:t>
+      </w:r>
+      <w:r>
+        <w:t xml:space="preserve"> by cohort and share each learner's key privately.</w:t>
+      </w:r>
+    </w:p>
+    <w:p>
+      <w:pPr>
+        <w:pStyle w:val="Heading2"/>
+      </w:pPr>
+      <w:bookmarkStart w:id="24" w:name="_Toc242288569"/>
+      <w:r>
+        <w:lastRenderedPageBreak/>
+        <w:t>When a cohort ends</w:t>
+      </w:r>
+      <w:bookmarkEnd w:id="24"/>
+    </w:p>
+    <w:p>
+      <w:r>
+        <w:t>Go to https://o</w:t>
+      </w:r>
+      <w:r>
+        <w:t xml:space="preserve">penrouter.ai/settings/keys, search for the cohort name (e.g. </w:t>
+      </w:r>
+      <w:r>
+        <w:rPr>
+          <w:rFonts w:ascii="Consolas" w:hAnsi="Consolas"/>
+          <w:sz w:val="20"/>
+        </w:rPr>
+        <w:t>mid-oct</w:t>
+      </w:r>
+      <w:r>
+        <w:t>) and disable or delete its keys. An automatic "revoke cohort" feature is planned but not built yet.</w:t>
+      </w:r>
+    </w:p>
+    <w:p>
+      <w:pPr>
+        <w:pStyle w:val="Heading1"/>
+      </w:pPr>
+      <w:bookmarkStart w:id="25" w:name="_Toc242288570"/>
+      <w:r>
+        <w:t>9. First-time test</w:t>
+      </w:r>
+      <w:bookmarkEnd w:id="25"/>
+    </w:p>
+    <w:p>
+      <w:r>
+        <w:t>Do this once, and again after any big change:</w:t>
+      </w:r>
+    </w:p>
+    <w:p>
+      <w:pPr>
+        <w:pStyle w:val="ListNumber"/>
+      </w:pPr>
+      <w:r>
+        <w:t>Make a CSV with one em</w:t>
+      </w:r>
+      <w:r>
+        <w:t>ail (yours is fine), e.g. from dummy.csv.</w:t>
+      </w:r>
+    </w:p>
+    <w:p>
+      <w:pPr>
+        <w:pStyle w:val="ListNumber"/>
+      </w:pPr>
+      <w:r>
+        <w:t xml:space="preserve">On the site choose SWE, US, cohort </w:t>
+      </w:r>
+      <w:r>
+        <w:rPr>
+          <w:rFonts w:ascii="Consolas" w:hAnsi="Consolas"/>
+          <w:sz w:val="20"/>
+        </w:rPr>
+        <w:t>test-run</w:t>
+      </w:r>
+      <w:r>
+        <w:t xml:space="preserve">, limit </w:t>
+      </w:r>
+      <w:r>
+        <w:rPr>
+          <w:b/>
+        </w:rPr>
+        <w:t>$1</w:t>
+      </w:r>
+      <w:r>
+        <w:t xml:space="preserve">. Upload the CSV and click </w:t>
+      </w:r>
+      <w:r>
+        <w:rPr>
+          <w:b/>
+        </w:rPr>
+        <w:t>Preview</w:t>
+      </w:r>
+      <w:r>
+        <w:t>. Check the key name.</w:t>
+      </w:r>
+    </w:p>
+    <w:p>
+      <w:pPr>
+        <w:pStyle w:val="ListNumber"/>
+      </w:pPr>
+      <w:r>
+        <w:t xml:space="preserve">Click </w:t>
+      </w:r>
+      <w:r>
+        <w:rPr>
+          <w:b/>
+        </w:rPr>
+        <w:t>Generate 1 key</w:t>
+      </w:r>
+      <w:r>
+        <w:t>.</w:t>
+      </w:r>
+    </w:p>
+    <w:p>
+      <w:pPr>
+        <w:pStyle w:val="ListNumber"/>
+      </w:pPr>
+      <w:r>
+        <w:t xml:space="preserve">Copy the key from </w:t>
+      </w:r>
+      <w:r>
+        <w:rPr>
+          <w:b/>
+        </w:rPr>
+        <w:t>Generated keys</w:t>
+      </w:r>
+      <w:r>
+        <w:t xml:space="preserve"> and check it works (Windows PowerShell shown; in C</w:t>
+      </w:r>
+      <w:r>
+        <w:t xml:space="preserve">MD use </w:t>
+      </w:r>
+      <w:r>
+        <w:rPr>
+          <w:rFonts w:ascii="Consolas" w:hAnsi="Consolas"/>
+          <w:sz w:val="20"/>
+        </w:rPr>
+        <w:t>curl</w:t>
+      </w:r>
+      <w:r>
+        <w:t xml:space="preserve"> instead of </w:t>
+      </w:r>
+      <w:r>
+        <w:rPr>
+          <w:rFonts w:ascii="Consolas" w:hAnsi="Consolas"/>
+          <w:sz w:val="20"/>
+        </w:rPr>
+        <w:t>curl.exe</w:t>
+      </w:r>
+      <w:r>
+        <w:t>):</w:t>
+      </w:r>
+    </w:p>
+    <w:p>
+      <w:pPr>
+        <w:shd w:val="clear" w:color="auto" w:fill="EEF1F5"/>
+        <w:ind w:left="227"/>
+      </w:pPr>
+      <w:r>
+        <w:rPr>
+          <w:rFonts w:ascii="Consolas" w:hAnsi="Consolas"/>
+          <w:sz w:val="19"/>
+        </w:rPr>
+        <w:t>curl.exe https://openrouter.ai/api/v1/key -H "Authorization: Bearer PASTE_KEY_HERE"</w:t>
+      </w:r>
+    </w:p>
+    <w:p>
+      <w:r>
+        <w:t xml:space="preserve">It should show the key's name and a limit of 1. The key should also appear in the </w:t>
+      </w:r>
+      <w:r>
+        <w:rPr>
+          <w:b/>
+        </w:rPr>
+        <w:t>Agentic AI-SWE</w:t>
+      </w:r>
+      <w:r>
+        <w:t xml:space="preserve"> workspace at https://openrouter.ai/settin</w:t>
+      </w:r>
+      <w:r>
+        <w:t>gs/keys.</w:t>
+      </w:r>
+    </w:p>
+    <w:p>
+      <w:pPr>
+        <w:pStyle w:val="ListBullet"/>
+      </w:pPr>
+      <w:r>
+        <w:t xml:space="preserve">Click </w:t>
+      </w:r>
+      <w:r>
+        <w:rPr>
+          <w:b/>
+        </w:rPr>
+        <w:t>Preview</w:t>
+      </w:r>
+      <w:r>
+        <w:t xml:space="preserve"> again: the row should say </w:t>
+      </w:r>
+      <w:r>
+        <w:rPr>
+          <w:b/>
+        </w:rPr>
+        <w:t>Already exists</w:t>
+      </w:r>
+      <w:r>
+        <w:t>, and there should be nothing to generate.</w:t>
+      </w:r>
+    </w:p>
+    <w:p>
+      <w:pPr>
+        <w:pStyle w:val="ListBullet"/>
+      </w:pPr>
+      <w:r>
+        <w:t>Delete the test key at https://openrouter.ai/settings/keys.</w:t>
+      </w:r>
+    </w:p>
+    <w:p>
+      <w:pPr>
+        <w:pStyle w:val="Heading1"/>
+      </w:pPr>
+      <w:bookmarkStart w:id="26" w:name="_Toc242288571"/>
+      <w:r>
+        <w:t>10. How the online site is set up</w:t>
+      </w:r>
+      <w:bookmarkEnd w:id="26"/>
+    </w:p>
+    <w:tbl>
+      <w:tblPr>
+        <w:tblStyle w:val="TableGrid"/>
+        <w:tblW w:w="0" w:type="auto"/>
+        <w:tblLook w:val="04A0" w:firstRow="1" w:lastRow="0" w:firstColumn="1" w:lastColumn="0" w:noHBand="0" w:noVBand="1"/>
+      </w:tblPr>
+      <w:tblGrid>
+        <w:gridCol w:w="1984"/>
+        <w:gridCol w:w="7370"/>
+      </w:tblGrid>
+      <w:tr>
+        <w:tc>
+          <w:tcPr>
+            <w:tcW w:w="1984" w:type="dxa"/>
+            <w:shd w:val="clear" w:color="auto" w:fill="3B5BDB"/>
+          </w:tcPr>
+          <w:p>
+            <w:pPr>
+              <w:spacing w:after="40"/>
+            </w:pPr>
+            <w:r>
+              <w:rPr>
+                <w:b/>
+                <w:color w:val="FFFFFF"/>
+                <w:sz w:val="20"/>
+              </w:rPr>
+              <w:t>Part</w:t>
+            </w:r>
+          </w:p>
+        </w:tc>
+        <w:tc>
+          <w:tcPr>
+            <w:tcW w:w="7370" w:type="dxa"/>
+            <w:shd w:val="clear" w:color="auto" w:fill="3B5BDB"/>
+          </w:tcPr>
+          <w:p>
+            <w:pPr>
+              <w:spacing w:after="40"/>
+            </w:pPr>
+            <w:r>
+              <w:rPr>
+                <w:b/>
+                <w:color w:val="FFFFFF"/>
+                <w:sz w:val="20"/>
+              </w:rPr>
+              <w:t>What / where</w:t>
+            </w:r>
+          </w:p>
+        </w:tc>
+      </w:tr>
+      <w:tr>
+        <w:tc>
+          <w:tcPr>
+            <w:tcW w:w="1984" w:type="dxa"/>
+          </w:tcPr>
+          <w:p>
+            <w:pPr>
+              <w:spacing w:after="40"/>
+            </w:pPr>
+            <w:r>
+              <w:rPr>
+                <w:sz w:val="20"/>
+              </w:rPr>
+              <w:t>Site address</w:t>
+            </w:r>
+          </w:p>
+        </w:tc>
+        <w:tc>
+          <w:tcPr>
+            <w:tcW w:w="7370" w:type="dxa"/>
+          </w:tcPr>
+          <w:p>
+            <w:pPr>
+              <w:spacing w:after="40"/>
+            </w:pPr>
+            <w:r>
+              <w:rPr>
+                <w:sz w:val="20"/>
+              </w:rPr>
+              <w:t>https://openrouter-key-generator.vercel.app</w:t>
+            </w:r>
+          </w:p>
+        </w:tc>
+      </w:tr>
+      <w:tr>
+        <w:tc>
+          <w:tcPr>
+            <w:tcW w:w="1984" w:type="dxa"/>
+          </w:tcPr>
+          <w:p>
+            <w:pPr>
+              <w:spacing w:after="40"/>
+            </w:pPr>
+            <w:r>
+              <w:rPr>
+                <w:sz w:val="20"/>
+              </w:rPr>
+              <w:t>Hosting</w:t>
+            </w:r>
+          </w:p>
+        </w:tc>
+        <w:tc>
+          <w:tcPr>
+            <w:tcW w:w="7370" w:type="dxa"/>
+          </w:tcPr>
+          <w:p>
+            <w:pPr>
+              <w:spacing w:after="40"/>
+            </w:pPr>
+            <w:r>
+              <w:rPr>
+                <w:sz w:val="20"/>
+              </w:rPr>
+              <w:t xml:space="preserve">Vercel, team </w:t>
+            </w:r>
+            <w:r>
+              <w:rPr>
+                <w:rFonts w:ascii="Consolas" w:hAnsi="Consolas"/>
+                <w:sz w:val="20"/>
+              </w:rPr>
+              <w:t>new-programs-ik</w:t>
+            </w:r>
+            <w:r>
+              <w:rPr>
+                <w:sz w:val="20"/>
+              </w:rPr>
+              <w:t xml:space="preserve">, project </w:t>
+            </w:r>
+            <w:r>
+              <w:rPr>
+                <w:rFonts w:ascii="Consolas" w:hAnsi="Consolas"/>
+                <w:sz w:val="20"/>
+              </w:rPr>
+              <w:t>openrouter-key-generator</w:t>
+            </w:r>
+            <w:r>
+              <w:rPr>
+                <w:sz w:val="20"/>
+              </w:rPr>
+              <w:t xml:space="preserve"> (https://vercel.com/new-programs-ik/openrouter-key-generator). Free Hobby plan.</w:t>
+            </w:r>
+          </w:p>
+        </w:tc>
+      </w:tr>
+      <w:tr>
+        <w:tc>
+          <w:tcPr>
+            <w:tcW w:w="1984" w:type="dxa"/>
+          </w:tcPr>
+          <w:p>
+            <w:pPr>
+              <w:spacing w:after="40"/>
+            </w:pPr>
+            <w:r>
+              <w:rPr>
+                <w:sz w:val="20"/>
+              </w:rPr>
+              <w:t>Key storage</w:t>
+            </w:r>
+          </w:p>
+        </w:tc>
+        <w:tc>
+          <w:tcPr>
+            <w:tcW w:w="7370" w:type="dxa"/>
+          </w:tcPr>
+          <w:p>
+            <w:pPr>
+              <w:spacing w:after="40"/>
+            </w:pPr>
+            <w:r>
+              <w:rPr>
+                <w:sz w:val="20"/>
+              </w:rPr>
+              <w:t xml:space="preserve">Private Vercel Blob store </w:t>
+            </w:r>
+            <w:r>
+              <w:rPr>
+                <w:rFonts w:ascii="Consolas" w:hAnsi="Consolas"/>
+                <w:sz w:val="20"/>
+              </w:rPr>
+              <w:t>openrouter-keys</w:t>
+            </w:r>
+            <w:r>
+              <w:rPr>
+                <w:sz w:val="20"/>
+              </w:rPr>
+              <w:t xml:space="preserve"> (Verc</w:t>
+            </w:r>
+            <w:r>
+              <w:rPr>
+                <w:sz w:val="20"/>
+              </w:rPr>
+              <w:t xml:space="preserve">el project → Storage). One file per run under </w:t>
+            </w:r>
+            <w:r>
+              <w:rPr>
+                <w:rFonts w:ascii="Consolas" w:hAnsi="Consolas"/>
+                <w:sz w:val="20"/>
+              </w:rPr>
+              <w:t>keys/</w:t>
+            </w:r>
+            <w:r>
+              <w:rPr>
+                <w:sz w:val="20"/>
+              </w:rPr>
+              <w:t>.</w:t>
+            </w:r>
+          </w:p>
+        </w:tc>
+      </w:tr>
+      <w:tr>
+        <w:tc>
+          <w:tcPr>
+            <w:tcW w:w="1984" w:type="dxa"/>
+          </w:tcPr>
+          <w:p>
+            <w:pPr>
+              <w:spacing w:after="40"/>
+            </w:pPr>
+            <w:r>
+              <w:rPr>
+                <w:sz w:val="20"/>
+              </w:rPr>
+              <w:t>Sign-in</w:t>
+            </w:r>
+          </w:p>
+        </w:tc>
+        <w:tc>
+          <w:tcPr>
+            <w:tcW w:w="7370" w:type="dxa"/>
+          </w:tcPr>
+          <w:p>
+            <w:pPr>
+              <w:spacing w:after="40"/>
+            </w:pPr>
+            <w:r>
+              <w:rPr>
+                <w:sz w:val="20"/>
+              </w:rPr>
+              <w:t xml:space="preserve">Google Cloud project with an </w:t>
+            </w:r>
+            <w:r>
+              <w:rPr>
+                <w:b/>
+                <w:sz w:val="20"/>
+              </w:rPr>
+              <w:t>Internal</w:t>
+            </w:r>
+            <w:r>
+              <w:rPr>
+                <w:sz w:val="20"/>
+              </w:rPr>
+              <w:t xml:space="preserve"> OAuth consent screen and a Web application OAuth client (ID starts </w:t>
+            </w:r>
+            <w:r>
+              <w:rPr>
+                <w:rFonts w:ascii="Consolas" w:hAnsi="Consolas"/>
+                <w:sz w:val="20"/>
+              </w:rPr>
+              <w:t>997169956711-k2namb…</w:t>
+            </w:r>
+            <w:r>
+              <w:rPr>
+                <w:sz w:val="20"/>
+              </w:rPr>
+              <w:t xml:space="preserve">). Redirect URI: </w:t>
+            </w:r>
+            <w:r>
+              <w:rPr>
+                <w:rFonts w:ascii="Consolas" w:hAnsi="Consolas"/>
+                <w:sz w:val="20"/>
+              </w:rPr>
+              <w:t>https://openrouter-key-generator.vercel.app/auth/cal</w:t>
+            </w:r>
+            <w:r>
+              <w:rPr>
+                <w:rFonts w:ascii="Consolas" w:hAnsi="Consolas"/>
+                <w:sz w:val="20"/>
+              </w:rPr>
+              <w:t>lback</w:t>
+            </w:r>
+            <w:r>
+              <w:rPr>
+                <w:sz w:val="20"/>
+              </w:rPr>
+              <w:t>.</w:t>
+            </w:r>
+          </w:p>
+        </w:tc>
+      </w:tr>
+      <w:tr>
+        <w:tc>
+          <w:tcPr>
+            <w:tcW w:w="1984" w:type="dxa"/>
+          </w:tcPr>
+          <w:p>
+            <w:pPr>
+              <w:spacing w:after="40"/>
+            </w:pPr>
+            <w:r>
+              <w:rPr>
+                <w:sz w:val="20"/>
+              </w:rPr>
+              <w:t>OpenRouter</w:t>
+            </w:r>
+          </w:p>
+        </w:tc>
+        <w:tc>
+          <w:tcPr>
+            <w:tcW w:w="7370" w:type="dxa"/>
+          </w:tcPr>
+          <w:p>
+            <w:pPr>
+              <w:spacing w:after="40"/>
+            </w:pPr>
+            <w:r>
+              <w:rPr>
+                <w:sz w:val="20"/>
+              </w:rPr>
+              <w:t xml:space="preserve">One </w:t>
+            </w:r>
+            <w:r>
+              <w:rPr>
+                <w:b/>
+                <w:sz w:val="20"/>
+              </w:rPr>
+              <w:t>Management key</w:t>
+            </w:r>
+            <w:r>
+              <w:rPr>
+                <w:sz w:val="20"/>
+              </w:rPr>
+              <w:t xml:space="preserve"> that can create keys in all program workspaces.</w:t>
+            </w:r>
+          </w:p>
+        </w:tc>
+      </w:tr>
+      <w:tr>
+        <w:tc>
+          <w:tcPr>
+            <w:tcW w:w="1984" w:type="dxa"/>
+          </w:tcPr>
+          <w:p>
+            <w:pPr>
+              <w:spacing w:after="40"/>
+            </w:pPr>
+            <w:r>
+              <w:rPr>
+                <w:sz w:val="20"/>
+              </w:rPr>
+              <w:t>Code</w:t>
+            </w:r>
+          </w:p>
+        </w:tc>
+        <w:tc>
+          <w:tcPr>
+            <w:tcW w:w="7370" w:type="dxa"/>
+          </w:tcPr>
+          <w:p>
+            <w:pPr>
+              <w:spacing w:after="40"/>
+            </w:pPr>
+            <w:r>
+              <w:rPr>
+                <w:sz w:val="20"/>
+              </w:rPr>
+              <w:t xml:space="preserve">https://github.com/new-programs-ik/openrouter-api-key-creation (branch </w:t>
+            </w:r>
+            <w:r>
+              <w:rPr>
+                <w:rFonts w:ascii="Consolas" w:hAnsi="Consolas"/>
+                <w:sz w:val="20"/>
+              </w:rPr>
+              <w:t>main</w:t>
+            </w:r>
+            <w:r>
+              <w:rPr>
+                <w:sz w:val="20"/>
+              </w:rPr>
+              <w:t>).</w:t>
+            </w:r>
+          </w:p>
+        </w:tc>
+      </w:tr>
+    </w:tbl>
+    <w:p/>
+    <w:p>
+      <w:pPr>
+        <w:pStyle w:val="Heading2"/>
+      </w:pPr>
+      <w:bookmarkStart w:id="27" w:name="_Toc242288572"/>
       <w:r>
         <w:t>Vercel settings</w:t>
       </w:r>
-      <w:bookmarkEnd w:id="22"/>
+      <w:bookmarkEnd w:id="27"/>
     </w:p>
     <w:p>
       <w:r>
@@ -5875,7 +6795,13 @@
               <w:rPr>
                 <w:sz w:val="20"/>
               </w:rPr>
-              <w:t>32+ random characters used to sign the sign-in cookie. Changing it signs everyone out.</w:t>
+              <w:t xml:space="preserve">32+ random characters used to sign the </w:t>
+            </w:r>
+            <w:r>
+              <w:rPr>
+                <w:sz w:val="20"/>
+              </w:rPr>
+              <w:t>sign-in cookie. Changing it signs everyone out.</w:t>
             </w:r>
           </w:p>
         </w:tc>
@@ -5911,13 +6837,7 @@
               <w:rPr>
                 <w:sz w:val="20"/>
               </w:rPr>
-              <w:t>Comma-separated list of people</w:t>
-            </w:r>
-            <w:r>
-              <w:rPr>
-                <w:sz w:val="20"/>
-              </w:rPr>
-              <w:t xml:space="preserve"> allowed in. Only @interviewkickstart.com addresses.</w:t>
+              <w:t>Comma-separated list of people allowed in. Only @interviewkickstart.com addresses.</w:t>
             </w:r>
           </w:p>
         </w:tc>
@@ -5978,7 +6898,14 @@
                 <w:rFonts w:ascii="Consolas" w:hAnsi="Consolas"/>
                 <w:sz w:val="20"/>
               </w:rPr>
-              <w:t>BLOB_READ_WRITE_TOKEN</w:t>
+              <w:t>BLOB_RE</w:t>
+            </w:r>
+            <w:r>
+              <w:rPr>
+                <w:rFonts w:ascii="Consolas" w:hAnsi="Consolas"/>
+                <w:sz w:val="20"/>
+              </w:rPr>
+              <w:t>AD_WRITE_TOKEN</w:t>
             </w:r>
           </w:p>
         </w:tc>
@@ -6041,11 +6968,11 @@
       <w:pPr>
         <w:pStyle w:val="Heading2"/>
       </w:pPr>
-      <w:bookmarkStart w:id="23" w:name="_Toc242277819"/>
+      <w:bookmarkStart w:id="28" w:name="_Toc242288573"/>
       <w:r>
         <w:t>Vercel's own login protection</w:t>
       </w:r>
-      <w:bookmarkEnd w:id="23"/>
+      <w:bookmarkEnd w:id="28"/>
     </w:p>
     <w:p>
       <w:r>
@@ -6076,31 +7003,31 @@
         <w:t>Disabled</w:t>
       </w:r>
       <w:r>
-        <w:t>; Google sign-in still protects every</w:t>
-      </w:r>
-      <w:r>
-        <w:t>thing.</w:t>
+        <w:t>; Google sign-in</w:t>
+      </w:r>
+      <w:r>
+        <w:t xml:space="preserve"> still protects everything.</w:t>
       </w:r>
     </w:p>
     <w:p>
       <w:pPr>
         <w:pStyle w:val="Heading1"/>
       </w:pPr>
-      <w:bookmarkStart w:id="24" w:name="_Toc242277820"/>
-      <w:r>
-        <w:t>10. Administration</w:t>
-      </w:r>
-      <w:bookmarkEnd w:id="24"/>
+      <w:bookmarkStart w:id="29" w:name="_Toc242288574"/>
+      <w:r>
+        <w:t>11. Administration</w:t>
+      </w:r>
+      <w:bookmarkEnd w:id="29"/>
     </w:p>
     <w:p>
       <w:pPr>
         <w:pStyle w:val="Heading2"/>
       </w:pPr>
-      <w:bookmarkStart w:id="25" w:name="_Toc242277821"/>
+      <w:bookmarkStart w:id="30" w:name="_Toc242288575"/>
       <w:r>
         <w:t>Adding or removing a person</w:t>
       </w:r>
-      <w:bookmarkEnd w:id="25"/>
+      <w:bookmarkEnd w:id="30"/>
     </w:p>
     <w:p>
       <w:pPr>
@@ -6164,7 +7091,14 @@
           <w:rFonts w:ascii="Consolas" w:hAnsi="Consolas"/>
           <w:sz w:val="20"/>
         </w:rPr>
-        <w:t>a@interviewkickstart.com,b@interviewkickstart.com</w:t>
+        <w:t>a@interviewkickstart.com,b@int</w:t>
+      </w:r>
+      <w:r>
+        <w:rPr>
+          <w:rFonts w:ascii="Consolas" w:hAnsi="Consolas"/>
+          <w:sz w:val="20"/>
+        </w:rPr>
+        <w:t>erviewkickstart.com</w:t>
       </w:r>
       <w:r>
         <w:t>.</w:t>
@@ -6215,10 +7149,10 @@
           </w:tcPr>
           <w:p>
             <w:r>
-              <w:t>Only @interviewkickstart.com addresses are accepted. If the list contains any other address, the site refuses everyone until it is removed. This is on purpose, so a mistake can't let a</w:t>
-            </w:r>
-            <w:r>
-              <w:t>n outsider in.</w:t>
+              <w:t xml:space="preserve">Only @interviewkickstart.com addresses are accepted. If the list contains any other address, the site refuses everyone until it is removed. This is on purpose, so </w:t>
+            </w:r>
+            <w:r>
+              <w:t>a mistake can't let an outsider in.</w:t>
             </w:r>
           </w:p>
         </w:tc>
@@ -6229,11 +7163,11 @@
       <w:pPr>
         <w:pStyle w:val="Heading2"/>
       </w:pPr>
-      <w:bookmarkStart w:id="26" w:name="_Toc242277822"/>
+      <w:bookmarkStart w:id="31" w:name="_Toc242288576"/>
       <w:r>
         <w:t>Redeploying</w:t>
       </w:r>
-      <w:bookmarkEnd w:id="26"/>
+      <w:bookmarkEnd w:id="31"/>
     </w:p>
     <w:p>
       <w:r>
@@ -6277,18 +7211,18 @@
       <w:pPr>
         <w:pStyle w:val="Heading2"/>
       </w:pPr>
-      <w:bookmarkStart w:id="27" w:name="_Toc242277823"/>
+      <w:bookmarkStart w:id="32" w:name="_Toc242288577"/>
       <w:r>
         <w:t>Changing the Management key</w:t>
       </w:r>
-      <w:bookmarkEnd w:id="27"/>
+      <w:bookmarkEnd w:id="32"/>
     </w:p>
     <w:p>
       <w:r>
-        <w:t>If the Management key leaks or is replaced: delet</w:t>
-      </w:r>
-      <w:r>
-        <w:t xml:space="preserve">e the old one at https://openrouter.ai/settings/management-keys, create a new one, put it in </w:t>
+        <w:t xml:space="preserve">If the Management key leaks </w:t>
+      </w:r>
+      <w:r>
+        <w:t xml:space="preserve">or is replaced: delete the old one at https://openrouter.ai/settings/management-keys, create a new one, put it in </w:t>
       </w:r>
       <w:r>
         <w:rPr>
@@ -6315,15 +7249,18 @@
       <w:pPr>
         <w:pStyle w:val="Heading2"/>
       </w:pPr>
-      <w:bookmarkStart w:id="28" w:name="_Toc242277824"/>
+      <w:bookmarkStart w:id="33" w:name="_Toc242288578"/>
       <w:r>
         <w:t>Updating the code</w:t>
       </w:r>
-      <w:bookmarkEnd w:id="28"/>
+      <w:bookmarkEnd w:id="33"/>
     </w:p>
     <w:p>
       <w:r>
-        <w:t>After a code change is tested (</w:t>
+        <w:t xml:space="preserve">After a code change is </w:t>
+      </w:r>
+      <w:r>
+        <w:t>tested (</w:t>
       </w:r>
       <w:r>
         <w:rPr>
@@ -6333,10 +7270,7 @@
         <w:t>npm test</w:t>
       </w:r>
       <w:r>
-        <w:t>) and</w:t>
-      </w:r>
-      <w:r>
-        <w:t xml:space="preserve"> pushed to GitHub, publish it from the project folder:</w:t>
+        <w:t>) and pushed to GitHub, publish it from the project folder:</w:t>
       </w:r>
     </w:p>
     <w:p>
@@ -6382,21 +7316,21 @@
       <w:pPr>
         <w:pStyle w:val="Heading1"/>
       </w:pPr>
-      <w:bookmarkStart w:id="29" w:name="_Toc242277825"/>
-      <w:r>
-        <w:t>11. Running it on your own computer</w:t>
-      </w:r>
-      <w:bookmarkEnd w:id="29"/>
+      <w:bookmarkStart w:id="34" w:name="_Toc242288579"/>
+      <w:r>
+        <w:t>12. Running it on your own computer</w:t>
+      </w:r>
+      <w:bookmarkEnd w:id="34"/>
     </w:p>
     <w:p>
       <w:pPr>
         <w:pStyle w:val="Heading2"/>
       </w:pPr>
-      <w:bookmarkStart w:id="30" w:name="_Toc242277826"/>
+      <w:bookmarkStart w:id="35" w:name="_Toc242288580"/>
       <w:r>
         <w:t>One-time setup</w:t>
       </w:r>
-      <w:bookmarkEnd w:id="30"/>
+      <w:bookmarkEnd w:id="35"/>
     </w:p>
     <w:p>
       <w:pPr>
@@ -6409,13 +7343,7 @@
         <w:rPr>
           <w:b/>
         </w:rPr>
-        <w:t>No</w:t>
-      </w:r>
-      <w:r>
-        <w:rPr>
-          <w:b/>
-        </w:rPr>
-        <w:t>de.js 18 or newer</w:t>
+        <w:t>Node.js 18 or newer</w:t>
       </w:r>
       <w:r>
         <w:t xml:space="preserve"> (LTS) from https://nodejs.org.</w:t>
@@ -6472,21 +7400,17 @@
         <w:t>copy .env.example .env</w:t>
       </w:r>
       <w:r>
-        <w:t xml:space="preserve"> (CMD) or </w:t>
+        <w:t xml:space="preserve"> (CM</w:t>
+      </w:r>
+      <w:r>
+        <w:t xml:space="preserve">D) or </w:t>
       </w:r>
       <w:r>
         <w:rPr>
           <w:rFonts w:ascii="Consolas" w:hAnsi="Consolas"/>
           <w:sz w:val="20"/>
         </w:rPr>
-        <w:t xml:space="preserve">Copy-Item </w:t>
-      </w:r>
-      <w:r>
-        <w:rPr>
-          <w:rFonts w:ascii="Consolas" w:hAnsi="Consolas"/>
-          <w:sz w:val="20"/>
-        </w:rPr>
-        <w:t>.env.example .env</w:t>
+        <w:t>Copy-Item .env.example .env</w:t>
       </w:r>
       <w:r>
         <w:t xml:space="preserve"> (PowerShell).</w:t>
@@ -6524,11 +7448,11 @@
       <w:pPr>
         <w:pStyle w:val="Heading2"/>
       </w:pPr>
-      <w:bookmarkStart w:id="31" w:name="_Toc242277827"/>
+      <w:bookmarkStart w:id="36" w:name="_Toc242288581"/>
       <w:r>
         <w:t>Web page</w:t>
       </w:r>
-      <w:bookmarkEnd w:id="31"/>
+      <w:bookmarkEnd w:id="36"/>
     </w:p>
     <w:p>
       <w:r>
@@ -6542,10 +7466,7 @@
         <w:t>npm run web</w:t>
       </w:r>
       <w:r>
-        <w:t>. The browser opens http://localhost:3000 with the same page as online, but without sign-in, and k</w:t>
-      </w:r>
-      <w:r>
-        <w:t xml:space="preserve">eys are saved in </w:t>
+        <w:t xml:space="preserve">. The browser opens http://localhost:3000 with the same page as online, but without sign-in, and keys are saved in </w:t>
       </w:r>
       <w:r>
         <w:rPr>
@@ -6571,11 +7492,11 @@
       <w:pPr>
         <w:pStyle w:val="Heading2"/>
       </w:pPr>
-      <w:bookmarkStart w:id="32" w:name="_Toc242277828"/>
+      <w:bookmarkStart w:id="37" w:name="_Toc242288582"/>
       <w:r>
         <w:t>Command line</w:t>
       </w:r>
-      <w:bookmarkEnd w:id="32"/>
+      <w:bookmarkEnd w:id="37"/>
     </w:p>
     <w:p>
       <w:r>
@@ -6586,10 +7507,7 @@
         <w:t>npm run api</w:t>
       </w:r>
       <w:r>
-        <w:t xml:space="preserve"> asks for the program, region, cohort and credit limit, shows a summary, </w:t>
-      </w:r>
-      <w:r>
-        <w:t xml:space="preserve">and asks you to type </w:t>
+        <w:t xml:space="preserve"> asks for the program, region, cohort and credit limit, shows a summary, and asks you to type </w:t>
       </w:r>
       <w:r>
         <w:rPr>
@@ -6614,7 +7532,10 @@
     </w:p>
     <w:p>
       <w:r>
-        <w:t>To skip the questions, set the answers first (PowerShell shown):</w:t>
+        <w:t>To skip the questions, set the answers first (Powe</w:t>
+      </w:r>
+      <w:r>
+        <w:t>rShell shown):</w:t>
       </w:r>
     </w:p>
     <w:p>
@@ -6659,14 +7580,7 @@
           <w:sz w:val="19"/>
         </w:rPr>
         <w:br/>
-        <w:t>npm</w:t>
-      </w:r>
-      <w:r>
-        <w:rPr>
-          <w:rFonts w:ascii="Consolas" w:hAnsi="Consolas"/>
-          <w:sz w:val="19"/>
-        </w:rPr>
-        <w:t xml:space="preserve"> run api</w:t>
+        <w:t>npm run api</w:t>
       </w:r>
     </w:p>
     <w:p>
@@ -6718,11 +7632,11 @@
       <w:pPr>
         <w:pStyle w:val="Heading2"/>
       </w:pPr>
-      <w:bookmarkStart w:id="33" w:name="_Toc242277829"/>
+      <w:bookmarkStart w:id="38" w:name="_Toc242288583"/>
       <w:r>
         <w:t>Trying Google sign-in locally</w:t>
       </w:r>
-      <w:bookmarkEnd w:id="33"/>
+      <w:bookmarkEnd w:id="38"/>
     </w:p>
     <w:p>
       <w:r>
@@ -6736,7 +7650,10 @@
         <w:t>http://localhost:3000/auth/callback</w:t>
       </w:r>
       <w:r>
-        <w:t xml:space="preserve"> to the Google app's Authorized redirect URIs, put </w:t>
+        <w:t xml:space="preserve"> to the Google app's Authorized redirect U</w:t>
+      </w:r>
+      <w:r>
+        <w:t xml:space="preserve">RIs, put </w:t>
       </w:r>
       <w:r>
         <w:rPr>
@@ -6786,10 +7703,7 @@
         <w:t>.env</w:t>
       </w:r>
       <w:r>
-        <w:t>, and ru</w:t>
-      </w:r>
-      <w:r>
-        <w:t xml:space="preserve">n </w:t>
+        <w:t xml:space="preserve">, and run </w:t>
       </w:r>
       <w:r>
         <w:rPr>
@@ -6806,11 +7720,11 @@
       <w:pPr>
         <w:pStyle w:val="Heading1"/>
       </w:pPr>
-      <w:bookmarkStart w:id="34" w:name="_Toc242277830"/>
-      <w:r>
-        <w:t>12. Changing settings in config.js</w:t>
-      </w:r>
-      <w:bookmarkEnd w:id="34"/>
+      <w:bookmarkStart w:id="39" w:name="_Toc242288584"/>
+      <w:r>
+        <w:t>13. Changing settings in config.js</w:t>
+      </w:r>
+      <w:bookmarkEnd w:id="39"/>
     </w:p>
     <w:p>
       <w:r>
@@ -6824,7 +7738,10 @@
         <w:t>config.js</w:t>
       </w:r>
       <w:r>
-        <w:t xml:space="preserve"> in the project. Change, test, push and redeploy for the online site; restart </w:t>
+        <w:t xml:space="preserve"> in the project</w:t>
+      </w:r>
+      <w:r>
+        <w:t xml:space="preserve">. Change, test, push and redeploy for the online site; restart </w:t>
       </w:r>
       <w:r>
         <w:rPr>
@@ -6864,15 +7781,7 @@
                 <w:color w:val="FFFFFF"/>
                 <w:sz w:val="20"/>
               </w:rPr>
-              <w:t>Set</w:t>
-            </w:r>
-            <w:r>
-              <w:rPr>
-                <w:b/>
-                <w:color w:val="FFFFFF"/>
-                <w:sz w:val="20"/>
-              </w:rPr>
-              <w:t>ting</w:t>
+              <w:t>Setting</w:t>
             </w:r>
           </w:p>
         </w:tc>
@@ -7039,7 +7948,13 @@
               <w:rPr>
                 <w:sz w:val="20"/>
               </w:rPr>
-              <w:t>1, 2, 5, 10</w:t>
+              <w:t xml:space="preserve">1, 2, 5, </w:t>
+            </w:r>
+            <w:r>
+              <w:rPr>
+                <w:sz w:val="20"/>
+              </w:rPr>
+              <w:t>10</w:t>
             </w:r>
           </w:p>
         </w:tc>
@@ -7388,13 +8303,7 @@
               <w:rPr>
                 <w:sz w:val="20"/>
               </w:rPr>
-              <w:t xml:space="preserve">Pause between key </w:t>
-            </w:r>
-            <w:r>
-              <w:rPr>
-                <w:sz w:val="20"/>
-              </w:rPr>
-              <w:t>creations (ms)</w:t>
+              <w:t>Pause between key creations (ms)</w:t>
             </w:r>
           </w:p>
         </w:tc>
@@ -7436,11 +8345,14 @@
       <w:pPr>
         <w:pStyle w:val="Heading1"/>
       </w:pPr>
-      <w:bookmarkStart w:id="35" w:name="_Toc242277831"/>
-      <w:r>
-        <w:t>13. How it works (technical summary)</w:t>
-      </w:r>
-      <w:bookmarkEnd w:id="35"/>
+      <w:bookmarkStart w:id="40" w:name="_Toc242288585"/>
+      <w:r>
+        <w:t xml:space="preserve">14. How </w:t>
+      </w:r>
+      <w:r>
+        <w:t>it works (technical summary)</w:t>
+      </w:r>
+      <w:bookmarkEnd w:id="40"/>
     </w:p>
     <w:p>
       <w:pPr>
@@ -7507,10 +8419,10 @@
         <w:t>Creating keys.</w:t>
       </w:r>
       <w:r>
-        <w:t xml:space="preserve"> The tool uses OpenRouter's Management API: it finds the program's workspace by slug, lists the existing keys i</w:t>
-      </w:r>
-      <w:r>
-        <w:t>n it, and creates each new key with its name, workspace and limit.</w:t>
+        <w:t xml:space="preserve"> The tool uses Op</w:t>
+      </w:r>
+      <w:r>
+        <w:t>enRouter's Management API: it finds the program's workspace by slug, lists the existing keys in it, and creates each new key with its name, workspace and limit.</w:t>
       </w:r>
     </w:p>
     <w:p>
@@ -7524,7 +8436,10 @@
         <w:t>Saving.</w:t>
       </w:r>
       <w:r>
-        <w:t xml:space="preserve"> Each key is saved right after it's created: online to a private Vercel Blob file (one per run), locally to the CSV. If saving isn't possible, the run stops before creating any key.</w:t>
+        <w:t xml:space="preserve"> Each key is saved right after it's created: online to a private Vercel Blob file (one p</w:t>
+      </w:r>
+      <w:r>
+        <w:t>er run), locally to the CSV. If saving isn't possible, the run stops before creating any key.</w:t>
       </w:r>
     </w:p>
     <w:p>
@@ -7552,10 +8467,10 @@
         <w:t>Long runs.</w:t>
       </w:r>
       <w:r>
-        <w:t xml:space="preserve"> Ea</w:t>
-      </w:r>
-      <w:r>
-        <w:t>ch request creates keys for up to about 4 minutes, then tells the page which row to continue from; the page sends the next request automatically.</w:t>
+        <w:t xml:space="preserve"> Each reque</w:t>
+      </w:r>
+      <w:r>
+        <w:t>st creates keys for up to about 4 minutes, then tells the page which row to continue from; the page sends the next request automatically.</w:t>
       </w:r>
     </w:p>
     <w:p>
@@ -7569,21 +8484,21 @@
         <w:t>Safeguards.</w:t>
       </w:r>
       <w:r>
-        <w:t xml:space="preserve"> Requests to the API must come from the page itself; full keys are never written to logs (only the </w:t>
-      </w:r>
-      <w:r>
-        <w:t>first 14 characters); the local page only accepts connections from the same computer.</w:t>
+        <w:t xml:space="preserve"> Requests to the API must come from the page itself; full keys are never written to logs (only the first 14</w:t>
+      </w:r>
+      <w:r>
+        <w:t xml:space="preserve"> characters); the local page only accepts connections from the same computer.</w:t>
       </w:r>
     </w:p>
     <w:p>
       <w:pPr>
         <w:pStyle w:val="Heading1"/>
       </w:pPr>
-      <w:bookmarkStart w:id="36" w:name="_Toc242277832"/>
-      <w:r>
-        <w:t>14. Security</w:t>
-      </w:r>
-      <w:bookmarkEnd w:id="36"/>
+      <w:bookmarkStart w:id="41" w:name="_Toc242288586"/>
+      <w:r>
+        <w:t>15. Security</w:t>
+      </w:r>
+      <w:bookmarkEnd w:id="41"/>
     </w:p>
     <w:p>
       <w:pPr>
@@ -7609,10 +8524,7 @@
         <w:t>live keys</w:t>
       </w:r>
       <w:r>
-        <w:t xml:space="preserve"> with learner emails. Share each learner's key only with the</w:t>
-      </w:r>
-      <w:r>
-        <w:t>m.</w:t>
+        <w:t xml:space="preserve"> with learner emails. Share each learner's key only with them.</w:t>
       </w:r>
     </w:p>
     <w:p>
@@ -7626,7 +8538,13 @@
         <w:rPr>
           <w:b/>
         </w:rPr>
-        <w:t>Management key</w:t>
+        <w:t>M</w:t>
+      </w:r>
+      <w:r>
+        <w:rPr>
+          <w:b/>
+        </w:rPr>
+        <w:t>anagement key</w:t>
       </w:r>
       <w:r>
         <w:t xml:space="preserve"> can create and delete keys on the whole OpenRouter account. Keep it only in the Vercel settings and </w:t>
@@ -7665,10 +8583,10 @@
         <w:pStyle w:val="ListBullet"/>
       </w:pPr>
       <w:r>
-        <w:t xml:space="preserve">Disable a cohort's keys when the </w:t>
-      </w:r>
-      <w:r>
-        <w:t>cohort ends.</w:t>
+        <w:t xml:space="preserve">Disable a cohort's keys when the cohort </w:t>
+      </w:r>
+      <w:r>
+        <w:t>ends.</w:t>
       </w:r>
     </w:p>
     <w:p>
@@ -7720,22 +8638,22 @@
         <w:t>same cohort at the same moment</w:t>
       </w:r>
       <w:r>
-        <w:t>, a learner could get two keys. Agree who ru</w:t>
-      </w:r>
-      <w:r>
-        <w:t>ns each cohort.</w:t>
+        <w:t>, a learner could get two keys. Agree who runs each</w:t>
+      </w:r>
+      <w:r>
+        <w:t xml:space="preserve"> cohort.</w:t>
       </w:r>
     </w:p>
     <w:p>
       <w:pPr>
         <w:pStyle w:val="Heading1"/>
       </w:pPr>
-      <w:bookmarkStart w:id="37" w:name="_Toc242277833"/>
+      <w:bookmarkStart w:id="42" w:name="_Toc242288587"/>
       <w:r>
         <w:lastRenderedPageBreak/>
-        <w:t>15. Troubleshooting</w:t>
-      </w:r>
-      <w:bookmarkEnd w:id="37"/>
+        <w:t>16. Troubleshooting</w:t>
+      </w:r>
+      <w:bookmarkEnd w:id="42"/>
     </w:p>
     <w:tbl>
       <w:tblPr>
@@ -7816,7 +8734,7 @@
               <w:rPr>
                 <w:sz w:val="20"/>
               </w:rPr>
-              <w:t>Vercel's Deployment Protection is on (section 9). Log in with the Vercel account, or ask the admin to disable it.</w:t>
+              <w:t>Vercel's Deployment Protection is on (section 10). Log in with the Vercel account, or ask the admin to disable it.</w:t>
             </w:r>
           </w:p>
         </w:tc>
@@ -8341,7 +9259,7 @@
               <w:rPr>
                 <w:sz w:val="20"/>
               </w:rPr>
-              <w:t>"Stopped after 50 parts"</w:t>
+              <w:t>Usage tab: "Some programs could not be read"</w:t>
             </w:r>
           </w:p>
         </w:tc>
@@ -8357,7 +9275,26 @@
               <w:rPr>
                 <w:sz w:val="20"/>
               </w:rPr>
-              <w:t>A very long list. Click Preview and Generate again; created keys are skipped.</w:t>
+              <w:t>That program's workspace couldn't be listed (wrong slug or Management key). The other programs are still shown. Check the message, then</w:t>
+            </w:r>
+            <w:r>
+              <w:rPr>
+                <w:sz w:val="20"/>
+              </w:rPr>
+              <w:t xml:space="preserve"> the slug in </w:t>
+            </w:r>
+            <w:r>
+              <w:rPr>
+                <w:rFonts w:ascii="Consolas" w:hAnsi="Consolas"/>
+                <w:sz w:val="20"/>
+              </w:rPr>
+              <w:t>config.js</w:t>
+            </w:r>
+            <w:r>
+              <w:rPr>
+                <w:sz w:val="20"/>
+              </w:rPr>
+              <w:t xml:space="preserve"> or the key.</w:t>
             </w:r>
           </w:p>
         </w:tc>
@@ -8375,7 +9312,7 @@
               <w:rPr>
                 <w:sz w:val="20"/>
               </w:rPr>
-              <w:t>"The connection closed before the run finished"</w:t>
+              <w:t>"Stopped after 50 parts"</w:t>
             </w:r>
           </w:p>
         </w:tc>
@@ -8391,13 +9328,7 @@
               <w:rPr>
                 <w:sz w:val="20"/>
               </w:rPr>
-              <w:t>The internet or tab dropped.</w:t>
-            </w:r>
-            <w:r>
-              <w:rPr>
-                <w:sz w:val="20"/>
-              </w:rPr>
-              <w:t xml:space="preserve"> Click Preview to see what was created, then Generate again.</w:t>
+              <w:t>A very long list. Click Preview and Generate again; created keys are skipped.</w:t>
             </w:r>
           </w:p>
         </w:tc>
@@ -8415,14 +9346,7 @@
               <w:rPr>
                 <w:sz w:val="20"/>
               </w:rPr>
-              <w:t xml:space="preserve">Local: </w:t>
-            </w:r>
-            <w:r>
-              <w:rPr>
-                <w:rFonts w:ascii="Consolas" w:hAnsi="Consolas"/>
-                <w:sz w:val="20"/>
-              </w:rPr>
-              <w:t>Cannot write to generated_openrouter_keys.csv (EBUSY)</w:t>
+              <w:t>"The connection closed before the run finished"</w:t>
             </w:r>
           </w:p>
         </w:tc>
@@ -8438,7 +9362,13 @@
               <w:rPr>
                 <w:sz w:val="20"/>
               </w:rPr>
-              <w:t>The file is open in Excel. Close it and try again.</w:t>
+              <w:t xml:space="preserve">The internet or tab dropped. Click Preview to see what was created, </w:t>
+            </w:r>
+            <w:r>
+              <w:rPr>
+                <w:sz w:val="20"/>
+              </w:rPr>
+              <w:t>then Generate again.</w:t>
             </w:r>
           </w:p>
         </w:tc>
@@ -8463,7 +9393,7 @@
                 <w:rFonts w:ascii="Consolas" w:hAnsi="Consolas"/>
                 <w:sz w:val="20"/>
               </w:rPr>
-              <w:t>… has different columns …</w:t>
+              <w:t>Cannot write to generated_openrouter_keys.csv (EBUSY)</w:t>
             </w:r>
           </w:p>
         </w:tc>
@@ -8479,26 +9409,7 @@
               <w:rPr>
                 <w:sz w:val="20"/>
               </w:rPr>
-              <w:t>The CSV is from an older version. Rename it (e.g</w:t>
-            </w:r>
-            <w:r>
-              <w:rPr>
-                <w:sz w:val="20"/>
-              </w:rPr>
-              <w:t xml:space="preserve">. </w:t>
-            </w:r>
-            <w:r>
-              <w:rPr>
-                <w:rFonts w:ascii="Consolas" w:hAnsi="Consolas"/>
-                <w:sz w:val="20"/>
-              </w:rPr>
-              <w:t>old_keys.csv</w:t>
-            </w:r>
-            <w:r>
-              <w:rPr>
-                <w:sz w:val="20"/>
-              </w:rPr>
-              <w:t>) and run again.</w:t>
+              <w:t>The file is open in Excel. Close it and try again.</w:t>
             </w:r>
           </w:p>
         </w:tc>
@@ -8523,7 +9434,7 @@
                 <w:rFonts w:ascii="Consolas" w:hAnsi="Consolas"/>
                 <w:sz w:val="20"/>
               </w:rPr>
-              <w:t>Port 3000 is already in use</w:t>
+              <w:t>… has different columns …</w:t>
             </w:r>
           </w:p>
         </w:tc>
@@ -8539,7 +9450,20 @@
               <w:rPr>
                 <w:sz w:val="20"/>
               </w:rPr>
-              <w:t>The page is already running in another terminal. Use that one, or close it.</w:t>
+              <w:t xml:space="preserve">The CSV is from an older version. Rename it (e.g. </w:t>
+            </w:r>
+            <w:r>
+              <w:rPr>
+                <w:rFonts w:ascii="Consolas" w:hAnsi="Consolas"/>
+                <w:sz w:val="20"/>
+              </w:rPr>
+              <w:t>old_keys.csv</w:t>
+            </w:r>
+            <w:r>
+              <w:rPr>
+                <w:sz w:val="20"/>
+              </w:rPr>
+              <w:t>) and run again.</w:t>
             </w:r>
           </w:p>
         </w:tc>
@@ -8564,7 +9488,14 @@
                 <w:rFonts w:ascii="Consolas" w:hAnsi="Consolas"/>
                 <w:sz w:val="20"/>
               </w:rPr>
-              <w:t>'npm' is not recognized</w:t>
+              <w:t>P</w:t>
+            </w:r>
+            <w:r>
+              <w:rPr>
+                <w:rFonts w:ascii="Consolas" w:hAnsi="Consolas"/>
+                <w:sz w:val="20"/>
+              </w:rPr>
+              <w:t>ort 3000 is already in use</w:t>
             </w:r>
           </w:p>
         </w:tc>
@@ -8580,6 +9511,47 @@
               <w:rPr>
                 <w:sz w:val="20"/>
               </w:rPr>
+              <w:t>The page is already running in another terminal. Use that one, or close it.</w:t>
+            </w:r>
+          </w:p>
+        </w:tc>
+      </w:tr>
+      <w:tr>
+        <w:tc>
+          <w:tcPr>
+            <w:tcW w:w="3685" w:type="dxa"/>
+          </w:tcPr>
+          <w:p>
+            <w:pPr>
+              <w:spacing w:after="40"/>
+            </w:pPr>
+            <w:r>
+              <w:rPr>
+                <w:sz w:val="20"/>
+              </w:rPr>
+              <w:t xml:space="preserve">Local: </w:t>
+            </w:r>
+            <w:r>
+              <w:rPr>
+                <w:rFonts w:ascii="Consolas" w:hAnsi="Consolas"/>
+                <w:sz w:val="20"/>
+              </w:rPr>
+              <w:t>'npm' is not recognized</w:t>
+            </w:r>
+          </w:p>
+        </w:tc>
+        <w:tc>
+          <w:tcPr>
+            <w:tcW w:w="5669" w:type="dxa"/>
+          </w:tcPr>
+          <w:p>
+            <w:pPr>
+              <w:spacing w:after="40"/>
+            </w:pPr>
+            <w:r>
+              <w:rPr>
+                <w:sz w:val="20"/>
+              </w:rPr>
               <w:t>Install Node.js and open a new terminal.</w:t>
             </w:r>
           </w:p>
@@ -8591,11 +9563,11 @@
       <w:pPr>
         <w:pStyle w:val="Heading1"/>
       </w:pPr>
-      <w:bookmarkStart w:id="38" w:name="_Toc242277834"/>
-      <w:r>
-        <w:t>16. For developers</w:t>
-      </w:r>
-      <w:bookmarkEnd w:id="38"/>
+      <w:bookmarkStart w:id="43" w:name="_Toc242288588"/>
+      <w:r>
+        <w:t>17. For developers</w:t>
+      </w:r>
+      <w:bookmarkEnd w:id="43"/>
     </w:p>
     <w:tbl>
       <w:tblPr>
@@ -8661,6 +9633,7 @@
                 <w:rFonts w:ascii="Consolas" w:hAnsi="Consolas"/>
                 <w:sz w:val="20"/>
               </w:rPr>
+              <w:lastRenderedPageBreak/>
               <w:t>config.js</w:t>
             </w:r>
           </w:p>
@@ -8677,7 +9650,13 @@
               <w:rPr>
                 <w:sz w:val="20"/>
               </w:rPr>
-              <w:t>Programs, regions, limits, sign-in domain, timings, file paths</w:t>
+              <w:t xml:space="preserve">Programs, regions, limits, </w:t>
+            </w:r>
+            <w:r>
+              <w:rPr>
+                <w:sz w:val="20"/>
+              </w:rPr>
+              <w:t>sign-in domain, timings, file paths</w:t>
             </w:r>
           </w:p>
         </w:tc>
@@ -8766,7 +9745,6 @@
                 <w:rFonts w:ascii="Consolas" w:hAnsi="Consolas"/>
                 <w:sz w:val="20"/>
               </w:rPr>
-              <w:lastRenderedPageBreak/>
               <w:t>api/index.js</w:t>
             </w:r>
             <w:r>
@@ -8809,13 +9787,7 @@
               <w:rPr>
                 <w:sz w:val="20"/>
               </w:rPr>
-              <w:t xml:space="preserve">Vercel entry point, routing and time limit, </w:t>
-            </w:r>
-            <w:r>
-              <w:rPr>
-                <w:sz w:val="20"/>
-              </w:rPr>
-              <w:t>upload exclusions</w:t>
+              <w:t>Vercel entry point, routing and time limit, upload exclusions</w:t>
             </w:r>
           </w:p>
         </w:tc>
@@ -8850,7 +9822,13 @@
               <w:rPr>
                 <w:sz w:val="20"/>
               </w:rPr>
-              <w:t>All web routes, shared by the local server and Vercel</w:t>
+              <w:t>All web</w:t>
+            </w:r>
+            <w:r>
+              <w:rPr>
+                <w:sz w:val="20"/>
+              </w:rPr>
+              <w:t xml:space="preserve"> routes, shared by the local server and Vercel</w:t>
             </w:r>
           </w:p>
         </w:tc>
@@ -8939,7 +9917,7 @@
                 <w:rFonts w:ascii="Consolas" w:hAnsi="Consolas"/>
                 <w:sz w:val="20"/>
               </w:rPr>
-              <w:t>lib/openrouter.js</w:t>
+              <w:t>lib/usage.js</w:t>
             </w:r>
           </w:p>
         </w:tc>
@@ -8955,13 +9933,49 @@
               <w:rPr>
                 <w:sz w:val="20"/>
               </w:rPr>
-              <w:t>Management API client and the k</w:t>
-            </w:r>
-            <w:r>
-              <w:rPr>
-                <w:sz w:val="20"/>
-              </w:rPr>
-              <w:t>ey-creation loop</w:t>
+              <w:t>Usage tab data: every program's keys with spend (read-only)</w:t>
+            </w:r>
+          </w:p>
+        </w:tc>
+      </w:tr>
+      <w:tr>
+        <w:tc>
+          <w:tcPr>
+            <w:tcW w:w="3402" w:type="dxa"/>
+          </w:tcPr>
+          <w:p>
+            <w:pPr>
+              <w:spacing w:after="40"/>
+            </w:pPr>
+            <w:r>
+              <w:rPr>
+                <w:rFonts w:ascii="Consolas" w:hAnsi="Consolas"/>
+                <w:sz w:val="20"/>
+              </w:rPr>
+              <w:t>lib/openrouter.</w:t>
+            </w:r>
+            <w:r>
+              <w:rPr>
+                <w:rFonts w:ascii="Consolas" w:hAnsi="Consolas"/>
+                <w:sz w:val="20"/>
+              </w:rPr>
+              <w:t>js</w:t>
+            </w:r>
+          </w:p>
+        </w:tc>
+        <w:tc>
+          <w:tcPr>
+            <w:tcW w:w="5953" w:type="dxa"/>
+          </w:tcPr>
+          <w:p>
+            <w:pPr>
+              <w:spacing w:after="40"/>
+            </w:pPr>
+            <w:r>
+              <w:rPr>
+                <w:sz w:val="20"/>
+              </w:rPr>
+              <w:t>Management API client and the key-creation loop</w:t>
             </w:r>
           </w:p>
         </w:tc>
@@ -21477,7 +22491,7 @@
     <w:autoRedefine/>
     <w:uiPriority w:val="39"/>
     <w:unhideWhenUsed/>
-    <w:rsid w:val="004B77B7"/>
+    <w:rsid w:val="0099510E"/>
     <w:pPr>
       <w:spacing w:after="100"/>
     </w:pPr>
@@ -21489,7 +22503,7 @@
     <w:autoRedefine/>
     <w:uiPriority w:val="39"/>
     <w:unhideWhenUsed/>
-    <w:rsid w:val="004B77B7"/>
+    <w:rsid w:val="0099510E"/>
     <w:pPr>
       <w:spacing w:after="100"/>
       <w:ind w:left="220"/>
@@ -21500,7 +22514,7 @@
     <w:basedOn w:val="DefaultParagraphFont"/>
     <w:uiPriority w:val="99"/>
     <w:unhideWhenUsed/>
-    <w:rsid w:val="004B77B7"/>
+    <w:rsid w:val="0099510E"/>
     <w:rPr>
       <w:color w:val="0000FF" w:themeColor="hyperlink"/>
       <w:u w:val="single"/>
@@ -21834,7 +22848,7 @@
 </file>
 
 <file path=customXml/itemProps1.xml><?xml version="1.0" encoding="utf-8"?>
-<ds:datastoreItem xmlns:ds="http://schemas.openxmlformats.org/officeDocument/2006/customXml" ds:itemID="{A7067938-2B0A-4C41-ADFA-9DB519D4F147}">
+<ds:datastoreItem xmlns:ds="http://schemas.openxmlformats.org/officeDocument/2006/customXml" ds:itemID="{8245732F-B3AC-4116-A1F1-B30E9DBFB9FD}">
   <ds:schemaRefs>
     <ds:schemaRef ds:uri="http://schemas.openxmlformats.org/officeDocument/2006/bibliography"/>
   </ds:schemaRefs>

</xml_diff>

<commit_message>
Add usage trends: monthly spend, spend by AI model, cohort x month
- GET /api/trends?months=1..12 queries OpenRouter analytics per program
  workspace (by key per month, and by key x model); read-only
- Usage tab: monthly spend chart and table, spend-by-model chart,
  monthly-spend-by-cohort table, CSV downloads; same filters as the tab
- Mock analytics endpoint and tests; docs updated

Co-Authored-By: Claude Opus 5.5 <noreply@anthropic.com>
</commit_message>
<xml_diff>
--- a/docs/OpenRouter-Key-Generator-Guide.docx
+++ b/docs/OpenRouter-Key-Generator-Guide.docx
@@ -242,7 +242,7 @@
       <w:r>
         <w:fldChar w:fldCharType="separate"/>
       </w:r>
-      <w:hyperlink w:anchor="_Toc242288546" w:history="1">
+      <w:hyperlink w:anchor="_Toc242289219" w:history="1">
         <w:r>
           <w:rPr>
             <w:rStyle w:val="Hyperlink"/>
@@ -269,7 +269,7 @@
             <w:noProof/>
             <w:webHidden/>
           </w:rPr>
-          <w:instrText xml:space="preserve"> PAGEREF _Toc242288546 \h </w:instrText>
+          <w:instrText xml:space="preserve"> PAGEREF _Toc242289219 \h </w:instrText>
         </w:r>
         <w:r>
           <w:rPr>
@@ -310,7 +310,7 @@
           <w:noProof/>
         </w:rPr>
       </w:pPr>
-      <w:hyperlink w:anchor="_Toc242288547" w:history="1">
+      <w:hyperlink w:anchor="_Toc242289220" w:history="1">
         <w:r>
           <w:rPr>
             <w:rStyle w:val="Hyperlink"/>
@@ -337,7 +337,7 @@
             <w:noProof/>
             <w:webHidden/>
           </w:rPr>
-          <w:instrText xml:space="preserve"> PAGEREF _Toc242288547 \h </w:instrText>
+          <w:instrText xml:space="preserve"> PAGEREF _Toc242289220 \h </w:instrText>
         </w:r>
         <w:r>
           <w:rPr>
@@ -378,7 +378,7 @@
           <w:noProof/>
         </w:rPr>
       </w:pPr>
-      <w:hyperlink w:anchor="_Toc242288548" w:history="1">
+      <w:hyperlink w:anchor="_Toc242289221" w:history="1">
         <w:r>
           <w:rPr>
             <w:rStyle w:val="Hyperlink"/>
@@ -405,7 +405,7 @@
             <w:noProof/>
             <w:webHidden/>
           </w:rPr>
-          <w:instrText xml:space="preserve"> PAGEREF _Toc242288548 \h </w:instrText>
+          <w:instrText xml:space="preserve"> PAGEREF _Toc242289221 \h </w:instrText>
         </w:r>
         <w:r>
           <w:rPr>
@@ -446,7 +446,7 @@
           <w:noProof/>
         </w:rPr>
       </w:pPr>
-      <w:hyperlink w:anchor="_Toc242288549" w:history="1">
+      <w:hyperlink w:anchor="_Toc242289222" w:history="1">
         <w:r>
           <w:rPr>
             <w:rStyle w:val="Hyperlink"/>
@@ -473,7 +473,7 @@
             <w:noProof/>
             <w:webHidden/>
           </w:rPr>
-          <w:instrText xml:space="preserve"> PAGEREF _Toc242288549 \h </w:instrText>
+          <w:instrText xml:space="preserve"> PAGEREF _Toc242289222 \h </w:instrText>
         </w:r>
         <w:r>
           <w:rPr>
@@ -514,7 +514,7 @@
           <w:noProof/>
         </w:rPr>
       </w:pPr>
-      <w:hyperlink w:anchor="_Toc242288550" w:history="1">
+      <w:hyperlink w:anchor="_Toc242289223" w:history="1">
         <w:r>
           <w:rPr>
             <w:rStyle w:val="Hyperlink"/>
@@ -541,7 +541,7 @@
             <w:noProof/>
             <w:webHidden/>
           </w:rPr>
-          <w:instrText xml:space="preserve"> PAGEREF _Toc242288550 \h </w:instrText>
+          <w:instrText xml:space="preserve"> PAGEREF _Toc242289223 \h </w:instrText>
         </w:r>
         <w:r>
           <w:rPr>
@@ -582,7 +582,7 @@
           <w:noProof/>
         </w:rPr>
       </w:pPr>
-      <w:hyperlink w:anchor="_Toc242288551" w:history="1">
+      <w:hyperlink w:anchor="_Toc242289224" w:history="1">
         <w:r>
           <w:rPr>
             <w:rStyle w:val="Hyperlink"/>
@@ -609,7 +609,7 @@
             <w:noProof/>
             <w:webHidden/>
           </w:rPr>
-          <w:instrText xml:space="preserve"> PAGEREF _Toc242288551 \h </w:instrText>
+          <w:instrText xml:space="preserve"> PAGEREF _Toc242289224 \h </w:instrText>
         </w:r>
         <w:r>
           <w:rPr>
@@ -650,7 +650,7 @@
           <w:noProof/>
         </w:rPr>
       </w:pPr>
-      <w:hyperlink w:anchor="_Toc242288552" w:history="1">
+      <w:hyperlink w:anchor="_Toc242289225" w:history="1">
         <w:r>
           <w:rPr>
             <w:rStyle w:val="Hyperlink"/>
@@ -677,7 +677,7 @@
             <w:noProof/>
             <w:webHidden/>
           </w:rPr>
-          <w:instrText xml:space="preserve"> PAGEREF _Toc242288552 \h </w:instrText>
+          <w:instrText xml:space="preserve"> PAGEREF _Toc242289225 \h </w:instrText>
         </w:r>
         <w:r>
           <w:rPr>
@@ -718,7 +718,7 @@
           <w:noProof/>
         </w:rPr>
       </w:pPr>
-      <w:hyperlink w:anchor="_Toc242288553" w:history="1">
+      <w:hyperlink w:anchor="_Toc242289226" w:history="1">
         <w:r>
           <w:rPr>
             <w:rStyle w:val="Hyperlink"/>
@@ -745,7 +745,7 @@
             <w:noProof/>
             <w:webHidden/>
           </w:rPr>
-          <w:instrText xml:space="preserve"> PAGEREF _Toc242288553 \h </w:instrText>
+          <w:instrText xml:space="preserve"> PAGEREF _Toc242289226 \h </w:instrText>
         </w:r>
         <w:r>
           <w:rPr>
@@ -786,7 +786,7 @@
           <w:noProof/>
         </w:rPr>
       </w:pPr>
-      <w:hyperlink w:anchor="_Toc242288554" w:history="1">
+      <w:hyperlink w:anchor="_Toc242289227" w:history="1">
         <w:r>
           <w:rPr>
             <w:rStyle w:val="Hyperlink"/>
@@ -813,7 +813,7 @@
             <w:noProof/>
             <w:webHidden/>
           </w:rPr>
-          <w:instrText xml:space="preserve"> PAGEREF _Toc242288554 \h </w:instrText>
+          <w:instrText xml:space="preserve"> PAGEREF _Toc242289227 \h </w:instrText>
         </w:r>
         <w:r>
           <w:rPr>
@@ -854,7 +854,7 @@
           <w:noProof/>
         </w:rPr>
       </w:pPr>
-      <w:hyperlink w:anchor="_Toc242288555" w:history="1">
+      <w:hyperlink w:anchor="_Toc242289228" w:history="1">
         <w:r>
           <w:rPr>
             <w:rStyle w:val="Hyperlink"/>
@@ -881,7 +881,7 @@
             <w:noProof/>
             <w:webHidden/>
           </w:rPr>
-          <w:instrText xml:space="preserve"> PAGEREF _Toc242288555 \h </w:instrText>
+          <w:instrText xml:space="preserve"> PAGEREF _Toc242289228 \h </w:instrText>
         </w:r>
         <w:r>
           <w:rPr>
@@ -922,7 +922,7 @@
           <w:noProof/>
         </w:rPr>
       </w:pPr>
-      <w:hyperlink w:anchor="_Toc242288556" w:history="1">
+      <w:hyperlink w:anchor="_Toc242289229" w:history="1">
         <w:r>
           <w:rPr>
             <w:rStyle w:val="Hyperlink"/>
@@ -949,7 +949,7 @@
             <w:noProof/>
             <w:webHidden/>
           </w:rPr>
-          <w:instrText xml:space="preserve"> PAGEREF _Toc242288556 \h </w:instrText>
+          <w:instrText xml:space="preserve"> PAGEREF _Toc242289229 \h </w:instrText>
         </w:r>
         <w:r>
           <w:rPr>
@@ -990,7 +990,7 @@
           <w:noProof/>
         </w:rPr>
       </w:pPr>
-      <w:hyperlink w:anchor="_Toc242288557" w:history="1">
+      <w:hyperlink w:anchor="_Toc242289230" w:history="1">
         <w:r>
           <w:rPr>
             <w:rStyle w:val="Hyperlink"/>
@@ -1017,7 +1017,7 @@
             <w:noProof/>
             <w:webHidden/>
           </w:rPr>
-          <w:instrText xml:space="preserve"> PAGEREF _Toc242288557 \h </w:instrText>
+          <w:instrText xml:space="preserve"> PAGEREF _Toc242289230 \h </w:instrText>
         </w:r>
         <w:r>
           <w:rPr>
@@ -1058,7 +1058,7 @@
           <w:noProof/>
         </w:rPr>
       </w:pPr>
-      <w:hyperlink w:anchor="_Toc242288558" w:history="1">
+      <w:hyperlink w:anchor="_Toc242289231" w:history="1">
         <w:r>
           <w:rPr>
             <w:rStyle w:val="Hyperlink"/>
@@ -1085,7 +1085,7 @@
             <w:noProof/>
             <w:webHidden/>
           </w:rPr>
-          <w:instrText xml:space="preserve"> PAGEREF _Toc242288558 \h </w:instrText>
+          <w:instrText xml:space="preserve"> PAGEREF _Toc242289231 \h </w:instrText>
         </w:r>
         <w:r>
           <w:rPr>
@@ -1126,7 +1126,7 @@
           <w:noProof/>
         </w:rPr>
       </w:pPr>
-      <w:hyperlink w:anchor="_Toc242288559" w:history="1">
+      <w:hyperlink w:anchor="_Toc242289232" w:history="1">
         <w:r>
           <w:rPr>
             <w:rStyle w:val="Hyperlink"/>
@@ -1153,7 +1153,7 @@
             <w:noProof/>
             <w:webHidden/>
           </w:rPr>
-          <w:instrText xml:space="preserve"> PAGEREF _Toc242288559 \h </w:instrText>
+          <w:instrText xml:space="preserve"> PAGEREF _Toc242289232 \h </w:instrText>
         </w:r>
         <w:r>
           <w:rPr>
@@ -1194,7 +1194,7 @@
           <w:noProof/>
         </w:rPr>
       </w:pPr>
-      <w:hyperlink w:anchor="_Toc242288560" w:history="1">
+      <w:hyperlink w:anchor="_Toc242289233" w:history="1">
         <w:r>
           <w:rPr>
             <w:rStyle w:val="Hyperlink"/>
@@ -1221,7 +1221,7 @@
             <w:noProof/>
             <w:webHidden/>
           </w:rPr>
-          <w:instrText xml:space="preserve"> PAGEREF _Toc242288560 \h </w:instrText>
+          <w:instrText xml:space="preserve"> PAGEREF _Toc242289233 \h </w:instrText>
         </w:r>
         <w:r>
           <w:rPr>
@@ -1262,7 +1262,7 @@
           <w:noProof/>
         </w:rPr>
       </w:pPr>
-      <w:hyperlink w:anchor="_Toc242288561" w:history="1">
+      <w:hyperlink w:anchor="_Toc242289234" w:history="1">
         <w:r>
           <w:rPr>
             <w:rStyle w:val="Hyperlink"/>
@@ -1289,7 +1289,7 @@
             <w:noProof/>
             <w:webHidden/>
           </w:rPr>
-          <w:instrText xml:space="preserve"> PAGEREF _Toc242288561 \h </w:instrText>
+          <w:instrText xml:space="preserve"> PAGEREF _Toc242289234 \h </w:instrText>
         </w:r>
         <w:r>
           <w:rPr>
@@ -1330,7 +1330,7 @@
           <w:noProof/>
         </w:rPr>
       </w:pPr>
-      <w:hyperlink w:anchor="_Toc242288562" w:history="1">
+      <w:hyperlink w:anchor="_Toc242289235" w:history="1">
         <w:r>
           <w:rPr>
             <w:rStyle w:val="Hyperlink"/>
@@ -1357,7 +1357,7 @@
             <w:noProof/>
             <w:webHidden/>
           </w:rPr>
-          <w:instrText xml:space="preserve"> PAGEREF _Toc242288562 \h </w:instrText>
+          <w:instrText xml:space="preserve"> PAGEREF _Toc242289235 \h </w:instrText>
         </w:r>
         <w:r>
           <w:rPr>
@@ -1398,7 +1398,7 @@
           <w:noProof/>
         </w:rPr>
       </w:pPr>
-      <w:hyperlink w:anchor="_Toc242288563" w:history="1">
+      <w:hyperlink w:anchor="_Toc242289236" w:history="1">
         <w:r>
           <w:rPr>
             <w:rStyle w:val="Hyperlink"/>
@@ -1425,7 +1425,7 @@
             <w:noProof/>
             <w:webHidden/>
           </w:rPr>
-          <w:instrText xml:space="preserve"> PAGEREF _Toc242288563 \h </w:instrText>
+          <w:instrText xml:space="preserve"> PAGEREF _Toc242289236 \h </w:instrText>
         </w:r>
         <w:r>
           <w:rPr>
@@ -1466,7 +1466,7 @@
           <w:noProof/>
         </w:rPr>
       </w:pPr>
-      <w:hyperlink w:anchor="_Toc242288564" w:history="1">
+      <w:hyperlink w:anchor="_Toc242289237" w:history="1">
         <w:r>
           <w:rPr>
             <w:rStyle w:val="Hyperlink"/>
@@ -1493,7 +1493,7 @@
             <w:noProof/>
             <w:webHidden/>
           </w:rPr>
-          <w:instrText xml:space="preserve"> PAGEREF _Toc242288564 \h </w:instrText>
+          <w:instrText xml:space="preserve"> PAGEREF _Toc242289237 \h </w:instrText>
         </w:r>
         <w:r>
           <w:rPr>
@@ -1534,7 +1534,7 @@
           <w:noProof/>
         </w:rPr>
       </w:pPr>
-      <w:hyperlink w:anchor="_Toc242288565" w:history="1">
+      <w:hyperlink w:anchor="_Toc242289238" w:history="1">
         <w:r>
           <w:rPr>
             <w:rStyle w:val="Hyperlink"/>
@@ -1561,7 +1561,7 @@
             <w:noProof/>
             <w:webHidden/>
           </w:rPr>
-          <w:instrText xml:space="preserve"> PAGEREF _Toc242288565 \h </w:instrText>
+          <w:instrText xml:space="preserve"> PAGEREF _Toc242289238 \h </w:instrText>
         </w:r>
         <w:r>
           <w:rPr>
@@ -1602,7 +1602,7 @@
           <w:noProof/>
         </w:rPr>
       </w:pPr>
-      <w:hyperlink w:anchor="_Toc242288566" w:history="1">
+      <w:hyperlink w:anchor="_Toc242289239" w:history="1">
         <w:r>
           <w:rPr>
             <w:rStyle w:val="Hyperlink"/>
@@ -1629,7 +1629,7 @@
             <w:noProof/>
             <w:webHidden/>
           </w:rPr>
-          <w:instrText xml:space="preserve"> PAGEREF _Toc242288566 \h </w:instrText>
+          <w:instrText xml:space="preserve"> PAGEREF _Toc242289239 \h </w:instrText>
         </w:r>
         <w:r>
           <w:rPr>
@@ -1670,7 +1670,7 @@
           <w:noProof/>
         </w:rPr>
       </w:pPr>
-      <w:hyperlink w:anchor="_Toc242288567" w:history="1">
+      <w:hyperlink w:anchor="_Toc242289240" w:history="1">
         <w:r>
           <w:rPr>
             <w:rStyle w:val="Hyperlink"/>
@@ -1697,7 +1697,7 @@
             <w:noProof/>
             <w:webHidden/>
           </w:rPr>
-          <w:instrText xml:space="preserve"> PAGEREF _Toc242288567 \h </w:instrText>
+          <w:instrText xml:space="preserve"> PAGEREF _Toc242289240 \h </w:instrText>
         </w:r>
         <w:r>
           <w:rPr>
@@ -1717,7 +1717,7 @@
             <w:noProof/>
             <w:webHidden/>
           </w:rPr>
-          <w:t>8</w:t>
+          <w:t>9</w:t>
         </w:r>
         <w:r>
           <w:rPr>
@@ -1738,7 +1738,7 @@
           <w:noProof/>
         </w:rPr>
       </w:pPr>
-      <w:hyperlink w:anchor="_Toc242288568" w:history="1">
+      <w:hyperlink w:anchor="_Toc242289241" w:history="1">
         <w:r>
           <w:rPr>
             <w:rStyle w:val="Hyperlink"/>
@@ -1765,7 +1765,7 @@
             <w:noProof/>
             <w:webHidden/>
           </w:rPr>
-          <w:instrText xml:space="preserve"> PAGEREF _Toc242288568 \h </w:instrText>
+          <w:instrText xml:space="preserve"> PAGEREF _Toc242289241 \h </w:instrText>
         </w:r>
         <w:r>
           <w:rPr>
@@ -1785,7 +1785,7 @@
             <w:noProof/>
             <w:webHidden/>
           </w:rPr>
-          <w:t>8</w:t>
+          <w:t>9</w:t>
         </w:r>
         <w:r>
           <w:rPr>
@@ -1806,7 +1806,7 @@
           <w:noProof/>
         </w:rPr>
       </w:pPr>
-      <w:hyperlink w:anchor="_Toc242288569" w:history="1">
+      <w:hyperlink w:anchor="_Toc242289242" w:history="1">
         <w:r>
           <w:rPr>
             <w:rStyle w:val="Hyperlink"/>
@@ -1833,7 +1833,7 @@
             <w:noProof/>
             <w:webHidden/>
           </w:rPr>
-          <w:instrText xml:space="preserve"> PAGEREF _Toc242288569 \h </w:instrText>
+          <w:instrText xml:space="preserve"> PAGEREF _Toc242289242 \h </w:instrText>
         </w:r>
         <w:r>
           <w:rPr>
@@ -1874,7 +1874,7 @@
           <w:noProof/>
         </w:rPr>
       </w:pPr>
-      <w:hyperlink w:anchor="_Toc242288570" w:history="1">
+      <w:hyperlink w:anchor="_Toc242289243" w:history="1">
         <w:r>
           <w:rPr>
             <w:rStyle w:val="Hyperlink"/>
@@ -1901,7 +1901,7 @@
             <w:noProof/>
             <w:webHidden/>
           </w:rPr>
-          <w:instrText xml:space="preserve"> PAGEREF _Toc242288570 \h </w:instrText>
+          <w:instrText xml:space="preserve"> PAGEREF _Toc242289243 \h </w:instrText>
         </w:r>
         <w:r>
           <w:rPr>
@@ -1942,7 +1942,7 @@
           <w:noProof/>
         </w:rPr>
       </w:pPr>
-      <w:hyperlink w:anchor="_Toc242288571" w:history="1">
+      <w:hyperlink w:anchor="_Toc242289244" w:history="1">
         <w:r>
           <w:rPr>
             <w:rStyle w:val="Hyperlink"/>
@@ -1969,7 +1969,7 @@
             <w:noProof/>
             <w:webHidden/>
           </w:rPr>
-          <w:instrText xml:space="preserve"> PAGEREF _Toc242288571 \h </w:instrText>
+          <w:instrText xml:space="preserve"> PAGEREF _Toc242289244 \h </w:instrText>
         </w:r>
         <w:r>
           <w:rPr>
@@ -2010,7 +2010,7 @@
           <w:noProof/>
         </w:rPr>
       </w:pPr>
-      <w:hyperlink w:anchor="_Toc242288572" w:history="1">
+      <w:hyperlink w:anchor="_Toc242289245" w:history="1">
         <w:r>
           <w:rPr>
             <w:rStyle w:val="Hyperlink"/>
@@ -2037,7 +2037,7 @@
             <w:noProof/>
             <w:webHidden/>
           </w:rPr>
-          <w:instrText xml:space="preserve"> PAGEREF _Toc242288572 \h </w:instrText>
+          <w:instrText xml:space="preserve"> PAGEREF _Toc242289245 \h </w:instrText>
         </w:r>
         <w:r>
           <w:rPr>
@@ -2057,7 +2057,7 @@
             <w:noProof/>
             <w:webHidden/>
           </w:rPr>
-          <w:t>9</w:t>
+          <w:t>10</w:t>
         </w:r>
         <w:r>
           <w:rPr>
@@ -2078,7 +2078,7 @@
           <w:noProof/>
         </w:rPr>
       </w:pPr>
-      <w:hyperlink w:anchor="_Toc242288573" w:history="1">
+      <w:hyperlink w:anchor="_Toc242289246" w:history="1">
         <w:r>
           <w:rPr>
             <w:rStyle w:val="Hyperlink"/>
@@ -2105,7 +2105,7 @@
             <w:noProof/>
             <w:webHidden/>
           </w:rPr>
-          <w:instrText xml:space="preserve"> PAGEREF _Toc242288573 \h </w:instrText>
+          <w:instrText xml:space="preserve"> PAGEREF _Toc242289246 \h </w:instrText>
         </w:r>
         <w:r>
           <w:rPr>
@@ -2146,7 +2146,7 @@
           <w:noProof/>
         </w:rPr>
       </w:pPr>
-      <w:hyperlink w:anchor="_Toc242288574" w:history="1">
+      <w:hyperlink w:anchor="_Toc242289247" w:history="1">
         <w:r>
           <w:rPr>
             <w:rStyle w:val="Hyperlink"/>
@@ -2173,7 +2173,7 @@
             <w:noProof/>
             <w:webHidden/>
           </w:rPr>
-          <w:instrText xml:space="preserve"> PAGEREF _Toc242288574 \h </w:instrText>
+          <w:instrText xml:space="preserve"> PAGEREF _Toc242289247 \h </w:instrText>
         </w:r>
         <w:r>
           <w:rPr>
@@ -2214,7 +2214,7 @@
           <w:noProof/>
         </w:rPr>
       </w:pPr>
-      <w:hyperlink w:anchor="_Toc242288575" w:history="1">
+      <w:hyperlink w:anchor="_Toc242289248" w:history="1">
         <w:r>
           <w:rPr>
             <w:rStyle w:val="Hyperlink"/>
@@ -2241,7 +2241,7 @@
             <w:noProof/>
             <w:webHidden/>
           </w:rPr>
-          <w:instrText xml:space="preserve"> PAGEREF _Toc242288575 \h </w:instrText>
+          <w:instrText xml:space="preserve"> PAGEREF _Toc242289248 \h </w:instrText>
         </w:r>
         <w:r>
           <w:rPr>
@@ -2282,7 +2282,7 @@
           <w:noProof/>
         </w:rPr>
       </w:pPr>
-      <w:hyperlink w:anchor="_Toc242288576" w:history="1">
+      <w:hyperlink w:anchor="_Toc242289249" w:history="1">
         <w:r>
           <w:rPr>
             <w:rStyle w:val="Hyperlink"/>
@@ -2309,7 +2309,7 @@
             <w:noProof/>
             <w:webHidden/>
           </w:rPr>
-          <w:instrText xml:space="preserve"> PAGEREF _Toc242288576 \h </w:instrText>
+          <w:instrText xml:space="preserve"> PAGEREF _Toc242289249 \h </w:instrText>
         </w:r>
         <w:r>
           <w:rPr>
@@ -2350,7 +2350,7 @@
           <w:noProof/>
         </w:rPr>
       </w:pPr>
-      <w:hyperlink w:anchor="_Toc242288577" w:history="1">
+      <w:hyperlink w:anchor="_Toc242289250" w:history="1">
         <w:r>
           <w:rPr>
             <w:rStyle w:val="Hyperlink"/>
@@ -2377,7 +2377,7 @@
             <w:noProof/>
             <w:webHidden/>
           </w:rPr>
-          <w:instrText xml:space="preserve"> PAGEREF _Toc242288577 \h </w:instrText>
+          <w:instrText xml:space="preserve"> PAGEREF _Toc242289250 \h </w:instrText>
         </w:r>
         <w:r>
           <w:rPr>
@@ -2397,7 +2397,7 @@
             <w:noProof/>
             <w:webHidden/>
           </w:rPr>
-          <w:t>10</w:t>
+          <w:t>11</w:t>
         </w:r>
         <w:r>
           <w:rPr>
@@ -2418,7 +2418,7 @@
           <w:noProof/>
         </w:rPr>
       </w:pPr>
-      <w:hyperlink w:anchor="_Toc242288578" w:history="1">
+      <w:hyperlink w:anchor="_Toc242289251" w:history="1">
         <w:r>
           <w:rPr>
             <w:rStyle w:val="Hyperlink"/>
@@ -2445,7 +2445,7 @@
             <w:noProof/>
             <w:webHidden/>
           </w:rPr>
-          <w:instrText xml:space="preserve"> PAGEREF _Toc242288578 \h </w:instrText>
+          <w:instrText xml:space="preserve"> PAGEREF _Toc242289251 \h </w:instrText>
         </w:r>
         <w:r>
           <w:rPr>
@@ -2465,7 +2465,7 @@
             <w:noProof/>
             <w:webHidden/>
           </w:rPr>
-          <w:t>10</w:t>
+          <w:t>11</w:t>
         </w:r>
         <w:r>
           <w:rPr>
@@ -2486,7 +2486,7 @@
           <w:noProof/>
         </w:rPr>
       </w:pPr>
-      <w:hyperlink w:anchor="_Toc242288579" w:history="1">
+      <w:hyperlink w:anchor="_Toc242289252" w:history="1">
         <w:r>
           <w:rPr>
             <w:rStyle w:val="Hyperlink"/>
@@ -2513,7 +2513,7 @@
             <w:noProof/>
             <w:webHidden/>
           </w:rPr>
-          <w:instrText xml:space="preserve"> PAGEREF _Toc242288579 \h </w:instrText>
+          <w:instrText xml:space="preserve"> PAGEREF _Toc242289252 \h </w:instrText>
         </w:r>
         <w:r>
           <w:rPr>
@@ -2554,7 +2554,7 @@
           <w:noProof/>
         </w:rPr>
       </w:pPr>
-      <w:hyperlink w:anchor="_Toc242288580" w:history="1">
+      <w:hyperlink w:anchor="_Toc242289253" w:history="1">
         <w:r>
           <w:rPr>
             <w:rStyle w:val="Hyperlink"/>
@@ -2581,7 +2581,7 @@
             <w:noProof/>
             <w:webHidden/>
           </w:rPr>
-          <w:instrText xml:space="preserve"> PAGEREF _Toc242288580 \h </w:instrText>
+          <w:instrText xml:space="preserve"> PAGEREF _Toc242289253 \h </w:instrText>
         </w:r>
         <w:r>
           <w:rPr>
@@ -2622,7 +2622,7 @@
           <w:noProof/>
         </w:rPr>
       </w:pPr>
-      <w:hyperlink w:anchor="_Toc242288581" w:history="1">
+      <w:hyperlink w:anchor="_Toc242289254" w:history="1">
         <w:r>
           <w:rPr>
             <w:rStyle w:val="Hyperlink"/>
@@ -2649,7 +2649,7 @@
             <w:noProof/>
             <w:webHidden/>
           </w:rPr>
-          <w:instrText xml:space="preserve"> PAGEREF _Toc242288581 \h </w:instrText>
+          <w:instrText xml:space="preserve"> PAGEREF _Toc242289254 \h </w:instrText>
         </w:r>
         <w:r>
           <w:rPr>
@@ -2690,7 +2690,7 @@
           <w:noProof/>
         </w:rPr>
       </w:pPr>
-      <w:hyperlink w:anchor="_Toc242288582" w:history="1">
+      <w:hyperlink w:anchor="_Toc242289255" w:history="1">
         <w:r>
           <w:rPr>
             <w:rStyle w:val="Hyperlink"/>
@@ -2717,7 +2717,7 @@
             <w:noProof/>
             <w:webHidden/>
           </w:rPr>
-          <w:instrText xml:space="preserve"> PAGEREF _Toc242288582 \h </w:instrText>
+          <w:instrText xml:space="preserve"> PAGEREF _Toc242289255 \h </w:instrText>
         </w:r>
         <w:r>
           <w:rPr>
@@ -2758,7 +2758,7 @@
           <w:noProof/>
         </w:rPr>
       </w:pPr>
-      <w:hyperlink w:anchor="_Toc242288583" w:history="1">
+      <w:hyperlink w:anchor="_Toc242289256" w:history="1">
         <w:r>
           <w:rPr>
             <w:rStyle w:val="Hyperlink"/>
@@ -2785,7 +2785,7 @@
             <w:noProof/>
             <w:webHidden/>
           </w:rPr>
-          <w:instrText xml:space="preserve"> PAGEREF _Toc242288583 \h </w:instrText>
+          <w:instrText xml:space="preserve"> PAGEREF _Toc242289256 \h </w:instrText>
         </w:r>
         <w:r>
           <w:rPr>
@@ -2805,7 +2805,7 @@
             <w:noProof/>
             <w:webHidden/>
           </w:rPr>
-          <w:t>11</w:t>
+          <w:t>12</w:t>
         </w:r>
         <w:r>
           <w:rPr>
@@ -2826,7 +2826,7 @@
           <w:noProof/>
         </w:rPr>
       </w:pPr>
-      <w:hyperlink w:anchor="_Toc242288584" w:history="1">
+      <w:hyperlink w:anchor="_Toc242289257" w:history="1">
         <w:r>
           <w:rPr>
             <w:rStyle w:val="Hyperlink"/>
@@ -2853,7 +2853,7 @@
             <w:noProof/>
             <w:webHidden/>
           </w:rPr>
-          <w:instrText xml:space="preserve"> PAGEREF _Toc242288584 \h </w:instrText>
+          <w:instrText xml:space="preserve"> PAGEREF _Toc242289257 \h </w:instrText>
         </w:r>
         <w:r>
           <w:rPr>
@@ -2873,7 +2873,7 @@
             <w:noProof/>
             <w:webHidden/>
           </w:rPr>
-          <w:t>11</w:t>
+          <w:t>12</w:t>
         </w:r>
         <w:r>
           <w:rPr>
@@ -2894,7 +2894,7 @@
           <w:noProof/>
         </w:rPr>
       </w:pPr>
-      <w:hyperlink w:anchor="_Toc242288585" w:history="1">
+      <w:hyperlink w:anchor="_Toc242289258" w:history="1">
         <w:r>
           <w:rPr>
             <w:rStyle w:val="Hyperlink"/>
@@ -2921,7 +2921,7 @@
             <w:noProof/>
             <w:webHidden/>
           </w:rPr>
-          <w:instrText xml:space="preserve"> PAGEREF _Toc242288585 \h </w:instrText>
+          <w:instrText xml:space="preserve"> PAGEREF _Toc242289258 \h </w:instrText>
         </w:r>
         <w:r>
           <w:rPr>
@@ -2962,7 +2962,7 @@
           <w:noProof/>
         </w:rPr>
       </w:pPr>
-      <w:hyperlink w:anchor="_Toc242288586" w:history="1">
+      <w:hyperlink w:anchor="_Toc242289259" w:history="1">
         <w:r>
           <w:rPr>
             <w:rStyle w:val="Hyperlink"/>
@@ -2989,7 +2989,7 @@
             <w:noProof/>
             <w:webHidden/>
           </w:rPr>
-          <w:instrText xml:space="preserve"> PAGEREF _Toc242288586 \h </w:instrText>
+          <w:instrText xml:space="preserve"> PAGEREF _Toc242289259 \h </w:instrText>
         </w:r>
         <w:r>
           <w:rPr>
@@ -3030,7 +3030,7 @@
           <w:noProof/>
         </w:rPr>
       </w:pPr>
-      <w:hyperlink w:anchor="_Toc242288587" w:history="1">
+      <w:hyperlink w:anchor="_Toc242289260" w:history="1">
         <w:r>
           <w:rPr>
             <w:rStyle w:val="Hyperlink"/>
@@ -3057,7 +3057,7 @@
             <w:noProof/>
             <w:webHidden/>
           </w:rPr>
-          <w:instrText xml:space="preserve"> PAGEREF _Toc242288587 \h </w:instrText>
+          <w:instrText xml:space="preserve"> PAGEREF _Toc242289260 \h </w:instrText>
         </w:r>
         <w:r>
           <w:rPr>
@@ -3098,7 +3098,7 @@
           <w:noProof/>
         </w:rPr>
       </w:pPr>
-      <w:hyperlink w:anchor="_Toc242288588" w:history="1">
+      <w:hyperlink w:anchor="_Toc242289261" w:history="1">
         <w:r>
           <w:rPr>
             <w:rStyle w:val="Hyperlink"/>
@@ -3125,7 +3125,7 @@
             <w:noProof/>
             <w:webHidden/>
           </w:rPr>
-          <w:instrText xml:space="preserve"> PAGEREF _Toc242288588 \h </w:instrText>
+          <w:instrText xml:space="preserve"> PAGEREF _Toc242289261 \h </w:instrText>
         </w:r>
         <w:r>
           <w:rPr>
@@ -3145,7 +3145,7 @@
             <w:noProof/>
             <w:webHidden/>
           </w:rPr>
-          <w:t>13</w:t>
+          <w:t>14</w:t>
         </w:r>
         <w:r>
           <w:rPr>
@@ -3170,7 +3170,7 @@
       <w:pPr>
         <w:pStyle w:val="Heading1"/>
       </w:pPr>
-      <w:bookmarkStart w:id="1" w:name="_Toc242288546"/>
+      <w:bookmarkStart w:id="1" w:name="_Toc242289219"/>
       <w:r>
         <w:lastRenderedPageBreak/>
         <w:t>1. Overview</w:t>
@@ -3267,7 +3267,7 @@
       <w:pPr>
         <w:pStyle w:val="Heading2"/>
       </w:pPr>
-      <w:bookmarkStart w:id="2" w:name="_Toc242288547"/>
+      <w:bookmarkStart w:id="2" w:name="_Toc242289220"/>
       <w:r>
         <w:t>Three ways to use it</w:t>
       </w:r>
@@ -3602,7 +3602,7 @@
       <w:pPr>
         <w:pStyle w:val="Heading1"/>
       </w:pPr>
-      <w:bookmarkStart w:id="3" w:name="_Toc242288548"/>
+      <w:bookmarkStart w:id="3" w:name="_Toc242289221"/>
       <w:r>
         <w:t>2. Who can use the online site</w:t>
       </w:r>
@@ -3715,7 +3715,7 @@
       <w:pPr>
         <w:pStyle w:val="Heading1"/>
       </w:pPr>
-      <w:bookmarkStart w:id="4" w:name="_Toc242288549"/>
+      <w:bookmarkStart w:id="4" w:name="_Toc242289222"/>
       <w:r>
         <w:lastRenderedPageBreak/>
         <w:t>3. Key concepts</w:t>
@@ -3726,7 +3726,7 @@
       <w:pPr>
         <w:pStyle w:val="Heading2"/>
       </w:pPr>
-      <w:bookmarkStart w:id="5" w:name="_Toc242288550"/>
+      <w:bookmarkStart w:id="5" w:name="_Toc242289223"/>
       <w:r>
         <w:t>Programs and workspaces</w:t>
       </w:r>
@@ -4043,7 +4043,7 @@
       <w:pPr>
         <w:pStyle w:val="Heading2"/>
       </w:pPr>
-      <w:bookmarkStart w:id="6" w:name="_Toc242288551"/>
+      <w:bookmarkStart w:id="6" w:name="_Toc242289224"/>
       <w:r>
         <w:t>Key names</w:t>
       </w:r>
@@ -4415,7 +4415,7 @@
       <w:pPr>
         <w:pStyle w:val="Heading2"/>
       </w:pPr>
-      <w:bookmarkStart w:id="7" w:name="_Toc242288552"/>
+      <w:bookmarkStart w:id="7" w:name="_Toc242289225"/>
       <w:r>
         <w:t>Running twice is safe</w:t>
       </w:r>
@@ -4451,7 +4451,7 @@
       <w:pPr>
         <w:pStyle w:val="Heading2"/>
       </w:pPr>
-      <w:bookmarkStart w:id="8" w:name="_Toc242288553"/>
+      <w:bookmarkStart w:id="8" w:name="_Toc242289226"/>
       <w:r>
         <w:t>Credit limits</w:t>
       </w:r>
@@ -4551,7 +4551,7 @@
       <w:pPr>
         <w:pStyle w:val="Heading1"/>
       </w:pPr>
-      <w:bookmarkStart w:id="9" w:name="_Toc242288554"/>
+      <w:bookmarkStart w:id="9" w:name="_Toc242289227"/>
       <w:r>
         <w:lastRenderedPageBreak/>
         <w:t>4. Preparing the learner list (CSV)</w:t>
@@ -4605,7 +4605,7 @@
       <w:pPr>
         <w:pStyle w:val="Heading2"/>
       </w:pPr>
-      <w:bookmarkStart w:id="10" w:name="_Toc242288555"/>
+      <w:bookmarkStart w:id="10" w:name="_Toc242289228"/>
       <w:r>
         <w:t>Using the template</w:t>
       </w:r>
@@ -4657,7 +4657,7 @@
       <w:pPr>
         <w:pStyle w:val="Heading2"/>
       </w:pPr>
-      <w:bookmarkStart w:id="11" w:name="_Toc242288556"/>
+      <w:bookmarkStart w:id="11" w:name="_Toc242289229"/>
       <w:r>
         <w:t>Rules</w:t>
       </w:r>
@@ -4740,7 +4740,7 @@
       <w:pPr>
         <w:pStyle w:val="Heading1"/>
       </w:pPr>
-      <w:bookmarkStart w:id="12" w:name="_Toc242288557"/>
+      <w:bookmarkStart w:id="12" w:name="_Toc242289230"/>
       <w:r>
         <w:t>5. Creating keys on the online site</w:t>
       </w:r>
@@ -4750,7 +4750,7 @@
       <w:pPr>
         <w:pStyle w:val="Heading2"/>
       </w:pPr>
-      <w:bookmarkStart w:id="13" w:name="_Toc242288558"/>
+      <w:bookmarkStart w:id="13" w:name="_Toc242289231"/>
       <w:r>
         <w:t>Step by step</w:t>
       </w:r>
@@ -5008,7 +5008,7 @@
       <w:pPr>
         <w:pStyle w:val="Heading2"/>
       </w:pPr>
-      <w:bookmarkStart w:id="14" w:name="_Toc242288559"/>
+      <w:bookmarkStart w:id="14" w:name="_Toc242289232"/>
       <w:r>
         <w:lastRenderedPageBreak/>
         <w:t>Big lists</w:t>
@@ -5039,7 +5039,7 @@
       <w:pPr>
         <w:pStyle w:val="Heading2"/>
       </w:pPr>
-      <w:bookmarkStart w:id="15" w:name="_Toc242288560"/>
+      <w:bookmarkStart w:id="15" w:name="_Toc242289233"/>
       <w:r>
         <w:t>If something fails</w:t>
       </w:r>
@@ -5133,7 +5133,7 @@
       <w:pPr>
         <w:pStyle w:val="Heading1"/>
       </w:pPr>
-      <w:bookmarkStart w:id="16" w:name="_Toc242288561"/>
+      <w:bookmarkStart w:id="16" w:name="_Toc242289234"/>
       <w:r>
         <w:t>6. Finding and sharing the generated keys</w:t>
       </w:r>
@@ -5302,7 +5302,7 @@
       <w:pPr>
         <w:pStyle w:val="Heading1"/>
       </w:pPr>
-      <w:bookmarkStart w:id="17" w:name="_Toc242288562"/>
+      <w:bookmarkStart w:id="17" w:name="_Toc242289235"/>
       <w:r>
         <w:t>7. Usage reports for leadership</w:t>
       </w:r>
@@ -5335,7 +5335,7 @@
       <w:pPr>
         <w:pStyle w:val="Heading2"/>
       </w:pPr>
-      <w:bookmarkStart w:id="18" w:name="_Toc242288563"/>
+      <w:bookmarkStart w:id="18" w:name="_Toc242289236"/>
       <w:r>
         <w:t>What it shows</w:t>
       </w:r>
@@ -5627,15 +5627,132 @@
           </w:p>
         </w:tc>
       </w:tr>
+      <w:tr>
+        <w:tc>
+          <w:tcPr>
+            <w:tcW w:w="1984" w:type="dxa"/>
+          </w:tcPr>
+          <w:p>
+            <w:pPr>
+              <w:spacing w:after="40"/>
+            </w:pPr>
+            <w:r>
+              <w:rPr>
+                <w:sz w:val="20"/>
+              </w:rPr>
+              <w:t>M</w:t>
+            </w:r>
+            <w:r>
+              <w:rPr>
+                <w:sz w:val="20"/>
+              </w:rPr>
+              <w:t>onthly spend</w:t>
+            </w:r>
+          </w:p>
+        </w:tc>
+        <w:tc>
+          <w:tcPr>
+            <w:tcW w:w="7370" w:type="dxa"/>
+          </w:tcPr>
+          <w:p>
+            <w:pPr>
+              <w:spacing w:after="40"/>
+            </w:pPr>
+            <w:r>
+              <w:rPr>
+                <w:sz w:val="20"/>
+              </w:rPr>
+              <w:t>A column per calendar month for the last 3, 6 or 12 months (choose in the box on the card), and a table with spend, requests, tokens, active learners and spend per active learner for each month.</w:t>
+            </w:r>
+          </w:p>
+        </w:tc>
+      </w:tr>
+      <w:tr>
+        <w:tc>
+          <w:tcPr>
+            <w:tcW w:w="1984" w:type="dxa"/>
+          </w:tcPr>
+          <w:p>
+            <w:pPr>
+              <w:spacing w:after="40"/>
+            </w:pPr>
+            <w:r>
+              <w:rPr>
+                <w:sz w:val="20"/>
+              </w:rPr>
+              <w:t>Spend by AI model</w:t>
+            </w:r>
+          </w:p>
+        </w:tc>
+        <w:tc>
+          <w:tcPr>
+            <w:tcW w:w="7370" w:type="dxa"/>
+          </w:tcPr>
+          <w:p>
+            <w:pPr>
+              <w:spacing w:after="40"/>
+            </w:pPr>
+            <w:r>
+              <w:rPr>
+                <w:sz w:val="20"/>
+              </w:rPr>
+              <w:t>Which AI models learners use:</w:t>
+            </w:r>
+            <w:r>
+              <w:rPr>
+                <w:sz w:val="20"/>
+              </w:rPr>
+              <w:t xml:space="preserve"> spend, share of total, requests, tokens and how many learners used each (top 10; the rest are grouped as Other models).</w:t>
+            </w:r>
+          </w:p>
+        </w:tc>
+      </w:tr>
+      <w:tr>
+        <w:tc>
+          <w:tcPr>
+            <w:tcW w:w="1984" w:type="dxa"/>
+          </w:tcPr>
+          <w:p>
+            <w:pPr>
+              <w:spacing w:after="40"/>
+            </w:pPr>
+            <w:r>
+              <w:rPr>
+                <w:sz w:val="20"/>
+              </w:rPr>
+              <w:t>Monthly spend by cohort</w:t>
+            </w:r>
+          </w:p>
+        </w:tc>
+        <w:tc>
+          <w:tcPr>
+            <w:tcW w:w="7370" w:type="dxa"/>
+          </w:tcPr>
+          <w:p>
+            <w:pPr>
+              <w:spacing w:after="40"/>
+            </w:pPr>
+            <w:r>
+              <w:rPr>
+                <w:sz w:val="20"/>
+              </w:rPr>
+              <w:t>One row per cohort and one column per month, with a total. Ready to paste into a slide.</w:t>
+            </w:r>
+          </w:p>
+        </w:tc>
+      </w:tr>
     </w:tbl>
     <w:p/>
     <w:p>
       <w:pPr>
         <w:pStyle w:val="Heading2"/>
       </w:pPr>
-      <w:bookmarkStart w:id="19" w:name="_Toc242288564"/>
-      <w:r>
-        <w:t>Filtering and sorting</w:t>
+      <w:bookmarkStart w:id="19" w:name="_Toc242289237"/>
+      <w:r>
+        <w:t xml:space="preserve">Filtering and </w:t>
+      </w:r>
+      <w:r>
+        <w:t>sorting</w:t>
       </w:r>
       <w:bookmarkEnd w:id="19"/>
     </w:p>
@@ -5696,17 +5813,17 @@
         <w:pStyle w:val="ListBullet"/>
       </w:pPr>
       <w:r>
-        <w:t>Click a column heading to sort by it; click ag</w:t>
-      </w:r>
-      <w:r>
-        <w:t>ain to reverse.</w:t>
+        <w:t xml:space="preserve">Click a column heading to sort by it; click again to </w:t>
+      </w:r>
+      <w:r>
+        <w:t>reverse.</w:t>
       </w:r>
     </w:p>
     <w:p>
       <w:pPr>
         <w:pStyle w:val="Heading2"/>
       </w:pPr>
-      <w:bookmarkStart w:id="20" w:name="_Toc242288565"/>
+      <w:bookmarkStart w:id="20" w:name="_Toc242289238"/>
       <w:r>
         <w:t>Getting the report out</w:t>
       </w:r>
@@ -5737,10 +5854,10 @@
         <w:t>Print / Save as PDF</w:t>
       </w:r>
       <w:r>
-        <w:t xml:space="preserve"> prints a clean report: the filters and the date of the data are printed at th</w:t>
-      </w:r>
-      <w:r>
-        <w:t xml:space="preserve">e top, and the buttons and tabs are left out. In the print window choose </w:t>
+        <w:t xml:space="preserve"> prints a clean report: the filters and the date of the data are printed at the top, </w:t>
+      </w:r>
+      <w:r>
+        <w:t xml:space="preserve">and the buttons and tabs are left out. In the print window choose </w:t>
       </w:r>
       <w:r>
         <w:rPr>
@@ -5773,7 +5890,7 @@
       <w:pPr>
         <w:pStyle w:val="Heading2"/>
       </w:pPr>
-      <w:bookmarkStart w:id="21" w:name="_Toc242288566"/>
+      <w:bookmarkStart w:id="21" w:name="_Toc242289239"/>
       <w:r>
         <w:t>Good to know</w:t>
       </w:r>
@@ -5793,27 +5910,55 @@
         <w:t>US dollars</w:t>
       </w:r>
       <w:r>
-        <w:t xml:space="preserve">, as </w:t>
-      </w:r>
-      <w:r>
-        <w:t>charged by OpenRouter.</w:t>
+        <w:t>, as charged b</w:t>
+      </w:r>
+      <w:r>
+        <w:t>y OpenRouter.</w:t>
       </w:r>
     </w:p>
     <w:p>
       <w:pPr>
         <w:pStyle w:val="ListBullet"/>
       </w:pPr>
+      <w:r>
+        <w:t xml:space="preserve">Months are </w:t>
+      </w:r>
       <w:r>
         <w:rPr>
           <w:b/>
         </w:rPr>
-        <w:t>This month</w:t>
-      </w:r>
-      <w:r>
-        <w:t xml:space="preserve"> means the current calendar month in UTC. OpenRouter only gives each key's spend for today, this week, this month and all time, so past months (e.g. "September only") can't be shown per key yet. A later version can add tren</w:t>
-      </w:r>
-      <w:r>
-        <w:t>ds over time from OpenRouter's analytics.</w:t>
+        <w:t>calendar months in UTC</w:t>
+      </w:r>
+      <w:r>
+        <w:t xml:space="preserve">; the current month is the month so far. OpenRouter keeps monthly figures for at most </w:t>
+      </w:r>
+      <w:r>
+        <w:rPr>
+          <w:b/>
+        </w:rPr>
+        <w:t>one year</w:t>
+      </w:r>
+      <w:r>
+        <w:t>, so the longest view is 12 months.</w:t>
+      </w:r>
+    </w:p>
+    <w:p>
+      <w:pPr>
+        <w:pStyle w:val="ListBullet"/>
+      </w:pPr>
+      <w:r>
+        <w:t xml:space="preserve">The monthly and model figures come from OpenRouter's analytics. They can lag a </w:t>
+      </w:r>
+      <w:r>
+        <w:t>few minutes behind the totals in the summary figures, so small differences right after heavy use are normal.</w:t>
+      </w:r>
+    </w:p>
+    <w:p>
+      <w:pPr>
+        <w:pStyle w:val="ListBullet"/>
+      </w:pPr>
+      <w:r>
+        <w:t>Only the four program workspaces are counted. Staff keys in OpenRouter's Default workspace are left out.</w:t>
       </w:r>
     </w:p>
     <w:p>
@@ -5827,7 +5972,10 @@
         <w:t>Budget</w:t>
       </w:r>
       <w:r>
-        <w:t xml:space="preserve"> is the total of the keys' credit limits. Keys with no limit are not in it; the note under the figures says how many there are.</w:t>
+        <w:t xml:space="preserve"> is the total of the keys' credit li</w:t>
+      </w:r>
+      <w:r>
+        <w:t>mits. Keys with no limit are not in it; the note under the figures says how many there are.</w:t>
       </w:r>
     </w:p>
     <w:p>
@@ -5845,18 +5993,16 @@
         <w:t>REGION-serial-cohort-email</w:t>
       </w:r>
       <w:r>
-        <w:t>) a</w:t>
-      </w:r>
-      <w:r>
-        <w:t>ppear as "(other keys)".</w:t>
+        <w:t>) appear as "(other keys)".</w:t>
       </w:r>
     </w:p>
     <w:p>
       <w:pPr>
         <w:pStyle w:val="Heading1"/>
       </w:pPr>
-      <w:bookmarkStart w:id="22" w:name="_Toc242288567"/>
-      <w:r>
+      <w:bookmarkStart w:id="22" w:name="_Toc242289240"/>
+      <w:r>
+        <w:lastRenderedPageBreak/>
         <w:t>8. Monthly checklist</w:t>
       </w:r>
       <w:bookmarkEnd w:id="22"/>
@@ -5865,7 +6011,7 @@
       <w:pPr>
         <w:pStyle w:val="Heading2"/>
       </w:pPr>
-      <w:bookmarkStart w:id="23" w:name="_Toc242288568"/>
+      <w:bookmarkStart w:id="23" w:name="_Toc242289241"/>
       <w:r>
         <w:t>When a cohort starts</w:t>
       </w:r>
@@ -5876,7 +6022,10 @@
         <w:pStyle w:val="ListNumber"/>
       </w:pPr>
       <w:r>
-        <w:t>Prepare one CSV per program (start from dummy.csv).</w:t>
+        <w:t>Prepare one CSV p</w:t>
+      </w:r>
+      <w:r>
+        <w:t>er program (start from dummy.csv).</w:t>
       </w:r>
     </w:p>
     <w:p>
@@ -5902,10 +6051,7 @@
         <w:t>early-nov</w:t>
       </w:r>
       <w:r>
-        <w:t xml:space="preserve">) and </w:t>
-      </w:r>
-      <w:r>
-        <w:t xml:space="preserve">limit, upload that program's CSV, </w:t>
+        <w:t xml:space="preserve">) and limit, upload that program's CSV, </w:t>
       </w:r>
       <w:r>
         <w:rPr>
@@ -5931,7 +6077,10 @@
         <w:pStyle w:val="ListNumber"/>
       </w:pPr>
       <w:r>
-        <w:t xml:space="preserve">Check the summary. Fix any </w:t>
+        <w:t>Check the summary. Fix any</w:t>
+      </w:r>
+      <w:r>
+        <w:t xml:space="preserve"> </w:t>
       </w:r>
       <w:r>
         <w:rPr>
@@ -5973,19 +6122,15 @@
       <w:pPr>
         <w:pStyle w:val="Heading2"/>
       </w:pPr>
-      <w:bookmarkStart w:id="24" w:name="_Toc242288569"/>
-      <w:r>
-        <w:lastRenderedPageBreak/>
+      <w:bookmarkStart w:id="24" w:name="_Toc242289242"/>
+      <w:r>
         <w:t>When a cohort ends</w:t>
       </w:r>
       <w:bookmarkEnd w:id="24"/>
     </w:p>
     <w:p>
       <w:r>
-        <w:t>Go to https://o</w:t>
-      </w:r>
-      <w:r>
-        <w:t xml:space="preserve">penrouter.ai/settings/keys, search for the cohort name (e.g. </w:t>
+        <w:t xml:space="preserve">Go to https://openrouter.ai/settings/keys, search for the cohort name (e.g. </w:t>
       </w:r>
       <w:r>
         <w:rPr>
@@ -5995,14 +6140,17 @@
         <w:t>mid-oct</w:t>
       </w:r>
       <w:r>
-        <w:t>) and disable or delete its keys. An automatic "revoke cohort" feature is planned but not built yet.</w:t>
+        <w:t>) and disable or</w:t>
+      </w:r>
+      <w:r>
+        <w:t xml:space="preserve"> delete its keys. An automatic "revoke cohort" feature is planned but not built yet.</w:t>
       </w:r>
     </w:p>
     <w:p>
       <w:pPr>
         <w:pStyle w:val="Heading1"/>
       </w:pPr>
-      <w:bookmarkStart w:id="25" w:name="_Toc242288570"/>
+      <w:bookmarkStart w:id="25" w:name="_Toc242289243"/>
       <w:r>
         <w:t>9. First-time test</w:t>
       </w:r>
@@ -6018,10 +6166,7 @@
         <w:pStyle w:val="ListNumber"/>
       </w:pPr>
       <w:r>
-        <w:t>Make a CSV with one em</w:t>
-      </w:r>
-      <w:r>
-        <w:t>ail (yours is fine), e.g. from dummy.csv.</w:t>
+        <w:t>Make a CSV with one email (yours is fine), e.g. from dummy.csv.</w:t>
       </w:r>
     </w:p>
     <w:p>
@@ -6036,7 +6181,14 @@
           <w:rFonts w:ascii="Consolas" w:hAnsi="Consolas"/>
           <w:sz w:val="20"/>
         </w:rPr>
-        <w:t>test-run</w:t>
+        <w:t>test-ru</w:t>
+      </w:r>
+      <w:r>
+        <w:rPr>
+          <w:rFonts w:ascii="Consolas" w:hAnsi="Consolas"/>
+          <w:sz w:val="20"/>
+        </w:rPr>
+        <w:t>n</w:t>
       </w:r>
       <w:r>
         <w:t xml:space="preserve">, limit </w:t>
@@ -6091,10 +6243,7 @@
         <w:t>Generated keys</w:t>
       </w:r>
       <w:r>
-        <w:t xml:space="preserve"> and check it works (Windows PowerShell shown; in C</w:t>
-      </w:r>
-      <w:r>
-        <w:t xml:space="preserve">MD use </w:t>
+        <w:t xml:space="preserve"> and check it works (Windows PowerShell shown; in CMD use </w:t>
       </w:r>
       <w:r>
         <w:rPr>
@@ -6127,7 +6276,14 @@
           <w:rFonts w:ascii="Consolas" w:hAnsi="Consolas"/>
           <w:sz w:val="19"/>
         </w:rPr>
-        <w:t>curl.exe https://openrouter.ai/api/v1/key -H "Authorization: Bearer PASTE_KEY_HERE"</w:t>
+        <w:t xml:space="preserve">curl.exe https://openrouter.ai/api/v1/key -H </w:t>
+      </w:r>
+      <w:r>
+        <w:rPr>
+          <w:rFonts w:ascii="Consolas" w:hAnsi="Consolas"/>
+          <w:sz w:val="19"/>
+        </w:rPr>
+        <w:t>"Authorization: Bearer PASTE_KEY_HERE"</w:t>
       </w:r>
     </w:p>
     <w:p>
@@ -6141,10 +6297,7 @@
         <w:t>Agentic AI-SWE</w:t>
       </w:r>
       <w:r>
-        <w:t xml:space="preserve"> workspace at https://openrouter.ai/settin</w:t>
-      </w:r>
-      <w:r>
-        <w:t>gs/keys.</w:t>
+        <w:t xml:space="preserve"> workspace at https://openrouter.ai/settings/keys.</w:t>
       </w:r>
     </w:p>
     <w:p>
@@ -6170,7 +6323,10 @@
         <w:t>Already exists</w:t>
       </w:r>
       <w:r>
-        <w:t>, and there should be nothing to generate.</w:t>
+        <w:t>, and there shou</w:t>
+      </w:r>
+      <w:r>
+        <w:t>ld be nothing to generate.</w:t>
       </w:r>
     </w:p>
     <w:p>
@@ -6185,7 +6341,7 @@
       <w:pPr>
         <w:pStyle w:val="Heading1"/>
       </w:pPr>
-      <w:bookmarkStart w:id="26" w:name="_Toc242288571"/>
+      <w:bookmarkStart w:id="26" w:name="_Toc242289244"/>
       <w:r>
         <w:t>10. How the online site is set up</w:t>
       </w:r>
@@ -6324,7 +6480,14 @@
                 <w:rFonts w:ascii="Consolas" w:hAnsi="Consolas"/>
                 <w:sz w:val="20"/>
               </w:rPr>
-              <w:t>openrouter-key-generator</w:t>
+              <w:t>openrouter-k</w:t>
+            </w:r>
+            <w:r>
+              <w:rPr>
+                <w:rFonts w:ascii="Consolas" w:hAnsi="Consolas"/>
+                <w:sz w:val="20"/>
+              </w:rPr>
+              <w:t>ey-generator</w:t>
             </w:r>
             <w:r>
               <w:rPr>
@@ -6377,13 +6540,7 @@
               <w:rPr>
                 <w:sz w:val="20"/>
               </w:rPr>
-              <w:t xml:space="preserve"> (Verc</w:t>
-            </w:r>
-            <w:r>
-              <w:rPr>
-                <w:sz w:val="20"/>
-              </w:rPr>
-              <w:t xml:space="preserve">el project → Storage). One file per run under </w:t>
+              <w:t xml:space="preserve"> (Vercel project → Storage). One file per run under </w:t>
             </w:r>
             <w:r>
               <w:rPr>
@@ -6463,14 +6620,7 @@
                 <w:rFonts w:ascii="Consolas" w:hAnsi="Consolas"/>
                 <w:sz w:val="20"/>
               </w:rPr>
-              <w:t>https://openrouter-key-generator.vercel.app/auth/cal</w:t>
-            </w:r>
-            <w:r>
-              <w:rPr>
-                <w:rFonts w:ascii="Consolas" w:hAnsi="Consolas"/>
-                <w:sz w:val="20"/>
-              </w:rPr>
-              <w:t>lback</w:t>
+              <w:t>https://openrouter-key-generator.vercel.app/auth/callback</w:t>
             </w:r>
             <w:r>
               <w:rPr>
@@ -6557,7 +6707,13 @@
               <w:rPr>
                 <w:sz w:val="20"/>
               </w:rPr>
-              <w:t xml:space="preserve">https://github.com/new-programs-ik/openrouter-api-key-creation (branch </w:t>
+              <w:t>https:/</w:t>
+            </w:r>
+            <w:r>
+              <w:rPr>
+                <w:sz w:val="20"/>
+              </w:rPr>
+              <w:t xml:space="preserve">/github.com/new-programs-ik/openrouter-api-key-creation (branch </w:t>
             </w:r>
             <w:r>
               <w:rPr>
@@ -6581,7 +6737,7 @@
       <w:pPr>
         <w:pStyle w:val="Heading2"/>
       </w:pPr>
-      <w:bookmarkStart w:id="27" w:name="_Toc242288572"/>
+      <w:bookmarkStart w:id="27" w:name="_Toc242289245"/>
       <w:r>
         <w:t>Vercel settings</w:t>
       </w:r>
@@ -6795,13 +6951,7 @@
               <w:rPr>
                 <w:sz w:val="20"/>
               </w:rPr>
-              <w:t xml:space="preserve">32+ random characters used to sign the </w:t>
-            </w:r>
-            <w:r>
-              <w:rPr>
-                <w:sz w:val="20"/>
-              </w:rPr>
-              <w:t>sign-in cookie. Changing it signs everyone out.</w:t>
+              <w:t>32+ random characters used to sign the sign-in cookie. Changing it signs everyone out.</w:t>
             </w:r>
           </w:p>
         </w:tc>
@@ -6820,7 +6970,6 @@
                 <w:rFonts w:ascii="Consolas" w:hAnsi="Consolas"/>
                 <w:sz w:val="20"/>
               </w:rPr>
-              <w:lastRenderedPageBreak/>
               <w:t>ALLOWED_EMAILS</w:t>
             </w:r>
           </w:p>
@@ -6837,7 +6986,13 @@
               <w:rPr>
                 <w:sz w:val="20"/>
               </w:rPr>
-              <w:t>Comma-separated list of people allowed in. Only @interviewkickstart.com addresses.</w:t>
+              <w:t>Comma-separated list of people allowed in. Only</w:t>
+            </w:r>
+            <w:r>
+              <w:rPr>
+                <w:sz w:val="20"/>
+              </w:rPr>
+              <w:t xml:space="preserve"> @interviewkickstart.com addresses.</w:t>
             </w:r>
           </w:p>
         </w:tc>
@@ -6898,14 +7053,7 @@
                 <w:rFonts w:ascii="Consolas" w:hAnsi="Consolas"/>
                 <w:sz w:val="20"/>
               </w:rPr>
-              <w:t>BLOB_RE</w:t>
-            </w:r>
-            <w:r>
-              <w:rPr>
-                <w:rFonts w:ascii="Consolas" w:hAnsi="Consolas"/>
-                <w:sz w:val="20"/>
-              </w:rPr>
-              <w:t>AD_WRITE_TOKEN</w:t>
+              <w:t>BLOB_READ_WRITE_TOKEN</w:t>
             </w:r>
           </w:p>
         </w:tc>
@@ -6968,7 +7116,7 @@
       <w:pPr>
         <w:pStyle w:val="Heading2"/>
       </w:pPr>
-      <w:bookmarkStart w:id="28" w:name="_Toc242288573"/>
+      <w:bookmarkStart w:id="28" w:name="_Toc242289246"/>
       <w:r>
         <w:t>Vercel's own login protection</w:t>
       </w:r>
@@ -6985,7 +7133,10 @@
         <w:t>Deployment Protection</w:t>
       </w:r>
       <w:r>
-        <w:t xml:space="preserve"> (Settings → Deployment Protection → *Vercel Authentication*) is currently </w:t>
+        <w:t xml:space="preserve"> (Settings → Deployment Protection → *Vercel Authentication*</w:t>
+      </w:r>
+      <w:r>
+        <w:t xml:space="preserve">) is currently </w:t>
       </w:r>
       <w:r>
         <w:rPr>
@@ -7003,17 +7154,14 @@
         <w:t>Disabled</w:t>
       </w:r>
       <w:r>
-        <w:t>; Google sign-in</w:t>
-      </w:r>
-      <w:r>
-        <w:t xml:space="preserve"> still protects everything.</w:t>
+        <w:t>; Google sign-in still protects everything.</w:t>
       </w:r>
     </w:p>
     <w:p>
       <w:pPr>
         <w:pStyle w:val="Heading1"/>
       </w:pPr>
-      <w:bookmarkStart w:id="29" w:name="_Toc242288574"/>
+      <w:bookmarkStart w:id="29" w:name="_Toc242289247"/>
       <w:r>
         <w:t>11. Administration</w:t>
       </w:r>
@@ -7023,7 +7171,7 @@
       <w:pPr>
         <w:pStyle w:val="Heading2"/>
       </w:pPr>
-      <w:bookmarkStart w:id="30" w:name="_Toc242288575"/>
+      <w:bookmarkStart w:id="30" w:name="_Toc242289248"/>
       <w:r>
         <w:t>Adding or removing a person</w:t>
       </w:r>
@@ -7034,7 +7182,10 @@
         <w:pStyle w:val="ListNumber"/>
       </w:pPr>
       <w:r>
-        <w:t xml:space="preserve">Open the Vercel project → </w:t>
+        <w:t>Open t</w:t>
+      </w:r>
+      <w:r>
+        <w:t xml:space="preserve">he Vercel project → </w:t>
       </w:r>
       <w:r>
         <w:rPr>
@@ -7091,14 +7242,7 @@
           <w:rFonts w:ascii="Consolas" w:hAnsi="Consolas"/>
           <w:sz w:val="20"/>
         </w:rPr>
-        <w:t>a@interviewkickstart.com,b@int</w:t>
-      </w:r>
-      <w:r>
-        <w:rPr>
-          <w:rFonts w:ascii="Consolas" w:hAnsi="Consolas"/>
-          <w:sz w:val="20"/>
-        </w:rPr>
-        <w:t>erviewkickstart.com</w:t>
+        <w:t>a@interviewkickstart.com,b@interviewkickstart.com</w:t>
       </w:r>
       <w:r>
         <w:t>.</w:t>
@@ -7126,7 +7270,10 @@
         <w:pStyle w:val="ListNumber"/>
       </w:pPr>
       <w:r>
-        <w:t>Redeploy (below). The change applies only after a redeploy.</w:t>
+        <w:t xml:space="preserve">Redeploy (below). The change applies only after </w:t>
+      </w:r>
+      <w:r>
+        <w:t>a redeploy.</w:t>
       </w:r>
     </w:p>
     <w:tbl>
@@ -7149,10 +7296,7 @@
           </w:tcPr>
           <w:p>
             <w:r>
-              <w:t xml:space="preserve">Only @interviewkickstart.com addresses are accepted. If the list contains any other address, the site refuses everyone until it is removed. This is on purpose, so </w:t>
-            </w:r>
-            <w:r>
-              <w:t>a mistake can't let an outsider in.</w:t>
+              <w:t>Only @interviewkickstart.com addresses are accepted. If the list contains any other address, the site refuses everyone until it is removed. This is on purpose, so a mistake can't let an outsider in.</w:t>
             </w:r>
           </w:p>
         </w:tc>
@@ -7163,7 +7307,7 @@
       <w:pPr>
         <w:pStyle w:val="Heading2"/>
       </w:pPr>
-      <w:bookmarkStart w:id="31" w:name="_Toc242288576"/>
+      <w:bookmarkStart w:id="31" w:name="_Toc242289249"/>
       <w:r>
         <w:t>Redeploying</w:t>
       </w:r>
@@ -7171,7 +7315,10 @@
     </w:p>
     <w:p>
       <w:r>
-        <w:t xml:space="preserve">Any change to a Vercel setting needs a new deployment: Vercel project → </w:t>
+        <w:t xml:space="preserve">Any change to a Vercel setting </w:t>
+      </w:r>
+      <w:r>
+        <w:t xml:space="preserve">needs a new deployment: Vercel project → </w:t>
       </w:r>
       <w:r>
         <w:rPr>
@@ -7211,18 +7358,16 @@
       <w:pPr>
         <w:pStyle w:val="Heading2"/>
       </w:pPr>
-      <w:bookmarkStart w:id="32" w:name="_Toc242288577"/>
-      <w:r>
+      <w:bookmarkStart w:id="32" w:name="_Toc242289250"/>
+      <w:r>
+        <w:lastRenderedPageBreak/>
         <w:t>Changing the Management key</w:t>
       </w:r>
       <w:bookmarkEnd w:id="32"/>
     </w:p>
     <w:p>
       <w:r>
-        <w:t xml:space="preserve">If the Management key leaks </w:t>
-      </w:r>
-      <w:r>
-        <w:t xml:space="preserve">or is replaced: delete the old one at https://openrouter.ai/settings/management-keys, create a new one, put it in </w:t>
+        <w:t xml:space="preserve">If the Management key leaks or is replaced: delete the old one at https://openrouter.ai/settings/management-keys, create a new one, put it in </w:t>
       </w:r>
       <w:r>
         <w:rPr>
@@ -7249,18 +7394,18 @@
       <w:pPr>
         <w:pStyle w:val="Heading2"/>
       </w:pPr>
-      <w:bookmarkStart w:id="33" w:name="_Toc242288578"/>
-      <w:r>
-        <w:t>Updating the code</w:t>
+      <w:bookmarkStart w:id="33" w:name="_Toc242289251"/>
+      <w:r>
+        <w:t xml:space="preserve">Updating the </w:t>
+      </w:r>
+      <w:r>
+        <w:t>code</w:t>
       </w:r>
       <w:bookmarkEnd w:id="33"/>
     </w:p>
     <w:p>
       <w:r>
-        <w:t xml:space="preserve">After a code change is </w:t>
-      </w:r>
-      <w:r>
-        <w:t>tested (</w:t>
+        <w:t>After a code change is tested (</w:t>
       </w:r>
       <w:r>
         <w:rPr>
@@ -7288,7 +7433,6 @@
     </w:p>
     <w:p>
       <w:r>
-        <w:lastRenderedPageBreak/>
         <w:t>This needs the Vercel command line logged in (</w:t>
       </w:r>
       <w:r>
@@ -7316,9 +7460,12 @@
       <w:pPr>
         <w:pStyle w:val="Heading1"/>
       </w:pPr>
-      <w:bookmarkStart w:id="34" w:name="_Toc242288579"/>
-      <w:r>
-        <w:t>12. Running it on your own computer</w:t>
+      <w:bookmarkStart w:id="34" w:name="_Toc242289252"/>
+      <w:r>
+        <w:t xml:space="preserve">12. Running </w:t>
+      </w:r>
+      <w:r>
+        <w:t>it on your own computer</w:t>
       </w:r>
       <w:bookmarkEnd w:id="34"/>
     </w:p>
@@ -7326,7 +7473,7 @@
       <w:pPr>
         <w:pStyle w:val="Heading2"/>
       </w:pPr>
-      <w:bookmarkStart w:id="35" w:name="_Toc242288580"/>
+      <w:bookmarkStart w:id="35" w:name="_Toc242289253"/>
       <w:r>
         <w:t>One-time setup</w:t>
       </w:r>
@@ -7400,10 +7547,7 @@
         <w:t>copy .env.example .env</w:t>
       </w:r>
       <w:r>
-        <w:t xml:space="preserve"> (CM</w:t>
-      </w:r>
-      <w:r>
-        <w:t xml:space="preserve">D) or </w:t>
+        <w:t xml:space="preserve"> (CMD) or </w:t>
       </w:r>
       <w:r>
         <w:rPr>
@@ -7448,7 +7592,7 @@
       <w:pPr>
         <w:pStyle w:val="Heading2"/>
       </w:pPr>
-      <w:bookmarkStart w:id="36" w:name="_Toc242288581"/>
+      <w:bookmarkStart w:id="36" w:name="_Toc242289254"/>
       <w:r>
         <w:t>Web page</w:t>
       </w:r>
@@ -7466,7 +7610,10 @@
         <w:t>npm run web</w:t>
       </w:r>
       <w:r>
-        <w:t xml:space="preserve">. The browser opens http://localhost:3000 with the same page as online, but without sign-in, and keys are saved in </w:t>
+        <w:t xml:space="preserve">. The browser opens http://localhost:3000 with the same </w:t>
+      </w:r>
+      <w:r>
+        <w:t xml:space="preserve">page as online, but without sign-in, and keys are saved in </w:t>
       </w:r>
       <w:r>
         <w:rPr>
@@ -7492,7 +7639,7 @@
       <w:pPr>
         <w:pStyle w:val="Heading2"/>
       </w:pPr>
-      <w:bookmarkStart w:id="37" w:name="_Toc242288582"/>
+      <w:bookmarkStart w:id="37" w:name="_Toc242289255"/>
       <w:r>
         <w:t>Command line</w:t>
       </w:r>
@@ -7507,7 +7654,10 @@
         <w:t>npm run api</w:t>
       </w:r>
       <w:r>
-        <w:t xml:space="preserve"> asks for the program, region, cohort and credit limit, shows a summary, and asks you to type </w:t>
+        <w:t xml:space="preserve"> asks for the program, region, </w:t>
+      </w:r>
+      <w:r>
+        <w:t xml:space="preserve">cohort and credit limit, shows a summary, and asks you to type </w:t>
       </w:r>
       <w:r>
         <w:rPr>
@@ -7532,10 +7682,7 @@
     </w:p>
     <w:p>
       <w:r>
-        <w:t>To skip the questions, set the answers first (Powe</w:t>
-      </w:r>
-      <w:r>
-        <w:t>rShell shown):</w:t>
+        <w:t>To skip the questions, set the answers first (PowerShell shown):</w:t>
       </w:r>
     </w:p>
     <w:p>
@@ -7564,7 +7711,14 @@
           <w:sz w:val="19"/>
         </w:rPr>
         <w:br/>
-        <w:t>$env:COHORT="mid-oct"</w:t>
+        <w:t>$env:</w:t>
+      </w:r>
+      <w:r>
+        <w:rPr>
+          <w:rFonts w:ascii="Consolas" w:hAnsi="Consolas"/>
+          <w:sz w:val="19"/>
+        </w:rPr>
+        <w:t>COHORT="mid-oct"</w:t>
       </w:r>
       <w:r>
         <w:rPr>
@@ -7632,8 +7786,9 @@
       <w:pPr>
         <w:pStyle w:val="Heading2"/>
       </w:pPr>
-      <w:bookmarkStart w:id="38" w:name="_Toc242288583"/>
-      <w:r>
+      <w:bookmarkStart w:id="38" w:name="_Toc242289256"/>
+      <w:r>
+        <w:lastRenderedPageBreak/>
         <w:t>Trying Google sign-in locally</w:t>
       </w:r>
       <w:bookmarkEnd w:id="38"/>
@@ -7650,10 +7805,7 @@
         <w:t>http://localhost:3000/auth/callback</w:t>
       </w:r>
       <w:r>
-        <w:t xml:space="preserve"> to the Google app's Authorized redirect U</w:t>
-      </w:r>
-      <w:r>
-        <w:t xml:space="preserve">RIs, put </w:t>
+        <w:t xml:space="preserve"> to the Google app's Authorized redirect URIs, put </w:t>
       </w:r>
       <w:r>
         <w:rPr>
@@ -7680,7 +7832,14 @@
           <w:rFonts w:ascii="Consolas" w:hAnsi="Consolas"/>
           <w:sz w:val="20"/>
         </w:rPr>
-        <w:t>SESSION_SECRET</w:t>
+        <w:t>SESSION</w:t>
+      </w:r>
+      <w:r>
+        <w:rPr>
+          <w:rFonts w:ascii="Consolas" w:hAnsi="Consolas"/>
+          <w:sz w:val="20"/>
+        </w:rPr>
+        <w:t>_SECRET</w:t>
       </w:r>
       <w:r>
         <w:t xml:space="preserve"> and </w:t>
@@ -7720,7 +7879,7 @@
       <w:pPr>
         <w:pStyle w:val="Heading1"/>
       </w:pPr>
-      <w:bookmarkStart w:id="39" w:name="_Toc242288584"/>
+      <w:bookmarkStart w:id="39" w:name="_Toc242289257"/>
       <w:r>
         <w:t>13. Changing settings in config.js</w:t>
       </w:r>
@@ -7738,10 +7897,10 @@
         <w:t>config.js</w:t>
       </w:r>
       <w:r>
-        <w:t xml:space="preserve"> in the project</w:t>
-      </w:r>
-      <w:r>
-        <w:t xml:space="preserve">. Change, test, push and redeploy for the online site; restart </w:t>
+        <w:t xml:space="preserve"> in the project. Change, test, push and redeploy for the online site; r</w:t>
+      </w:r>
+      <w:r>
+        <w:t xml:space="preserve">estart </w:t>
       </w:r>
       <w:r>
         <w:rPr>
@@ -7915,7 +8074,6 @@
                 <w:rFonts w:ascii="Consolas" w:hAnsi="Consolas"/>
                 <w:sz w:val="20"/>
               </w:rPr>
-              <w:lastRenderedPageBreak/>
               <w:t>CREDIT_LIMIT_CHOICES</w:t>
             </w:r>
           </w:p>
@@ -7948,13 +8106,7 @@
               <w:rPr>
                 <w:sz w:val="20"/>
               </w:rPr>
-              <w:t xml:space="preserve">1, 2, 5, </w:t>
-            </w:r>
-            <w:r>
-              <w:rPr>
-                <w:sz w:val="20"/>
-              </w:rPr>
-              <w:t>10</w:t>
+              <w:t>1, 2, 5, 10</w:t>
             </w:r>
           </w:p>
         </w:tc>
@@ -8252,7 +8404,13 @@
               <w:rPr>
                 <w:sz w:val="20"/>
               </w:rPr>
-              <w:t>How long a sign-in lasts</w:t>
+              <w:t xml:space="preserve">How long a </w:t>
+            </w:r>
+            <w:r>
+              <w:rPr>
+                <w:sz w:val="20"/>
+              </w:rPr>
+              <w:t>sign-in lasts</w:t>
             </w:r>
           </w:p>
         </w:tc>
@@ -8345,12 +8503,9 @@
       <w:pPr>
         <w:pStyle w:val="Heading1"/>
       </w:pPr>
-      <w:bookmarkStart w:id="40" w:name="_Toc242288585"/>
-      <w:r>
-        <w:t xml:space="preserve">14. How </w:t>
-      </w:r>
-      <w:r>
-        <w:t>it works (technical summary)</w:t>
+      <w:bookmarkStart w:id="40" w:name="_Toc242289258"/>
+      <w:r>
+        <w:t>14. How it works (technical summary)</w:t>
       </w:r>
       <w:bookmarkEnd w:id="40"/>
     </w:p>
@@ -8365,7 +8520,10 @@
         <w:t>One shared core.</w:t>
       </w:r>
       <w:r>
-        <w:t xml:space="preserve"> The online site (</w:t>
+        <w:t xml:space="preserve"> The</w:t>
+      </w:r>
+      <w:r>
+        <w:t xml:space="preserve"> online site (</w:t>
       </w:r>
       <w:r>
         <w:rPr>
@@ -8419,10 +8577,10 @@
         <w:t>Creating keys.</w:t>
       </w:r>
       <w:r>
-        <w:t xml:space="preserve"> The tool uses Op</w:t>
-      </w:r>
-      <w:r>
-        <w:t>enRouter's Management API: it finds the program's workspace by slug, lists the existing keys in it, and creates each new key with its name, workspace and limit.</w:t>
+        <w:t xml:space="preserve"> The tool uses OpenRouter's Management API: it finds the program's</w:t>
+      </w:r>
+      <w:r>
+        <w:t xml:space="preserve"> workspace by slug, lists the existing keys in it, and creates each new key with its name, workspace and limit.</w:t>
       </w:r>
     </w:p>
     <w:p>
@@ -8436,10 +8594,7 @@
         <w:t>Saving.</w:t>
       </w:r>
       <w:r>
-        <w:t xml:space="preserve"> Each key is saved right after it's created: online to a private Vercel Blob file (one p</w:t>
-      </w:r>
-      <w:r>
-        <w:t>er run), locally to the CSV. If saving isn't possible, the run stops before creating any key.</w:t>
+        <w:t xml:space="preserve"> Each key is saved right after it's created: online to a private Vercel Blob file (one per run), locally to the CSV. If saving isn't possible, the run stops before creating any key.</w:t>
       </w:r>
     </w:p>
     <w:p>
@@ -8453,7 +8608,10 @@
         <w:t>Sign-in.</w:t>
       </w:r>
       <w:r>
-        <w:t xml:space="preserve"> Standard Google sign-in (OAuth). After Google confirms the account, the site checks the company domain and the allowed list, then gives the browser a signed, 12-hour sign-in cookie. Every request checks the cookie and the list again.</w:t>
+        <w:t xml:space="preserve"> Standard Google sign-in (OAuth). After Google confirms the accoun</w:t>
+      </w:r>
+      <w:r>
+        <w:t>t, the site checks the company domain and the allowed list, then gives the browser a signed, 12-hour sign-in cookie. Every request checks the cookie and the list again.</w:t>
       </w:r>
     </w:p>
     <w:p>
@@ -8467,10 +8625,10 @@
         <w:t>Long runs.</w:t>
       </w:r>
       <w:r>
-        <w:t xml:space="preserve"> Each reque</w:t>
-      </w:r>
-      <w:r>
-        <w:t>st creates keys for up to about 4 minutes, then tells the page which row to continue from; the page sends the next request automatically.</w:t>
+        <w:t xml:space="preserve"> Each request creates keys for up to about 4 minutes, then tells the page whi</w:t>
+      </w:r>
+      <w:r>
+        <w:t>ch row to continue from; the page sends the next request automatically.</w:t>
       </w:r>
     </w:p>
     <w:p>
@@ -8484,17 +8642,14 @@
         <w:t>Safeguards.</w:t>
       </w:r>
       <w:r>
-        <w:t xml:space="preserve"> Requests to the API must come from the page itself; full keys are never written to logs (only the first 14</w:t>
-      </w:r>
-      <w:r>
-        <w:t xml:space="preserve"> characters); the local page only accepts connections from the same computer.</w:t>
+        <w:t xml:space="preserve"> Requests to the API must come from the page itself; full keys are never written to logs (only the first 14 characters); the local page only accepts connections from the same computer.</w:t>
       </w:r>
     </w:p>
     <w:p>
       <w:pPr>
         <w:pStyle w:val="Heading1"/>
       </w:pPr>
-      <w:bookmarkStart w:id="41" w:name="_Toc242288586"/>
+      <w:bookmarkStart w:id="41" w:name="_Toc242289259"/>
       <w:r>
         <w:t>15. Security</w:t>
       </w:r>
@@ -8512,7 +8667,14 @@
           <w:rFonts w:ascii="Consolas" w:hAnsi="Consolas"/>
           <w:sz w:val="20"/>
         </w:rPr>
-        <w:t>generated_openrouter_keys.csv</w:t>
+        <w:t>generated_openrouter_keys</w:t>
+      </w:r>
+      <w:r>
+        <w:rPr>
+          <w:rFonts w:ascii="Consolas" w:hAnsi="Consolas"/>
+          <w:sz w:val="20"/>
+        </w:rPr>
+        <w:t>.csv</w:t>
       </w:r>
       <w:r>
         <w:t xml:space="preserve">, any downloaded CSV) are </w:t>
@@ -8532,19 +8694,14 @@
         <w:pStyle w:val="ListBullet"/>
       </w:pPr>
       <w:r>
+        <w:lastRenderedPageBreak/>
         <w:t xml:space="preserve">The </w:t>
       </w:r>
       <w:r>
         <w:rPr>
           <w:b/>
         </w:rPr>
-        <w:t>M</w:t>
-      </w:r>
-      <w:r>
-        <w:rPr>
-          <w:b/>
-        </w:rPr>
-        <w:t>anagement key</w:t>
+        <w:t>Management key</w:t>
       </w:r>
       <w:r>
         <w:t xml:space="preserve"> can create and delete keys on the whole OpenRouter account. Keep it only in the Vercel settings and </w:t>
@@ -8557,7 +8714,10 @@
         <w:t>.env</w:t>
       </w:r>
       <w:r>
-        <w:t>. Never paste it in chat or email.</w:t>
+        <w:t>. Never paste it in chat or ema</w:t>
+      </w:r>
+      <w:r>
+        <w:t>il.</w:t>
       </w:r>
     </w:p>
     <w:p>
@@ -8583,10 +8743,7 @@
         <w:pStyle w:val="ListBullet"/>
       </w:pPr>
       <w:r>
-        <w:t xml:space="preserve">Disable a cohort's keys when the cohort </w:t>
-      </w:r>
-      <w:r>
-        <w:t>ends.</w:t>
+        <w:t>Disable a cohort's keys when the cohort ends.</w:t>
       </w:r>
     </w:p>
     <w:p>
@@ -8629,7 +8786,10 @@
         <w:pStyle w:val="ListBullet"/>
       </w:pPr>
       <w:r>
-        <w:t xml:space="preserve">If two people generate keys for the </w:t>
+        <w:t>If two peopl</w:t>
+      </w:r>
+      <w:r>
+        <w:t xml:space="preserve">e generate keys for the </w:t>
       </w:r>
       <w:r>
         <w:rPr>
@@ -8638,19 +8798,15 @@
         <w:t>same cohort at the same moment</w:t>
       </w:r>
       <w:r>
-        <w:t>, a learner could get two keys. Agree who runs each</w:t>
-      </w:r>
-      <w:r>
-        <w:t xml:space="preserve"> cohort.</w:t>
+        <w:t>, a learner could get two keys. Agree who runs each cohort.</w:t>
       </w:r>
     </w:p>
     <w:p>
       <w:pPr>
         <w:pStyle w:val="Heading1"/>
       </w:pPr>
-      <w:bookmarkStart w:id="42" w:name="_Toc242288587"/>
-      <w:r>
-        <w:lastRenderedPageBreak/>
+      <w:bookmarkStart w:id="42" w:name="_Toc242289260"/>
+      <w:r>
         <w:t>16. Troubleshooting</w:t>
       </w:r>
       <w:bookmarkEnd w:id="42"/>
@@ -8734,7 +8890,13 @@
               <w:rPr>
                 <w:sz w:val="20"/>
               </w:rPr>
-              <w:t>Vercel's Deployment Protection is on (section 10). Log in with the Vercel account, or ask the admin to disable it.</w:t>
+              <w:t xml:space="preserve">Vercel's Deployment Protection is on (section 10). Log </w:t>
+            </w:r>
+            <w:r>
+              <w:rPr>
+                <w:sz w:val="20"/>
+              </w:rPr>
+              <w:t>in with the Vercel account, or ask the admin to disable it.</w:t>
             </w:r>
           </w:p>
         </w:tc>
@@ -8815,7 +8977,13 @@
               <w:rPr>
                 <w:sz w:val="20"/>
               </w:rPr>
-              <w:t>You picked a personal Google account. Sign in with the company one.</w:t>
+              <w:t xml:space="preserve">You picked a personal </w:t>
+            </w:r>
+            <w:r>
+              <w:rPr>
+                <w:sz w:val="20"/>
+              </w:rPr>
+              <w:t>Google account. Sign in with the company one.</w:t>
             </w:r>
           </w:p>
         </w:tc>
@@ -8849,13 +9017,7 @@
               <w:rPr>
                 <w:sz w:val="20"/>
               </w:rPr>
-              <w:t>Start the sign-in a</w:t>
-            </w:r>
-            <w:r>
-              <w:rPr>
-                <w:sz w:val="20"/>
-              </w:rPr>
-              <w:t>gain from the site, in one tab.</w:t>
+              <w:t>Start the sign-in again from the site, in one tab.</w:t>
             </w:r>
           </w:p>
         </w:tc>
@@ -8907,7 +9069,13 @@
               <w:rPr>
                 <w:sz w:val="20"/>
               </w:rPr>
-              <w:t xml:space="preserve">Google: </w:t>
+              <w:t>Google:</w:t>
+            </w:r>
+            <w:r>
+              <w:rPr>
+                <w:sz w:val="20"/>
+              </w:rPr>
+              <w:t xml:space="preserve"> </w:t>
             </w:r>
             <w:r>
               <w:rPr>
@@ -8930,13 +9098,7 @@
               <w:rPr>
                 <w:sz w:val="20"/>
               </w:rPr>
-              <w:t>In Google Cloud Console → Credentials → the OAuth client, Aut</w:t>
-            </w:r>
-            <w:r>
-              <w:rPr>
-                <w:sz w:val="20"/>
-              </w:rPr>
-              <w:t xml:space="preserve">horized redirect URIs must contain exactly </w:t>
+              <w:t xml:space="preserve">In Google Cloud Console → Credentials → the OAuth client, Authorized redirect URIs must contain exactly </w:t>
             </w:r>
             <w:r>
               <w:rPr>
@@ -8974,7 +9136,13 @@
               <w:rPr>
                 <w:sz w:val="20"/>
               </w:rPr>
-              <w:t xml:space="preserve"> / "Check that OPENROUTER_MANAGEMENT_KEY is a Management key"</w:t>
+              <w:t xml:space="preserve"> / "Check that OPENROUTER_MANAGEMENT_KEY is a Mana</w:t>
+            </w:r>
+            <w:r>
+              <w:rPr>
+                <w:sz w:val="20"/>
+              </w:rPr>
+              <w:t>gement key"</w:t>
             </w:r>
           </w:p>
         </w:tc>
@@ -8990,13 +9158,7 @@
               <w:rPr>
                 <w:sz w:val="20"/>
               </w:rPr>
-              <w:t xml:space="preserve">The Management key is wrong or is a normal key. Create a Management key, update it </w:t>
-            </w:r>
-            <w:r>
-              <w:rPr>
-                <w:sz w:val="20"/>
-              </w:rPr>
-              <w:t xml:space="preserve">in Vercel / </w:t>
+              <w:t xml:space="preserve">The Management key is wrong or is a normal key. Create a Management key, update it in Vercel / </w:t>
             </w:r>
             <w:r>
               <w:rPr>
@@ -9085,21 +9247,20 @@
               <w:rPr>
                 <w:sz w:val="20"/>
               </w:rPr>
-              <w:t xml:space="preserve">The workspace doesn't exist or its slug changed. Check OpenRouter, then fix the slug in </w:t>
+              <w:t>T</w:t>
+            </w:r>
+            <w:r>
+              <w:rPr>
+                <w:sz w:val="20"/>
+              </w:rPr>
+              <w:t xml:space="preserve">he workspace doesn't exist or its slug changed. Check OpenRouter, then fix the slug in </w:t>
             </w:r>
             <w:r>
               <w:rPr>
                 <w:rFonts w:ascii="Consolas" w:hAnsi="Consolas"/>
                 <w:sz w:val="20"/>
               </w:rPr>
-              <w:t>config.j</w:t>
-            </w:r>
-            <w:r>
-              <w:rPr>
-                <w:rFonts w:ascii="Consolas" w:hAnsi="Consolas"/>
-                <w:sz w:val="20"/>
-              </w:rPr>
-              <w:t>s</w:t>
+              <w:t>config.js</w:t>
             </w:r>
             <w:r>
               <w:rPr>
@@ -9200,7 +9361,13 @@
               <w:rPr>
                 <w:sz w:val="20"/>
               </w:rPr>
-              <w:t>Fix them in the CSV and run again; created keys are skipped.</w:t>
+              <w:t xml:space="preserve">Fix them </w:t>
+            </w:r>
+            <w:r>
+              <w:rPr>
+                <w:sz w:val="20"/>
+              </w:rPr>
+              <w:t>in the CSV and run again; created keys are skipped.</w:t>
             </w:r>
           </w:p>
         </w:tc>
@@ -9235,13 +9402,7 @@
               <w:rPr>
                 <w:sz w:val="20"/>
               </w:rPr>
-              <w:t xml:space="preserve">Delete the key </w:t>
-            </w:r>
-            <w:r>
-              <w:rPr>
-                <w:sz w:val="20"/>
-              </w:rPr>
-              <w:t>named in the message at https://openrouter.ai/settings/keys and run again.</w:t>
+              <w:t>Delete the key named in the message at https://openrouter.ai/settings/keys and run again.</w:t>
             </w:r>
           </w:p>
         </w:tc>
@@ -9275,13 +9436,13 @@
               <w:rPr>
                 <w:sz w:val="20"/>
               </w:rPr>
-              <w:t>That program's workspace couldn't be listed (wrong slug or Management key). The other programs are still shown. Check the message, then</w:t>
-            </w:r>
-            <w:r>
-              <w:rPr>
-                <w:sz w:val="20"/>
-              </w:rPr>
-              <w:t xml:space="preserve"> the slug in </w:t>
+              <w:t>That program's workspace couldn't be list</w:t>
+            </w:r>
+            <w:r>
+              <w:rPr>
+                <w:sz w:val="20"/>
+              </w:rPr>
+              <w:t xml:space="preserve">ed (wrong slug or Management key). The other programs are still shown. Check the message, then the slug in </w:t>
             </w:r>
             <w:r>
               <w:rPr>
@@ -9346,7 +9507,13 @@
               <w:rPr>
                 <w:sz w:val="20"/>
               </w:rPr>
-              <w:t>"The connection closed before the run finished"</w:t>
+              <w:t>"The connection closed</w:t>
+            </w:r>
+            <w:r>
+              <w:rPr>
+                <w:sz w:val="20"/>
+              </w:rPr>
+              <w:t xml:space="preserve"> before the run finished"</w:t>
             </w:r>
           </w:p>
         </w:tc>
@@ -9362,13 +9529,7 @@
               <w:rPr>
                 <w:sz w:val="20"/>
               </w:rPr>
-              <w:t xml:space="preserve">The internet or tab dropped. Click Preview to see what was created, </w:t>
-            </w:r>
-            <w:r>
-              <w:rPr>
-                <w:sz w:val="20"/>
-              </w:rPr>
-              <w:t>then Generate again.</w:t>
+              <w:t>The internet or tab dropped. Click Preview to see what was created, then Generate again.</w:t>
             </w:r>
           </w:p>
         </w:tc>
@@ -9427,6 +9588,7 @@
               <w:rPr>
                 <w:sz w:val="20"/>
               </w:rPr>
+              <w:lastRenderedPageBreak/>
               <w:t xml:space="preserve">Local: </w:t>
             </w:r>
             <w:r>
@@ -9434,7 +9596,14 @@
                 <w:rFonts w:ascii="Consolas" w:hAnsi="Consolas"/>
                 <w:sz w:val="20"/>
               </w:rPr>
-              <w:t>… has different columns …</w:t>
+              <w:t>… has different colu</w:t>
+            </w:r>
+            <w:r>
+              <w:rPr>
+                <w:rFonts w:ascii="Consolas" w:hAnsi="Consolas"/>
+                <w:sz w:val="20"/>
+              </w:rPr>
+              <w:t>mns …</w:t>
             </w:r>
           </w:p>
         </w:tc>
@@ -9488,14 +9657,7 @@
                 <w:rFonts w:ascii="Consolas" w:hAnsi="Consolas"/>
                 <w:sz w:val="20"/>
               </w:rPr>
-              <w:t>P</w:t>
-            </w:r>
-            <w:r>
-              <w:rPr>
-                <w:rFonts w:ascii="Consolas" w:hAnsi="Consolas"/>
-                <w:sz w:val="20"/>
-              </w:rPr>
-              <w:t>ort 3000 is already in use</w:t>
+              <w:t>Port 3000 is already in use</w:t>
             </w:r>
           </w:p>
         </w:tc>
@@ -9552,7 +9714,13 @@
               <w:rPr>
                 <w:sz w:val="20"/>
               </w:rPr>
-              <w:t>Install Node.js and open a new terminal.</w:t>
+              <w:t xml:space="preserve">Install Node.js and open a </w:t>
+            </w:r>
+            <w:r>
+              <w:rPr>
+                <w:sz w:val="20"/>
+              </w:rPr>
+              <w:t>new terminal.</w:t>
             </w:r>
           </w:p>
         </w:tc>
@@ -9563,7 +9731,7 @@
       <w:pPr>
         <w:pStyle w:val="Heading1"/>
       </w:pPr>
-      <w:bookmarkStart w:id="43" w:name="_Toc242288588"/>
+      <w:bookmarkStart w:id="43" w:name="_Toc242289261"/>
       <w:r>
         <w:t>17. For developers</w:t>
       </w:r>
@@ -9633,7 +9801,6 @@
                 <w:rFonts w:ascii="Consolas" w:hAnsi="Consolas"/>
                 <w:sz w:val="20"/>
               </w:rPr>
-              <w:lastRenderedPageBreak/>
               <w:t>config.js</w:t>
             </w:r>
           </w:p>
@@ -9650,13 +9817,7 @@
               <w:rPr>
                 <w:sz w:val="20"/>
               </w:rPr>
-              <w:t xml:space="preserve">Programs, regions, limits, </w:t>
-            </w:r>
-            <w:r>
-              <w:rPr>
-                <w:sz w:val="20"/>
-              </w:rPr>
-              <w:t>sign-in domain, timings, file paths</w:t>
+              <w:t>Programs, regions, limits, sign-in domain, timings, file paths</w:t>
             </w:r>
           </w:p>
         </w:tc>
@@ -9822,13 +9983,7 @@
               <w:rPr>
                 <w:sz w:val="20"/>
               </w:rPr>
-              <w:t>All web</w:t>
-            </w:r>
-            <w:r>
-              <w:rPr>
-                <w:sz w:val="20"/>
-              </w:rPr>
-              <w:t xml:space="preserve"> routes, shared by the local server and Vercel</w:t>
+              <w:t>All web routes, shared by the local server and Vercel</w:t>
             </w:r>
           </w:p>
         </w:tc>
@@ -9898,7 +10053,13 @@
               <w:rPr>
                 <w:sz w:val="20"/>
               </w:rPr>
-              <w:t>Key stores: CSV file and private Vercel Blob</w:t>
+              <w:t>Key stores: CSV file and private Verc</w:t>
+            </w:r>
+            <w:r>
+              <w:rPr>
+                <w:sz w:val="20"/>
+              </w:rPr>
+              <w:t>el Blob</w:t>
             </w:r>
           </w:p>
         </w:tc>
@@ -9952,14 +10113,7 @@
                 <w:rFonts w:ascii="Consolas" w:hAnsi="Consolas"/>
                 <w:sz w:val="20"/>
               </w:rPr>
-              <w:t>lib/openrouter.</w:t>
-            </w:r>
-            <w:r>
-              <w:rPr>
-                <w:rFonts w:ascii="Consolas" w:hAnsi="Consolas"/>
-                <w:sz w:val="20"/>
-              </w:rPr>
-              <w:t>js</w:t>
+              <w:t>lib/openrouter.js</w:t>
             </w:r>
           </w:p>
         </w:tc>
@@ -10058,7 +10212,13 @@
               <w:rPr>
                 <w:sz w:val="20"/>
               </w:rPr>
-              <w:t>The page and the sign-in page</w:t>
+              <w:t>The page and the</w:t>
+            </w:r>
+            <w:r>
+              <w:rPr>
+                <w:sz w:val="20"/>
+              </w:rPr>
+              <w:t xml:space="preserve"> sign-in page</w:t>
             </w:r>
           </w:p>
         </w:tc>
@@ -10135,7 +10295,10 @@
         <w:t>.env</w:t>
       </w:r>
       <w:r>
-        <w:t xml:space="preserve">, learner list or output CSV. Project rules for future changes are in </w:t>
+        <w:t>, learner list or output CSV. Project rules for future chang</w:t>
+      </w:r>
+      <w:r>
+        <w:t xml:space="preserve">es are in </w:t>
       </w:r>
       <w:r>
         <w:rPr>
@@ -22491,7 +22654,7 @@
     <w:autoRedefine/>
     <w:uiPriority w:val="39"/>
     <w:unhideWhenUsed/>
-    <w:rsid w:val="0099510E"/>
+    <w:rsid w:val="00411A27"/>
     <w:pPr>
       <w:spacing w:after="100"/>
     </w:pPr>
@@ -22503,7 +22666,7 @@
     <w:autoRedefine/>
     <w:uiPriority w:val="39"/>
     <w:unhideWhenUsed/>
-    <w:rsid w:val="0099510E"/>
+    <w:rsid w:val="00411A27"/>
     <w:pPr>
       <w:spacing w:after="100"/>
       <w:ind w:left="220"/>
@@ -22514,7 +22677,7 @@
     <w:basedOn w:val="DefaultParagraphFont"/>
     <w:uiPriority w:val="99"/>
     <w:unhideWhenUsed/>
-    <w:rsid w:val="0099510E"/>
+    <w:rsid w:val="00411A27"/>
     <w:rPr>
       <w:color w:val="0000FF" w:themeColor="hyperlink"/>
       <w:u w:val="single"/>
@@ -22848,7 +23011,7 @@
 </file>
 
 <file path=customXml/itemProps1.xml><?xml version="1.0" encoding="utf-8"?>
-<ds:datastoreItem xmlns:ds="http://schemas.openxmlformats.org/officeDocument/2006/customXml" ds:itemID="{8245732F-B3AC-4116-A1F1-B30E9DBFB9FD}">
+<ds:datastoreItem xmlns:ds="http://schemas.openxmlformats.org/officeDocument/2006/customXml" ds:itemID="{33286F2B-0DF7-4BB7-9AEB-6D7281C382EF}">
   <ds:schemaRefs>
     <ds:schemaRef ds:uri="http://schemas.openxmlformats.org/officeDocument/2006/bibliography"/>
   </ds:schemaRefs>

</xml_diff>

<commit_message>
Rename the CSV template download to learners.csv
Co-Authored-By: Claude Opus 5.5 <noreply@anthropic.com>
</commit_message>
<xml_diff>
--- a/docs/OpenRouter-Key-Generator-Guide.docx
+++ b/docs/OpenRouter-Key-Generator-Guide.docx
@@ -242,7 +242,7 @@
       <w:r>
         <w:fldChar w:fldCharType="separate"/>
       </w:r>
-      <w:hyperlink w:anchor="_Toc242289219" w:history="1">
+      <w:hyperlink w:anchor="_Toc242290116" w:history="1">
         <w:r>
           <w:rPr>
             <w:rStyle w:val="Hyperlink"/>
@@ -269,7 +269,7 @@
             <w:noProof/>
             <w:webHidden/>
           </w:rPr>
-          <w:instrText xml:space="preserve"> PAGEREF _Toc242289219 \h </w:instrText>
+          <w:instrText xml:space="preserve"> PAGEREF _Toc242290116 \h </w:instrText>
         </w:r>
         <w:r>
           <w:rPr>
@@ -310,7 +310,7 @@
           <w:noProof/>
         </w:rPr>
       </w:pPr>
-      <w:hyperlink w:anchor="_Toc242289220" w:history="1">
+      <w:hyperlink w:anchor="_Toc242290117" w:history="1">
         <w:r>
           <w:rPr>
             <w:rStyle w:val="Hyperlink"/>
@@ -337,7 +337,7 @@
             <w:noProof/>
             <w:webHidden/>
           </w:rPr>
-          <w:instrText xml:space="preserve"> PAGEREF _Toc242289220 \h </w:instrText>
+          <w:instrText xml:space="preserve"> PAGEREF _Toc242290117 \h </w:instrText>
         </w:r>
         <w:r>
           <w:rPr>
@@ -378,7 +378,7 @@
           <w:noProof/>
         </w:rPr>
       </w:pPr>
-      <w:hyperlink w:anchor="_Toc242289221" w:history="1">
+      <w:hyperlink w:anchor="_Toc242290118" w:history="1">
         <w:r>
           <w:rPr>
             <w:rStyle w:val="Hyperlink"/>
@@ -405,7 +405,7 @@
             <w:noProof/>
             <w:webHidden/>
           </w:rPr>
-          <w:instrText xml:space="preserve"> PAGEREF _Toc242289221 \h </w:instrText>
+          <w:instrText xml:space="preserve"> PAGEREF _Toc242290118 \h </w:instrText>
         </w:r>
         <w:r>
           <w:rPr>
@@ -446,7 +446,7 @@
           <w:noProof/>
         </w:rPr>
       </w:pPr>
-      <w:hyperlink w:anchor="_Toc242289222" w:history="1">
+      <w:hyperlink w:anchor="_Toc242290119" w:history="1">
         <w:r>
           <w:rPr>
             <w:rStyle w:val="Hyperlink"/>
@@ -473,7 +473,7 @@
             <w:noProof/>
             <w:webHidden/>
           </w:rPr>
-          <w:instrText xml:space="preserve"> PAGEREF _Toc242289222 \h </w:instrText>
+          <w:instrText xml:space="preserve"> PAGEREF _Toc242290119 \h </w:instrText>
         </w:r>
         <w:r>
           <w:rPr>
@@ -514,7 +514,7 @@
           <w:noProof/>
         </w:rPr>
       </w:pPr>
-      <w:hyperlink w:anchor="_Toc242289223" w:history="1">
+      <w:hyperlink w:anchor="_Toc242290120" w:history="1">
         <w:r>
           <w:rPr>
             <w:rStyle w:val="Hyperlink"/>
@@ -541,7 +541,7 @@
             <w:noProof/>
             <w:webHidden/>
           </w:rPr>
-          <w:instrText xml:space="preserve"> PAGEREF _Toc242289223 \h </w:instrText>
+          <w:instrText xml:space="preserve"> PAGEREF _Toc242290120 \h </w:instrText>
         </w:r>
         <w:r>
           <w:rPr>
@@ -582,7 +582,7 @@
           <w:noProof/>
         </w:rPr>
       </w:pPr>
-      <w:hyperlink w:anchor="_Toc242289224" w:history="1">
+      <w:hyperlink w:anchor="_Toc242290121" w:history="1">
         <w:r>
           <w:rPr>
             <w:rStyle w:val="Hyperlink"/>
@@ -609,7 +609,7 @@
             <w:noProof/>
             <w:webHidden/>
           </w:rPr>
-          <w:instrText xml:space="preserve"> PAGEREF _Toc242289224 \h </w:instrText>
+          <w:instrText xml:space="preserve"> PAGEREF _Toc242290121 \h </w:instrText>
         </w:r>
         <w:r>
           <w:rPr>
@@ -650,7 +650,7 @@
           <w:noProof/>
         </w:rPr>
       </w:pPr>
-      <w:hyperlink w:anchor="_Toc242289225" w:history="1">
+      <w:hyperlink w:anchor="_Toc242290122" w:history="1">
         <w:r>
           <w:rPr>
             <w:rStyle w:val="Hyperlink"/>
@@ -677,7 +677,7 @@
             <w:noProof/>
             <w:webHidden/>
           </w:rPr>
-          <w:instrText xml:space="preserve"> PAGEREF _Toc242289225 \h </w:instrText>
+          <w:instrText xml:space="preserve"> PAGEREF _Toc242290122 \h </w:instrText>
         </w:r>
         <w:r>
           <w:rPr>
@@ -718,7 +718,7 @@
           <w:noProof/>
         </w:rPr>
       </w:pPr>
-      <w:hyperlink w:anchor="_Toc242289226" w:history="1">
+      <w:hyperlink w:anchor="_Toc242290123" w:history="1">
         <w:r>
           <w:rPr>
             <w:rStyle w:val="Hyperlink"/>
@@ -745,7 +745,7 @@
             <w:noProof/>
             <w:webHidden/>
           </w:rPr>
-          <w:instrText xml:space="preserve"> PAGEREF _Toc242289226 \h </w:instrText>
+          <w:instrText xml:space="preserve"> PAGEREF _Toc242290123 \h </w:instrText>
         </w:r>
         <w:r>
           <w:rPr>
@@ -786,7 +786,7 @@
           <w:noProof/>
         </w:rPr>
       </w:pPr>
-      <w:hyperlink w:anchor="_Toc242289227" w:history="1">
+      <w:hyperlink w:anchor="_Toc242290124" w:history="1">
         <w:r>
           <w:rPr>
             <w:rStyle w:val="Hyperlink"/>
@@ -813,7 +813,7 @@
             <w:noProof/>
             <w:webHidden/>
           </w:rPr>
-          <w:instrText xml:space="preserve"> PAGEREF _Toc242289227 \h </w:instrText>
+          <w:instrText xml:space="preserve"> PAGEREF _Toc242290124 \h </w:instrText>
         </w:r>
         <w:r>
           <w:rPr>
@@ -854,7 +854,7 @@
           <w:noProof/>
         </w:rPr>
       </w:pPr>
-      <w:hyperlink w:anchor="_Toc242289228" w:history="1">
+      <w:hyperlink w:anchor="_Toc242290125" w:history="1">
         <w:r>
           <w:rPr>
             <w:rStyle w:val="Hyperlink"/>
@@ -881,7 +881,7 @@
             <w:noProof/>
             <w:webHidden/>
           </w:rPr>
-          <w:instrText xml:space="preserve"> PAGEREF _Toc242289228 \h </w:instrText>
+          <w:instrText xml:space="preserve"> PAGEREF _Toc242290125 \h </w:instrText>
         </w:r>
         <w:r>
           <w:rPr>
@@ -922,7 +922,7 @@
           <w:noProof/>
         </w:rPr>
       </w:pPr>
-      <w:hyperlink w:anchor="_Toc242289229" w:history="1">
+      <w:hyperlink w:anchor="_Toc242290126" w:history="1">
         <w:r>
           <w:rPr>
             <w:rStyle w:val="Hyperlink"/>
@@ -949,7 +949,7 @@
             <w:noProof/>
             <w:webHidden/>
           </w:rPr>
-          <w:instrText xml:space="preserve"> PAGEREF _Toc242289229 \h </w:instrText>
+          <w:instrText xml:space="preserve"> PAGEREF _Toc242290126 \h </w:instrText>
         </w:r>
         <w:r>
           <w:rPr>
@@ -990,7 +990,7 @@
           <w:noProof/>
         </w:rPr>
       </w:pPr>
-      <w:hyperlink w:anchor="_Toc242289230" w:history="1">
+      <w:hyperlink w:anchor="_Toc242290127" w:history="1">
         <w:r>
           <w:rPr>
             <w:rStyle w:val="Hyperlink"/>
@@ -1017,7 +1017,7 @@
             <w:noProof/>
             <w:webHidden/>
           </w:rPr>
-          <w:instrText xml:space="preserve"> PAGEREF _Toc242289230 \h </w:instrText>
+          <w:instrText xml:space="preserve"> PAGEREF _Toc242290127 \h </w:instrText>
         </w:r>
         <w:r>
           <w:rPr>
@@ -1058,7 +1058,7 @@
           <w:noProof/>
         </w:rPr>
       </w:pPr>
-      <w:hyperlink w:anchor="_Toc242289231" w:history="1">
+      <w:hyperlink w:anchor="_Toc242290128" w:history="1">
         <w:r>
           <w:rPr>
             <w:rStyle w:val="Hyperlink"/>
@@ -1085,7 +1085,7 @@
             <w:noProof/>
             <w:webHidden/>
           </w:rPr>
-          <w:instrText xml:space="preserve"> PAGEREF _Toc242289231 \h </w:instrText>
+          <w:instrText xml:space="preserve"> PAGEREF _Toc242290128 \h </w:instrText>
         </w:r>
         <w:r>
           <w:rPr>
@@ -1126,7 +1126,7 @@
           <w:noProof/>
         </w:rPr>
       </w:pPr>
-      <w:hyperlink w:anchor="_Toc242289232" w:history="1">
+      <w:hyperlink w:anchor="_Toc242290129" w:history="1">
         <w:r>
           <w:rPr>
             <w:rStyle w:val="Hyperlink"/>
@@ -1153,7 +1153,7 @@
             <w:noProof/>
             <w:webHidden/>
           </w:rPr>
-          <w:instrText xml:space="preserve"> PAGEREF _Toc242289232 \h </w:instrText>
+          <w:instrText xml:space="preserve"> PAGEREF _Toc242290129 \h </w:instrText>
         </w:r>
         <w:r>
           <w:rPr>
@@ -1194,7 +1194,7 @@
           <w:noProof/>
         </w:rPr>
       </w:pPr>
-      <w:hyperlink w:anchor="_Toc242289233" w:history="1">
+      <w:hyperlink w:anchor="_Toc242290130" w:history="1">
         <w:r>
           <w:rPr>
             <w:rStyle w:val="Hyperlink"/>
@@ -1221,7 +1221,7 @@
             <w:noProof/>
             <w:webHidden/>
           </w:rPr>
-          <w:instrText xml:space="preserve"> PAGEREF _Toc242289233 \h </w:instrText>
+          <w:instrText xml:space="preserve"> PAGEREF _Toc242290130 \h </w:instrText>
         </w:r>
         <w:r>
           <w:rPr>
@@ -1262,7 +1262,7 @@
           <w:noProof/>
         </w:rPr>
       </w:pPr>
-      <w:hyperlink w:anchor="_Toc242289234" w:history="1">
+      <w:hyperlink w:anchor="_Toc242290131" w:history="1">
         <w:r>
           <w:rPr>
             <w:rStyle w:val="Hyperlink"/>
@@ -1289,7 +1289,7 @@
             <w:noProof/>
             <w:webHidden/>
           </w:rPr>
-          <w:instrText xml:space="preserve"> PAGEREF _Toc242289234 \h </w:instrText>
+          <w:instrText xml:space="preserve"> PAGEREF _Toc242290131 \h </w:instrText>
         </w:r>
         <w:r>
           <w:rPr>
@@ -1330,7 +1330,7 @@
           <w:noProof/>
         </w:rPr>
       </w:pPr>
-      <w:hyperlink w:anchor="_Toc242289235" w:history="1">
+      <w:hyperlink w:anchor="_Toc242290132" w:history="1">
         <w:r>
           <w:rPr>
             <w:rStyle w:val="Hyperlink"/>
@@ -1357,7 +1357,7 @@
             <w:noProof/>
             <w:webHidden/>
           </w:rPr>
-          <w:instrText xml:space="preserve"> PAGEREF _Toc242289235 \h </w:instrText>
+          <w:instrText xml:space="preserve"> PAGEREF _Toc242290132 \h </w:instrText>
         </w:r>
         <w:r>
           <w:rPr>
@@ -1398,7 +1398,7 @@
           <w:noProof/>
         </w:rPr>
       </w:pPr>
-      <w:hyperlink w:anchor="_Toc242289236" w:history="1">
+      <w:hyperlink w:anchor="_Toc242290133" w:history="1">
         <w:r>
           <w:rPr>
             <w:rStyle w:val="Hyperlink"/>
@@ -1425,7 +1425,7 @@
             <w:noProof/>
             <w:webHidden/>
           </w:rPr>
-          <w:instrText xml:space="preserve"> PAGEREF _Toc242289236 \h </w:instrText>
+          <w:instrText xml:space="preserve"> PAGEREF _Toc242290133 \h </w:instrText>
         </w:r>
         <w:r>
           <w:rPr>
@@ -1466,7 +1466,7 @@
           <w:noProof/>
         </w:rPr>
       </w:pPr>
-      <w:hyperlink w:anchor="_Toc242289237" w:history="1">
+      <w:hyperlink w:anchor="_Toc242290134" w:history="1">
         <w:r>
           <w:rPr>
             <w:rStyle w:val="Hyperlink"/>
@@ -1493,7 +1493,7 @@
             <w:noProof/>
             <w:webHidden/>
           </w:rPr>
-          <w:instrText xml:space="preserve"> PAGEREF _Toc242289237 \h </w:instrText>
+          <w:instrText xml:space="preserve"> PAGEREF _Toc242290134 \h </w:instrText>
         </w:r>
         <w:r>
           <w:rPr>
@@ -1534,7 +1534,7 @@
           <w:noProof/>
         </w:rPr>
       </w:pPr>
-      <w:hyperlink w:anchor="_Toc242289238" w:history="1">
+      <w:hyperlink w:anchor="_Toc242290135" w:history="1">
         <w:r>
           <w:rPr>
             <w:rStyle w:val="Hyperlink"/>
@@ -1561,7 +1561,7 @@
             <w:noProof/>
             <w:webHidden/>
           </w:rPr>
-          <w:instrText xml:space="preserve"> PAGEREF _Toc242289238 \h </w:instrText>
+          <w:instrText xml:space="preserve"> PAGEREF _Toc242290135 \h </w:instrText>
         </w:r>
         <w:r>
           <w:rPr>
@@ -1602,7 +1602,7 @@
           <w:noProof/>
         </w:rPr>
       </w:pPr>
-      <w:hyperlink w:anchor="_Toc242289239" w:history="1">
+      <w:hyperlink w:anchor="_Toc242290136" w:history="1">
         <w:r>
           <w:rPr>
             <w:rStyle w:val="Hyperlink"/>
@@ -1629,7 +1629,7 @@
             <w:noProof/>
             <w:webHidden/>
           </w:rPr>
-          <w:instrText xml:space="preserve"> PAGEREF _Toc242289239 \h </w:instrText>
+          <w:instrText xml:space="preserve"> PAGEREF _Toc242290136 \h </w:instrText>
         </w:r>
         <w:r>
           <w:rPr>
@@ -1670,7 +1670,7 @@
           <w:noProof/>
         </w:rPr>
       </w:pPr>
-      <w:hyperlink w:anchor="_Toc242289240" w:history="1">
+      <w:hyperlink w:anchor="_Toc242290137" w:history="1">
         <w:r>
           <w:rPr>
             <w:rStyle w:val="Hyperlink"/>
@@ -1697,7 +1697,7 @@
             <w:noProof/>
             <w:webHidden/>
           </w:rPr>
-          <w:instrText xml:space="preserve"> PAGEREF _Toc242289240 \h </w:instrText>
+          <w:instrText xml:space="preserve"> PAGEREF _Toc242290137 \h </w:instrText>
         </w:r>
         <w:r>
           <w:rPr>
@@ -1738,7 +1738,7 @@
           <w:noProof/>
         </w:rPr>
       </w:pPr>
-      <w:hyperlink w:anchor="_Toc242289241" w:history="1">
+      <w:hyperlink w:anchor="_Toc242290138" w:history="1">
         <w:r>
           <w:rPr>
             <w:rStyle w:val="Hyperlink"/>
@@ -1765,7 +1765,7 @@
             <w:noProof/>
             <w:webHidden/>
           </w:rPr>
-          <w:instrText xml:space="preserve"> PAGEREF _Toc242289241 \h </w:instrText>
+          <w:instrText xml:space="preserve"> PAGEREF _Toc242290138 \h </w:instrText>
         </w:r>
         <w:r>
           <w:rPr>
@@ -1806,7 +1806,7 @@
           <w:noProof/>
         </w:rPr>
       </w:pPr>
-      <w:hyperlink w:anchor="_Toc242289242" w:history="1">
+      <w:hyperlink w:anchor="_Toc242290139" w:history="1">
         <w:r>
           <w:rPr>
             <w:rStyle w:val="Hyperlink"/>
@@ -1833,7 +1833,7 @@
             <w:noProof/>
             <w:webHidden/>
           </w:rPr>
-          <w:instrText xml:space="preserve"> PAGEREF _Toc242289242 \h </w:instrText>
+          <w:instrText xml:space="preserve"> PAGEREF _Toc242290139 \h </w:instrText>
         </w:r>
         <w:r>
           <w:rPr>
@@ -1874,7 +1874,7 @@
           <w:noProof/>
         </w:rPr>
       </w:pPr>
-      <w:hyperlink w:anchor="_Toc242289243" w:history="1">
+      <w:hyperlink w:anchor="_Toc242290140" w:history="1">
         <w:r>
           <w:rPr>
             <w:rStyle w:val="Hyperlink"/>
@@ -1901,7 +1901,7 @@
             <w:noProof/>
             <w:webHidden/>
           </w:rPr>
-          <w:instrText xml:space="preserve"> PAGEREF _Toc242289243 \h </w:instrText>
+          <w:instrText xml:space="preserve"> PAGEREF _Toc242290140 \h </w:instrText>
         </w:r>
         <w:r>
           <w:rPr>
@@ -1942,7 +1942,7 @@
           <w:noProof/>
         </w:rPr>
       </w:pPr>
-      <w:hyperlink w:anchor="_Toc242289244" w:history="1">
+      <w:hyperlink w:anchor="_Toc242290141" w:history="1">
         <w:r>
           <w:rPr>
             <w:rStyle w:val="Hyperlink"/>
@@ -1969,7 +1969,7 @@
             <w:noProof/>
             <w:webHidden/>
           </w:rPr>
-          <w:instrText xml:space="preserve"> PAGEREF _Toc242289244 \h </w:instrText>
+          <w:instrText xml:space="preserve"> PAGEREF _Toc242290141 \h </w:instrText>
         </w:r>
         <w:r>
           <w:rPr>
@@ -2010,7 +2010,7 @@
           <w:noProof/>
         </w:rPr>
       </w:pPr>
-      <w:hyperlink w:anchor="_Toc242289245" w:history="1">
+      <w:hyperlink w:anchor="_Toc242290142" w:history="1">
         <w:r>
           <w:rPr>
             <w:rStyle w:val="Hyperlink"/>
@@ -2037,7 +2037,7 @@
             <w:noProof/>
             <w:webHidden/>
           </w:rPr>
-          <w:instrText xml:space="preserve"> PAGEREF _Toc242289245 \h </w:instrText>
+          <w:instrText xml:space="preserve"> PAGEREF _Toc242290142 \h </w:instrText>
         </w:r>
         <w:r>
           <w:rPr>
@@ -2078,7 +2078,7 @@
           <w:noProof/>
         </w:rPr>
       </w:pPr>
-      <w:hyperlink w:anchor="_Toc242289246" w:history="1">
+      <w:hyperlink w:anchor="_Toc242290143" w:history="1">
         <w:r>
           <w:rPr>
             <w:rStyle w:val="Hyperlink"/>
@@ -2105,7 +2105,7 @@
             <w:noProof/>
             <w:webHidden/>
           </w:rPr>
-          <w:instrText xml:space="preserve"> PAGEREF _Toc242289246 \h </w:instrText>
+          <w:instrText xml:space="preserve"> PAGEREF _Toc242290143 \h </w:instrText>
         </w:r>
         <w:r>
           <w:rPr>
@@ -2146,7 +2146,7 @@
           <w:noProof/>
         </w:rPr>
       </w:pPr>
-      <w:hyperlink w:anchor="_Toc242289247" w:history="1">
+      <w:hyperlink w:anchor="_Toc242290144" w:history="1">
         <w:r>
           <w:rPr>
             <w:rStyle w:val="Hyperlink"/>
@@ -2173,7 +2173,7 @@
             <w:noProof/>
             <w:webHidden/>
           </w:rPr>
-          <w:instrText xml:space="preserve"> PAGEREF _Toc242289247 \h </w:instrText>
+          <w:instrText xml:space="preserve"> PAGEREF _Toc242290144 \h </w:instrText>
         </w:r>
         <w:r>
           <w:rPr>
@@ -2214,7 +2214,7 @@
           <w:noProof/>
         </w:rPr>
       </w:pPr>
-      <w:hyperlink w:anchor="_Toc242289248" w:history="1">
+      <w:hyperlink w:anchor="_Toc242290145" w:history="1">
         <w:r>
           <w:rPr>
             <w:rStyle w:val="Hyperlink"/>
@@ -2241,7 +2241,7 @@
             <w:noProof/>
             <w:webHidden/>
           </w:rPr>
-          <w:instrText xml:space="preserve"> PAGEREF _Toc242289248 \h </w:instrText>
+          <w:instrText xml:space="preserve"> PAGEREF _Toc242290145 \h </w:instrText>
         </w:r>
         <w:r>
           <w:rPr>
@@ -2282,7 +2282,7 @@
           <w:noProof/>
         </w:rPr>
       </w:pPr>
-      <w:hyperlink w:anchor="_Toc242289249" w:history="1">
+      <w:hyperlink w:anchor="_Toc242290146" w:history="1">
         <w:r>
           <w:rPr>
             <w:rStyle w:val="Hyperlink"/>
@@ -2309,7 +2309,7 @@
             <w:noProof/>
             <w:webHidden/>
           </w:rPr>
-          <w:instrText xml:space="preserve"> PAGEREF _Toc242289249 \h </w:instrText>
+          <w:instrText xml:space="preserve"> PAGEREF _Toc242290146 \h </w:instrText>
         </w:r>
         <w:r>
           <w:rPr>
@@ -2350,7 +2350,7 @@
           <w:noProof/>
         </w:rPr>
       </w:pPr>
-      <w:hyperlink w:anchor="_Toc242289250" w:history="1">
+      <w:hyperlink w:anchor="_Toc242290147" w:history="1">
         <w:r>
           <w:rPr>
             <w:rStyle w:val="Hyperlink"/>
@@ -2377,7 +2377,7 @@
             <w:noProof/>
             <w:webHidden/>
           </w:rPr>
-          <w:instrText xml:space="preserve"> PAGEREF _Toc242289250 \h </w:instrText>
+          <w:instrText xml:space="preserve"> PAGEREF _Toc242290147 \h </w:instrText>
         </w:r>
         <w:r>
           <w:rPr>
@@ -2418,7 +2418,7 @@
           <w:noProof/>
         </w:rPr>
       </w:pPr>
-      <w:hyperlink w:anchor="_Toc242289251" w:history="1">
+      <w:hyperlink w:anchor="_Toc242290148" w:history="1">
         <w:r>
           <w:rPr>
             <w:rStyle w:val="Hyperlink"/>
@@ -2445,7 +2445,7 @@
             <w:noProof/>
             <w:webHidden/>
           </w:rPr>
-          <w:instrText xml:space="preserve"> PAGEREF _Toc242289251 \h </w:instrText>
+          <w:instrText xml:space="preserve"> PAGEREF _Toc242290148 \h </w:instrText>
         </w:r>
         <w:r>
           <w:rPr>
@@ -2486,7 +2486,7 @@
           <w:noProof/>
         </w:rPr>
       </w:pPr>
-      <w:hyperlink w:anchor="_Toc242289252" w:history="1">
+      <w:hyperlink w:anchor="_Toc242290149" w:history="1">
         <w:r>
           <w:rPr>
             <w:rStyle w:val="Hyperlink"/>
@@ -2513,7 +2513,7 @@
             <w:noProof/>
             <w:webHidden/>
           </w:rPr>
-          <w:instrText xml:space="preserve"> PAGEREF _Toc242289252 \h </w:instrText>
+          <w:instrText xml:space="preserve"> PAGEREF _Toc242290149 \h </w:instrText>
         </w:r>
         <w:r>
           <w:rPr>
@@ -2554,7 +2554,7 @@
           <w:noProof/>
         </w:rPr>
       </w:pPr>
-      <w:hyperlink w:anchor="_Toc242289253" w:history="1">
+      <w:hyperlink w:anchor="_Toc242290150" w:history="1">
         <w:r>
           <w:rPr>
             <w:rStyle w:val="Hyperlink"/>
@@ -2581,7 +2581,7 @@
             <w:noProof/>
             <w:webHidden/>
           </w:rPr>
-          <w:instrText xml:space="preserve"> PAGEREF _Toc242289253 \h </w:instrText>
+          <w:instrText xml:space="preserve"> PAGEREF _Toc242290150 \h </w:instrText>
         </w:r>
         <w:r>
           <w:rPr>
@@ -2622,7 +2622,7 @@
           <w:noProof/>
         </w:rPr>
       </w:pPr>
-      <w:hyperlink w:anchor="_Toc242289254" w:history="1">
+      <w:hyperlink w:anchor="_Toc242290151" w:history="1">
         <w:r>
           <w:rPr>
             <w:rStyle w:val="Hyperlink"/>
@@ -2649,7 +2649,7 @@
             <w:noProof/>
             <w:webHidden/>
           </w:rPr>
-          <w:instrText xml:space="preserve"> PAGEREF _Toc242289254 \h </w:instrText>
+          <w:instrText xml:space="preserve"> PAGEREF _Toc242290151 \h </w:instrText>
         </w:r>
         <w:r>
           <w:rPr>
@@ -2690,7 +2690,7 @@
           <w:noProof/>
         </w:rPr>
       </w:pPr>
-      <w:hyperlink w:anchor="_Toc242289255" w:history="1">
+      <w:hyperlink w:anchor="_Toc242290152" w:history="1">
         <w:r>
           <w:rPr>
             <w:rStyle w:val="Hyperlink"/>
@@ -2717,7 +2717,7 @@
             <w:noProof/>
             <w:webHidden/>
           </w:rPr>
-          <w:instrText xml:space="preserve"> PAGEREF _Toc242289255 \h </w:instrText>
+          <w:instrText xml:space="preserve"> PAGEREF _Toc242290152 \h </w:instrText>
         </w:r>
         <w:r>
           <w:rPr>
@@ -2758,7 +2758,7 @@
           <w:noProof/>
         </w:rPr>
       </w:pPr>
-      <w:hyperlink w:anchor="_Toc242289256" w:history="1">
+      <w:hyperlink w:anchor="_Toc242290153" w:history="1">
         <w:r>
           <w:rPr>
             <w:rStyle w:val="Hyperlink"/>
@@ -2785,7 +2785,7 @@
             <w:noProof/>
             <w:webHidden/>
           </w:rPr>
-          <w:instrText xml:space="preserve"> PAGEREF _Toc242289256 \h </w:instrText>
+          <w:instrText xml:space="preserve"> PAGEREF _Toc242290153 \h </w:instrText>
         </w:r>
         <w:r>
           <w:rPr>
@@ -2826,7 +2826,7 @@
           <w:noProof/>
         </w:rPr>
       </w:pPr>
-      <w:hyperlink w:anchor="_Toc242289257" w:history="1">
+      <w:hyperlink w:anchor="_Toc242290154" w:history="1">
         <w:r>
           <w:rPr>
             <w:rStyle w:val="Hyperlink"/>
@@ -2853,7 +2853,7 @@
             <w:noProof/>
             <w:webHidden/>
           </w:rPr>
-          <w:instrText xml:space="preserve"> PAGEREF _Toc242289257 \h </w:instrText>
+          <w:instrText xml:space="preserve"> PAGEREF _Toc242290154 \h </w:instrText>
         </w:r>
         <w:r>
           <w:rPr>
@@ -2894,7 +2894,7 @@
           <w:noProof/>
         </w:rPr>
       </w:pPr>
-      <w:hyperlink w:anchor="_Toc242289258" w:history="1">
+      <w:hyperlink w:anchor="_Toc242290155" w:history="1">
         <w:r>
           <w:rPr>
             <w:rStyle w:val="Hyperlink"/>
@@ -2921,7 +2921,7 @@
             <w:noProof/>
             <w:webHidden/>
           </w:rPr>
-          <w:instrText xml:space="preserve"> PAGEREF _Toc242289258 \h </w:instrText>
+          <w:instrText xml:space="preserve"> PAGEREF _Toc242290155 \h </w:instrText>
         </w:r>
         <w:r>
           <w:rPr>
@@ -2962,7 +2962,7 @@
           <w:noProof/>
         </w:rPr>
       </w:pPr>
-      <w:hyperlink w:anchor="_Toc242289259" w:history="1">
+      <w:hyperlink w:anchor="_Toc242290156" w:history="1">
         <w:r>
           <w:rPr>
             <w:rStyle w:val="Hyperlink"/>
@@ -2989,7 +2989,7 @@
             <w:noProof/>
             <w:webHidden/>
           </w:rPr>
-          <w:instrText xml:space="preserve"> PAGEREF _Toc242289259 \h </w:instrText>
+          <w:instrText xml:space="preserve"> PAGEREF _Toc242290156 \h </w:instrText>
         </w:r>
         <w:r>
           <w:rPr>
@@ -3030,7 +3030,7 @@
           <w:noProof/>
         </w:rPr>
       </w:pPr>
-      <w:hyperlink w:anchor="_Toc242289260" w:history="1">
+      <w:hyperlink w:anchor="_Toc242290157" w:history="1">
         <w:r>
           <w:rPr>
             <w:rStyle w:val="Hyperlink"/>
@@ -3057,7 +3057,7 @@
             <w:noProof/>
             <w:webHidden/>
           </w:rPr>
-          <w:instrText xml:space="preserve"> PAGEREF _Toc242289260 \h </w:instrText>
+          <w:instrText xml:space="preserve"> PAGEREF _Toc242290157 \h </w:instrText>
         </w:r>
         <w:r>
           <w:rPr>
@@ -3098,7 +3098,7 @@
           <w:noProof/>
         </w:rPr>
       </w:pPr>
-      <w:hyperlink w:anchor="_Toc242289261" w:history="1">
+      <w:hyperlink w:anchor="_Toc242290158" w:history="1">
         <w:r>
           <w:rPr>
             <w:rStyle w:val="Hyperlink"/>
@@ -3125,7 +3125,7 @@
             <w:noProof/>
             <w:webHidden/>
           </w:rPr>
-          <w:instrText xml:space="preserve"> PAGEREF _Toc242289261 \h </w:instrText>
+          <w:instrText xml:space="preserve"> PAGEREF _Toc242290158 \h </w:instrText>
         </w:r>
         <w:r>
           <w:rPr>
@@ -3170,7 +3170,7 @@
       <w:pPr>
         <w:pStyle w:val="Heading1"/>
       </w:pPr>
-      <w:bookmarkStart w:id="1" w:name="_Toc242289219"/>
+      <w:bookmarkStart w:id="1" w:name="_Toc242290116"/>
       <w:r>
         <w:lastRenderedPageBreak/>
         <w:t>1. Overview</w:t>
@@ -3267,7 +3267,7 @@
       <w:pPr>
         <w:pStyle w:val="Heading2"/>
       </w:pPr>
-      <w:bookmarkStart w:id="2" w:name="_Toc242289220"/>
+      <w:bookmarkStart w:id="2" w:name="_Toc242290117"/>
       <w:r>
         <w:t>Three ways to use it</w:t>
       </w:r>
@@ -3602,7 +3602,7 @@
       <w:pPr>
         <w:pStyle w:val="Heading1"/>
       </w:pPr>
-      <w:bookmarkStart w:id="3" w:name="_Toc242289221"/>
+      <w:bookmarkStart w:id="3" w:name="_Toc242290118"/>
       <w:r>
         <w:t>2. Who can use the online site</w:t>
       </w:r>
@@ -3715,7 +3715,7 @@
       <w:pPr>
         <w:pStyle w:val="Heading1"/>
       </w:pPr>
-      <w:bookmarkStart w:id="4" w:name="_Toc242289222"/>
+      <w:bookmarkStart w:id="4" w:name="_Toc242290119"/>
       <w:r>
         <w:lastRenderedPageBreak/>
         <w:t>3. Key concepts</w:t>
@@ -3726,7 +3726,7 @@
       <w:pPr>
         <w:pStyle w:val="Heading2"/>
       </w:pPr>
-      <w:bookmarkStart w:id="5" w:name="_Toc242289223"/>
+      <w:bookmarkStart w:id="5" w:name="_Toc242290120"/>
       <w:r>
         <w:t>Programs and workspaces</w:t>
       </w:r>
@@ -4043,7 +4043,7 @@
       <w:pPr>
         <w:pStyle w:val="Heading2"/>
       </w:pPr>
-      <w:bookmarkStart w:id="6" w:name="_Toc242289224"/>
+      <w:bookmarkStart w:id="6" w:name="_Toc242290121"/>
       <w:r>
         <w:t>Key names</w:t>
       </w:r>
@@ -4415,7 +4415,7 @@
       <w:pPr>
         <w:pStyle w:val="Heading2"/>
       </w:pPr>
-      <w:bookmarkStart w:id="7" w:name="_Toc242289225"/>
+      <w:bookmarkStart w:id="7" w:name="_Toc242290122"/>
       <w:r>
         <w:t>Running twice is safe</w:t>
       </w:r>
@@ -4451,7 +4451,7 @@
       <w:pPr>
         <w:pStyle w:val="Heading2"/>
       </w:pPr>
-      <w:bookmarkStart w:id="8" w:name="_Toc242289226"/>
+      <w:bookmarkStart w:id="8" w:name="_Toc242290123"/>
       <w:r>
         <w:t>Credit limits</w:t>
       </w:r>
@@ -4551,7 +4551,7 @@
       <w:pPr>
         <w:pStyle w:val="Heading1"/>
       </w:pPr>
-      <w:bookmarkStart w:id="9" w:name="_Toc242289227"/>
+      <w:bookmarkStart w:id="9" w:name="_Toc242290124"/>
       <w:r>
         <w:lastRenderedPageBreak/>
         <w:t>4. Preparing the learner list (CSV)</w:t>
@@ -4605,7 +4605,7 @@
       <w:pPr>
         <w:pStyle w:val="Heading2"/>
       </w:pPr>
-      <w:bookmarkStart w:id="10" w:name="_Toc242289228"/>
+      <w:bookmarkStart w:id="10" w:name="_Toc242290125"/>
       <w:r>
         <w:t>Using the template</w:t>
       </w:r>
@@ -4622,7 +4622,7 @@
         <w:rPr>
           <w:b/>
         </w:rPr>
-        <w:t>Download the template (dummy.csv)</w:t>
+        <w:t>Download the template (learners.csv)</w:t>
       </w:r>
       <w:r>
         <w:t>.</w:t>
@@ -4657,7 +4657,7 @@
       <w:pPr>
         <w:pStyle w:val="Heading2"/>
       </w:pPr>
-      <w:bookmarkStart w:id="11" w:name="_Toc242289229"/>
+      <w:bookmarkStart w:id="11" w:name="_Toc242290126"/>
       <w:r>
         <w:t>Rules</w:t>
       </w:r>
@@ -4668,10 +4668,10 @@
         <w:pStyle w:val="ListBullet"/>
       </w:pPr>
       <w:r>
-        <w:t>The column can al</w:t>
-      </w:r>
-      <w:r>
-        <w:t xml:space="preserve">so be called </w:t>
+        <w:t>The column can</w:t>
+      </w:r>
+      <w:r>
+        <w:t xml:space="preserve"> also be called </w:t>
       </w:r>
       <w:r>
         <w:rPr>
@@ -4740,7 +4740,7 @@
       <w:pPr>
         <w:pStyle w:val="Heading1"/>
       </w:pPr>
-      <w:bookmarkStart w:id="12" w:name="_Toc242289230"/>
+      <w:bookmarkStart w:id="12" w:name="_Toc242290127"/>
       <w:r>
         <w:t>5. Creating keys on the online site</w:t>
       </w:r>
@@ -4750,7 +4750,7 @@
       <w:pPr>
         <w:pStyle w:val="Heading2"/>
       </w:pPr>
-      <w:bookmarkStart w:id="13" w:name="_Toc242289231"/>
+      <w:bookmarkStart w:id="13" w:name="_Toc242290128"/>
       <w:r>
         <w:t>Step by step</w:t>
       </w:r>
@@ -5008,7 +5008,7 @@
       <w:pPr>
         <w:pStyle w:val="Heading2"/>
       </w:pPr>
-      <w:bookmarkStart w:id="14" w:name="_Toc242289232"/>
+      <w:bookmarkStart w:id="14" w:name="_Toc242290129"/>
       <w:r>
         <w:lastRenderedPageBreak/>
         <w:t>Big lists</w:t>
@@ -5039,7 +5039,7 @@
       <w:pPr>
         <w:pStyle w:val="Heading2"/>
       </w:pPr>
-      <w:bookmarkStart w:id="15" w:name="_Toc242289233"/>
+      <w:bookmarkStart w:id="15" w:name="_Toc242290130"/>
       <w:r>
         <w:t>If something fails</w:t>
       </w:r>
@@ -5133,7 +5133,7 @@
       <w:pPr>
         <w:pStyle w:val="Heading1"/>
       </w:pPr>
-      <w:bookmarkStart w:id="16" w:name="_Toc242289234"/>
+      <w:bookmarkStart w:id="16" w:name="_Toc242290131"/>
       <w:r>
         <w:t>6. Finding and sharing the generated keys</w:t>
       </w:r>
@@ -5302,7 +5302,7 @@
       <w:pPr>
         <w:pStyle w:val="Heading1"/>
       </w:pPr>
-      <w:bookmarkStart w:id="17" w:name="_Toc242289235"/>
+      <w:bookmarkStart w:id="17" w:name="_Toc242290132"/>
       <w:r>
         <w:t>7. Usage reports for leadership</w:t>
       </w:r>
@@ -5335,7 +5335,7 @@
       <w:pPr>
         <w:pStyle w:val="Heading2"/>
       </w:pPr>
-      <w:bookmarkStart w:id="18" w:name="_Toc242289236"/>
+      <w:bookmarkStart w:id="18" w:name="_Toc242290133"/>
       <w:r>
         <w:t>What it shows</w:t>
       </w:r>
@@ -5747,7 +5747,7 @@
       <w:pPr>
         <w:pStyle w:val="Heading2"/>
       </w:pPr>
-      <w:bookmarkStart w:id="19" w:name="_Toc242289237"/>
+      <w:bookmarkStart w:id="19" w:name="_Toc242290134"/>
       <w:r>
         <w:t xml:space="preserve">Filtering and </w:t>
       </w:r>
@@ -5823,7 +5823,7 @@
       <w:pPr>
         <w:pStyle w:val="Heading2"/>
       </w:pPr>
-      <w:bookmarkStart w:id="20" w:name="_Toc242289238"/>
+      <w:bookmarkStart w:id="20" w:name="_Toc242290135"/>
       <w:r>
         <w:t>Getting the report out</w:t>
       </w:r>
@@ -5890,7 +5890,7 @@
       <w:pPr>
         <w:pStyle w:val="Heading2"/>
       </w:pPr>
-      <w:bookmarkStart w:id="21" w:name="_Toc242289239"/>
+      <w:bookmarkStart w:id="21" w:name="_Toc242290136"/>
       <w:r>
         <w:t>Good to know</w:t>
       </w:r>
@@ -6000,7 +6000,7 @@
       <w:pPr>
         <w:pStyle w:val="Heading1"/>
       </w:pPr>
-      <w:bookmarkStart w:id="22" w:name="_Toc242289240"/>
+      <w:bookmarkStart w:id="22" w:name="_Toc242290137"/>
       <w:r>
         <w:lastRenderedPageBreak/>
         <w:t>8. Monthly checklist</w:t>
@@ -6011,7 +6011,7 @@
       <w:pPr>
         <w:pStyle w:val="Heading2"/>
       </w:pPr>
-      <w:bookmarkStart w:id="23" w:name="_Toc242289241"/>
+      <w:bookmarkStart w:id="23" w:name="_Toc242290138"/>
       <w:r>
         <w:t>When a cohort starts</w:t>
       </w:r>
@@ -6025,7 +6025,7 @@
         <w:t>Prepare one CSV p</w:t>
       </w:r>
       <w:r>
-        <w:t>er program (start from dummy.csv).</w:t>
+        <w:t>er program (start from learners.csv).</w:t>
       </w:r>
     </w:p>
     <w:p>
@@ -6077,10 +6077,10 @@
         <w:pStyle w:val="ListNumber"/>
       </w:pPr>
       <w:r>
-        <w:t>Check the summary. Fix any</w:t>
-      </w:r>
-      <w:r>
-        <w:t xml:space="preserve"> </w:t>
+        <w:t xml:space="preserve">Check the summary. Fix </w:t>
+      </w:r>
+      <w:r>
+        <w:t xml:space="preserve">any </w:t>
       </w:r>
       <w:r>
         <w:rPr>
@@ -6122,7 +6122,7 @@
       <w:pPr>
         <w:pStyle w:val="Heading2"/>
       </w:pPr>
-      <w:bookmarkStart w:id="24" w:name="_Toc242289242"/>
+      <w:bookmarkStart w:id="24" w:name="_Toc242290139"/>
       <w:r>
         <w:t>When a cohort ends</w:t>
       </w:r>
@@ -6140,17 +6140,17 @@
         <w:t>mid-oct</w:t>
       </w:r>
       <w:r>
-        <w:t>) and disable or</w:t>
-      </w:r>
-      <w:r>
-        <w:t xml:space="preserve"> delete its keys. An automatic "revoke cohort" feature is planned but not built yet.</w:t>
+        <w:t>) and disable</w:t>
+      </w:r>
+      <w:r>
+        <w:t xml:space="preserve"> or delete its keys. An automatic "revoke cohort" feature is planned but not built yet.</w:t>
       </w:r>
     </w:p>
     <w:p>
       <w:pPr>
         <w:pStyle w:val="Heading1"/>
       </w:pPr>
-      <w:bookmarkStart w:id="25" w:name="_Toc242289243"/>
+      <w:bookmarkStart w:id="25" w:name="_Toc242290140"/>
       <w:r>
         <w:t>9. First-time test</w:t>
       </w:r>
@@ -6166,7 +6166,7 @@
         <w:pStyle w:val="ListNumber"/>
       </w:pPr>
       <w:r>
-        <w:t>Make a CSV with one email (yours is fine), e.g. from dummy.csv.</w:t>
+        <w:t>Make a CSV with one email (yours is fine), e.g. from learners.csv.</w:t>
       </w:r>
     </w:p>
     <w:p>
@@ -6181,14 +6181,14 @@
           <w:rFonts w:ascii="Consolas" w:hAnsi="Consolas"/>
           <w:sz w:val="20"/>
         </w:rPr>
-        <w:t>test-ru</w:t>
+        <w:t>t</w:t>
       </w:r>
       <w:r>
         <w:rPr>
           <w:rFonts w:ascii="Consolas" w:hAnsi="Consolas"/>
           <w:sz w:val="20"/>
         </w:rPr>
-        <w:t>n</w:t>
+        <w:t>est-run</w:t>
       </w:r>
       <w:r>
         <w:t xml:space="preserve">, limit </w:t>
@@ -6276,14 +6276,14 @@
           <w:rFonts w:ascii="Consolas" w:hAnsi="Consolas"/>
           <w:sz w:val="19"/>
         </w:rPr>
-        <w:t xml:space="preserve">curl.exe https://openrouter.ai/api/v1/key -H </w:t>
+        <w:t>curl.exe https://openrouter.ai/api/v1/key -H</w:t>
       </w:r>
       <w:r>
         <w:rPr>
           <w:rFonts w:ascii="Consolas" w:hAnsi="Consolas"/>
           <w:sz w:val="19"/>
         </w:rPr>
-        <w:t>"Authorization: Bearer PASTE_KEY_HERE"</w:t>
+        <w:t xml:space="preserve"> "Authorization: Bearer PASTE_KEY_HERE"</w:t>
       </w:r>
     </w:p>
     <w:p>
@@ -6323,10 +6323,10 @@
         <w:t>Already exists</w:t>
       </w:r>
       <w:r>
-        <w:t>, and there shou</w:t>
-      </w:r>
-      <w:r>
-        <w:t>ld be nothing to generate.</w:t>
+        <w:t>, and there sho</w:t>
+      </w:r>
+      <w:r>
+        <w:t>uld be nothing to generate.</w:t>
       </w:r>
     </w:p>
     <w:p>
@@ -6341,7 +6341,7 @@
       <w:pPr>
         <w:pStyle w:val="Heading1"/>
       </w:pPr>
-      <w:bookmarkStart w:id="26" w:name="_Toc242289244"/>
+      <w:bookmarkStart w:id="26" w:name="_Toc242290141"/>
       <w:r>
         <w:t>10. How the online site is set up</w:t>
       </w:r>
@@ -6480,14 +6480,14 @@
                 <w:rFonts w:ascii="Consolas" w:hAnsi="Consolas"/>
                 <w:sz w:val="20"/>
               </w:rPr>
-              <w:t>openrouter-k</w:t>
+              <w:t>openrouter-</w:t>
             </w:r>
             <w:r>
               <w:rPr>
                 <w:rFonts w:ascii="Consolas" w:hAnsi="Consolas"/>
                 <w:sz w:val="20"/>
               </w:rPr>
-              <w:t>ey-generator</w:t>
+              <w:t>key-generator</w:t>
             </w:r>
             <w:r>
               <w:rPr>
@@ -6737,7 +6737,7 @@
       <w:pPr>
         <w:pStyle w:val="Heading2"/>
       </w:pPr>
-      <w:bookmarkStart w:id="27" w:name="_Toc242289245"/>
+      <w:bookmarkStart w:id="27" w:name="_Toc242290142"/>
       <w:r>
         <w:t>Vercel settings</w:t>
       </w:r>
@@ -7116,7 +7116,7 @@
       <w:pPr>
         <w:pStyle w:val="Heading2"/>
       </w:pPr>
-      <w:bookmarkStart w:id="28" w:name="_Toc242289246"/>
+      <w:bookmarkStart w:id="28" w:name="_Toc242290143"/>
       <w:r>
         <w:t>Vercel's own login protection</w:t>
       </w:r>
@@ -7161,7 +7161,7 @@
       <w:pPr>
         <w:pStyle w:val="Heading1"/>
       </w:pPr>
-      <w:bookmarkStart w:id="29" w:name="_Toc242289247"/>
+      <w:bookmarkStart w:id="29" w:name="_Toc242290144"/>
       <w:r>
         <w:t>11. Administration</w:t>
       </w:r>
@@ -7171,7 +7171,7 @@
       <w:pPr>
         <w:pStyle w:val="Heading2"/>
       </w:pPr>
-      <w:bookmarkStart w:id="30" w:name="_Toc242289248"/>
+      <w:bookmarkStart w:id="30" w:name="_Toc242290145"/>
       <w:r>
         <w:t>Adding or removing a person</w:t>
       </w:r>
@@ -7307,7 +7307,7 @@
       <w:pPr>
         <w:pStyle w:val="Heading2"/>
       </w:pPr>
-      <w:bookmarkStart w:id="31" w:name="_Toc242289249"/>
+      <w:bookmarkStart w:id="31" w:name="_Toc242290146"/>
       <w:r>
         <w:t>Redeploying</w:t>
       </w:r>
@@ -7358,7 +7358,7 @@
       <w:pPr>
         <w:pStyle w:val="Heading2"/>
       </w:pPr>
-      <w:bookmarkStart w:id="32" w:name="_Toc242289250"/>
+      <w:bookmarkStart w:id="32" w:name="_Toc242290147"/>
       <w:r>
         <w:lastRenderedPageBreak/>
         <w:t>Changing the Management key</w:t>
@@ -7394,7 +7394,7 @@
       <w:pPr>
         <w:pStyle w:val="Heading2"/>
       </w:pPr>
-      <w:bookmarkStart w:id="33" w:name="_Toc242289251"/>
+      <w:bookmarkStart w:id="33" w:name="_Toc242290148"/>
       <w:r>
         <w:t xml:space="preserve">Updating the </w:t>
       </w:r>
@@ -7460,7 +7460,7 @@
       <w:pPr>
         <w:pStyle w:val="Heading1"/>
       </w:pPr>
-      <w:bookmarkStart w:id="34" w:name="_Toc242289252"/>
+      <w:bookmarkStart w:id="34" w:name="_Toc242290149"/>
       <w:r>
         <w:t xml:space="preserve">12. Running </w:t>
       </w:r>
@@ -7473,7 +7473,7 @@
       <w:pPr>
         <w:pStyle w:val="Heading2"/>
       </w:pPr>
-      <w:bookmarkStart w:id="35" w:name="_Toc242289253"/>
+      <w:bookmarkStart w:id="35" w:name="_Toc242290150"/>
       <w:r>
         <w:t>One-time setup</w:t>
       </w:r>
@@ -7592,7 +7592,7 @@
       <w:pPr>
         <w:pStyle w:val="Heading2"/>
       </w:pPr>
-      <w:bookmarkStart w:id="36" w:name="_Toc242289254"/>
+      <w:bookmarkStart w:id="36" w:name="_Toc242290151"/>
       <w:r>
         <w:t>Web page</w:t>
       </w:r>
@@ -7639,7 +7639,7 @@
       <w:pPr>
         <w:pStyle w:val="Heading2"/>
       </w:pPr>
-      <w:bookmarkStart w:id="37" w:name="_Toc242289255"/>
+      <w:bookmarkStart w:id="37" w:name="_Toc242290152"/>
       <w:r>
         <w:t>Command line</w:t>
       </w:r>
@@ -7786,7 +7786,7 @@
       <w:pPr>
         <w:pStyle w:val="Heading2"/>
       </w:pPr>
-      <w:bookmarkStart w:id="38" w:name="_Toc242289256"/>
+      <w:bookmarkStart w:id="38" w:name="_Toc242290153"/>
       <w:r>
         <w:lastRenderedPageBreak/>
         <w:t>Trying Google sign-in locally</w:t>
@@ -7879,7 +7879,7 @@
       <w:pPr>
         <w:pStyle w:val="Heading1"/>
       </w:pPr>
-      <w:bookmarkStart w:id="39" w:name="_Toc242289257"/>
+      <w:bookmarkStart w:id="39" w:name="_Toc242290154"/>
       <w:r>
         <w:t>13. Changing settings in config.js</w:t>
       </w:r>
@@ -8503,7 +8503,7 @@
       <w:pPr>
         <w:pStyle w:val="Heading1"/>
       </w:pPr>
-      <w:bookmarkStart w:id="40" w:name="_Toc242289258"/>
+      <w:bookmarkStart w:id="40" w:name="_Toc242290155"/>
       <w:r>
         <w:t>14. How it works (technical summary)</w:t>
       </w:r>
@@ -8649,7 +8649,7 @@
       <w:pPr>
         <w:pStyle w:val="Heading1"/>
       </w:pPr>
-      <w:bookmarkStart w:id="41" w:name="_Toc242289259"/>
+      <w:bookmarkStart w:id="41" w:name="_Toc242290156"/>
       <w:r>
         <w:t>15. Security</w:t>
       </w:r>
@@ -8805,7 +8805,7 @@
       <w:pPr>
         <w:pStyle w:val="Heading1"/>
       </w:pPr>
-      <w:bookmarkStart w:id="42" w:name="_Toc242289260"/>
+      <w:bookmarkStart w:id="42" w:name="_Toc242290157"/>
       <w:r>
         <w:t>16. Troubleshooting</w:t>
       </w:r>
@@ -9314,7 +9314,7 @@
               <w:rPr>
                 <w:sz w:val="20"/>
               </w:rPr>
-              <w:t>. Start from dummy.csv.</w:t>
+              <w:t>. Start from learners.csv.</w:t>
             </w:r>
           </w:p>
         </w:tc>
@@ -9361,13 +9361,13 @@
               <w:rPr>
                 <w:sz w:val="20"/>
               </w:rPr>
-              <w:t xml:space="preserve">Fix them </w:t>
-            </w:r>
-            <w:r>
-              <w:rPr>
-                <w:sz w:val="20"/>
-              </w:rPr>
-              <w:t>in the CSV and run again; created keys are skipped.</w:t>
+              <w:t xml:space="preserve">Fix </w:t>
+            </w:r>
+            <w:r>
+              <w:rPr>
+                <w:sz w:val="20"/>
+              </w:rPr>
+              <w:t>them in the CSV and run again; created keys are skipped.</w:t>
             </w:r>
           </w:p>
         </w:tc>
@@ -9436,13 +9436,13 @@
               <w:rPr>
                 <w:sz w:val="20"/>
               </w:rPr>
-              <w:t>That program's workspace couldn't be list</w:t>
-            </w:r>
-            <w:r>
-              <w:rPr>
-                <w:sz w:val="20"/>
-              </w:rPr>
-              <w:t xml:space="preserve">ed (wrong slug or Management key). The other programs are still shown. Check the message, then the slug in </w:t>
+              <w:t>That program's workspace couldn't be</w:t>
+            </w:r>
+            <w:r>
+              <w:rPr>
+                <w:sz w:val="20"/>
+              </w:rPr>
+              <w:t xml:space="preserve"> listed (wrong slug or Management key). The other programs are still shown. Check the message, then the slug in </w:t>
             </w:r>
             <w:r>
               <w:rPr>
@@ -9507,13 +9507,13 @@
               <w:rPr>
                 <w:sz w:val="20"/>
               </w:rPr>
-              <w:t>"The connection closed</w:t>
-            </w:r>
-            <w:r>
-              <w:rPr>
-                <w:sz w:val="20"/>
-              </w:rPr>
-              <w:t xml:space="preserve"> before the run finished"</w:t>
+              <w:t>"The connection c</w:t>
+            </w:r>
+            <w:r>
+              <w:rPr>
+                <w:sz w:val="20"/>
+              </w:rPr>
+              <w:t>losed before the run finished"</w:t>
             </w:r>
           </w:p>
         </w:tc>
@@ -9596,14 +9596,14 @@
                 <w:rFonts w:ascii="Consolas" w:hAnsi="Consolas"/>
                 <w:sz w:val="20"/>
               </w:rPr>
-              <w:t>… has different colu</w:t>
+              <w:t>… has different</w:t>
             </w:r>
             <w:r>
               <w:rPr>
                 <w:rFonts w:ascii="Consolas" w:hAnsi="Consolas"/>
                 <w:sz w:val="20"/>
               </w:rPr>
-              <w:t>mns …</w:t>
+              <w:t xml:space="preserve"> columns …</w:t>
             </w:r>
           </w:p>
         </w:tc>
@@ -9714,13 +9714,13 @@
               <w:rPr>
                 <w:sz w:val="20"/>
               </w:rPr>
-              <w:t xml:space="preserve">Install Node.js and open a </w:t>
-            </w:r>
-            <w:r>
-              <w:rPr>
-                <w:sz w:val="20"/>
-              </w:rPr>
-              <w:t>new terminal.</w:t>
+              <w:t xml:space="preserve">Install Node.js and </w:t>
+            </w:r>
+            <w:r>
+              <w:rPr>
+                <w:sz w:val="20"/>
+              </w:rPr>
+              <w:t>open a new terminal.</w:t>
             </w:r>
           </w:p>
         </w:tc>
@@ -9731,7 +9731,7 @@
       <w:pPr>
         <w:pStyle w:val="Heading1"/>
       </w:pPr>
-      <w:bookmarkStart w:id="43" w:name="_Toc242289261"/>
+      <w:bookmarkStart w:id="43" w:name="_Toc242290158"/>
       <w:r>
         <w:t>17. For developers</w:t>
       </w:r>
@@ -22654,7 +22654,7 @@
     <w:autoRedefine/>
     <w:uiPriority w:val="39"/>
     <w:unhideWhenUsed/>
-    <w:rsid w:val="00411A27"/>
+    <w:rsid w:val="00CC6778"/>
     <w:pPr>
       <w:spacing w:after="100"/>
     </w:pPr>
@@ -22666,7 +22666,7 @@
     <w:autoRedefine/>
     <w:uiPriority w:val="39"/>
     <w:unhideWhenUsed/>
-    <w:rsid w:val="00411A27"/>
+    <w:rsid w:val="00CC6778"/>
     <w:pPr>
       <w:spacing w:after="100"/>
       <w:ind w:left="220"/>
@@ -22677,7 +22677,7 @@
     <w:basedOn w:val="DefaultParagraphFont"/>
     <w:uiPriority w:val="99"/>
     <w:unhideWhenUsed/>
-    <w:rsid w:val="00411A27"/>
+    <w:rsid w:val="00CC6778"/>
     <w:rPr>
       <w:color w:val="0000FF" w:themeColor="hyperlink"/>
       <w:u w:val="single"/>
@@ -23011,7 +23011,7 @@
 </file>
 
 <file path=customXml/itemProps1.xml><?xml version="1.0" encoding="utf-8"?>
-<ds:datastoreItem xmlns:ds="http://schemas.openxmlformats.org/officeDocument/2006/customXml" ds:itemID="{33286F2B-0DF7-4BB7-9AEB-6D7281C382EF}">
+<ds:datastoreItem xmlns:ds="http://schemas.openxmlformats.org/officeDocument/2006/customXml" ds:itemID="{E88C492C-B3D8-4A2C-8672-7C799BB8CDFE}">
   <ds:schemaRefs>
     <ds:schemaRef ds:uri="http://schemas.openxmlformats.org/officeDocument/2006/bibliography"/>
   </ds:schemaRefs>

</xml_diff>

<commit_message>
Docs: Make troubleshooting, security notes and webhook replies
- README and guide: Make errors in Troubleshooting, Make webhook key and
  key-email notes in Security, intro mentions emailing keys
- Explain what the app expects back from Make (sent / Accepted / failed)

Co-Authored-By: Claude Opus 5.5 <noreply@anthropic.com>
</commit_message>
<xml_diff>
--- a/docs/OpenRouter-Key-Generator-Guide.docx
+++ b/docs/OpenRouter-Key-Generator-Guide.docx
@@ -3601,6 +3601,14 @@
       </w:r>
       <w:r>
         <w:t xml:space="preserve"> tab).</w:t>
+      </w:r>
+    </w:p>
+    <w:p>
+      <w:pPr>
+        <w:pStyle w:val="ListBullet"/>
+      </w:pPr>
+      <w:r>
+        <w:t xml:space="preserve">emails each learner their own key through the team's Make scenario, after you approve it (section 7).</w:t>
       </w:r>
     </w:p>
     <w:p>
@@ -5925,13 +5933,7 @@
               <w:rPr>
                 <w:sz w:val="20"/>
               </w:rPr>
-              <w:t xml:space="preserve">Make accepted it, but the scenario didn't confirm the email (its last step, Webhook response, is </w:t>
-            </w:r>
-            <w:r>
-              <w:rPr>
-                <w:sz w:val="20"/>
-              </w:rPr>
-              <w:t>missing).</w:t>
+              <w:t xml:space="preserve">Make accepted it but didn't confirm the email: the scenario's last step (Webhook response) is missing, or the scenario is off and Make is holding the email until it's turned on.</w:t>
             </w:r>
           </w:p>
         </w:tc>
@@ -6754,6 +6756,83 @@
           <w:p>
             <w:r>
               <w:t>The webhook address and API key are kept on the server only; the browser never sees them, and keys are never written to logs. Only people allowed to sign in can send.</w:t>
+            </w:r>
+          </w:p>
+          <w:p>
+            <w:r>
+              <w:t xml:space="preserve">What the site expects back from Make:</w:t>
+            </w:r>
+          </w:p>
+          <w:p>
+            <w:pPr>
+              <w:pStyle w:val="ListBullet"/>
+            </w:pPr>
+            <w:r>
+              <w:rPr>
+                <w:rFonts w:ascii="Consolas" w:hAnsi="Consolas"/>
+                <w:sz w:val="20"/>
+              </w:rPr>
+              <w:t xml:space="preserve">{"status":"sent"}</w:t>
+            </w:r>
+            <w:r>
+              <w:t xml:space="preserve"> → </w:t>
+            </w:r>
+            <w:r>
+              <w:rPr>
+                <w:b/>
+              </w:rPr>
+              <w:t xml:space="preserve">Sent ✓</w:t>
+            </w:r>
+            <w:r>
+              <w:t xml:space="preserve">.</w:t>
+            </w:r>
+          </w:p>
+          <w:p>
+            <w:pPr>
+              <w:pStyle w:val="ListBullet"/>
+            </w:pPr>
+            <w:r>
+              <w:rPr>
+                <w:rFonts w:ascii="Consolas" w:hAnsi="Consolas"/>
+                <w:sz w:val="20"/>
+              </w:rPr>
+              <w:t xml:space="preserve">Accepted</w:t>
+            </w:r>
+            <w:r>
+              <w:t xml:space="preserve"> (Make's default reply when there is no Webhook response) → </w:t>
+            </w:r>
+            <w:r>
+              <w:rPr>
+                <w:b/>
+              </w:rPr>
+              <w:t xml:space="preserve">Sent to Make</w:t>
+            </w:r>
+            <w:r>
+              <w:t xml:space="preserve">.</w:t>
+            </w:r>
+          </w:p>
+          <w:p>
+            <w:pPr>
+              <w:pStyle w:val="ListBullet"/>
+            </w:pPr>
+            <w:r>
+              <w:rPr>
+                <w:rFonts w:ascii="Consolas" w:hAnsi="Consolas"/>
+                <w:sz w:val="20"/>
+              </w:rPr>
+              <w:t xml:space="preserve">{"status":"failed","message":"reason"}</w:t>
+            </w:r>
+            <w:r>
+              <w:t xml:space="preserve">, an HTTP error, or no answer within 60 seconds → </w:t>
+            </w:r>
+            <w:r>
+              <w:rPr>
+                <w:b/>
+              </w:rPr>
+              <w:t xml:space="preserve">Failed</w:t>
+            </w:r>
+            <w:r>
+              <w:t xml:space="preserve">. A scenario can send the failed reply itself, e.g. from an error handler after the Gmail module.</w:t>
             </w:r>
           </w:p>
         </w:tc>
@@ -10172,6 +10251,20 @@
     </w:p>
     <w:p>
       <w:pPr>
+        <w:pStyle w:val="ListBullet"/>
+      </w:pPr>
+      <w:r>
+        <w:rPr>
+          <w:b/>
+        </w:rPr>
+        <w:t xml:space="preserve">Emailing keys.</w:t>
+      </w:r>
+      <w:r>
+        <w:t xml:space="preserve"> After the person confirms in the page, the server looks up each selected key and calls the Make webhook once per learner (with the webhook's API key). Each result (sent, queued or failed) is recorded in a sent log before the next learner; if it can't be recorded, sending stops. Learners already sent are skipped unless a resend is confirmed.</w:t>
+      </w:r>
+    </w:p>
+    <w:p>
+      <w:pPr>
         <w:pStyle w:val="Heading1"/>
       </w:pPr>
       <w:bookmarkStart w:id="46" w:name="_Toc242291000"/>
@@ -10235,6 +10328,81 @@
       </w:r>
       <w:r>
         <w:t>. Never paste it in chat or email.</w:t>
+      </w:r>
+    </w:p>
+    <w:p>
+      <w:pPr>
+        <w:pStyle w:val="ListBullet"/>
+      </w:pPr>
+      <w:r>
+        <w:t xml:space="preserve">The </w:t>
+      </w:r>
+      <w:r>
+        <w:rPr>
+          <w:b/>
+        </w:rPr>
+        <w:t xml:space="preserve">Make webhook address and API key</w:t>
+      </w:r>
+      <w:r>
+        <w:t xml:space="preserve"> (</w:t>
+      </w:r>
+      <w:r>
+        <w:rPr>
+          <w:rFonts w:ascii="Consolas" w:hAnsi="Consolas"/>
+          <w:sz w:val="20"/>
+        </w:rPr>
+        <w:t xml:space="preserve">MAKE_WEBHOOK_URL</w:t>
+      </w:r>
+      <w:r>
+        <w:t xml:space="preserve">, </w:t>
+      </w:r>
+      <w:r>
+        <w:rPr>
+          <w:rFonts w:ascii="Consolas" w:hAnsi="Consolas"/>
+          <w:sz w:val="20"/>
+        </w:rPr>
+        <w:t xml:space="preserve">MAKE_WEBHOOK_API_KEY</w:t>
+      </w:r>
+      <w:r>
+        <w:t xml:space="preserve">) let anyone trigger key emails from the team's Gmail. Keep them only in the Vercel settings and </w:t>
+      </w:r>
+      <w:r>
+        <w:rPr>
+          <w:rFonts w:ascii="Consolas" w:hAnsi="Consolas"/>
+          <w:sz w:val="20"/>
+        </w:rPr>
+        <w:t xml:space="preserve">.env</w:t>
+      </w:r>
+      <w:r>
+        <w:t xml:space="preserve">. If they leak, create a new API key on the webhook in Make and update both places.</w:t>
+      </w:r>
+    </w:p>
+    <w:p>
+      <w:pPr>
+        <w:pStyle w:val="ListBullet"/>
+      </w:pPr>
+      <w:r>
+        <w:t xml:space="preserve">Key emails carry live keys through Make and Gmail; each learner only gets their own. If the Google Sheet log stores </w:t>
+      </w:r>
+      <w:r>
+        <w:rPr>
+          <w:rFonts w:ascii="Consolas" w:hAnsi="Consolas"/>
+          <w:sz w:val="20"/>
+        </w:rPr>
+        <w:t xml:space="preserve">api_key</w:t>
+      </w:r>
+      <w:r>
+        <w:t xml:space="preserve">, restrict who can open that sheet, or don't map </w:t>
+      </w:r>
+      <w:r>
+        <w:rPr>
+          <w:rFonts w:ascii="Consolas" w:hAnsi="Consolas"/>
+          <w:sz w:val="20"/>
+        </w:rPr>
+        <w:t xml:space="preserve">api_key</w:t>
+      </w:r>
+      <w:r>
+        <w:t xml:space="preserve"> there.</w:t>
       </w:r>
     </w:p>
     <w:p>
@@ -11033,6 +11201,312 @@
                 <w:sz w:val="20"/>
               </w:rPr>
               <w:t>The internet or tab dropped. Click Preview to see what was created, then Generate again.</w:t>
+            </w:r>
+          </w:p>
+        </w:tc>
+      </w:tr>
+      <w:tr>
+        <w:tc>
+          <w:tcPr>
+            <w:tcW w:w="3685" w:type="dxa"/>
+          </w:tcPr>
+          <w:p>
+            <w:pPr>
+              <w:spacing w:after="40"/>
+            </w:pPr>
+            <w:r>
+              <w:rPr>
+                <w:sz w:val="20"/>
+              </w:rPr>
+              <w:t xml:space="preserve">"Sending is not set up: MAKE_WEBHOOK_URL is not set" (Send buttons off)</w:t>
+            </w:r>
+          </w:p>
+        </w:tc>
+        <w:tc>
+          <w:tcPr>
+            <w:tcW w:w="5669" w:type="dxa"/>
+          </w:tcPr>
+          <w:p>
+            <w:pPr>
+              <w:spacing w:after="40"/>
+            </w:pPr>
+            <w:r>
+              <w:rPr>
+                <w:sz w:val="20"/>
+              </w:rPr>
+              <w:t xml:space="preserve">Add </w:t>
+            </w:r>
+            <w:r>
+              <w:rPr>
+                <w:rFonts w:ascii="Consolas" w:hAnsi="Consolas"/>
+                <w:sz w:val="20"/>
+              </w:rPr>
+              <w:t xml:space="preserve">MAKE_WEBHOOK_URL</w:t>
+            </w:r>
+            <w:r>
+              <w:rPr>
+                <w:sz w:val="20"/>
+              </w:rPr>
+              <w:t xml:space="preserve"> and </w:t>
+            </w:r>
+            <w:r>
+              <w:rPr>
+                <w:rFonts w:ascii="Consolas" w:hAnsi="Consolas"/>
+                <w:sz w:val="20"/>
+              </w:rPr>
+              <w:t xml:space="preserve">MAKE_WEBHOOK_API_KEY</w:t>
+            </w:r>
+            <w:r>
+              <w:rPr>
+                <w:sz w:val="20"/>
+              </w:rPr>
+              <w:t xml:space="preserve"> in Vercel / .env, then redeploy / restart (section 7).</w:t>
+            </w:r>
+          </w:p>
+        </w:tc>
+      </w:tr>
+      <w:tr>
+        <w:tc>
+          <w:tcPr>
+            <w:tcW w:w="3685" w:type="dxa"/>
+          </w:tcPr>
+          <w:p>
+            <w:pPr>
+              <w:spacing w:after="40"/>
+            </w:pPr>
+            <w:r>
+              <w:rPr>
+                <w:rFonts w:ascii="Consolas" w:hAnsi="Consolas"/>
+                <w:sz w:val="20"/>
+              </w:rPr>
+              <w:t xml:space="preserve">MAKE_WEBHOOK_URL must start with https://</w:t>
+            </w:r>
+          </w:p>
+        </w:tc>
+        <w:tc>
+          <w:tcPr>
+            <w:tcW w:w="5669" w:type="dxa"/>
+          </w:tcPr>
+          <w:p>
+            <w:pPr>
+              <w:spacing w:after="40"/>
+            </w:pPr>
+            <w:r>
+              <w:rPr>
+                <w:sz w:val="20"/>
+              </w:rPr>
+              <w:t xml:space="preserve">Copy the webhook address again from Make (Copy address to clipboard). It starts with https://hook.</w:t>
+            </w:r>
+          </w:p>
+        </w:tc>
+      </w:tr>
+      <w:tr>
+        <w:tc>
+          <w:tcPr>
+            <w:tcW w:w="3685" w:type="dxa"/>
+          </w:tcPr>
+          <w:p>
+            <w:pPr>
+              <w:spacing w:after="40"/>
+            </w:pPr>
+            <w:r>
+              <w:rPr>
+                <w:sz w:val="20"/>
+              </w:rPr>
+              <w:t xml:space="preserve">Make webhook returned HTTP 401 / 403</w:t>
+            </w:r>
+          </w:p>
+        </w:tc>
+        <w:tc>
+          <w:tcPr>
+            <w:tcW w:w="5669" w:type="dxa"/>
+          </w:tcPr>
+          <w:p>
+            <w:pPr>
+              <w:spacing w:after="40"/>
+            </w:pPr>
+            <w:r>
+              <w:rPr>
+                <w:rFonts w:ascii="Consolas" w:hAnsi="Consolas"/>
+                <w:sz w:val="20"/>
+              </w:rPr>
+              <w:t xml:space="preserve">MAKE_WEBHOOK_API_KEY</w:t>
+            </w:r>
+            <w:r>
+              <w:rPr>
+                <w:sz w:val="20"/>
+              </w:rPr>
+              <w:t xml:space="preserve"> doesn't match the API key on the webhook in Make. Fix one of them, then redeploy / restart.</w:t>
+            </w:r>
+          </w:p>
+        </w:tc>
+      </w:tr>
+      <w:tr>
+        <w:tc>
+          <w:tcPr>
+            <w:tcW w:w="3685" w:type="dxa"/>
+          </w:tcPr>
+          <w:p>
+            <w:pPr>
+              <w:spacing w:after="40"/>
+            </w:pPr>
+            <w:r>
+              <w:rPr>
+                <w:sz w:val="20"/>
+              </w:rPr>
+              <w:t xml:space="preserve">Make webhook returned HTTP 404 / 410</w:t>
+            </w:r>
+          </w:p>
+        </w:tc>
+        <w:tc>
+          <w:tcPr>
+            <w:tcW w:w="5669" w:type="dxa"/>
+          </w:tcPr>
+          <w:p>
+            <w:pPr>
+              <w:spacing w:after="40"/>
+            </w:pPr>
+            <w:r>
+              <w:rPr>
+                <w:sz w:val="20"/>
+              </w:rPr>
+              <w:t xml:space="preserve">The webhook was deleted or the address is wrong. Copy the address from the Make scenario again.</w:t>
+            </w:r>
+          </w:p>
+        </w:tc>
+      </w:tr>
+      <w:tr>
+        <w:tc>
+          <w:tcPr>
+            <w:tcW w:w="3685" w:type="dxa"/>
+          </w:tcPr>
+          <w:p>
+            <w:pPr>
+              <w:spacing w:after="40"/>
+            </w:pPr>
+            <w:r>
+              <w:rPr>
+                <w:sz w:val="20"/>
+              </w:rPr>
+              <w:t xml:space="preserve">"Make did not answer within 60 seconds"</w:t>
+            </w:r>
+          </w:p>
+        </w:tc>
+        <w:tc>
+          <w:tcPr>
+            <w:tcW w:w="5669" w:type="dxa"/>
+          </w:tcPr>
+          <w:p>
+            <w:pPr>
+              <w:spacing w:after="40"/>
+            </w:pPr>
+            <w:r>
+              <w:rPr>
+                <w:sz w:val="20"/>
+              </w:rPr>
+              <w:t xml:space="preserve">The scenario took too long (usually Gmail). Check the scenario's History in Make to see whether the email went out before sending to that learner again.</w:t>
+            </w:r>
+          </w:p>
+        </w:tc>
+      </w:tr>
+      <w:tr>
+        <w:tc>
+          <w:tcPr>
+            <w:tcW w:w="3685" w:type="dxa"/>
+          </w:tcPr>
+          <w:p>
+            <w:pPr>
+              <w:spacing w:after="40"/>
+            </w:pPr>
+            <w:r>
+              <w:rPr>
+                <w:sz w:val="20"/>
+              </w:rPr>
+              <w:t xml:space="preserve">"Make reported a failure: …"</w:t>
+            </w:r>
+          </w:p>
+        </w:tc>
+        <w:tc>
+          <w:tcPr>
+            <w:tcW w:w="5669" w:type="dxa"/>
+          </w:tcPr>
+          <w:p>
+            <w:pPr>
+              <w:spacing w:after="40"/>
+            </w:pPr>
+            <w:r>
+              <w:rPr>
+                <w:sz w:val="20"/>
+              </w:rPr>
+              <w:t xml:space="preserve">The scenario replied {"status":"failed"}. Check its History in Make for the reason.</w:t>
+            </w:r>
+          </w:p>
+        </w:tc>
+      </w:tr>
+      <w:tr>
+        <w:tc>
+          <w:tcPr>
+            <w:tcW w:w="3685" w:type="dxa"/>
+          </w:tcPr>
+          <w:p>
+            <w:pPr>
+              <w:spacing w:after="40"/>
+            </w:pPr>
+            <w:r>
+              <w:rPr>
+                <w:sz w:val="20"/>
+              </w:rPr>
+              <w:t xml:space="preserve">Learner shows Sent to Make, not Sent ✓</w:t>
+            </w:r>
+          </w:p>
+        </w:tc>
+        <w:tc>
+          <w:tcPr>
+            <w:tcW w:w="5669" w:type="dxa"/>
+          </w:tcPr>
+          <w:p>
+            <w:pPr>
+              <w:spacing w:after="40"/>
+            </w:pPr>
+            <w:r>
+              <w:rPr>
+                <w:sz w:val="20"/>
+              </w:rPr>
+              <w:t xml:space="preserve">The scenario has no Webhook response at the end, or it is off (Make holds the email). Check Make or Gmail that the email went out.</w:t>
+            </w:r>
+          </w:p>
+        </w:tc>
+      </w:tr>
+      <w:tr>
+        <w:tc>
+          <w:tcPr>
+            <w:tcW w:w="3685" w:type="dxa"/>
+          </w:tcPr>
+          <w:p>
+            <w:pPr>
+              <w:spacing w:after="40"/>
+            </w:pPr>
+            <w:r>
+              <w:rPr>
+                <w:sz w:val="20"/>
+              </w:rPr>
+              <w:t xml:space="preserve">"Email … but the record could not be saved. Stopped"</w:t>
+            </w:r>
+          </w:p>
+        </w:tc>
+        <w:tc>
+          <w:tcPr>
+            <w:tcW w:w="5669" w:type="dxa"/>
+          </w:tcPr>
+          <w:p>
+            <w:pPr>
+              <w:spacing w:after="40"/>
+            </w:pPr>
+            <w:r>
+              <w:rPr>
+                <w:sz w:val="20"/>
+              </w:rPr>
+              <w:t xml:space="preserve">The email may have gone out without being recorded. Check Gmail's Sent folder for that learner before sending again. Locally, close sent_keys_log.csv if it is open in Excel.</w:t>
             </w:r>
           </w:p>
         </w:tc>

</xml_diff>

<commit_message>
Docs: log the sending Gmail address (sent_from) via Gmail Get an email
The Make scenario now reads the sent email back with Gmail > Get an email
and writes the sender's address to a sent_from column in the sheet.

Co-Authored-By: Claude Opus 5.5 <noreply@anthropic.com>
</commit_message>
<xml_diff>
--- a/docs/OpenRouter-Key-Generator-Guide.docx
+++ b/docs/OpenRouter-Key-Generator-Guide.docx
@@ -6650,14 +6650,30 @@
         <w:pStyle w:val="ListNumber"/>
       </w:pPr>
       <w:r>
-        <w:lastRenderedPageBreak/>
+        <w:t xml:space="preserve">After Send an email add </w:t>
+      </w:r>
+      <w:r>
+        <w:rPr>
+          <w:b/>
+        </w:rPr>
+        <w:t xml:space="preserve">Gmail → Get an email</w:t>
+      </w:r>
+      <w:r>
+        <w:t xml:space="preserve"> with the Message ID from Send an email. It reads the sent email back, so the sheet can record which Gmail account sent it.</w:t>
+      </w:r>
+    </w:p>
+    <w:p>
+      <w:pPr>
+        <w:pStyle w:val="ListNumber"/>
+      </w:pPr>
+      <w:r>
         <w:t xml:space="preserve">Replace </w:t>
       </w:r>
       <w:r>
         <w:rPr>
           <w:b/>
         </w:rPr>
-        <w:t>Update a Row</w:t>
+        <w:t xml:space="preserve">Update a Row</w:t>
       </w:r>
       <w:r>
         <w:t xml:space="preserve"> with </w:t>
@@ -6666,16 +6682,20 @@
         <w:rPr>
           <w:b/>
         </w:rPr>
-        <w:t xml:space="preserve">Google </w:t>
-      </w:r>
-      <w:r>
-        <w:rPr>
-          <w:b/>
-        </w:rPr>
-        <w:t>Sheets: Add a Row</w:t>
-      </w:r>
-      <w:r>
-        <w:t xml:space="preserve"> to keep the sheet as a sent log (email, name, key name, program, cohort, sent by, date).</w:t>
+        <w:t xml:space="preserve">Google Sheets: Add a Row</w:t>
+      </w:r>
+      <w:r>
+        <w:t xml:space="preserve"> to keep the sheet as a sent log: email, name, key name, program, cohort, sent by (who clicked Send in the app), test, date, and </w:t>
+      </w:r>
+      <w:r>
+        <w:rPr>
+          <w:rFonts w:ascii="Consolas" w:hAnsi="Consolas"/>
+          <w:sz w:val="20"/>
+        </w:rPr>
+        <w:t xml:space="preserve">sent_from</w:t>
+      </w:r>
+      <w:r>
+        <w:t xml:space="preserve"> = the sender's address from Get an email (the Gmail account the email came from).</w:t>
       </w:r>
     </w:p>
     <w:p>

</xml_diff>

<commit_message>
Guide: update table of contents page numbers
Co-Authored-By: Claude Opus 5.5 <noreply@anthropic.com>
</commit_message>
<xml_diff>
--- a/docs/OpenRouter-Key-Generator-Guide.docx
+++ b/docs/OpenRouter-Key-Generator-Guide.docx
@@ -230,7 +230,9 @@
           <w:tab w:val="right" w:leader="dot" w:pos="9736"/>
         </w:tabs>
         <w:rPr>
+          <w:rFonts w:asciiTheme="minorHAnsi" w:hAnsiTheme="minorHAnsi"/>
           <w:noProof/>
+          <w:lang w:val="en-IN" w:eastAsia="en-IN"/>
         </w:rPr>
       </w:pPr>
       <w:r>
@@ -242,7 +244,7 @@
       <w:r>
         <w:fldChar w:fldCharType="separate"/>
       </w:r>
-      <w:hyperlink w:anchor="_Toc242290955" w:history="1">
+      <w:hyperlink w:anchor="_Toc242296119" w:history="1">
         <w:r>
           <w:rPr>
             <w:rStyle w:val="Hyperlink"/>
@@ -269,7 +271,7 @@
             <w:noProof/>
             <w:webHidden/>
           </w:rPr>
-          <w:instrText xml:space="preserve"> PAGEREF _Toc242290955 \h </w:instrText>
+          <w:instrText xml:space="preserve"> PAGEREF _Toc242296119 \h </w:instrText>
         </w:r>
         <w:r>
           <w:rPr>
@@ -307,10 +309,12 @@
           <w:tab w:val="right" w:leader="dot" w:pos="9736"/>
         </w:tabs>
         <w:rPr>
+          <w:rFonts w:asciiTheme="minorHAnsi" w:hAnsiTheme="minorHAnsi"/>
           <w:noProof/>
-        </w:rPr>
-      </w:pPr>
-      <w:hyperlink w:anchor="_Toc242290956" w:history="1">
+          <w:lang w:val="en-IN" w:eastAsia="en-IN"/>
+        </w:rPr>
+      </w:pPr>
+      <w:hyperlink w:anchor="_Toc242296120" w:history="1">
         <w:r>
           <w:rPr>
             <w:rStyle w:val="Hyperlink"/>
@@ -337,7 +341,7 @@
             <w:noProof/>
             <w:webHidden/>
           </w:rPr>
-          <w:instrText xml:space="preserve"> PAGEREF _Toc242290956 \h </w:instrText>
+          <w:instrText xml:space="preserve"> PAGEREF _Toc242296120 \h </w:instrText>
         </w:r>
         <w:r>
           <w:rPr>
@@ -375,10 +379,12 @@
           <w:tab w:val="right" w:leader="dot" w:pos="9736"/>
         </w:tabs>
         <w:rPr>
+          <w:rFonts w:asciiTheme="minorHAnsi" w:hAnsiTheme="minorHAnsi"/>
           <w:noProof/>
-        </w:rPr>
-      </w:pPr>
-      <w:hyperlink w:anchor="_Toc242290957" w:history="1">
+          <w:lang w:val="en-IN" w:eastAsia="en-IN"/>
+        </w:rPr>
+      </w:pPr>
+      <w:hyperlink w:anchor="_Toc242296121" w:history="1">
         <w:r>
           <w:rPr>
             <w:rStyle w:val="Hyperlink"/>
@@ -405,7 +411,7 @@
             <w:noProof/>
             <w:webHidden/>
           </w:rPr>
-          <w:instrText xml:space="preserve"> PAGEREF _Toc242290957 \h </w:instrText>
+          <w:instrText xml:space="preserve"> PAGEREF _Toc242296121 \h </w:instrText>
         </w:r>
         <w:r>
           <w:rPr>
@@ -443,10 +449,12 @@
           <w:tab w:val="right" w:leader="dot" w:pos="9736"/>
         </w:tabs>
         <w:rPr>
+          <w:rFonts w:asciiTheme="minorHAnsi" w:hAnsiTheme="minorHAnsi"/>
           <w:noProof/>
-        </w:rPr>
-      </w:pPr>
-      <w:hyperlink w:anchor="_Toc242290958" w:history="1">
+          <w:lang w:val="en-IN" w:eastAsia="en-IN"/>
+        </w:rPr>
+      </w:pPr>
+      <w:hyperlink w:anchor="_Toc242296122" w:history="1">
         <w:r>
           <w:rPr>
             <w:rStyle w:val="Hyperlink"/>
@@ -473,7 +481,7 @@
             <w:noProof/>
             <w:webHidden/>
           </w:rPr>
-          <w:instrText xml:space="preserve"> PAGEREF _Toc242290958 \h </w:instrText>
+          <w:instrText xml:space="preserve"> PAGEREF _Toc242296122 \h </w:instrText>
         </w:r>
         <w:r>
           <w:rPr>
@@ -511,10 +519,12 @@
           <w:tab w:val="right" w:leader="dot" w:pos="9736"/>
         </w:tabs>
         <w:rPr>
+          <w:rFonts w:asciiTheme="minorHAnsi" w:hAnsiTheme="minorHAnsi"/>
           <w:noProof/>
-        </w:rPr>
-      </w:pPr>
-      <w:hyperlink w:anchor="_Toc242290959" w:history="1">
+          <w:lang w:val="en-IN" w:eastAsia="en-IN"/>
+        </w:rPr>
+      </w:pPr>
+      <w:hyperlink w:anchor="_Toc242296123" w:history="1">
         <w:r>
           <w:rPr>
             <w:rStyle w:val="Hyperlink"/>
@@ -541,7 +551,7 @@
             <w:noProof/>
             <w:webHidden/>
           </w:rPr>
-          <w:instrText xml:space="preserve"> PAGEREF _Toc242290959 \h </w:instrText>
+          <w:instrText xml:space="preserve"> PAGEREF _Toc242296123 \h </w:instrText>
         </w:r>
         <w:r>
           <w:rPr>
@@ -579,10 +589,12 @@
           <w:tab w:val="right" w:leader="dot" w:pos="9736"/>
         </w:tabs>
         <w:rPr>
+          <w:rFonts w:asciiTheme="minorHAnsi" w:hAnsiTheme="minorHAnsi"/>
           <w:noProof/>
-        </w:rPr>
-      </w:pPr>
-      <w:hyperlink w:anchor="_Toc242290960" w:history="1">
+          <w:lang w:val="en-IN" w:eastAsia="en-IN"/>
+        </w:rPr>
+      </w:pPr>
+      <w:hyperlink w:anchor="_Toc242296124" w:history="1">
         <w:r>
           <w:rPr>
             <w:rStyle w:val="Hyperlink"/>
@@ -609,7 +621,7 @@
             <w:noProof/>
             <w:webHidden/>
           </w:rPr>
-          <w:instrText xml:space="preserve"> PAGEREF _Toc242290960 \h </w:instrText>
+          <w:instrText xml:space="preserve"> PAGEREF _Toc242296124 \h </w:instrText>
         </w:r>
         <w:r>
           <w:rPr>
@@ -647,10 +659,12 @@
           <w:tab w:val="right" w:leader="dot" w:pos="9736"/>
         </w:tabs>
         <w:rPr>
+          <w:rFonts w:asciiTheme="minorHAnsi" w:hAnsiTheme="minorHAnsi"/>
           <w:noProof/>
-        </w:rPr>
-      </w:pPr>
-      <w:hyperlink w:anchor="_Toc242290961" w:history="1">
+          <w:lang w:val="en-IN" w:eastAsia="en-IN"/>
+        </w:rPr>
+      </w:pPr>
+      <w:hyperlink w:anchor="_Toc242296125" w:history="1">
         <w:r>
           <w:rPr>
             <w:rStyle w:val="Hyperlink"/>
@@ -677,7 +691,7 @@
             <w:noProof/>
             <w:webHidden/>
           </w:rPr>
-          <w:instrText xml:space="preserve"> PAGEREF _Toc242290961 \h </w:instrText>
+          <w:instrText xml:space="preserve"> PAGEREF _Toc242296125 \h </w:instrText>
         </w:r>
         <w:r>
           <w:rPr>
@@ -715,10 +729,12 @@
           <w:tab w:val="right" w:leader="dot" w:pos="9736"/>
         </w:tabs>
         <w:rPr>
+          <w:rFonts w:asciiTheme="minorHAnsi" w:hAnsiTheme="minorHAnsi"/>
           <w:noProof/>
-        </w:rPr>
-      </w:pPr>
-      <w:hyperlink w:anchor="_Toc242290962" w:history="1">
+          <w:lang w:val="en-IN" w:eastAsia="en-IN"/>
+        </w:rPr>
+      </w:pPr>
+      <w:hyperlink w:anchor="_Toc242296126" w:history="1">
         <w:r>
           <w:rPr>
             <w:rStyle w:val="Hyperlink"/>
@@ -745,7 +761,7 @@
             <w:noProof/>
             <w:webHidden/>
           </w:rPr>
-          <w:instrText xml:space="preserve"> PAGEREF _Toc242290962 \h </w:instrText>
+          <w:instrText xml:space="preserve"> PAGEREF _Toc242296126 \h </w:instrText>
         </w:r>
         <w:r>
           <w:rPr>
@@ -783,10 +799,12 @@
           <w:tab w:val="right" w:leader="dot" w:pos="9736"/>
         </w:tabs>
         <w:rPr>
+          <w:rFonts w:asciiTheme="minorHAnsi" w:hAnsiTheme="minorHAnsi"/>
           <w:noProof/>
-        </w:rPr>
-      </w:pPr>
-      <w:hyperlink w:anchor="_Toc242290963" w:history="1">
+          <w:lang w:val="en-IN" w:eastAsia="en-IN"/>
+        </w:rPr>
+      </w:pPr>
+      <w:hyperlink w:anchor="_Toc242296127" w:history="1">
         <w:r>
           <w:rPr>
             <w:rStyle w:val="Hyperlink"/>
@@ -813,7 +831,7 @@
             <w:noProof/>
             <w:webHidden/>
           </w:rPr>
-          <w:instrText xml:space="preserve"> PAGEREF _Toc242290963 \h </w:instrText>
+          <w:instrText xml:space="preserve"> PAGEREF _Toc242296127 \h </w:instrText>
         </w:r>
         <w:r>
           <w:rPr>
@@ -851,10 +869,12 @@
           <w:tab w:val="right" w:leader="dot" w:pos="9736"/>
         </w:tabs>
         <w:rPr>
+          <w:rFonts w:asciiTheme="minorHAnsi" w:hAnsiTheme="minorHAnsi"/>
           <w:noProof/>
-        </w:rPr>
-      </w:pPr>
-      <w:hyperlink w:anchor="_Toc242290964" w:history="1">
+          <w:lang w:val="en-IN" w:eastAsia="en-IN"/>
+        </w:rPr>
+      </w:pPr>
+      <w:hyperlink w:anchor="_Toc242296128" w:history="1">
         <w:r>
           <w:rPr>
             <w:rStyle w:val="Hyperlink"/>
@@ -881,7 +901,7 @@
             <w:noProof/>
             <w:webHidden/>
           </w:rPr>
-          <w:instrText xml:space="preserve"> PAGEREF _Toc242290964 \h </w:instrText>
+          <w:instrText xml:space="preserve"> PAGEREF _Toc242296128 \h </w:instrText>
         </w:r>
         <w:r>
           <w:rPr>
@@ -919,10 +939,12 @@
           <w:tab w:val="right" w:leader="dot" w:pos="9736"/>
         </w:tabs>
         <w:rPr>
+          <w:rFonts w:asciiTheme="minorHAnsi" w:hAnsiTheme="minorHAnsi"/>
           <w:noProof/>
-        </w:rPr>
-      </w:pPr>
-      <w:hyperlink w:anchor="_Toc242290965" w:history="1">
+          <w:lang w:val="en-IN" w:eastAsia="en-IN"/>
+        </w:rPr>
+      </w:pPr>
+      <w:hyperlink w:anchor="_Toc242296129" w:history="1">
         <w:r>
           <w:rPr>
             <w:rStyle w:val="Hyperlink"/>
@@ -949,7 +971,7 @@
             <w:noProof/>
             <w:webHidden/>
           </w:rPr>
-          <w:instrText xml:space="preserve"> PAGEREF _Toc242290965 \h </w:instrText>
+          <w:instrText xml:space="preserve"> PAGEREF _Toc242296129 \h </w:instrText>
         </w:r>
         <w:r>
           <w:rPr>
@@ -987,10 +1009,12 @@
           <w:tab w:val="right" w:leader="dot" w:pos="9736"/>
         </w:tabs>
         <w:rPr>
+          <w:rFonts w:asciiTheme="minorHAnsi" w:hAnsiTheme="minorHAnsi"/>
           <w:noProof/>
-        </w:rPr>
-      </w:pPr>
-      <w:hyperlink w:anchor="_Toc242290966" w:history="1">
+          <w:lang w:val="en-IN" w:eastAsia="en-IN"/>
+        </w:rPr>
+      </w:pPr>
+      <w:hyperlink w:anchor="_Toc242296130" w:history="1">
         <w:r>
           <w:rPr>
             <w:rStyle w:val="Hyperlink"/>
@@ -1017,7 +1041,7 @@
             <w:noProof/>
             <w:webHidden/>
           </w:rPr>
-          <w:instrText xml:space="preserve"> PAGEREF _Toc242290966 \h </w:instrText>
+          <w:instrText xml:space="preserve"> PAGEREF _Toc242296130 \h </w:instrText>
         </w:r>
         <w:r>
           <w:rPr>
@@ -1055,10 +1079,12 @@
           <w:tab w:val="right" w:leader="dot" w:pos="9736"/>
         </w:tabs>
         <w:rPr>
+          <w:rFonts w:asciiTheme="minorHAnsi" w:hAnsiTheme="minorHAnsi"/>
           <w:noProof/>
-        </w:rPr>
-      </w:pPr>
-      <w:hyperlink w:anchor="_Toc242290967" w:history="1">
+          <w:lang w:val="en-IN" w:eastAsia="en-IN"/>
+        </w:rPr>
+      </w:pPr>
+      <w:hyperlink w:anchor="_Toc242296131" w:history="1">
         <w:r>
           <w:rPr>
             <w:rStyle w:val="Hyperlink"/>
@@ -1085,7 +1111,7 @@
             <w:noProof/>
             <w:webHidden/>
           </w:rPr>
-          <w:instrText xml:space="preserve"> PAGEREF _Toc242290967 \h </w:instrText>
+          <w:instrText xml:space="preserve"> PAGEREF _Toc242296131 \h </w:instrText>
         </w:r>
         <w:r>
           <w:rPr>
@@ -1123,10 +1149,12 @@
           <w:tab w:val="right" w:leader="dot" w:pos="9736"/>
         </w:tabs>
         <w:rPr>
+          <w:rFonts w:asciiTheme="minorHAnsi" w:hAnsiTheme="minorHAnsi"/>
           <w:noProof/>
-        </w:rPr>
-      </w:pPr>
-      <w:hyperlink w:anchor="_Toc242290968" w:history="1">
+          <w:lang w:val="en-IN" w:eastAsia="en-IN"/>
+        </w:rPr>
+      </w:pPr>
+      <w:hyperlink w:anchor="_Toc242296132" w:history="1">
         <w:r>
           <w:rPr>
             <w:rStyle w:val="Hyperlink"/>
@@ -1153,7 +1181,7 @@
             <w:noProof/>
             <w:webHidden/>
           </w:rPr>
-          <w:instrText xml:space="preserve"> PAGEREF _Toc242290968 \h </w:instrText>
+          <w:instrText xml:space="preserve"> PAGEREF _Toc242296132 \h </w:instrText>
         </w:r>
         <w:r>
           <w:rPr>
@@ -1191,10 +1219,12 @@
           <w:tab w:val="right" w:leader="dot" w:pos="9736"/>
         </w:tabs>
         <w:rPr>
+          <w:rFonts w:asciiTheme="minorHAnsi" w:hAnsiTheme="minorHAnsi"/>
           <w:noProof/>
-        </w:rPr>
-      </w:pPr>
-      <w:hyperlink w:anchor="_Toc242290969" w:history="1">
+          <w:lang w:val="en-IN" w:eastAsia="en-IN"/>
+        </w:rPr>
+      </w:pPr>
+      <w:hyperlink w:anchor="_Toc242296133" w:history="1">
         <w:r>
           <w:rPr>
             <w:rStyle w:val="Hyperlink"/>
@@ -1221,7 +1251,7 @@
             <w:noProof/>
             <w:webHidden/>
           </w:rPr>
-          <w:instrText xml:space="preserve"> PAGEREF _Toc242290969 \h </w:instrText>
+          <w:instrText xml:space="preserve"> PAGEREF _Toc242296133 \h </w:instrText>
         </w:r>
         <w:r>
           <w:rPr>
@@ -1259,10 +1289,12 @@
           <w:tab w:val="right" w:leader="dot" w:pos="9736"/>
         </w:tabs>
         <w:rPr>
+          <w:rFonts w:asciiTheme="minorHAnsi" w:hAnsiTheme="minorHAnsi"/>
           <w:noProof/>
-        </w:rPr>
-      </w:pPr>
-      <w:hyperlink w:anchor="_Toc242290970" w:history="1">
+          <w:lang w:val="en-IN" w:eastAsia="en-IN"/>
+        </w:rPr>
+      </w:pPr>
+      <w:hyperlink w:anchor="_Toc242296134" w:history="1">
         <w:r>
           <w:rPr>
             <w:rStyle w:val="Hyperlink"/>
@@ -1289,7 +1321,7 @@
             <w:noProof/>
             <w:webHidden/>
           </w:rPr>
-          <w:instrText xml:space="preserve"> PAGEREF _Toc242290970 \h </w:instrText>
+          <w:instrText xml:space="preserve"> PAGEREF _Toc242296134 \h </w:instrText>
         </w:r>
         <w:r>
           <w:rPr>
@@ -1327,10 +1359,12 @@
           <w:tab w:val="right" w:leader="dot" w:pos="9736"/>
         </w:tabs>
         <w:rPr>
+          <w:rFonts w:asciiTheme="minorHAnsi" w:hAnsiTheme="minorHAnsi"/>
           <w:noProof/>
-        </w:rPr>
-      </w:pPr>
-      <w:hyperlink w:anchor="_Toc242290971" w:history="1">
+          <w:lang w:val="en-IN" w:eastAsia="en-IN"/>
+        </w:rPr>
+      </w:pPr>
+      <w:hyperlink w:anchor="_Toc242296135" w:history="1">
         <w:r>
           <w:rPr>
             <w:rStyle w:val="Hyperlink"/>
@@ -1357,7 +1391,7 @@
             <w:noProof/>
             <w:webHidden/>
           </w:rPr>
-          <w:instrText xml:space="preserve"> PAGEREF _Toc242290971 \h </w:instrText>
+          <w:instrText xml:space="preserve"> PAGEREF _Toc242296135 \h </w:instrText>
         </w:r>
         <w:r>
           <w:rPr>
@@ -1395,10 +1429,12 @@
           <w:tab w:val="right" w:leader="dot" w:pos="9736"/>
         </w:tabs>
         <w:rPr>
+          <w:rFonts w:asciiTheme="minorHAnsi" w:hAnsiTheme="minorHAnsi"/>
           <w:noProof/>
-        </w:rPr>
-      </w:pPr>
-      <w:hyperlink w:anchor="_Toc242290972" w:history="1">
+          <w:lang w:val="en-IN" w:eastAsia="en-IN"/>
+        </w:rPr>
+      </w:pPr>
+      <w:hyperlink w:anchor="_Toc242296136" w:history="1">
         <w:r>
           <w:rPr>
             <w:rStyle w:val="Hyperlink"/>
@@ -1425,7 +1461,7 @@
             <w:noProof/>
             <w:webHidden/>
           </w:rPr>
-          <w:instrText xml:space="preserve"> PAGEREF _Toc242290972 \h </w:instrText>
+          <w:instrText xml:space="preserve"> PAGEREF _Toc242296136 \h </w:instrText>
         </w:r>
         <w:r>
           <w:rPr>
@@ -1463,10 +1499,12 @@
           <w:tab w:val="right" w:leader="dot" w:pos="9736"/>
         </w:tabs>
         <w:rPr>
+          <w:rFonts w:asciiTheme="minorHAnsi" w:hAnsiTheme="minorHAnsi"/>
           <w:noProof/>
-        </w:rPr>
-      </w:pPr>
-      <w:hyperlink w:anchor="_Toc242290973" w:history="1">
+          <w:lang w:val="en-IN" w:eastAsia="en-IN"/>
+        </w:rPr>
+      </w:pPr>
+      <w:hyperlink w:anchor="_Toc242296137" w:history="1">
         <w:r>
           <w:rPr>
             <w:rStyle w:val="Hyperlink"/>
@@ -1493,7 +1531,7 @@
             <w:noProof/>
             <w:webHidden/>
           </w:rPr>
-          <w:instrText xml:space="preserve"> PAGEREF _Toc242290973 \h </w:instrText>
+          <w:instrText xml:space="preserve"> PAGEREF _Toc242296137 \h </w:instrText>
         </w:r>
         <w:r>
           <w:rPr>
@@ -1531,10 +1569,12 @@
           <w:tab w:val="right" w:leader="dot" w:pos="9736"/>
         </w:tabs>
         <w:rPr>
+          <w:rFonts w:asciiTheme="minorHAnsi" w:hAnsiTheme="minorHAnsi"/>
           <w:noProof/>
-        </w:rPr>
-      </w:pPr>
-      <w:hyperlink w:anchor="_Toc242290974" w:history="1">
+          <w:lang w:val="en-IN" w:eastAsia="en-IN"/>
+        </w:rPr>
+      </w:pPr>
+      <w:hyperlink w:anchor="_Toc242296138" w:history="1">
         <w:r>
           <w:rPr>
             <w:rStyle w:val="Hyperlink"/>
@@ -1561,7 +1601,7 @@
             <w:noProof/>
             <w:webHidden/>
           </w:rPr>
-          <w:instrText xml:space="preserve"> PAGEREF _Toc242290974 \h </w:instrText>
+          <w:instrText xml:space="preserve"> PAGEREF _Toc242296138 \h </w:instrText>
         </w:r>
         <w:r>
           <w:rPr>
@@ -1599,10 +1639,12 @@
           <w:tab w:val="right" w:leader="dot" w:pos="9736"/>
         </w:tabs>
         <w:rPr>
+          <w:rFonts w:asciiTheme="minorHAnsi" w:hAnsiTheme="minorHAnsi"/>
           <w:noProof/>
-        </w:rPr>
-      </w:pPr>
-      <w:hyperlink w:anchor="_Toc242290975" w:history="1">
+          <w:lang w:val="en-IN" w:eastAsia="en-IN"/>
+        </w:rPr>
+      </w:pPr>
+      <w:hyperlink w:anchor="_Toc242296139" w:history="1">
         <w:r>
           <w:rPr>
             <w:rStyle w:val="Hyperlink"/>
@@ -1629,7 +1671,7 @@
             <w:noProof/>
             <w:webHidden/>
           </w:rPr>
-          <w:instrText xml:space="preserve"> PAGEREF _Toc242290975 \h </w:instrText>
+          <w:instrText xml:space="preserve"> PAGEREF _Toc242296139 \h </w:instrText>
         </w:r>
         <w:r>
           <w:rPr>
@@ -1667,10 +1709,12 @@
           <w:tab w:val="right" w:leader="dot" w:pos="9736"/>
         </w:tabs>
         <w:rPr>
+          <w:rFonts w:asciiTheme="minorHAnsi" w:hAnsiTheme="minorHAnsi"/>
           <w:noProof/>
-        </w:rPr>
-      </w:pPr>
-      <w:hyperlink w:anchor="_Toc242290976" w:history="1">
+          <w:lang w:val="en-IN" w:eastAsia="en-IN"/>
+        </w:rPr>
+      </w:pPr>
+      <w:hyperlink w:anchor="_Toc242296140" w:history="1">
         <w:r>
           <w:rPr>
             <w:rStyle w:val="Hyperlink"/>
@@ -1697,7 +1741,7 @@
             <w:noProof/>
             <w:webHidden/>
           </w:rPr>
-          <w:instrText xml:space="preserve"> PAGEREF _Toc242290976 \h </w:instrText>
+          <w:instrText xml:space="preserve"> PAGEREF _Toc242296140 \h </w:instrText>
         </w:r>
         <w:r>
           <w:rPr>
@@ -1735,10 +1779,12 @@
           <w:tab w:val="right" w:leader="dot" w:pos="9736"/>
         </w:tabs>
         <w:rPr>
+          <w:rFonts w:asciiTheme="minorHAnsi" w:hAnsiTheme="minorHAnsi"/>
           <w:noProof/>
-        </w:rPr>
-      </w:pPr>
-      <w:hyperlink w:anchor="_Toc242290977" w:history="1">
+          <w:lang w:val="en-IN" w:eastAsia="en-IN"/>
+        </w:rPr>
+      </w:pPr>
+      <w:hyperlink w:anchor="_Toc242296141" w:history="1">
         <w:r>
           <w:rPr>
             <w:rStyle w:val="Hyperlink"/>
@@ -1765,7 +1811,7 @@
             <w:noProof/>
             <w:webHidden/>
           </w:rPr>
-          <w:instrText xml:space="preserve"> PAGEREF _Toc242290977 \h </w:instrText>
+          <w:instrText xml:space="preserve"> PAGEREF _Toc242296141 \h </w:instrText>
         </w:r>
         <w:r>
           <w:rPr>
@@ -1803,10 +1849,12 @@
           <w:tab w:val="right" w:leader="dot" w:pos="9736"/>
         </w:tabs>
         <w:rPr>
+          <w:rFonts w:asciiTheme="minorHAnsi" w:hAnsiTheme="minorHAnsi"/>
           <w:noProof/>
-        </w:rPr>
-      </w:pPr>
-      <w:hyperlink w:anchor="_Toc242290978" w:history="1">
+          <w:lang w:val="en-IN" w:eastAsia="en-IN"/>
+        </w:rPr>
+      </w:pPr>
+      <w:hyperlink w:anchor="_Toc242296142" w:history="1">
         <w:r>
           <w:rPr>
             <w:rStyle w:val="Hyperlink"/>
@@ -1833,7 +1881,7 @@
             <w:noProof/>
             <w:webHidden/>
           </w:rPr>
-          <w:instrText xml:space="preserve"> PAGEREF _Toc242290978 \h </w:instrText>
+          <w:instrText xml:space="preserve"> PAGEREF _Toc242296142 \h </w:instrText>
         </w:r>
         <w:r>
           <w:rPr>
@@ -1853,7 +1901,7 @@
             <w:noProof/>
             <w:webHidden/>
           </w:rPr>
-          <w:t>9</w:t>
+          <w:t>10</w:t>
         </w:r>
         <w:r>
           <w:rPr>
@@ -1871,10 +1919,12 @@
           <w:tab w:val="right" w:leader="dot" w:pos="9736"/>
         </w:tabs>
         <w:rPr>
+          <w:rFonts w:asciiTheme="minorHAnsi" w:hAnsiTheme="minorHAnsi"/>
           <w:noProof/>
-        </w:rPr>
-      </w:pPr>
-      <w:hyperlink w:anchor="_Toc242290979" w:history="1">
+          <w:lang w:val="en-IN" w:eastAsia="en-IN"/>
+        </w:rPr>
+      </w:pPr>
+      <w:hyperlink w:anchor="_Toc242296143" w:history="1">
         <w:r>
           <w:rPr>
             <w:rStyle w:val="Hyperlink"/>
@@ -1901,7 +1951,7 @@
             <w:noProof/>
             <w:webHidden/>
           </w:rPr>
-          <w:instrText xml:space="preserve"> PAGEREF _Toc242290979 \h </w:instrText>
+          <w:instrText xml:space="preserve"> PAGEREF _Toc242296143 \h </w:instrText>
         </w:r>
         <w:r>
           <w:rPr>
@@ -1939,10 +1989,12 @@
           <w:tab w:val="right" w:leader="dot" w:pos="9736"/>
         </w:tabs>
         <w:rPr>
+          <w:rFonts w:asciiTheme="minorHAnsi" w:hAnsiTheme="minorHAnsi"/>
           <w:noProof/>
-        </w:rPr>
-      </w:pPr>
-      <w:hyperlink w:anchor="_Toc242290980" w:history="1">
+          <w:lang w:val="en-IN" w:eastAsia="en-IN"/>
+        </w:rPr>
+      </w:pPr>
+      <w:hyperlink w:anchor="_Toc242296144" w:history="1">
         <w:r>
           <w:rPr>
             <w:rStyle w:val="Hyperlink"/>
@@ -1969,7 +2021,7 @@
             <w:noProof/>
             <w:webHidden/>
           </w:rPr>
-          <w:instrText xml:space="preserve"> PAGEREF _Toc242290980 \h </w:instrText>
+          <w:instrText xml:space="preserve"> PAGEREF _Toc242296144 \h </w:instrText>
         </w:r>
         <w:r>
           <w:rPr>
@@ -2007,10 +2059,12 @@
           <w:tab w:val="right" w:leader="dot" w:pos="9736"/>
         </w:tabs>
         <w:rPr>
+          <w:rFonts w:asciiTheme="minorHAnsi" w:hAnsiTheme="minorHAnsi"/>
           <w:noProof/>
-        </w:rPr>
-      </w:pPr>
-      <w:hyperlink w:anchor="_Toc242290981" w:history="1">
+          <w:lang w:val="en-IN" w:eastAsia="en-IN"/>
+        </w:rPr>
+      </w:pPr>
+      <w:hyperlink w:anchor="_Toc242296145" w:history="1">
         <w:r>
           <w:rPr>
             <w:rStyle w:val="Hyperlink"/>
@@ -2037,7 +2091,7 @@
             <w:noProof/>
             <w:webHidden/>
           </w:rPr>
-          <w:instrText xml:space="preserve"> PAGEREF _Toc242290981 \h </w:instrText>
+          <w:instrText xml:space="preserve"> PAGEREF _Toc242296145 \h </w:instrText>
         </w:r>
         <w:r>
           <w:rPr>
@@ -2075,10 +2129,12 @@
           <w:tab w:val="right" w:leader="dot" w:pos="9736"/>
         </w:tabs>
         <w:rPr>
+          <w:rFonts w:asciiTheme="minorHAnsi" w:hAnsiTheme="minorHAnsi"/>
           <w:noProof/>
-        </w:rPr>
-      </w:pPr>
-      <w:hyperlink w:anchor="_Toc242290982" w:history="1">
+          <w:lang w:val="en-IN" w:eastAsia="en-IN"/>
+        </w:rPr>
+      </w:pPr>
+      <w:hyperlink w:anchor="_Toc242296146" w:history="1">
         <w:r>
           <w:rPr>
             <w:rStyle w:val="Hyperlink"/>
@@ -2105,7 +2161,7 @@
             <w:noProof/>
             <w:webHidden/>
           </w:rPr>
-          <w:instrText xml:space="preserve"> PAGEREF _Toc242290982 \h </w:instrText>
+          <w:instrText xml:space="preserve"> PAGEREF _Toc242296146 \h </w:instrText>
         </w:r>
         <w:r>
           <w:rPr>
@@ -2143,10 +2199,12 @@
           <w:tab w:val="right" w:leader="dot" w:pos="9736"/>
         </w:tabs>
         <w:rPr>
+          <w:rFonts w:asciiTheme="minorHAnsi" w:hAnsiTheme="minorHAnsi"/>
           <w:noProof/>
-        </w:rPr>
-      </w:pPr>
-      <w:hyperlink w:anchor="_Toc242290983" w:history="1">
+          <w:lang w:val="en-IN" w:eastAsia="en-IN"/>
+        </w:rPr>
+      </w:pPr>
+      <w:hyperlink w:anchor="_Toc242296147" w:history="1">
         <w:r>
           <w:rPr>
             <w:rStyle w:val="Hyperlink"/>
@@ -2173,7 +2231,7 @@
             <w:noProof/>
             <w:webHidden/>
           </w:rPr>
-          <w:instrText xml:space="preserve"> PAGEREF _Toc242290983 \h </w:instrText>
+          <w:instrText xml:space="preserve"> PAGEREF _Toc242296147 \h </w:instrText>
         </w:r>
         <w:r>
           <w:rPr>
@@ -2193,7 +2251,7 @@
             <w:noProof/>
             <w:webHidden/>
           </w:rPr>
-          <w:t>10</w:t>
+          <w:t>11</w:t>
         </w:r>
         <w:r>
           <w:rPr>
@@ -2211,10 +2269,12 @@
           <w:tab w:val="right" w:leader="dot" w:pos="9736"/>
         </w:tabs>
         <w:rPr>
+          <w:rFonts w:asciiTheme="minorHAnsi" w:hAnsiTheme="minorHAnsi"/>
           <w:noProof/>
-        </w:rPr>
-      </w:pPr>
-      <w:hyperlink w:anchor="_Toc242290984" w:history="1">
+          <w:lang w:val="en-IN" w:eastAsia="en-IN"/>
+        </w:rPr>
+      </w:pPr>
+      <w:hyperlink w:anchor="_Toc242296148" w:history="1">
         <w:r>
           <w:rPr>
             <w:rStyle w:val="Hyperlink"/>
@@ -2241,7 +2301,7 @@
             <w:noProof/>
             <w:webHidden/>
           </w:rPr>
-          <w:instrText xml:space="preserve"> PAGEREF _Toc242290984 \h </w:instrText>
+          <w:instrText xml:space="preserve"> PAGEREF _Toc242296148 \h </w:instrText>
         </w:r>
         <w:r>
           <w:rPr>
@@ -2261,7 +2321,7 @@
             <w:noProof/>
             <w:webHidden/>
           </w:rPr>
-          <w:t>10</w:t>
+          <w:t>11</w:t>
         </w:r>
         <w:r>
           <w:rPr>
@@ -2279,10 +2339,12 @@
           <w:tab w:val="right" w:leader="dot" w:pos="9736"/>
         </w:tabs>
         <w:rPr>
+          <w:rFonts w:asciiTheme="minorHAnsi" w:hAnsiTheme="minorHAnsi"/>
           <w:noProof/>
-        </w:rPr>
-      </w:pPr>
-      <w:hyperlink w:anchor="_Toc242290985" w:history="1">
+          <w:lang w:val="en-IN" w:eastAsia="en-IN"/>
+        </w:rPr>
+      </w:pPr>
+      <w:hyperlink w:anchor="_Toc242296149" w:history="1">
         <w:r>
           <w:rPr>
             <w:rStyle w:val="Hyperlink"/>
@@ -2309,7 +2371,7 @@
             <w:noProof/>
             <w:webHidden/>
           </w:rPr>
-          <w:instrText xml:space="preserve"> PAGEREF _Toc242290985 \h </w:instrText>
+          <w:instrText xml:space="preserve"> PAGEREF _Toc242296149 \h </w:instrText>
         </w:r>
         <w:r>
           <w:rPr>
@@ -2347,10 +2409,12 @@
           <w:tab w:val="right" w:leader="dot" w:pos="9736"/>
         </w:tabs>
         <w:rPr>
+          <w:rFonts w:asciiTheme="minorHAnsi" w:hAnsiTheme="minorHAnsi"/>
           <w:noProof/>
-        </w:rPr>
-      </w:pPr>
-      <w:hyperlink w:anchor="_Toc242290986" w:history="1">
+          <w:lang w:val="en-IN" w:eastAsia="en-IN"/>
+        </w:rPr>
+      </w:pPr>
+      <w:hyperlink w:anchor="_Toc242296150" w:history="1">
         <w:r>
           <w:rPr>
             <w:rStyle w:val="Hyperlink"/>
@@ -2377,7 +2441,7 @@
             <w:noProof/>
             <w:webHidden/>
           </w:rPr>
-          <w:instrText xml:space="preserve"> PAGEREF _Toc242290986 \h </w:instrText>
+          <w:instrText xml:space="preserve"> PAGEREF _Toc242296150 \h </w:instrText>
         </w:r>
         <w:r>
           <w:rPr>
@@ -2415,10 +2479,12 @@
           <w:tab w:val="right" w:leader="dot" w:pos="9736"/>
         </w:tabs>
         <w:rPr>
+          <w:rFonts w:asciiTheme="minorHAnsi" w:hAnsiTheme="minorHAnsi"/>
           <w:noProof/>
-        </w:rPr>
-      </w:pPr>
-      <w:hyperlink w:anchor="_Toc242290987" w:history="1">
+          <w:lang w:val="en-IN" w:eastAsia="en-IN"/>
+        </w:rPr>
+      </w:pPr>
+      <w:hyperlink w:anchor="_Toc242296151" w:history="1">
         <w:r>
           <w:rPr>
             <w:rStyle w:val="Hyperlink"/>
@@ -2445,7 +2511,7 @@
             <w:noProof/>
             <w:webHidden/>
           </w:rPr>
-          <w:instrText xml:space="preserve"> PAGEREF _Toc242290987 \h </w:instrText>
+          <w:instrText xml:space="preserve"> PAGEREF _Toc242296151 \h </w:instrText>
         </w:r>
         <w:r>
           <w:rPr>
@@ -2483,10 +2549,12 @@
           <w:tab w:val="right" w:leader="dot" w:pos="9736"/>
         </w:tabs>
         <w:rPr>
+          <w:rFonts w:asciiTheme="minorHAnsi" w:hAnsiTheme="minorHAnsi"/>
           <w:noProof/>
-        </w:rPr>
-      </w:pPr>
-      <w:hyperlink w:anchor="_Toc242290988" w:history="1">
+          <w:lang w:val="en-IN" w:eastAsia="en-IN"/>
+        </w:rPr>
+      </w:pPr>
+      <w:hyperlink w:anchor="_Toc242296152" w:history="1">
         <w:r>
           <w:rPr>
             <w:rStyle w:val="Hyperlink"/>
@@ -2513,7 +2581,7 @@
             <w:noProof/>
             <w:webHidden/>
           </w:rPr>
-          <w:instrText xml:space="preserve"> PAGEREF _Toc242290988 \h </w:instrText>
+          <w:instrText xml:space="preserve"> PAGEREF _Toc242296152 \h </w:instrText>
         </w:r>
         <w:r>
           <w:rPr>
@@ -2551,10 +2619,12 @@
           <w:tab w:val="right" w:leader="dot" w:pos="9736"/>
         </w:tabs>
         <w:rPr>
+          <w:rFonts w:asciiTheme="minorHAnsi" w:hAnsiTheme="minorHAnsi"/>
           <w:noProof/>
-        </w:rPr>
-      </w:pPr>
-      <w:hyperlink w:anchor="_Toc242290989" w:history="1">
+          <w:lang w:val="en-IN" w:eastAsia="en-IN"/>
+        </w:rPr>
+      </w:pPr>
+      <w:hyperlink w:anchor="_Toc242296153" w:history="1">
         <w:r>
           <w:rPr>
             <w:rStyle w:val="Hyperlink"/>
@@ -2581,7 +2651,7 @@
             <w:noProof/>
             <w:webHidden/>
           </w:rPr>
-          <w:instrText xml:space="preserve"> PAGEREF _Toc242290989 \h </w:instrText>
+          <w:instrText xml:space="preserve"> PAGEREF _Toc242296153 \h </w:instrText>
         </w:r>
         <w:r>
           <w:rPr>
@@ -2619,10 +2689,12 @@
           <w:tab w:val="right" w:leader="dot" w:pos="9736"/>
         </w:tabs>
         <w:rPr>
+          <w:rFonts w:asciiTheme="minorHAnsi" w:hAnsiTheme="minorHAnsi"/>
           <w:noProof/>
-        </w:rPr>
-      </w:pPr>
-      <w:hyperlink w:anchor="_Toc242290990" w:history="1">
+          <w:lang w:val="en-IN" w:eastAsia="en-IN"/>
+        </w:rPr>
+      </w:pPr>
+      <w:hyperlink w:anchor="_Toc242296154" w:history="1">
         <w:r>
           <w:rPr>
             <w:rStyle w:val="Hyperlink"/>
@@ -2649,7 +2721,7 @@
             <w:noProof/>
             <w:webHidden/>
           </w:rPr>
-          <w:instrText xml:space="preserve"> PAGEREF _Toc242290990 \h </w:instrText>
+          <w:instrText xml:space="preserve"> PAGEREF _Toc242296154 \h </w:instrText>
         </w:r>
         <w:r>
           <w:rPr>
@@ -2687,10 +2759,12 @@
           <w:tab w:val="right" w:leader="dot" w:pos="9736"/>
         </w:tabs>
         <w:rPr>
+          <w:rFonts w:asciiTheme="minorHAnsi" w:hAnsiTheme="minorHAnsi"/>
           <w:noProof/>
-        </w:rPr>
-      </w:pPr>
-      <w:hyperlink w:anchor="_Toc242290991" w:history="1">
+          <w:lang w:val="en-IN" w:eastAsia="en-IN"/>
+        </w:rPr>
+      </w:pPr>
+      <w:hyperlink w:anchor="_Toc242296155" w:history="1">
         <w:r>
           <w:rPr>
             <w:rStyle w:val="Hyperlink"/>
@@ -2717,7 +2791,7 @@
             <w:noProof/>
             <w:webHidden/>
           </w:rPr>
-          <w:instrText xml:space="preserve"> PAGEREF _Toc242290991 \h </w:instrText>
+          <w:instrText xml:space="preserve"> PAGEREF _Toc242296155 \h </w:instrText>
         </w:r>
         <w:r>
           <w:rPr>
@@ -2755,10 +2829,12 @@
           <w:tab w:val="right" w:leader="dot" w:pos="9736"/>
         </w:tabs>
         <w:rPr>
+          <w:rFonts w:asciiTheme="minorHAnsi" w:hAnsiTheme="minorHAnsi"/>
           <w:noProof/>
-        </w:rPr>
-      </w:pPr>
-      <w:hyperlink w:anchor="_Toc242290992" w:history="1">
+          <w:lang w:val="en-IN" w:eastAsia="en-IN"/>
+        </w:rPr>
+      </w:pPr>
+      <w:hyperlink w:anchor="_Toc242296156" w:history="1">
         <w:r>
           <w:rPr>
             <w:rStyle w:val="Hyperlink"/>
@@ -2785,7 +2861,7 @@
             <w:noProof/>
             <w:webHidden/>
           </w:rPr>
-          <w:instrText xml:space="preserve"> PAGEREF _Toc242290992 \h </w:instrText>
+          <w:instrText xml:space="preserve"> PAGEREF _Toc242296156 \h </w:instrText>
         </w:r>
         <w:r>
           <w:rPr>
@@ -2823,10 +2899,12 @@
           <w:tab w:val="right" w:leader="dot" w:pos="9736"/>
         </w:tabs>
         <w:rPr>
+          <w:rFonts w:asciiTheme="minorHAnsi" w:hAnsiTheme="minorHAnsi"/>
           <w:noProof/>
-        </w:rPr>
-      </w:pPr>
-      <w:hyperlink w:anchor="_Toc242290993" w:history="1">
+          <w:lang w:val="en-IN" w:eastAsia="en-IN"/>
+        </w:rPr>
+      </w:pPr>
+      <w:hyperlink w:anchor="_Toc242296157" w:history="1">
         <w:r>
           <w:rPr>
             <w:rStyle w:val="Hyperlink"/>
@@ -2853,7 +2931,7 @@
             <w:noProof/>
             <w:webHidden/>
           </w:rPr>
-          <w:instrText xml:space="preserve"> PAGEREF _Toc242290993 \h </w:instrText>
+          <w:instrText xml:space="preserve"> PAGEREF _Toc242296157 \h </w:instrText>
         </w:r>
         <w:r>
           <w:rPr>
@@ -2873,7 +2951,7 @@
             <w:noProof/>
             <w:webHidden/>
           </w:rPr>
-          <w:t>12</w:t>
+          <w:t>13</w:t>
         </w:r>
         <w:r>
           <w:rPr>
@@ -2891,10 +2969,12 @@
           <w:tab w:val="right" w:leader="dot" w:pos="9736"/>
         </w:tabs>
         <w:rPr>
+          <w:rFonts w:asciiTheme="minorHAnsi" w:hAnsiTheme="minorHAnsi"/>
           <w:noProof/>
-        </w:rPr>
-      </w:pPr>
-      <w:hyperlink w:anchor="_Toc242290994" w:history="1">
+          <w:lang w:val="en-IN" w:eastAsia="en-IN"/>
+        </w:rPr>
+      </w:pPr>
+      <w:hyperlink w:anchor="_Toc242296158" w:history="1">
         <w:r>
           <w:rPr>
             <w:rStyle w:val="Hyperlink"/>
@@ -2921,7 +3001,7 @@
             <w:noProof/>
             <w:webHidden/>
           </w:rPr>
-          <w:instrText xml:space="preserve"> PAGEREF _Toc242290994 \h </w:instrText>
+          <w:instrText xml:space="preserve"> PAGEREF _Toc242296158 \h </w:instrText>
         </w:r>
         <w:r>
           <w:rPr>
@@ -2941,7 +3021,7 @@
             <w:noProof/>
             <w:webHidden/>
           </w:rPr>
-          <w:t>12</w:t>
+          <w:t>13</w:t>
         </w:r>
         <w:r>
           <w:rPr>
@@ -2959,10 +3039,12 @@
           <w:tab w:val="right" w:leader="dot" w:pos="9736"/>
         </w:tabs>
         <w:rPr>
+          <w:rFonts w:asciiTheme="minorHAnsi" w:hAnsiTheme="minorHAnsi"/>
           <w:noProof/>
-        </w:rPr>
-      </w:pPr>
-      <w:hyperlink w:anchor="_Toc242290995" w:history="1">
+          <w:lang w:val="en-IN" w:eastAsia="en-IN"/>
+        </w:rPr>
+      </w:pPr>
+      <w:hyperlink w:anchor="_Toc242296159" w:history="1">
         <w:r>
           <w:rPr>
             <w:rStyle w:val="Hyperlink"/>
@@ -2989,7 +3071,7 @@
             <w:noProof/>
             <w:webHidden/>
           </w:rPr>
-          <w:instrText xml:space="preserve"> PAGEREF _Toc242290995 \h </w:instrText>
+          <w:instrText xml:space="preserve"> PAGEREF _Toc242296159 \h </w:instrText>
         </w:r>
         <w:r>
           <w:rPr>
@@ -3027,10 +3109,12 @@
           <w:tab w:val="right" w:leader="dot" w:pos="9736"/>
         </w:tabs>
         <w:rPr>
+          <w:rFonts w:asciiTheme="minorHAnsi" w:hAnsiTheme="minorHAnsi"/>
           <w:noProof/>
-        </w:rPr>
-      </w:pPr>
-      <w:hyperlink w:anchor="_Toc242290996" w:history="1">
+          <w:lang w:val="en-IN" w:eastAsia="en-IN"/>
+        </w:rPr>
+      </w:pPr>
+      <w:hyperlink w:anchor="_Toc242296160" w:history="1">
         <w:r>
           <w:rPr>
             <w:rStyle w:val="Hyperlink"/>
@@ -3057,7 +3141,7 @@
             <w:noProof/>
             <w:webHidden/>
           </w:rPr>
-          <w:instrText xml:space="preserve"> PAGEREF _Toc242290996 \h </w:instrText>
+          <w:instrText xml:space="preserve"> PAGEREF _Toc242296160 \h </w:instrText>
         </w:r>
         <w:r>
           <w:rPr>
@@ -3095,10 +3179,12 @@
           <w:tab w:val="right" w:leader="dot" w:pos="9736"/>
         </w:tabs>
         <w:rPr>
+          <w:rFonts w:asciiTheme="minorHAnsi" w:hAnsiTheme="minorHAnsi"/>
           <w:noProof/>
-        </w:rPr>
-      </w:pPr>
-      <w:hyperlink w:anchor="_Toc242290997" w:history="1">
+          <w:lang w:val="en-IN" w:eastAsia="en-IN"/>
+        </w:rPr>
+      </w:pPr>
+      <w:hyperlink w:anchor="_Toc242296161" w:history="1">
         <w:r>
           <w:rPr>
             <w:rStyle w:val="Hyperlink"/>
@@ -3125,7 +3211,7 @@
             <w:noProof/>
             <w:webHidden/>
           </w:rPr>
-          <w:instrText xml:space="preserve"> PAGEREF _Toc242290997 \h </w:instrText>
+          <w:instrText xml:space="preserve"> PAGEREF _Toc242296161 \h </w:instrText>
         </w:r>
         <w:r>
           <w:rPr>
@@ -3163,10 +3249,12 @@
           <w:tab w:val="right" w:leader="dot" w:pos="9736"/>
         </w:tabs>
         <w:rPr>
+          <w:rFonts w:asciiTheme="minorHAnsi" w:hAnsiTheme="minorHAnsi"/>
           <w:noProof/>
-        </w:rPr>
-      </w:pPr>
-      <w:hyperlink w:anchor="_Toc242290998" w:history="1">
+          <w:lang w:val="en-IN" w:eastAsia="en-IN"/>
+        </w:rPr>
+      </w:pPr>
+      <w:hyperlink w:anchor="_Toc242296162" w:history="1">
         <w:r>
           <w:rPr>
             <w:rStyle w:val="Hyperlink"/>
@@ -3193,7 +3281,7 @@
             <w:noProof/>
             <w:webHidden/>
           </w:rPr>
-          <w:instrText xml:space="preserve"> PAGEREF _Toc242290998 \h </w:instrText>
+          <w:instrText xml:space="preserve"> PAGEREF _Toc242296162 \h </w:instrText>
         </w:r>
         <w:r>
           <w:rPr>
@@ -3231,10 +3319,12 @@
           <w:tab w:val="right" w:leader="dot" w:pos="9736"/>
         </w:tabs>
         <w:rPr>
+          <w:rFonts w:asciiTheme="minorHAnsi" w:hAnsiTheme="minorHAnsi"/>
           <w:noProof/>
-        </w:rPr>
-      </w:pPr>
-      <w:hyperlink w:anchor="_Toc242290999" w:history="1">
+          <w:lang w:val="en-IN" w:eastAsia="en-IN"/>
+        </w:rPr>
+      </w:pPr>
+      <w:hyperlink w:anchor="_Toc242296163" w:history="1">
         <w:r>
           <w:rPr>
             <w:rStyle w:val="Hyperlink"/>
@@ -3261,7 +3351,7 @@
             <w:noProof/>
             <w:webHidden/>
           </w:rPr>
-          <w:instrText xml:space="preserve"> PAGEREF _Toc242290999 \h </w:instrText>
+          <w:instrText xml:space="preserve"> PAGEREF _Toc242296163 \h </w:instrText>
         </w:r>
         <w:r>
           <w:rPr>
@@ -3299,10 +3389,12 @@
           <w:tab w:val="right" w:leader="dot" w:pos="9736"/>
         </w:tabs>
         <w:rPr>
+          <w:rFonts w:asciiTheme="minorHAnsi" w:hAnsiTheme="minorHAnsi"/>
           <w:noProof/>
-        </w:rPr>
-      </w:pPr>
-      <w:hyperlink w:anchor="_Toc242291000" w:history="1">
+          <w:lang w:val="en-IN" w:eastAsia="en-IN"/>
+        </w:rPr>
+      </w:pPr>
+      <w:hyperlink w:anchor="_Toc242296164" w:history="1">
         <w:r>
           <w:rPr>
             <w:rStyle w:val="Hyperlink"/>
@@ -3329,7 +3421,7 @@
             <w:noProof/>
             <w:webHidden/>
           </w:rPr>
-          <w:instrText xml:space="preserve"> PAGEREF _Toc242291000 \h </w:instrText>
+          <w:instrText xml:space="preserve"> PAGEREF _Toc242296164 \h </w:instrText>
         </w:r>
         <w:r>
           <w:rPr>
@@ -3367,10 +3459,12 @@
           <w:tab w:val="right" w:leader="dot" w:pos="9736"/>
         </w:tabs>
         <w:rPr>
+          <w:rFonts w:asciiTheme="minorHAnsi" w:hAnsiTheme="minorHAnsi"/>
           <w:noProof/>
-        </w:rPr>
-      </w:pPr>
-      <w:hyperlink w:anchor="_Toc242291001" w:history="1">
+          <w:lang w:val="en-IN" w:eastAsia="en-IN"/>
+        </w:rPr>
+      </w:pPr>
+      <w:hyperlink w:anchor="_Toc242296165" w:history="1">
         <w:r>
           <w:rPr>
             <w:rStyle w:val="Hyperlink"/>
@@ -3397,7 +3491,7 @@
             <w:noProof/>
             <w:webHidden/>
           </w:rPr>
-          <w:instrText xml:space="preserve"> PAGEREF _Toc242291001 \h </w:instrText>
+          <w:instrText xml:space="preserve"> PAGEREF _Toc242296165 \h </w:instrText>
         </w:r>
         <w:r>
           <w:rPr>
@@ -3417,7 +3511,7 @@
             <w:noProof/>
             <w:webHidden/>
           </w:rPr>
-          <w:t>14</w:t>
+          <w:t>15</w:t>
         </w:r>
         <w:r>
           <w:rPr>
@@ -3435,10 +3529,12 @@
           <w:tab w:val="right" w:leader="dot" w:pos="9736"/>
         </w:tabs>
         <w:rPr>
+          <w:rFonts w:asciiTheme="minorHAnsi" w:hAnsiTheme="minorHAnsi"/>
           <w:noProof/>
-        </w:rPr>
-      </w:pPr>
-      <w:hyperlink w:anchor="_Toc242291002" w:history="1">
+          <w:lang w:val="en-IN" w:eastAsia="en-IN"/>
+        </w:rPr>
+      </w:pPr>
+      <w:hyperlink w:anchor="_Toc242296166" w:history="1">
         <w:r>
           <w:rPr>
             <w:rStyle w:val="Hyperlink"/>
@@ -3465,7 +3561,7 @@
             <w:noProof/>
             <w:webHidden/>
           </w:rPr>
-          <w:instrText xml:space="preserve"> PAGEREF _Toc242291002 \h </w:instrText>
+          <w:instrText xml:space="preserve"> PAGEREF _Toc242296166 \h </w:instrText>
         </w:r>
         <w:r>
           <w:rPr>
@@ -3485,7 +3581,7 @@
             <w:noProof/>
             <w:webHidden/>
           </w:rPr>
-          <w:t>15</w:t>
+          <w:t>16</w:t>
         </w:r>
         <w:r>
           <w:rPr>
@@ -3510,7 +3606,7 @@
       <w:pPr>
         <w:pStyle w:val="Heading1"/>
       </w:pPr>
-      <w:bookmarkStart w:id="1" w:name="_Toc242290955"/>
+      <w:bookmarkStart w:id="1" w:name="_Toc242296119"/>
       <w:r>
         <w:lastRenderedPageBreak/>
         <w:t>1. Overview</w:t>
@@ -3519,10 +3615,7 @@
     </w:p>
     <w:p>
       <w:r>
-        <w:t>Every month a new cohort of learners starts in each program (SWE, PM / TPM, EM and the FDE Program). Each learner needs their own OpenRouter API key so they can use AI models during the course, with a spending cap so one</w:t>
-      </w:r>
-      <w:r>
-        <w:t xml:space="preserve"> person can't use up the shared balance.</w:t>
+        <w:t>Every month a new cohort of learners starts in each program (SWE, PM / TPM, EM and the FDE Program). Each learner needs their own OpenRouter API key so they can use AI models during the course, with a spending cap so one person can't use up the shared balance.</w:t>
       </w:r>
     </w:p>
     <w:p>
@@ -3535,10 +3628,7 @@
         <w:pStyle w:val="ListBullet"/>
       </w:pPr>
       <w:r>
-        <w:t>creates one key per learner inside that program's OpenRouter workspace</w:t>
-      </w:r>
-      <w:r>
-        <w:t>,</w:t>
+        <w:t>creates one key per learner inside that program's OpenRouter workspace,</w:t>
       </w:r>
     </w:p>
     <w:p>
@@ -3580,10 +3670,7 @@
         <w:pStyle w:val="ListBullet"/>
       </w:pPr>
       <w:r>
-        <w:t>saves every key as s</w:t>
-      </w:r>
-      <w:r>
-        <w:t>oon as it is created, so none are lost,</w:t>
+        <w:t>saves every key as soon as it is created, so none are lost,</w:t>
       </w:r>
     </w:p>
     <w:p>
@@ -3608,14 +3695,14 @@
         <w:pStyle w:val="ListBullet"/>
       </w:pPr>
       <w:r>
-        <w:t xml:space="preserve">emails each learner their own key through the team's Make scenario, after you approve it (section 7).</w:t>
+        <w:t>emails each learner their own key through the team's Make scenario, after you approve it (section 7).</w:t>
       </w:r>
     </w:p>
     <w:p>
       <w:pPr>
         <w:pStyle w:val="Heading2"/>
       </w:pPr>
-      <w:bookmarkStart w:id="2" w:name="_Toc242290956"/>
+      <w:bookmarkStart w:id="2" w:name="_Toc242296120"/>
       <w:r>
         <w:t>Three ways to use it</w:t>
       </w:r>
@@ -3727,13 +3814,7 @@
               <w:rPr>
                 <w:sz w:val="20"/>
               </w:rPr>
-              <w:t xml:space="preserve">Everyone on the team. Nothing to install; sign in </w:t>
-            </w:r>
-            <w:r>
-              <w:rPr>
-                <w:sz w:val="20"/>
-              </w:rPr>
-              <w:t>with Google.</w:t>
+              <w:t>Everyone on the team. Nothing to install; sign in with Google.</w:t>
             </w:r>
           </w:p>
         </w:tc>
@@ -3880,13 +3961,7 @@
               <w:rPr>
                 <w:sz w:val="20"/>
               </w:rPr>
-              <w:t xml:space="preserve">People comfortable with a terminal; </w:t>
-            </w:r>
-            <w:r>
-              <w:rPr>
-                <w:sz w:val="20"/>
-              </w:rPr>
-              <w:t>automation.</w:t>
+              <w:t>People comfortable with a terminal; automation.</w:t>
             </w:r>
           </w:p>
         </w:tc>
@@ -3950,7 +4025,7 @@
       <w:pPr>
         <w:pStyle w:val="Heading1"/>
       </w:pPr>
-      <w:bookmarkStart w:id="3" w:name="_Toc242290957"/>
+      <w:bookmarkStart w:id="3" w:name="_Toc242296121"/>
       <w:r>
         <w:t>2. Who can use the online site</w:t>
       </w:r>
@@ -4007,14 +4082,7 @@
           <w:rFonts w:ascii="Consolas" w:hAnsi="Consolas"/>
           <w:sz w:val="20"/>
         </w:rPr>
-        <w:t>A</w:t>
-      </w:r>
-      <w:r>
-        <w:rPr>
-          <w:rFonts w:ascii="Consolas" w:hAnsi="Consolas"/>
-          <w:sz w:val="20"/>
-        </w:rPr>
-        <w:t>LLOWED_EMAILS</w:t>
+        <w:t>ALLOWED_EMAILS</w:t>
       </w:r>
       <w:r>
         <w:t xml:space="preserve"> in the Vercel settings).</w:t>
@@ -4022,10 +4090,7 @@
     </w:p>
     <w:p>
       <w:r>
-        <w:t>Anyone else sees a message instead of the page: personal Google accounts get *Use your @interviewkickstart.com Google account*, and company accounts that are not on the list get *This account is not on the list of peo</w:t>
-      </w:r>
-      <w:r>
-        <w:t>ple allowed to create keys*.</w:t>
+        <w:t>Anyone else sees a message instead of the page: personal Google accounts get *Use your @interviewkickstart.com Google account*, and company accounts that are not on the list get *This account is not on the list of people allowed to create keys*.</w:t>
       </w:r>
     </w:p>
     <w:p>
@@ -4053,17 +4118,14 @@
     </w:p>
     <w:p>
       <w:r>
-        <w:t>Adding and removing people is explained in se</w:t>
-      </w:r>
-      <w:r>
-        <w:t>ction 12.</w:t>
+        <w:t>Adding and removing people is explained in section 12.</w:t>
       </w:r>
     </w:p>
     <w:p>
       <w:pPr>
         <w:pStyle w:val="Heading1"/>
       </w:pPr>
-      <w:bookmarkStart w:id="4" w:name="_Toc242290958"/>
+      <w:bookmarkStart w:id="4" w:name="_Toc242296122"/>
       <w:r>
         <w:lastRenderedPageBreak/>
         <w:t>3. Key concepts</w:t>
@@ -4074,7 +4136,7 @@
       <w:pPr>
         <w:pStyle w:val="Heading2"/>
       </w:pPr>
-      <w:bookmarkStart w:id="5" w:name="_Toc242290959"/>
+      <w:bookmarkStart w:id="5" w:name="_Toc242296123"/>
       <w:r>
         <w:t>Programs and workspaces</w:t>
       </w:r>
@@ -4381,17 +4443,14 @@
         <w:t>no workspace per cohort</w:t>
       </w:r>
       <w:r>
-        <w:t>. Creating a workspace every month would mean setting up guardrails again</w:t>
-      </w:r>
-      <w:r>
-        <w:t xml:space="preserve"> and again. Cohorts are told apart by the key name instead.</w:t>
+        <w:t>. Creating a workspace every month would mean setting up guardrails again and again. Cohorts are told apart by the key name instead.</w:t>
       </w:r>
     </w:p>
     <w:p>
       <w:pPr>
         <w:pStyle w:val="Heading2"/>
       </w:pPr>
-      <w:bookmarkStart w:id="6" w:name="_Toc242290960"/>
+      <w:bookmarkStart w:id="6" w:name="_Toc242296124"/>
       <w:r>
         <w:t>Key names</w:t>
       </w:r>
@@ -4595,13 +4654,7 @@
               <w:rPr>
                 <w:sz w:val="20"/>
               </w:rPr>
-              <w:t xml:space="preserve">3 digits: the learner's </w:t>
-            </w:r>
-            <w:r>
-              <w:rPr>
-                <w:sz w:val="20"/>
-              </w:rPr>
-              <w:t>row number in the CSV (001, 002, …). Invalid or repeated rows still use up a number; blank rows don't.</w:t>
+              <w:t>3 digits: the learner's row number in the CSV (001, 002, …). Invalid or repeated rows still use up a number; blank rows don't.</w:t>
             </w:r>
           </w:p>
         </w:tc>
@@ -4652,13 +4705,7 @@
               <w:rPr>
                 <w:sz w:val="20"/>
               </w:rPr>
-              <w:t xml:space="preserve">The cohort name you type in. Capitals become lowercase and spaces become dashes. Only letters, numbers, spaces and dashes; up to 40 </w:t>
-            </w:r>
-            <w:r>
-              <w:rPr>
-                <w:sz w:val="20"/>
-              </w:rPr>
-              <w:t>characters.</w:t>
+              <w:t>The cohort name you type in. Capitals become lowercase and spaces become dashes. Only letters, numbers, spaces and dashes; up to 40 characters.</w:t>
             </w:r>
           </w:p>
         </w:tc>
@@ -4763,7 +4810,7 @@
       <w:pPr>
         <w:pStyle w:val="Heading2"/>
       </w:pPr>
-      <w:bookmarkStart w:id="7" w:name="_Toc242290961"/>
+      <w:bookmarkStart w:id="7" w:name="_Toc242296125"/>
       <w:r>
         <w:t>Running twice is safe</w:t>
       </w:r>
@@ -4780,10 +4827,7 @@
         <w:t>same region, cohort and email</w:t>
       </w:r>
       <w:r>
-        <w:t xml:space="preserve"> (any serial). If </w:t>
-      </w:r>
-      <w:r>
-        <w:t xml:space="preserve">one exists, that learner is </w:t>
+        <w:t xml:space="preserve"> (any serial). If one exists, that learner is </w:t>
       </w:r>
       <w:r>
         <w:rPr>
@@ -4799,7 +4843,7 @@
       <w:pPr>
         <w:pStyle w:val="Heading2"/>
       </w:pPr>
-      <w:bookmarkStart w:id="8" w:name="_Toc242290962"/>
+      <w:bookmarkStart w:id="8" w:name="_Toc242296126"/>
       <w:r>
         <w:t>Credit limits</w:t>
       </w:r>
@@ -4816,10 +4860,7 @@
         <w:t>$5</w:t>
       </w:r>
       <w:r>
-        <w:t xml:space="preserve">. For a run you can </w:t>
-      </w:r>
-      <w:r>
-        <w:t xml:space="preserve">pick $1, $2, $5, $10, </w:t>
+        <w:t xml:space="preserve">. For a run you can pick $1, $2, $5, $10, </w:t>
       </w:r>
       <w:r>
         <w:rPr>
@@ -4885,10 +4926,7 @@
               <w:t>No limit</w:t>
             </w:r>
             <w:r>
-              <w:t xml:space="preserve"> means one learner could spend the whol</w:t>
-            </w:r>
-            <w:r>
-              <w:t>e OpenRouter balance. Use it only when you are sure.</w:t>
+              <w:t xml:space="preserve"> means one learner could spend the whole OpenRouter balance. Use it only when you are sure.</w:t>
             </w:r>
           </w:p>
         </w:tc>
@@ -4899,7 +4937,7 @@
       <w:pPr>
         <w:pStyle w:val="Heading1"/>
       </w:pPr>
-      <w:bookmarkStart w:id="9" w:name="_Toc242290963"/>
+      <w:bookmarkStart w:id="9" w:name="_Toc242296127"/>
       <w:r>
         <w:lastRenderedPageBreak/>
         <w:t>4. Preparing the learner list (CSV)</w:t>
@@ -4953,7 +4991,7 @@
       <w:pPr>
         <w:pStyle w:val="Heading2"/>
       </w:pPr>
-      <w:bookmarkStart w:id="10" w:name="_Toc242290964"/>
+      <w:bookmarkStart w:id="10" w:name="_Toc242296128"/>
       <w:r>
         <w:t>Using the template</w:t>
       </w:r>
@@ -5005,7 +5043,7 @@
       <w:pPr>
         <w:pStyle w:val="Heading2"/>
       </w:pPr>
-      <w:bookmarkStart w:id="11" w:name="_Toc242290965"/>
+      <w:bookmarkStart w:id="11" w:name="_Toc242296129"/>
       <w:r>
         <w:t>Rules</w:t>
       </w:r>
@@ -5016,10 +5054,7 @@
         <w:pStyle w:val="ListBullet"/>
       </w:pPr>
       <w:r>
-        <w:t>The column can</w:t>
-      </w:r>
-      <w:r>
-        <w:t xml:space="preserve"> also be called </w:t>
+        <w:t xml:space="preserve">The column can also be called </w:t>
       </w:r>
       <w:r>
         <w:rPr>
@@ -5106,7 +5141,7 @@
       <w:pPr>
         <w:pStyle w:val="Heading1"/>
       </w:pPr>
-      <w:bookmarkStart w:id="12" w:name="_Toc242290966"/>
+      <w:bookmarkStart w:id="12" w:name="_Toc242296130"/>
       <w:r>
         <w:t>5. Creating keys on the online site</w:t>
       </w:r>
@@ -5116,7 +5151,7 @@
       <w:pPr>
         <w:pStyle w:val="Heading2"/>
       </w:pPr>
-      <w:bookmarkStart w:id="13" w:name="_Toc242290967"/>
+      <w:bookmarkStart w:id="13" w:name="_Toc242296131"/>
       <w:r>
         <w:t>Step by step</w:t>
       </w:r>
@@ -5142,13 +5177,7 @@
         <w:rPr>
           <w:b/>
         </w:rPr>
-        <w:t>Sign in w</w:t>
-      </w:r>
-      <w:r>
-        <w:rPr>
-          <w:b/>
-        </w:rPr>
-        <w:t>ith Google</w:t>
+        <w:t>Sign in with Google</w:t>
       </w:r>
       <w:r>
         <w:t>. Choose your @interviewkickstart.com account.</w:t>
@@ -5203,10 +5232,7 @@
         <w:t>mid-oct</w:t>
       </w:r>
       <w:r>
-        <w:t>. The page shows what the key names will lo</w:t>
-      </w:r>
-      <w:r>
-        <w:t>ok like.</w:t>
+        <w:t>. The page shows what the key names will look like.</w:t>
       </w:r>
     </w:p>
     <w:p>
@@ -5260,10 +5286,7 @@
         <w:t>New</w:t>
       </w:r>
       <w:r>
-        <w:t xml:space="preserve"> (</w:t>
-      </w:r>
-      <w:r>
-        <w:t xml:space="preserve">will be created), </w:t>
+        <w:t xml:space="preserve"> (will be created), </w:t>
       </w:r>
       <w:r>
         <w:rPr>
@@ -5314,10 +5337,7 @@
         <w:pStyle w:val="ListNumber"/>
       </w:pPr>
       <w:r>
-        <w:t xml:space="preserve">Watch each row change </w:t>
-      </w:r>
-      <w:r>
-        <w:t xml:space="preserve">to </w:t>
+        <w:t xml:space="preserve">Watch each row change to </w:t>
       </w:r>
       <w:r>
         <w:rPr>
@@ -5374,7 +5394,7 @@
       <w:pPr>
         <w:pStyle w:val="Heading2"/>
       </w:pPr>
-      <w:bookmarkStart w:id="14" w:name="_Toc242290968"/>
+      <w:bookmarkStart w:id="14" w:name="_Toc242296132"/>
       <w:r>
         <w:lastRenderedPageBreak/>
         <w:t>Big lists</w:t>
@@ -5392,17 +5412,14 @@
         <w:t>parts of about 4 minutes</w:t>
       </w:r>
       <w:r>
-        <w:t>. The page starts the next part by itself and shows *part 2*, *part 3* and so on. Just keep the tab open. Serial numbers and key names don't change be</w:t>
-      </w:r>
-      <w:r>
-        <w:t>tween parts.</w:t>
+        <w:t>. The page starts the next part by itself and shows *part 2*, *part 3* and so on. Just keep the tab open. Serial numbers and key names don't change between parts.</w:t>
       </w:r>
     </w:p>
     <w:p>
       <w:pPr>
         <w:pStyle w:val="Heading2"/>
       </w:pPr>
-      <w:bookmarkStart w:id="15" w:name="_Toc242290969"/>
+      <w:bookmarkStart w:id="15" w:name="_Toc242296133"/>
       <w:r>
         <w:t>If something fails</w:t>
       </w:r>
@@ -5438,10 +5455,7 @@
         <w:pStyle w:val="ListBullet"/>
       </w:pPr>
       <w:r>
-        <w:t>The site's error details are in the Vercel project under</w:t>
-      </w:r>
-      <w:r>
-        <w:t xml:space="preserve"> </w:t>
+        <w:t xml:space="preserve">The site's error details are in the Vercel project under </w:t>
       </w:r>
       <w:r>
         <w:rPr>
@@ -5493,12 +5507,9 @@
       <w:pPr>
         <w:pStyle w:val="Heading1"/>
       </w:pPr>
-      <w:bookmarkStart w:id="16" w:name="_Toc242290970"/>
-      <w:r>
-        <w:t>6. Finding and sharing</w:t>
-      </w:r>
-      <w:r>
-        <w:t xml:space="preserve"> the generated keys</w:t>
+      <w:bookmarkStart w:id="16" w:name="_Toc242296134"/>
+      <w:r>
+        <w:t>6. Finding and sharing the generated keys</w:t>
       </w:r>
       <w:bookmarkEnd w:id="16"/>
     </w:p>
@@ -5576,10 +5587,7 @@
         <w:t>Download CSV</w:t>
       </w:r>
       <w:r>
-        <w:t xml:space="preserve"> downloads the rows c</w:t>
-      </w:r>
-      <w:r>
-        <w:t>urrently shown (e.g. one cohort),</w:t>
+        <w:t xml:space="preserve"> downloads the rows currently shown (e.g. one cohort),</w:t>
       </w:r>
     </w:p>
     <w:p>
@@ -5616,14 +5624,7 @@
           <w:rFonts w:ascii="Consolas" w:hAnsi="Consolas"/>
           <w:sz w:val="19"/>
         </w:rPr>
-        <w:t>SERIAL,REGION,EMAIL_ID,PROGRAM,COHORT,KEY_NAME,API_KEY,KEY_HASH,LE</w:t>
-      </w:r>
-      <w:r>
-        <w:rPr>
-          <w:rFonts w:ascii="Consolas" w:hAnsi="Consolas"/>
-          <w:sz w:val="19"/>
-        </w:rPr>
-        <w:t>ARNER_NAME</w:t>
+        <w:t>SERIAL,REGION,EMAIL_ID,PROGRAM,COHORT,KEY_NAME,API_KEY,KEY_HASH,LEARNER_NAME</w:t>
       </w:r>
     </w:p>
     <w:tbl>
@@ -5666,7 +5667,7 @@
       <w:pPr>
         <w:pStyle w:val="Heading1"/>
       </w:pPr>
-      <w:bookmarkStart w:id="17" w:name="_Toc242290971"/>
+      <w:bookmarkStart w:id="17" w:name="_Toc242296135"/>
       <w:r>
         <w:t>7. Emailing keys to learners</w:t>
       </w:r>
@@ -5674,17 +5675,14 @@
     </w:p>
     <w:p>
       <w:r>
-        <w:t xml:space="preserve">Once keys are created, </w:t>
-      </w:r>
-      <w:r>
-        <w:t>the site can email each learner their own key through the team's Make scenario. Nothing is sent until you approve it.</w:t>
+        <w:t>Once keys are created, the site can email each learner their own key through the team's Make scenario. Nothing is sent until you approve it.</w:t>
       </w:r>
     </w:p>
     <w:p>
       <w:pPr>
         <w:pStyle w:val="Heading2"/>
       </w:pPr>
-      <w:bookmarkStart w:id="18" w:name="_Toc242290972"/>
+      <w:bookmarkStart w:id="18" w:name="_Toc242296136"/>
       <w:r>
         <w:t>Sending</w:t>
       </w:r>
@@ -5721,10 +5719,7 @@
         <w:pStyle w:val="ListNumber"/>
       </w:pPr>
       <w:r>
-        <w:t>Tick the learners, or tick the box at</w:t>
-      </w:r>
-      <w:r>
-        <w:t xml:space="preserve"> the top of the table to select everyone shown.</w:t>
+        <w:t>Tick the learners, or tick the box at the top of the table to select everyone shown.</w:t>
       </w:r>
     </w:p>
     <w:p>
@@ -5933,7 +5928,7 @@
               <w:rPr>
                 <w:sz w:val="20"/>
               </w:rPr>
-              <w:t xml:space="preserve">Make accepted it but didn't confirm the email: the scenario's last step (Webhook response) is missing, or the scenario is off and Make is holding the email until it's turned on.</w:t>
+              <w:t>Make accepted it but didn't confirm the email: the scenario's last step (Webhook response) is missing, or the scenario is off and Make is holding the email until it's turned on.</w:t>
             </w:r>
           </w:p>
         </w:tc>
@@ -5983,10 +5978,7 @@
     <w:p/>
     <w:p>
       <w:r>
-        <w:t>Learners already emailed are skipped automatically. If you select only learners who were already emailed, the site asks whether</w:t>
-      </w:r>
-      <w:r>
-        <w:t xml:space="preserve"> to send their keys </w:t>
+        <w:t xml:space="preserve">Learners already emailed are skipped automatically. If you select only learners who were already emailed, the site asks whether to send their keys </w:t>
       </w:r>
       <w:r>
         <w:rPr>
@@ -6032,12 +6024,9 @@
       <w:pPr>
         <w:pStyle w:val="Heading2"/>
       </w:pPr>
-      <w:bookmarkStart w:id="19" w:name="_Toc242290973"/>
-      <w:r>
-        <w:t xml:space="preserve">Learner </w:t>
-      </w:r>
-      <w:r>
-        <w:t>names</w:t>
+      <w:bookmarkStart w:id="19" w:name="_Toc242296137"/>
+      <w:r>
+        <w:t>Learner names</w:t>
       </w:r>
       <w:bookmarkEnd w:id="19"/>
     </w:p>
@@ -6060,7 +6049,7 @@
       <w:pPr>
         <w:pStyle w:val="Heading2"/>
       </w:pPr>
-      <w:bookmarkStart w:id="20" w:name="_Toc242290974"/>
+      <w:bookmarkStart w:id="20" w:name="_Toc242296138"/>
       <w:r>
         <w:t>What the site sends to Make</w:t>
       </w:r>
@@ -6450,7 +6439,7 @@
       <w:pPr>
         <w:pStyle w:val="Heading2"/>
       </w:pPr>
-      <w:bookmarkStart w:id="21" w:name="_Toc242290975"/>
+      <w:bookmarkStart w:id="21" w:name="_Toc242296139"/>
       <w:r>
         <w:t>Setting up the Make scenario (once)</w:t>
       </w:r>
@@ -6472,13 +6461,7 @@
         <w:rPr>
           <w:b/>
         </w:rPr>
-        <w:t>Webhooks → Custom w</w:t>
-      </w:r>
-      <w:r>
-        <w:rPr>
-          <w:b/>
-        </w:rPr>
-        <w:t>ebhook</w:t>
+        <w:t>Webhooks → Custom webhook</w:t>
       </w:r>
       <w:r>
         <w:t xml:space="preserve"> (name it </w:t>
@@ -6545,10 +6528,7 @@
         <w:pStyle w:val="ListNumber"/>
       </w:pPr>
       <w:r>
-        <w:t>In the webho</w:t>
-      </w:r>
-      <w:r>
-        <w:t xml:space="preserve">ok module click </w:t>
+        <w:t xml:space="preserve">In the webhook module click </w:t>
       </w:r>
       <w:r>
         <w:rPr>
@@ -6650,13 +6630,14 @@
         <w:pStyle w:val="ListNumber"/>
       </w:pPr>
       <w:r>
+        <w:lastRenderedPageBreak/>
         <w:t xml:space="preserve">After Send an email add </w:t>
       </w:r>
       <w:r>
         <w:rPr>
           <w:b/>
         </w:rPr>
-        <w:t xml:space="preserve">Gmail → Get an email</w:t>
+        <w:t>Gmail → Get an email</w:t>
       </w:r>
       <w:r>
         <w:t xml:space="preserve"> with the Message ID from Send an email. It reads the sent email back, so the sheet can record which Gmail account sent it.</w:t>
@@ -6673,7 +6654,7 @@
         <w:rPr>
           <w:b/>
         </w:rPr>
-        <w:t xml:space="preserve">Update a Row</w:t>
+        <w:t>Update a Row</w:t>
       </w:r>
       <w:r>
         <w:t xml:space="preserve"> with </w:t>
@@ -6682,7 +6663,7 @@
         <w:rPr>
           <w:b/>
         </w:rPr>
-        <w:t xml:space="preserve">Google Sheets: Add a Row</w:t>
+        <w:t>Google Sheets: Add a Row</w:t>
       </w:r>
       <w:r>
         <w:t xml:space="preserve"> to keep the sheet as a sent log: email, name, key name, program, cohort, sent by (who clicked Send in the app), test, date, and </w:t>
@@ -6692,7 +6673,7 @@
           <w:rFonts w:ascii="Consolas" w:hAnsi="Consolas"/>
           <w:sz w:val="20"/>
         </w:rPr>
-        <w:t xml:space="preserve">sent_from</w:t>
+        <w:t>sent_from</w:t>
       </w:r>
       <w:r>
         <w:t xml:space="preserve"> = the sender's address from Get an email (the Gmail account the email came from).</w:t>
@@ -6749,10 +6730,7 @@
         <w:t>on</w:t>
       </w:r>
       <w:r>
-        <w:t xml:space="preserve"> with *Imm</w:t>
-      </w:r>
-      <w:r>
-        <w:t>ediately as data arrives*. Send a test, then one real learner, then the cohort.</w:t>
+        <w:t xml:space="preserve"> with *Immediately as data arrives*. Send a test, then one real learner, then the cohort.</w:t>
       </w:r>
     </w:p>
     <w:tbl>
@@ -6780,7 +6758,7 @@
           </w:p>
           <w:p>
             <w:r>
-              <w:t xml:space="preserve">What the site expects back from Make:</w:t>
+              <w:t>What the site expects back from Make:</w:t>
             </w:r>
           </w:p>
           <w:p>
@@ -6792,7 +6770,7 @@
                 <w:rFonts w:ascii="Consolas" w:hAnsi="Consolas"/>
                 <w:sz w:val="20"/>
               </w:rPr>
-              <w:t xml:space="preserve">{"status":"sent"}</w:t>
+              <w:t>{"status":"sent"}</w:t>
             </w:r>
             <w:r>
               <w:t xml:space="preserve"> → </w:t>
@@ -6801,10 +6779,10 @@
               <w:rPr>
                 <w:b/>
               </w:rPr>
-              <w:t xml:space="preserve">Sent ✓</w:t>
-            </w:r>
-            <w:r>
-              <w:t xml:space="preserve">.</w:t>
+              <w:t>Sent ✓</w:t>
+            </w:r>
+            <w:r>
+              <w:t>.</w:t>
             </w:r>
           </w:p>
           <w:p>
@@ -6816,7 +6794,7 @@
                 <w:rFonts w:ascii="Consolas" w:hAnsi="Consolas"/>
                 <w:sz w:val="20"/>
               </w:rPr>
-              <w:t xml:space="preserve">Accepted</w:t>
+              <w:t>Accepted</w:t>
             </w:r>
             <w:r>
               <w:t xml:space="preserve"> (Make's default reply when there is no Webhook response) → </w:t>
@@ -6825,10 +6803,10 @@
               <w:rPr>
                 <w:b/>
               </w:rPr>
-              <w:t xml:space="preserve">Sent to Make</w:t>
-            </w:r>
-            <w:r>
-              <w:t xml:space="preserve">.</w:t>
+              <w:t>Sent to Make</w:t>
+            </w:r>
+            <w:r>
+              <w:t>.</w:t>
             </w:r>
           </w:p>
           <w:p>
@@ -6840,7 +6818,7 @@
                 <w:rFonts w:ascii="Consolas" w:hAnsi="Consolas"/>
                 <w:sz w:val="20"/>
               </w:rPr>
-              <w:t xml:space="preserve">{"status":"failed","message":"reason"}</w:t>
+              <w:t>{"status":"failed","message":"reason"}</w:t>
             </w:r>
             <w:r>
               <w:t xml:space="preserve">, an HTTP error, or no answer within 60 seconds → </w:t>
@@ -6849,10 +6827,10 @@
               <w:rPr>
                 <w:b/>
               </w:rPr>
-              <w:t xml:space="preserve">Failed</w:t>
-            </w:r>
-            <w:r>
-              <w:t xml:space="preserve">. A scenario can send the failed reply itself, e.g. from an error handler after the Gmail module.</w:t>
+              <w:t>Failed</w:t>
+            </w:r>
+            <w:r>
+              <w:t>. A scenario can send the failed reply itself, e.g. from an error handler after the Gmail module.</w:t>
             </w:r>
           </w:p>
         </w:tc>
@@ -6863,12 +6841,9 @@
       <w:pPr>
         <w:pStyle w:val="Heading1"/>
       </w:pPr>
-      <w:bookmarkStart w:id="22" w:name="_Toc242290976"/>
-      <w:r>
-        <w:t xml:space="preserve">8. </w:t>
-      </w:r>
-      <w:r>
-        <w:t>Usage reports for leadership</w:t>
+      <w:bookmarkStart w:id="22" w:name="_Toc242296140"/>
+      <w:r>
+        <w:t>8. Usage reports for leadership</w:t>
       </w:r>
       <w:bookmarkEnd w:id="22"/>
     </w:p>
@@ -6899,7 +6874,7 @@
       <w:pPr>
         <w:pStyle w:val="Heading2"/>
       </w:pPr>
-      <w:bookmarkStart w:id="23" w:name="_Toc242290977"/>
+      <w:bookmarkStart w:id="23" w:name="_Toc242296141"/>
       <w:r>
         <w:t>What it shows</w:t>
       </w:r>
@@ -6931,33 +6906,25 @@
                 <w:color w:val="FFFFFF"/>
                 <w:sz w:val="20"/>
               </w:rPr>
-              <w:t>Par</w:t>
-            </w:r>
+              <w:t>Part</w:t>
+            </w:r>
+          </w:p>
+        </w:tc>
+        <w:tc>
+          <w:tcPr>
+            <w:tcW w:w="7370" w:type="dxa"/>
+            <w:shd w:val="clear" w:color="auto" w:fill="3B5BDB"/>
+          </w:tcPr>
+          <w:p>
+            <w:pPr>
+              <w:spacing w:after="40"/>
+            </w:pPr>
             <w:r>
               <w:rPr>
                 <w:b/>
                 <w:color w:val="FFFFFF"/>
                 <w:sz w:val="20"/>
               </w:rPr>
-              <w:t>t</w:t>
-            </w:r>
-          </w:p>
-        </w:tc>
-        <w:tc>
-          <w:tcPr>
-            <w:tcW w:w="7370" w:type="dxa"/>
-            <w:shd w:val="clear" w:color="auto" w:fill="3B5BDB"/>
-          </w:tcPr>
-          <w:p>
-            <w:pPr>
-              <w:spacing w:after="40"/>
-            </w:pPr>
-            <w:r>
-              <w:rPr>
-                <w:b/>
-                <w:color w:val="FFFFFF"/>
-                <w:sz w:val="20"/>
-              </w:rPr>
               <w:t>What it shows</w:t>
             </w:r>
           </w:p>
@@ -6992,13 +6959,7 @@
               <w:rPr>
                 <w:sz w:val="20"/>
               </w:rPr>
-              <w:t>Total spend (all time); spend this month; budget used (spend as a % of the total of the keys' credit limits); learners with keys and number of cohorts; active learners (% who used their key at least once); average spend per</w:t>
-            </w:r>
-            <w:r>
-              <w:rPr>
-                <w:sz w:val="20"/>
-              </w:rPr>
-              <w:t xml:space="preserve"> active learner; keys at or near their limit (90%+); keys not used 7 days after they were created.</w:t>
+              <w:t>Total spend (all time); spend this month; budget used (spend as a % of the total of the keys' credit limits); learners with keys and number of cohorts; active learners (% who used their key at least once); average spend per active learner; keys at or near their limit (90%+); keys not used 7 days after they were created.</w:t>
             </w:r>
           </w:p>
         </w:tc>
@@ -7066,13 +7027,7 @@
               <w:rPr>
                 <w:sz w:val="20"/>
               </w:rPr>
-              <w:t xml:space="preserve">One bar per </w:t>
-            </w:r>
-            <w:r>
-              <w:rPr>
-                <w:sz w:val="20"/>
-              </w:rPr>
-              <w:t>cohort (program · region · cohort), the top 15 by spend.</w:t>
+              <w:t>One bar per cohort (program · region · cohort), the top 15 by spend.</w:t>
             </w:r>
           </w:p>
         </w:tc>
@@ -7140,13 +7095,7 @@
               <w:rPr>
                 <w:sz w:val="20"/>
               </w:rPr>
-              <w:t xml:space="preserve">Keys at or near their credit </w:t>
-            </w:r>
-            <w:r>
-              <w:rPr>
-                <w:sz w:val="20"/>
-              </w:rPr>
-              <w:t>limit, and keys not used 7 days after creation. Use it to follow up with learners or raise a limit.</w:t>
+              <w:t>Keys at or near their credit limit, and keys not used 7 days after creation. Use it to follow up with learners or raise a limit.</w:t>
             </w:r>
           </w:p>
         </w:tc>
@@ -7180,13 +7129,7 @@
               <w:rPr>
                 <w:sz w:val="20"/>
               </w:rPr>
-              <w:t>Every key: learner, program, region, cohort, spend, this month, limit, remaining, % of limit used, status (Active, Near limit, At limit, Not</w:t>
-            </w:r>
-            <w:r>
-              <w:rPr>
-                <w:sz w:val="20"/>
-              </w:rPr>
-              <w:t xml:space="preserve"> used, New, Disabled), created date.</w:t>
+              <w:t>Every key: learner, program, region, cohort, spend, this month, limit, remaining, % of limit used, status (Active, Near limit, At limit, Not used, New, Disabled), created date.</w:t>
             </w:r>
           </w:p>
         </w:tc>
@@ -7238,13 +7181,7 @@
               <w:rPr>
                 <w:sz w:val="20"/>
               </w:rPr>
-              <w:t>Spend by</w:t>
-            </w:r>
-            <w:r>
-              <w:rPr>
-                <w:sz w:val="20"/>
-              </w:rPr>
-              <w:t xml:space="preserve"> AI model</w:t>
+              <w:t>Spend by AI model</w:t>
             </w:r>
           </w:p>
         </w:tc>
@@ -7278,7 +7215,14 @@
               <w:rPr>
                 <w:sz w:val="20"/>
               </w:rPr>
-              <w:t>Monthly spend by cohort</w:t>
+              <w:t xml:space="preserve">Monthly spend by </w:t>
+            </w:r>
+            <w:r>
+              <w:rPr>
+                <w:sz w:val="20"/>
+              </w:rPr>
+              <w:lastRenderedPageBreak/>
+              <w:t>cohort</w:t>
             </w:r>
           </w:p>
         </w:tc>
@@ -7294,13 +7238,15 @@
               <w:rPr>
                 <w:sz w:val="20"/>
               </w:rPr>
-              <w:t>One row per cohort and one column per month, with a total. Ready to pas</w:t>
-            </w:r>
-            <w:r>
-              <w:rPr>
-                <w:sz w:val="20"/>
-              </w:rPr>
-              <w:t>te into a slide.</w:t>
+              <w:lastRenderedPageBreak/>
+              <w:t xml:space="preserve">One row per cohort and one column per month, with a total. Ready to paste into a </w:t>
+            </w:r>
+            <w:r>
+              <w:rPr>
+                <w:sz w:val="20"/>
+              </w:rPr>
+              <w:lastRenderedPageBreak/>
+              <w:t>slide.</w:t>
             </w:r>
           </w:p>
         </w:tc>
@@ -7311,7 +7257,7 @@
       <w:pPr>
         <w:pStyle w:val="Heading2"/>
       </w:pPr>
-      <w:bookmarkStart w:id="24" w:name="_Toc242290978"/>
+      <w:bookmarkStart w:id="24" w:name="_Toc242296142"/>
       <w:r>
         <w:t>Filtering and sorting</w:t>
       </w:r>
@@ -7374,19 +7320,15 @@
         <w:pStyle w:val="ListBullet"/>
       </w:pPr>
       <w:r>
-        <w:t xml:space="preserve">Click a column heading to </w:t>
-      </w:r>
-      <w:r>
-        <w:t>sort by it; click again to reverse.</w:t>
+        <w:t>Click a column heading to sort by it; click again to reverse.</w:t>
       </w:r>
     </w:p>
     <w:p>
       <w:pPr>
         <w:pStyle w:val="Heading2"/>
       </w:pPr>
-      <w:bookmarkStart w:id="25" w:name="_Toc242290979"/>
-      <w:r>
-        <w:lastRenderedPageBreak/>
+      <w:bookmarkStart w:id="25" w:name="_Toc242296143"/>
+      <w:r>
         <w:t>Getting the report out</w:t>
       </w:r>
       <w:bookmarkEnd w:id="25"/>
@@ -7439,13 +7381,7 @@
         <w:rPr>
           <w:b/>
         </w:rPr>
-        <w:t>Include le</w:t>
-      </w:r>
-      <w:r>
-        <w:rPr>
-          <w:b/>
-        </w:rPr>
-        <w:t>arner list in PDF</w:t>
+        <w:t>Include learner list in PDF</w:t>
       </w:r>
       <w:r>
         <w:t xml:space="preserve"> is ticked.</w:t>
@@ -7455,7 +7391,7 @@
       <w:pPr>
         <w:pStyle w:val="Heading2"/>
       </w:pPr>
-      <w:bookmarkStart w:id="26" w:name="_Toc242290980"/>
+      <w:bookmarkStart w:id="26" w:name="_Toc242296144"/>
       <w:r>
         <w:t>Good to know</w:t>
       </w:r>
@@ -7501,10 +7437,7 @@
         <w:t>one year</w:t>
       </w:r>
       <w:r>
-        <w:t>, so the longest view is 12 mo</w:t>
-      </w:r>
-      <w:r>
-        <w:t>nths.</w:t>
+        <w:t>, so the longest view is 12 months.</w:t>
       </w:r>
     </w:p>
     <w:p>
@@ -7520,10 +7453,7 @@
         <w:pStyle w:val="ListBullet"/>
       </w:pPr>
       <w:r>
-        <w:t>Only the four program workspaces are counted. Staff keys in Op</w:t>
-      </w:r>
-      <w:r>
-        <w:t>enRouter's Default workspace are left out.</w:t>
+        <w:t>Only the four program workspaces are counted. Staff keys in OpenRouter's Default workspace are left out.</w:t>
       </w:r>
     </w:p>
     <w:p>
@@ -7555,17 +7485,14 @@
         <w:t>REGION-serial-cohort-email</w:t>
       </w:r>
       <w:r>
-        <w:t xml:space="preserve">) </w:t>
-      </w:r>
-      <w:r>
-        <w:t>appear as "(other keys)".</w:t>
+        <w:t>) appear as "(other keys)".</w:t>
       </w:r>
     </w:p>
     <w:p>
       <w:pPr>
         <w:pStyle w:val="Heading1"/>
       </w:pPr>
-      <w:bookmarkStart w:id="27" w:name="_Toc242290981"/>
+      <w:bookmarkStart w:id="27" w:name="_Toc242296145"/>
       <w:r>
         <w:t>9. Monthly checklist</w:t>
       </w:r>
@@ -7575,7 +7502,7 @@
       <w:pPr>
         <w:pStyle w:val="Heading2"/>
       </w:pPr>
-      <w:bookmarkStart w:id="28" w:name="_Toc242290982"/>
+      <w:bookmarkStart w:id="28" w:name="_Toc242296146"/>
       <w:r>
         <w:t>When a cohort starts</w:t>
       </w:r>
@@ -7612,10 +7539,7 @@
         <w:t>early-nov</w:t>
       </w:r>
       <w:r>
-        <w:t xml:space="preserve">) </w:t>
-      </w:r>
-      <w:r>
-        <w:t xml:space="preserve">and limit, upload that program's CSV, </w:t>
+        <w:t xml:space="preserve">) and limit, upload that program's CSV, </w:t>
       </w:r>
       <w:r>
         <w:rPr>
@@ -7692,12 +7616,10 @@
       <w:pPr>
         <w:pStyle w:val="Heading2"/>
       </w:pPr>
-      <w:bookmarkStart w:id="29" w:name="_Toc242290983"/>
-      <w:r>
-        <w:t>When a co</w:t>
-      </w:r>
-      <w:r>
-        <w:t>hort ends</w:t>
+      <w:bookmarkStart w:id="29" w:name="_Toc242296147"/>
+      <w:r>
+        <w:lastRenderedPageBreak/>
+        <w:t>When a cohort ends</w:t>
       </w:r>
       <w:bookmarkEnd w:id="29"/>
     </w:p>
@@ -7720,7 +7642,7 @@
       <w:pPr>
         <w:pStyle w:val="Heading1"/>
       </w:pPr>
-      <w:bookmarkStart w:id="30" w:name="_Toc242290984"/>
+      <w:bookmarkStart w:id="30" w:name="_Toc242296148"/>
       <w:r>
         <w:t>10. First-time test</w:t>
       </w:r>
@@ -7728,10 +7650,7 @@
     </w:p>
     <w:p>
       <w:r>
-        <w:t>Do this once, and again after any big chan</w:t>
-      </w:r>
-      <w:r>
-        <w:t>ge:</w:t>
+        <w:t>Do this once, and again after any big change:</w:t>
       </w:r>
     </w:p>
     <w:p>
@@ -7800,7 +7719,6 @@
         <w:pStyle w:val="ListNumber"/>
       </w:pPr>
       <w:r>
-        <w:lastRenderedPageBreak/>
         <w:t xml:space="preserve">Copy the key from </w:t>
       </w:r>
       <w:r>
@@ -7898,7 +7816,7 @@
       <w:pPr>
         <w:pStyle w:val="Heading1"/>
       </w:pPr>
-      <w:bookmarkStart w:id="31" w:name="_Toc242290985"/>
+      <w:bookmarkStart w:id="31" w:name="_Toc242296149"/>
       <w:r>
         <w:t>11. How the online site is set up</w:t>
       </w:r>
@@ -8170,14 +8088,7 @@
                 <w:rFonts w:ascii="Consolas" w:hAnsi="Consolas"/>
                 <w:sz w:val="20"/>
               </w:rPr>
-              <w:t>https</w:t>
-            </w:r>
-            <w:r>
-              <w:rPr>
-                <w:rFonts w:ascii="Consolas" w:hAnsi="Consolas"/>
-                <w:sz w:val="20"/>
-              </w:rPr>
-              <w:t>://openrouter-key-generator.vercel.app/auth/callback</w:t>
+              <w:t>https://openrouter-key-generator.vercel.app/auth/callback</w:t>
             </w:r>
             <w:r>
               <w:rPr>
@@ -8288,7 +8199,7 @@
       <w:pPr>
         <w:pStyle w:val="Heading2"/>
       </w:pPr>
-      <w:bookmarkStart w:id="32" w:name="_Toc242290986"/>
+      <w:bookmarkStart w:id="32" w:name="_Toc242296150"/>
       <w:r>
         <w:t>Vercel settings</w:t>
       </w:r>
@@ -8302,13 +8213,7 @@
         <w:rPr>
           <w:b/>
         </w:rPr>
-        <w:t>Sett</w:t>
-      </w:r>
-      <w:r>
-        <w:rPr>
-          <w:b/>
-        </w:rPr>
-        <w:t>ings → Environment Variables</w:t>
+        <w:t>Settings → Environment Variables</w:t>
       </w:r>
       <w:r>
         <w:t xml:space="preserve">, all for </w:t>
@@ -8508,13 +8413,7 @@
               <w:rPr>
                 <w:sz w:val="20"/>
               </w:rPr>
-              <w:t xml:space="preserve">32+ </w:t>
-            </w:r>
-            <w:r>
-              <w:rPr>
-                <w:sz w:val="20"/>
-              </w:rPr>
-              <w:t>random characters used to sign the sign-in cookie. Changing it signs everyone out.</w:t>
+              <w:t>32+ random characters used to sign the sign-in cookie. Changing it signs everyone out.</w:t>
             </w:r>
           </w:p>
         </w:tc>
@@ -8533,6 +8432,7 @@
                 <w:rFonts w:ascii="Consolas" w:hAnsi="Consolas"/>
                 <w:sz w:val="20"/>
               </w:rPr>
+              <w:lastRenderedPageBreak/>
               <w:t>ALLOWED_EMAILS</w:t>
             </w:r>
           </w:p>
@@ -8591,13 +8491,7 @@
               <w:rPr>
                 <w:sz w:val="20"/>
               </w:rPr>
-              <w:t xml:space="preserve"> (where Google sends p</w:t>
-            </w:r>
-            <w:r>
-              <w:rPr>
-                <w:sz w:val="20"/>
-              </w:rPr>
-              <w:t>eople back after sign-in).</w:t>
+              <w:t xml:space="preserve"> (where Google sends people back after sign-in).</w:t>
             </w:r>
           </w:p>
         </w:tc>
@@ -8702,13 +8596,7 @@
               <w:rPr>
                 <w:sz w:val="20"/>
               </w:rPr>
-              <w:t xml:space="preserve">The API key set on that webhook in </w:t>
-            </w:r>
-            <w:r>
-              <w:rPr>
-                <w:sz w:val="20"/>
-              </w:rPr>
-              <w:t>Make.</w:t>
+              <w:t>The API key set on that webhook in Make.</w:t>
             </w:r>
           </w:p>
         </w:tc>
@@ -8755,9 +8643,8 @@
       <w:pPr>
         <w:pStyle w:val="Heading2"/>
       </w:pPr>
-      <w:bookmarkStart w:id="33" w:name="_Toc242290987"/>
-      <w:r>
-        <w:lastRenderedPageBreak/>
+      <w:bookmarkStart w:id="33" w:name="_Toc242296151"/>
+      <w:r>
         <w:t>Vercel's own login protection</w:t>
       </w:r>
       <w:bookmarkEnd w:id="33"/>
@@ -8773,10 +8660,7 @@
         <w:t>Deployment Protection</w:t>
       </w:r>
       <w:r>
-        <w:t xml:space="preserve"> (Settings → Deployment Protection → *Vercel Authent</w:t>
-      </w:r>
-      <w:r>
-        <w:t xml:space="preserve">ication*) is currently </w:t>
+        <w:t xml:space="preserve"> (Settings → Deployment Protection → *Vercel Authentication*) is currently </w:t>
       </w:r>
       <w:r>
         <w:rPr>
@@ -8801,7 +8685,7 @@
       <w:pPr>
         <w:pStyle w:val="Heading1"/>
       </w:pPr>
-      <w:bookmarkStart w:id="34" w:name="_Toc242290988"/>
+      <w:bookmarkStart w:id="34" w:name="_Toc242296152"/>
       <w:r>
         <w:t>12. Administration</w:t>
       </w:r>
@@ -8811,12 +8695,9 @@
       <w:pPr>
         <w:pStyle w:val="Heading2"/>
       </w:pPr>
-      <w:bookmarkStart w:id="35" w:name="_Toc242290989"/>
-      <w:r>
-        <w:t>Adding or removing a perso</w:t>
-      </w:r>
-      <w:r>
-        <w:t>n</w:t>
+      <w:bookmarkStart w:id="35" w:name="_Toc242296153"/>
+      <w:r>
+        <w:t>Adding or removing a person</w:t>
       </w:r>
       <w:bookmarkEnd w:id="35"/>
     </w:p>
@@ -8858,13 +8739,7 @@
         <w:rPr>
           <w:b/>
         </w:rPr>
-        <w:t>⋯</w:t>
-      </w:r>
-      <w:r>
-        <w:rPr>
-          <w:b/>
-        </w:rPr>
-        <w:t xml:space="preserve"> → Edit</w:t>
+        <w:t>⋯ → Edit</w:t>
       </w:r>
       <w:r>
         <w:t>.</w:t>
@@ -8910,10 +8785,7 @@
         <w:pStyle w:val="ListNumber"/>
       </w:pPr>
       <w:r>
-        <w:t>Redeploy (below). The change applies onl</w:t>
-      </w:r>
-      <w:r>
-        <w:t>y after a redeploy.</w:t>
+        <w:t>Redeploy (below). The change applies only after a redeploy.</w:t>
       </w:r>
     </w:p>
     <w:tbl>
@@ -8947,7 +8819,7 @@
       <w:pPr>
         <w:pStyle w:val="Heading2"/>
       </w:pPr>
-      <w:bookmarkStart w:id="36" w:name="_Toc242290990"/>
+      <w:bookmarkStart w:id="36" w:name="_Toc242296154"/>
       <w:r>
         <w:t>Redeploying</w:t>
       </w:r>
@@ -8970,13 +8842,7 @@
         <w:rPr>
           <w:b/>
         </w:rPr>
-        <w:t>⋯</w:t>
-      </w:r>
-      <w:r>
-        <w:rPr>
-          <w:b/>
-        </w:rPr>
-        <w:t xml:space="preserve"> → Redeploy</w:t>
+        <w:t>⋯ → Redeploy</w:t>
       </w:r>
       <w:r>
         <w:t xml:space="preserve"> → </w:t>
@@ -8995,7 +8861,7 @@
       <w:pPr>
         <w:pStyle w:val="Heading2"/>
       </w:pPr>
-      <w:bookmarkStart w:id="37" w:name="_Toc242290991"/>
+      <w:bookmarkStart w:id="37" w:name="_Toc242296155"/>
       <w:r>
         <w:t>Changing the Management key</w:t>
       </w:r>
@@ -9003,10 +8869,7 @@
     </w:p>
     <w:p>
       <w:r>
-        <w:t>If the Management key leaks or is replaced: delete the old one at https://open</w:t>
-      </w:r>
-      <w:r>
-        <w:t xml:space="preserve">router.ai/settings/management-keys, create a new one, put it in </w:t>
+        <w:t xml:space="preserve">If the Management key leaks or is replaced: delete the old one at https://openrouter.ai/settings/management-keys, create a new one, put it in </w:t>
       </w:r>
       <w:r>
         <w:rPr>
@@ -9033,7 +8896,7 @@
       <w:pPr>
         <w:pStyle w:val="Heading2"/>
       </w:pPr>
-      <w:bookmarkStart w:id="38" w:name="_Toc242290992"/>
+      <w:bookmarkStart w:id="38" w:name="_Toc242296156"/>
       <w:r>
         <w:t>Updating the code</w:t>
       </w:r>
@@ -9051,10 +8914,7 @@
         <w:t>npm test</w:t>
       </w:r>
       <w:r>
-        <w:t>) and pushed to GitHub, publish it</w:t>
-      </w:r>
-      <w:r>
-        <w:t xml:space="preserve"> from the project folder:</w:t>
+        <w:t>) and pushed to GitHub, publish it from the project folder:</w:t>
       </w:r>
     </w:p>
     <w:p>
@@ -9067,6 +8927,7 @@
           <w:rFonts w:ascii="Consolas" w:hAnsi="Consolas"/>
           <w:sz w:val="19"/>
         </w:rPr>
+        <w:lastRenderedPageBreak/>
         <w:t>npx vercel deploy --prod</w:t>
       </w:r>
     </w:p>
@@ -9099,7 +8960,7 @@
       <w:pPr>
         <w:pStyle w:val="Heading1"/>
       </w:pPr>
-      <w:bookmarkStart w:id="39" w:name="_Toc242290993"/>
+      <w:bookmarkStart w:id="39" w:name="_Toc242296157"/>
       <w:r>
         <w:t>13. Running it on your own computer</w:t>
       </w:r>
@@ -9109,7 +8970,7 @@
       <w:pPr>
         <w:pStyle w:val="Heading2"/>
       </w:pPr>
-      <w:bookmarkStart w:id="40" w:name="_Toc242290994"/>
+      <w:bookmarkStart w:id="40" w:name="_Toc242296158"/>
       <w:r>
         <w:t>One-time setup</w:t>
       </w:r>
@@ -9173,7 +9034,6 @@
         <w:pStyle w:val="ListNumber"/>
       </w:pPr>
       <w:r>
-        <w:lastRenderedPageBreak/>
         <w:t xml:space="preserve">Copy the example settings file: </w:t>
       </w:r>
       <w:r>
@@ -9194,10 +9054,7 @@
         <w:t>Copy-Item .env.example .env</w:t>
       </w:r>
       <w:r>
-        <w:t xml:space="preserve"> (PowerSh</w:t>
-      </w:r>
-      <w:r>
-        <w:t>ell).</w:t>
+        <w:t xml:space="preserve"> (PowerShell).</w:t>
       </w:r>
     </w:p>
     <w:p>
@@ -9232,7 +9089,7 @@
       <w:pPr>
         <w:pStyle w:val="Heading2"/>
       </w:pPr>
-      <w:bookmarkStart w:id="41" w:name="_Toc242290995"/>
+      <w:bookmarkStart w:id="41" w:name="_Toc242296159"/>
       <w:r>
         <w:t>Web page</w:t>
       </w:r>
@@ -9257,14 +9114,7 @@
           <w:rFonts w:ascii="Consolas" w:hAnsi="Consolas"/>
           <w:sz w:val="20"/>
         </w:rPr>
-        <w:t>generated</w:t>
-      </w:r>
-      <w:r>
-        <w:rPr>
-          <w:rFonts w:ascii="Consolas" w:hAnsi="Consolas"/>
-          <w:sz w:val="20"/>
-        </w:rPr>
-        <w:t>_openrouter_keys.csv</w:t>
+        <w:t>generated_openrouter_keys.csv</w:t>
       </w:r>
       <w:r>
         <w:t xml:space="preserve"> in the project folder. Keep the terminal open; press </w:t>
@@ -9283,7 +9133,7 @@
       <w:pPr>
         <w:pStyle w:val="Heading2"/>
       </w:pPr>
-      <w:bookmarkStart w:id="42" w:name="_Toc242290996"/>
+      <w:bookmarkStart w:id="42" w:name="_Toc242296160"/>
       <w:r>
         <w:t>Command line</w:t>
       </w:r>
@@ -9308,10 +9158,7 @@
         <w:t>y</w:t>
       </w:r>
       <w:r>
-        <w:t xml:space="preserve"> bef</w:t>
-      </w:r>
-      <w:r>
-        <w:t xml:space="preserve">ore creating anything. </w:t>
+        <w:t xml:space="preserve"> before creating anything. </w:t>
       </w:r>
       <w:r>
         <w:rPr>
@@ -9423,7 +9270,7 @@
       <w:pPr>
         <w:pStyle w:val="Heading2"/>
       </w:pPr>
-      <w:bookmarkStart w:id="43" w:name="_Toc242290997"/>
+      <w:bookmarkStart w:id="43" w:name="_Toc242296161"/>
       <w:r>
         <w:t>Trying Google sign-in locally</w:t>
       </w:r>
@@ -9501,17 +9348,14 @@
         <w:t>npm run web</w:t>
       </w:r>
       <w:r>
-        <w:t>. Add all fo</w:t>
-      </w:r>
-      <w:r>
-        <w:t>ur or none: some but not all makes the page refuse everyone.</w:t>
+        <w:t>. Add all four or none: some but not all makes the page refuse everyone.</w:t>
       </w:r>
     </w:p>
     <w:p>
       <w:pPr>
         <w:pStyle w:val="Heading1"/>
       </w:pPr>
-      <w:bookmarkStart w:id="44" w:name="_Toc242290998"/>
+      <w:bookmarkStart w:id="44" w:name="_Toc242296162"/>
       <w:r>
         <w:t>14. Changing settings in config.js</w:t>
       </w:r>
@@ -9626,6 +9470,7 @@
                 <w:rFonts w:ascii="Consolas" w:hAnsi="Consolas"/>
                 <w:sz w:val="20"/>
               </w:rPr>
+              <w:lastRenderedPageBreak/>
               <w:t>creditLimit</w:t>
             </w:r>
             <w:r>
@@ -10109,7 +9954,6 @@
     <w:p/>
     <w:p>
       <w:r>
-        <w:lastRenderedPageBreak/>
         <w:t xml:space="preserve">To add a program, add an entry to </w:t>
       </w:r>
       <w:r>
@@ -10127,7 +9971,7 @@
       <w:pPr>
         <w:pStyle w:val="Heading1"/>
       </w:pPr>
-      <w:bookmarkStart w:id="45" w:name="_Toc242290999"/>
+      <w:bookmarkStart w:id="45" w:name="_Toc242296163"/>
       <w:r>
         <w:t>15. How it works (technical summary)</w:t>
       </w:r>
@@ -10164,10 +10008,7 @@
         <w:t>local-server.js</w:t>
       </w:r>
       <w:r>
-        <w:t xml:space="preserve">) and </w:t>
-      </w:r>
-      <w:r>
-        <w:t>the command line (</w:t>
+        <w:t>) and the command line (</w:t>
       </w:r>
       <w:r>
         <w:rPr>
@@ -10201,10 +10042,7 @@
         <w:t>Creating keys.</w:t>
       </w:r>
       <w:r>
-        <w:t xml:space="preserve"> The tool uses OpenRouter's Management API: it finds the program's workspace by slug, lists the existing keys in it, and creates eac</w:t>
-      </w:r>
-      <w:r>
-        <w:t>h new key with its name, workspace and limit.</w:t>
+        <w:t xml:space="preserve"> The tool uses OpenRouter's Management API: it finds the program's workspace by slug, lists the existing keys in it, and creates each new key with its name, workspace and limit.</w:t>
       </w:r>
     </w:p>
     <w:p>
@@ -10232,10 +10070,7 @@
         <w:t>Sign-in.</w:t>
       </w:r>
       <w:r>
-        <w:t xml:space="preserve"> Standard Goo</w:t>
-      </w:r>
-      <w:r>
-        <w:t>gle sign-in (OAuth). After Google confirms the account, the site checks the company domain and the allowed list, then gives the browser a signed, 12-hour sign-in cookie. Every request checks the cookie and the list again.</w:t>
+        <w:t xml:space="preserve"> Standard Google sign-in (OAuth). After Google confirms the account, the site checks the company domain and the allowed list, then gives the browser a signed, 12-hour sign-in cookie. Every request checks the cookie and the list again.</w:t>
       </w:r>
     </w:p>
     <w:p>
@@ -10263,10 +10098,7 @@
         <w:t>Safeguards.</w:t>
       </w:r>
       <w:r>
-        <w:t xml:space="preserve"> Requests to the API must come from the page itself; full keys are never written to logs (only t</w:t>
-      </w:r>
-      <w:r>
-        <w:t>he first 14 characters); the local page only accepts connections from the same computer.</w:t>
+        <w:t xml:space="preserve"> Requests to the API must come from the page itself; full keys are never written to logs (only the first 14 characters); the local page only accepts connections from the same computer.</w:t>
       </w:r>
     </w:p>
     <w:p>
@@ -10277,7 +10109,7 @@
         <w:rPr>
           <w:b/>
         </w:rPr>
-        <w:t xml:space="preserve">Emailing keys.</w:t>
+        <w:t>Emailing keys.</w:t>
       </w:r>
       <w:r>
         <w:t xml:space="preserve"> After the person confirms in the page, the server looks up each selected key and calls the Make webhook once per learner (with the webhook's API key). Each result (sent, queued or failed) is recorded in a sent log before the next learner; if it can't be recorded, sending stops. Learners already sent are skipped unless a resend is confirmed.</w:t>
@@ -10287,7 +10119,7 @@
       <w:pPr>
         <w:pStyle w:val="Heading1"/>
       </w:pPr>
-      <w:bookmarkStart w:id="46" w:name="_Toc242291000"/>
+      <w:bookmarkStart w:id="46" w:name="_Toc242296164"/>
       <w:r>
         <w:t>16. Security</w:t>
       </w:r>
@@ -10317,10 +10149,7 @@
         <w:t>live keys</w:t>
       </w:r>
       <w:r>
-        <w:t xml:space="preserve"> with learner emails. Share each learner's key only with </w:t>
-      </w:r>
-      <w:r>
-        <w:t>them.</w:t>
+        <w:t xml:space="preserve"> with learner emails. Share each learner's key only with them.</w:t>
       </w:r>
     </w:p>
     <w:p>
@@ -10361,7 +10190,7 @@
         <w:rPr>
           <w:b/>
         </w:rPr>
-        <w:t xml:space="preserve">Make webhook address and API key</w:t>
+        <w:t>Make webhook address and API key</w:t>
       </w:r>
       <w:r>
         <w:t xml:space="preserve"> (</w:t>
@@ -10371,7 +10200,7 @@
           <w:rFonts w:ascii="Consolas" w:hAnsi="Consolas"/>
           <w:sz w:val="20"/>
         </w:rPr>
-        <w:t xml:space="preserve">MAKE_WEBHOOK_URL</w:t>
+        <w:t>MAKE_WEBHOOK_URL</w:t>
       </w:r>
       <w:r>
         <w:t xml:space="preserve">, </w:t>
@@ -10381,7 +10210,7 @@
           <w:rFonts w:ascii="Consolas" w:hAnsi="Consolas"/>
           <w:sz w:val="20"/>
         </w:rPr>
-        <w:t xml:space="preserve">MAKE_WEBHOOK_API_KEY</w:t>
+        <w:t>MAKE_WEBHOOK_API_KEY</w:t>
       </w:r>
       <w:r>
         <w:t xml:space="preserve">) let anyone trigger key emails from the team's Gmail. Keep them only in the Vercel settings and </w:t>
@@ -10391,10 +10220,10 @@
           <w:rFonts w:ascii="Consolas" w:hAnsi="Consolas"/>
           <w:sz w:val="20"/>
         </w:rPr>
-        <w:t xml:space="preserve">.env</w:t>
-      </w:r>
-      <w:r>
-        <w:t xml:space="preserve">. If they leak, create a new API key on the webhook in Make and update both places.</w:t>
+        <w:t>.env</w:t>
+      </w:r>
+      <w:r>
+        <w:t>. If they leak, create a new API key on the webhook in Make and update both places.</w:t>
       </w:r>
     </w:p>
     <w:p>
@@ -10402,6 +10231,7 @@
         <w:pStyle w:val="ListBullet"/>
       </w:pPr>
       <w:r>
+        <w:lastRenderedPageBreak/>
         <w:t xml:space="preserve">Key emails carry live keys through Make and Gmail; each learner only gets their own. If the Google Sheet log stores </w:t>
       </w:r>
       <w:r>
@@ -10409,7 +10239,7 @@
           <w:rFonts w:ascii="Consolas" w:hAnsi="Consolas"/>
           <w:sz w:val="20"/>
         </w:rPr>
-        <w:t xml:space="preserve">api_key</w:t>
+        <w:t>api_key</w:t>
       </w:r>
       <w:r>
         <w:t xml:space="preserve">, restrict who can open that sheet, or don't map </w:t>
@@ -10419,7 +10249,7 @@
           <w:rFonts w:ascii="Consolas" w:hAnsi="Consolas"/>
           <w:sz w:val="20"/>
         </w:rPr>
-        <w:t xml:space="preserve">api_key</w:t>
+        <w:t>api_key</w:t>
       </w:r>
       <w:r>
         <w:t xml:space="preserve"> there.</w:t>
@@ -10448,10 +10278,7 @@
         <w:pStyle w:val="ListBullet"/>
       </w:pPr>
       <w:r>
-        <w:t>Disable a cohort's keys when th</w:t>
-      </w:r>
-      <w:r>
-        <w:t>e cohort ends.</w:t>
+        <w:t>Disable a cohort's keys when the cohort ends.</w:t>
       </w:r>
     </w:p>
     <w:p>
@@ -10503,17 +10330,14 @@
         <w:t>same cohort at the same moment</w:t>
       </w:r>
       <w:r>
-        <w:t xml:space="preserve">, a learner could get two keys. Agree who </w:t>
-      </w:r>
-      <w:r>
-        <w:t>runs each cohort.</w:t>
+        <w:t>, a learner could get two keys. Agree who runs each cohort.</w:t>
       </w:r>
     </w:p>
     <w:p>
       <w:pPr>
         <w:pStyle w:val="Heading1"/>
       </w:pPr>
-      <w:bookmarkStart w:id="47" w:name="_Toc242291001"/>
+      <w:bookmarkStart w:id="47" w:name="_Toc242296165"/>
       <w:r>
         <w:t>17. Troubleshooting</w:t>
       </w:r>
@@ -10713,13 +10537,7 @@
               <w:rPr>
                 <w:sz w:val="20"/>
               </w:rPr>
-              <w:t>Start the sign-in a</w:t>
-            </w:r>
-            <w:r>
-              <w:rPr>
-                <w:sz w:val="20"/>
-              </w:rPr>
-              <w:t>gain from the site, in one tab.</w:t>
+              <w:t>Start the sign-in again from the site, in one tab.</w:t>
             </w:r>
           </w:p>
         </w:tc>
@@ -10771,7 +10589,6 @@
               <w:rPr>
                 <w:sz w:val="20"/>
               </w:rPr>
-              <w:lastRenderedPageBreak/>
               <w:t xml:space="preserve">Google: </w:t>
             </w:r>
             <w:r>
@@ -10849,13 +10666,7 @@
               <w:rPr>
                 <w:sz w:val="20"/>
               </w:rPr>
-              <w:t xml:space="preserve">The Management key is </w:t>
-            </w:r>
-            <w:r>
-              <w:rPr>
-                <w:sz w:val="20"/>
-              </w:rPr>
-              <w:t xml:space="preserve">wrong or is a normal key. Create a Management key, update it in Vercel / </w:t>
+              <w:t xml:space="preserve">The Management key is wrong or is a normal key. Create a Management key, update it in Vercel / </w:t>
             </w:r>
             <w:r>
               <w:rPr>
@@ -10944,13 +10755,7 @@
               <w:rPr>
                 <w:sz w:val="20"/>
               </w:rPr>
-              <w:t xml:space="preserve">The workspace doesn't exist or its </w:t>
-            </w:r>
-            <w:r>
-              <w:rPr>
-                <w:sz w:val="20"/>
-              </w:rPr>
-              <w:t xml:space="preserve">slug changed. Check OpenRouter, then fix the slug in </w:t>
+              <w:t xml:space="preserve">The workspace doesn't exist or its slug changed. Check OpenRouter, then fix the slug in </w:t>
             </w:r>
             <w:r>
               <w:rPr>
@@ -11058,13 +10863,7 @@
               <w:rPr>
                 <w:sz w:val="20"/>
               </w:rPr>
-              <w:t xml:space="preserve">Fix them in the CSV and run again; </w:t>
-            </w:r>
-            <w:r>
-              <w:rPr>
-                <w:sz w:val="20"/>
-              </w:rPr>
-              <w:t>created keys are skipped.</w:t>
+              <w:t>Fix them in the CSV and run again; created keys are skipped.</w:t>
             </w:r>
           </w:p>
         </w:tc>
@@ -11133,13 +10932,7 @@
               <w:rPr>
                 <w:sz w:val="20"/>
               </w:rPr>
-              <w:t>That program's workspace couldn't be listed (wrong slug or Manageme</w:t>
-            </w:r>
-            <w:r>
-              <w:rPr>
-                <w:sz w:val="20"/>
-              </w:rPr>
-              <w:t xml:space="preserve">nt key). The other programs are still shown. Check the message, then the slug in </w:t>
+              <w:t xml:space="preserve">That program's workspace couldn't be listed (wrong slug or Management key). The other programs are still shown. Check the message, then the slug in </w:t>
             </w:r>
             <w:r>
               <w:rPr>
@@ -11238,7 +11031,7 @@
               <w:rPr>
                 <w:sz w:val="20"/>
               </w:rPr>
-              <w:t xml:space="preserve">"Sending is not set up: MAKE_WEBHOOK_URL is not set" (Send buttons off)</w:t>
+              <w:t>"Sending is not set up: MAKE_WEBHOOK_URL is not set" (Send buttons off)</w:t>
             </w:r>
           </w:p>
         </w:tc>
@@ -11261,7 +11054,7 @@
                 <w:rFonts w:ascii="Consolas" w:hAnsi="Consolas"/>
                 <w:sz w:val="20"/>
               </w:rPr>
-              <w:t xml:space="preserve">MAKE_WEBHOOK_URL</w:t>
+              <w:t>MAKE_WEBHOOK_URL</w:t>
             </w:r>
             <w:r>
               <w:rPr>
@@ -11274,7 +11067,7 @@
                 <w:rFonts w:ascii="Consolas" w:hAnsi="Consolas"/>
                 <w:sz w:val="20"/>
               </w:rPr>
-              <w:t xml:space="preserve">MAKE_WEBHOOK_API_KEY</w:t>
+              <w:t>MAKE_WEBHOOK_API_KEY</w:t>
             </w:r>
             <w:r>
               <w:rPr>
@@ -11299,7 +11092,15 @@
                 <w:rFonts w:ascii="Consolas" w:hAnsi="Consolas"/>
                 <w:sz w:val="20"/>
               </w:rPr>
-              <w:t xml:space="preserve">MAKE_WEBHOOK_URL must start with https://</w:t>
+              <w:t xml:space="preserve">MAKE_WEBHOOK_URL must start </w:t>
+            </w:r>
+            <w:r>
+              <w:rPr>
+                <w:rFonts w:ascii="Consolas" w:hAnsi="Consolas"/>
+                <w:sz w:val="20"/>
+              </w:rPr>
+              <w:lastRenderedPageBreak/>
+              <w:t>with https://</w:t>
             </w:r>
           </w:p>
         </w:tc>
@@ -11315,7 +11116,15 @@
               <w:rPr>
                 <w:sz w:val="20"/>
               </w:rPr>
-              <w:t xml:space="preserve">Copy the webhook address again from Make (Copy address to clipboard). It starts with https://hook.</w:t>
+              <w:lastRenderedPageBreak/>
+              <w:t xml:space="preserve">Copy the webhook address again from Make (Copy address to </w:t>
+            </w:r>
+            <w:r>
+              <w:rPr>
+                <w:sz w:val="20"/>
+              </w:rPr>
+              <w:lastRenderedPageBreak/>
+              <w:t>clipboard). It starts with https://hook.</w:t>
             </w:r>
           </w:p>
         </w:tc>
@@ -11333,7 +11142,8 @@
               <w:rPr>
                 <w:sz w:val="20"/>
               </w:rPr>
-              <w:t xml:space="preserve">Make webhook returned HTTP 401 / 403</w:t>
+              <w:lastRenderedPageBreak/>
+              <w:t>Make webhook returned HTTP 401 / 403</w:t>
             </w:r>
           </w:p>
         </w:tc>
@@ -11350,7 +11160,7 @@
                 <w:rFonts w:ascii="Consolas" w:hAnsi="Consolas"/>
                 <w:sz w:val="20"/>
               </w:rPr>
-              <w:t xml:space="preserve">MAKE_WEBHOOK_API_KEY</w:t>
+              <w:t>MAKE_WEBHOOK_API_KEY</w:t>
             </w:r>
             <w:r>
               <w:rPr>
@@ -11374,7 +11184,7 @@
               <w:rPr>
                 <w:sz w:val="20"/>
               </w:rPr>
-              <w:t xml:space="preserve">Make webhook returned HTTP 404 / 410</w:t>
+              <w:t>Make webhook returned HTTP 404 / 410</w:t>
             </w:r>
           </w:p>
         </w:tc>
@@ -11390,7 +11200,7 @@
               <w:rPr>
                 <w:sz w:val="20"/>
               </w:rPr>
-              <w:t xml:space="preserve">The webhook was deleted or the address is wrong. Copy the address from the Make scenario again.</w:t>
+              <w:t>The webhook was deleted or the address is wrong. Copy the address from the Make scenario again.</w:t>
             </w:r>
           </w:p>
         </w:tc>
@@ -11408,7 +11218,7 @@
               <w:rPr>
                 <w:sz w:val="20"/>
               </w:rPr>
-              <w:t xml:space="preserve">"Make did not answer within 60 seconds"</w:t>
+              <w:t>"Make did not answer within 60 seconds"</w:t>
             </w:r>
           </w:p>
         </w:tc>
@@ -11424,7 +11234,7 @@
               <w:rPr>
                 <w:sz w:val="20"/>
               </w:rPr>
-              <w:t xml:space="preserve">The scenario took too long (usually Gmail). Check the scenario's History in Make to see whether the email went out before sending to that learner again.</w:t>
+              <w:t>The scenario took too long (usually Gmail). Check the scenario's History in Make to see whether the email went out before sending to that learner again.</w:t>
             </w:r>
           </w:p>
         </w:tc>
@@ -11442,7 +11252,7 @@
               <w:rPr>
                 <w:sz w:val="20"/>
               </w:rPr>
-              <w:t xml:space="preserve">"Make reported a failure: …"</w:t>
+              <w:t>"Make reported a failure: …"</w:t>
             </w:r>
           </w:p>
         </w:tc>
@@ -11458,7 +11268,7 @@
               <w:rPr>
                 <w:sz w:val="20"/>
               </w:rPr>
-              <w:t xml:space="preserve">The scenario replied {"status":"failed"}. Check its History in Make for the reason.</w:t>
+              <w:t>The scenario replied {"status":"failed"}. Check its History in Make for the reason.</w:t>
             </w:r>
           </w:p>
         </w:tc>
@@ -11476,7 +11286,7 @@
               <w:rPr>
                 <w:sz w:val="20"/>
               </w:rPr>
-              <w:t xml:space="preserve">Learner shows Sent to Make, not Sent ✓</w:t>
+              <w:t>Learner shows Sent to Make, not Sent ✓</w:t>
             </w:r>
           </w:p>
         </w:tc>
@@ -11492,7 +11302,7 @@
               <w:rPr>
                 <w:sz w:val="20"/>
               </w:rPr>
-              <w:t xml:space="preserve">The scenario has no Webhook response at the end, or it is off (Make holds the email). Check Make or Gmail that the email went out.</w:t>
+              <w:t>The scenario has no Webhook response at the end, or it is off (Make holds the email). Check Make or Gmail that the email went out.</w:t>
             </w:r>
           </w:p>
         </w:tc>
@@ -11510,7 +11320,7 @@
               <w:rPr>
                 <w:sz w:val="20"/>
               </w:rPr>
-              <w:t xml:space="preserve">"Email … but the record could not be saved. Stopped"</w:t>
+              <w:t>"Email … but the record could not be saved. Stopped"</w:t>
             </w:r>
           </w:p>
         </w:tc>
@@ -11526,7 +11336,7 @@
               <w:rPr>
                 <w:sz w:val="20"/>
               </w:rPr>
-              <w:t xml:space="preserve">The email may have gone out without being recorded. Check Gmail's Sent folder for that learner before sending again. Locally, close sent_keys_log.csv if it is open in Excel.</w:t>
+              <w:t>The email may have gone out without being recorded. Check Gmail's Sent folder for that learner before sending again. Locally, close sent_keys_log.csv if it is open in Excel.</w:t>
             </w:r>
           </w:p>
         </w:tc>
@@ -11608,13 +11418,7 @@
               <w:rPr>
                 <w:sz w:val="20"/>
               </w:rPr>
-              <w:t>The CSV is from an o</w:t>
-            </w:r>
-            <w:r>
-              <w:rPr>
-                <w:sz w:val="20"/>
-              </w:rPr>
-              <w:t xml:space="preserve">lder version. Rename it (e.g. </w:t>
+              <w:t xml:space="preserve">The CSV is from an older version. Rename it (e.g. </w:t>
             </w:r>
             <w:r>
               <w:rPr>
@@ -11720,12 +11524,9 @@
       <w:pPr>
         <w:pStyle w:val="Heading1"/>
       </w:pPr>
-      <w:bookmarkStart w:id="48" w:name="_Toc242291002"/>
-      <w:r>
-        <w:t>18. For de</w:t>
-      </w:r>
-      <w:r>
-        <w:t>velopers</w:t>
+      <w:bookmarkStart w:id="48" w:name="_Toc242296166"/>
+      <w:r>
+        <w:t>18. For developers</w:t>
       </w:r>
       <w:bookmarkEnd w:id="48"/>
     </w:p>
@@ -11940,13 +11741,7 @@
               <w:rPr>
                 <w:sz w:val="20"/>
               </w:rPr>
-              <w:t>Vercel entry point,</w:t>
-            </w:r>
-            <w:r>
-              <w:rPr>
-                <w:sz w:val="20"/>
-              </w:rPr>
-              <w:t xml:space="preserve"> routing and time limit, upload exclusions</w:t>
+              <w:t>Vercel entry point, routing and time limit, upload exclusions</w:t>
             </w:r>
           </w:p>
         </w:tc>
@@ -12210,7 +12005,6 @@
                 <w:rFonts w:ascii="Consolas" w:hAnsi="Consolas"/>
                 <w:sz w:val="20"/>
               </w:rPr>
-              <w:lastRenderedPageBreak/>
               <w:t>web/index.html</w:t>
             </w:r>
             <w:r>
@@ -12350,6 +12144,7 @@
           </w:tcPr>
           <w:p>
             <w:r>
+              <w:lastRenderedPageBreak/>
               <w:t xml:space="preserve">Don't add a file called </w:t>
             </w:r>
             <w:r>
@@ -25030,7 +24825,7 @@
 </file>
 
 <file path=customXml/itemProps1.xml><?xml version="1.0" encoding="utf-8"?>
-<ds:datastoreItem xmlns:ds="http://schemas.openxmlformats.org/officeDocument/2006/customXml" ds:itemID="{96407B16-1D12-4552-99BD-8B006DC70183}">
+<ds:datastoreItem xmlns:ds="http://schemas.openxmlformats.org/officeDocument/2006/customXml" ds:itemID="{FEA2ED44-08A5-4738-965D-7764B4939D67}">
   <ds:schemaRefs>
     <ds:schemaRef ds:uri="http://schemas.openxmlformats.org/officeDocument/2006/bibliography"/>
   </ds:schemaRefs>

</xml_diff>